<commit_message>
refactor(examenes): simplificar formulario y unificar descarga general con historial automático
</commit_message>
<xml_diff>
--- a/examenes_medicos_templates/FORMATO EXAMEN DE SANGRE.docx
+++ b/examenes_medicos_templates/FORMATO EXAMEN DE SANGRE.docx
@@ -579,8 +579,17 @@
                 <w:spacing w:val="-4"/>
                 <w:sz w:val="16"/>
               </w:rPr>
-              <w:t>g/dL</w:t>
-            </w:r>
+              <w:t>g/</w:t>
+            </w:r>
+            <w:proofErr w:type="spellStart"/>
+            <w:r>
+              <w:rPr>
+                <w:spacing w:val="-4"/>
+                <w:sz w:val="16"/>
+              </w:rPr>
+              <w:t>dL</w:t>
+            </w:r>
+            <w:proofErr w:type="spellEnd"/>
           </w:p>
         </w:tc>
         <w:tc>
@@ -889,6 +898,7 @@
                 <w:sz w:val="16"/>
               </w:rPr>
             </w:pPr>
+            <w:proofErr w:type="spellStart"/>
             <w:r>
               <w:rPr>
                 <w:spacing w:val="-5"/>
@@ -896,6 +906,7 @@
               </w:rPr>
               <w:t>fL</w:t>
             </w:r>
+            <w:proofErr w:type="spellEnd"/>
           </w:p>
         </w:tc>
         <w:tc>
@@ -1038,14 +1049,7 @@
                 <w:spacing w:val="-2"/>
                 <w:sz w:val="16"/>
               </w:rPr>
-              <w:t>H</w:t>
-            </w:r>
-            <w:r>
-              <w:rPr>
-                <w:spacing w:val="-2"/>
-                <w:sz w:val="16"/>
-              </w:rPr>
-              <w:t>CM</w:t>
+              <w:t>HCM</w:t>
             </w:r>
             <w:r>
               <w:rPr>
@@ -1074,6 +1078,7 @@
                 <w:sz w:val="16"/>
               </w:rPr>
             </w:pPr>
+            <w:proofErr w:type="spellStart"/>
             <w:r>
               <w:rPr>
                 <w:spacing w:val="-5"/>
@@ -1081,6 +1086,7 @@
               </w:rPr>
               <w:t>pg</w:t>
             </w:r>
+            <w:proofErr w:type="spellEnd"/>
           </w:p>
         </w:tc>
         <w:tc>
@@ -1240,7 +1246,23 @@
                 <w:spacing w:val="-4"/>
                 <w:sz w:val="16"/>
               </w:rPr>
-              <w:t>{conc_media_hb_corp}</w:t>
+              <w:t>{</w:t>
+            </w:r>
+            <w:proofErr w:type="spellStart"/>
+            <w:r>
+              <w:rPr>
+                <w:spacing w:val="-4"/>
+                <w:sz w:val="16"/>
+              </w:rPr>
+              <w:t>conc_media_hb_corp</w:t>
+            </w:r>
+            <w:proofErr w:type="spellEnd"/>
+            <w:r>
+              <w:rPr>
+                <w:spacing w:val="-4"/>
+                <w:sz w:val="16"/>
+              </w:rPr>
+              <w:t>}</w:t>
             </w:r>
           </w:p>
         </w:tc>
@@ -1267,8 +1289,17 @@
                 <w:spacing w:val="-4"/>
                 <w:sz w:val="16"/>
               </w:rPr>
-              <w:t>g/dL</w:t>
-            </w:r>
+              <w:t>g/</w:t>
+            </w:r>
+            <w:proofErr w:type="spellStart"/>
+            <w:r>
+              <w:rPr>
+                <w:spacing w:val="-4"/>
+                <w:sz w:val="16"/>
+              </w:rPr>
+              <w:t>dL</w:t>
+            </w:r>
+            <w:proofErr w:type="spellEnd"/>
           </w:p>
         </w:tc>
         <w:tc>
@@ -1469,6 +1500,7 @@
                 <w:sz w:val="16"/>
               </w:rPr>
             </w:pPr>
+            <w:proofErr w:type="spellStart"/>
             <w:r>
               <w:rPr>
                 <w:spacing w:val="-5"/>
@@ -1476,6 +1508,7 @@
               </w:rPr>
               <w:t>fL</w:t>
             </w:r>
+            <w:proofErr w:type="spellEnd"/>
           </w:p>
         </w:tc>
         <w:tc>
@@ -1647,35 +1680,7 @@
                 <w:spacing w:val="-4"/>
                 <w:sz w:val="16"/>
               </w:rPr>
-              <w:t>AD_</w:t>
-            </w:r>
-            <w:r>
-              <w:rPr>
-                <w:spacing w:val="-4"/>
-                <w:sz w:val="16"/>
-              </w:rPr>
-              <w:t>C</w:t>
-            </w:r>
-            <w:r>
-              <w:rPr>
-                <w:spacing w:val="-4"/>
-                <w:sz w:val="16"/>
-              </w:rPr>
-              <w:t>.</w:t>
-            </w:r>
-            <w:r>
-              <w:rPr>
-                <w:spacing w:val="-4"/>
-                <w:sz w:val="16"/>
-              </w:rPr>
-              <w:t>V</w:t>
-            </w:r>
-            <w:r>
-              <w:rPr>
-                <w:spacing w:val="-4"/>
-                <w:sz w:val="16"/>
-              </w:rPr>
-              <w:t>.</w:t>
+              <w:t>AD_C.V.</w:t>
             </w:r>
             <w:r>
               <w:rPr>
@@ -2000,6 +2005,7 @@
               </w:rPr>
               <w:t>{</w:t>
             </w:r>
+            <w:proofErr w:type="spellStart"/>
             <w:r>
               <w:rPr>
                 <w:spacing w:val="-2"/>
@@ -2012,7 +2018,15 @@
                 <w:spacing w:val="-2"/>
                 <w:sz w:val="16"/>
               </w:rPr>
-              <w:t>_plaquetario_medio}</w:t>
+              <w:t>_plaquetario_medio</w:t>
+            </w:r>
+            <w:proofErr w:type="spellEnd"/>
+            <w:r>
+              <w:rPr>
+                <w:spacing w:val="-2"/>
+                <w:sz w:val="16"/>
+              </w:rPr>
+              <w:t>}</w:t>
             </w:r>
           </w:p>
         </w:tc>
@@ -2034,6 +2048,7 @@
                 <w:sz w:val="16"/>
               </w:rPr>
             </w:pPr>
+            <w:proofErr w:type="spellStart"/>
             <w:r>
               <w:rPr>
                 <w:spacing w:val="-5"/>
@@ -2041,6 +2056,7 @@
               </w:rPr>
               <w:t>fL</w:t>
             </w:r>
+            <w:proofErr w:type="spellEnd"/>
           </w:p>
         </w:tc>
         <w:tc>
@@ -2162,7 +2178,23 @@
                 <w:spacing w:val="-4"/>
                 <w:sz w:val="16"/>
               </w:rPr>
-              <w:t>{linfocitos_pct}</w:t>
+              <w:t>{</w:t>
+            </w:r>
+            <w:proofErr w:type="spellStart"/>
+            <w:r>
+              <w:rPr>
+                <w:spacing w:val="-4"/>
+                <w:sz w:val="16"/>
+              </w:rPr>
+              <w:t>linfocitos_pct</w:t>
+            </w:r>
+            <w:proofErr w:type="spellEnd"/>
+            <w:r>
+              <w:rPr>
+                <w:spacing w:val="-4"/>
+                <w:sz w:val="16"/>
+              </w:rPr>
+              <w:t>}</w:t>
             </w:r>
           </w:p>
         </w:tc>
@@ -2620,9 +2652,11 @@
         </w:rPr>
         <w:t xml:space="preserve"> </w:t>
       </w:r>
+      <w:proofErr w:type="gramStart"/>
       <w:r>
         <w:t>realizado</w:t>
       </w:r>
+      <w:proofErr w:type="gramEnd"/>
       <w:r>
         <w:rPr>
           <w:spacing w:val="-7"/>
@@ -2819,8 +2853,12 @@
         <w:spacing w:line="247" w:lineRule="auto"/>
         <w:jc w:val="both"/>
         <w:sectPr>
-          <w:headerReference w:type="default" r:id="rId8"/>
-          <w:footerReference w:type="default" r:id="rId9"/>
+          <w:headerReference w:type="even" r:id="rId8"/>
+          <w:headerReference w:type="default" r:id="rId9"/>
+          <w:footerReference w:type="even" r:id="rId10"/>
+          <w:footerReference w:type="default" r:id="rId11"/>
+          <w:headerReference w:type="first" r:id="rId12"/>
+          <w:footerReference w:type="first" r:id="rId13"/>
           <w:type w:val="continuous"/>
           <w:pgSz w:w="12240" w:h="15840"/>
           <w:pgMar w:top="3600" w:right="360" w:bottom="3440" w:left="0" w:header="287" w:footer="3256" w:gutter="0"/>
@@ -2970,7 +3008,23 @@
                 <w:spacing w:val="-4"/>
                 <w:sz w:val="16"/>
               </w:rPr>
-              <w:t>{neutrofilos_pct}</w:t>
+              <w:t>{</w:t>
+            </w:r>
+            <w:proofErr w:type="spellStart"/>
+            <w:r>
+              <w:rPr>
+                <w:spacing w:val="-4"/>
+                <w:sz w:val="16"/>
+              </w:rPr>
+              <w:t>neutrofilos_pct</w:t>
+            </w:r>
+            <w:proofErr w:type="spellEnd"/>
+            <w:r>
+              <w:rPr>
+                <w:spacing w:val="-4"/>
+                <w:sz w:val="16"/>
+              </w:rPr>
+              <w:t>}</w:t>
             </w:r>
           </w:p>
         </w:tc>
@@ -3106,7 +3160,23 @@
                 <w:spacing w:val="-5"/>
                 <w:sz w:val="16"/>
               </w:rPr>
-              <w:t>{monocitos_pct}</w:t>
+              <w:t>{</w:t>
+            </w:r>
+            <w:proofErr w:type="spellStart"/>
+            <w:r>
+              <w:rPr>
+                <w:spacing w:val="-5"/>
+                <w:sz w:val="16"/>
+              </w:rPr>
+              <w:t>monocitos_pct</w:t>
+            </w:r>
+            <w:proofErr w:type="spellEnd"/>
+            <w:r>
+              <w:rPr>
+                <w:spacing w:val="-5"/>
+                <w:sz w:val="16"/>
+              </w:rPr>
+              <w:t>}</w:t>
             </w:r>
           </w:p>
         </w:tc>
@@ -3235,7 +3305,23 @@
                 <w:spacing w:val="-5"/>
                 <w:sz w:val="16"/>
               </w:rPr>
-              <w:t>{eosinofilos_pct}</w:t>
+              <w:t>{</w:t>
+            </w:r>
+            <w:proofErr w:type="spellStart"/>
+            <w:r>
+              <w:rPr>
+                <w:spacing w:val="-5"/>
+                <w:sz w:val="16"/>
+              </w:rPr>
+              <w:t>eosinofilos_pct</w:t>
+            </w:r>
+            <w:proofErr w:type="spellEnd"/>
+            <w:r>
+              <w:rPr>
+                <w:spacing w:val="-5"/>
+                <w:sz w:val="16"/>
+              </w:rPr>
+              <w:t>}</w:t>
             </w:r>
           </w:p>
         </w:tc>
@@ -3371,7 +3457,23 @@
                 <w:spacing w:val="-5"/>
                 <w:sz w:val="16"/>
               </w:rPr>
-              <w:t>{basofilos_pct}</w:t>
+              <w:t>{</w:t>
+            </w:r>
+            <w:proofErr w:type="spellStart"/>
+            <w:r>
+              <w:rPr>
+                <w:spacing w:val="-5"/>
+                <w:sz w:val="16"/>
+              </w:rPr>
+              <w:t>basofilos_pct</w:t>
+            </w:r>
+            <w:proofErr w:type="spellEnd"/>
+            <w:r>
+              <w:rPr>
+                <w:spacing w:val="-5"/>
+                <w:sz w:val="16"/>
+              </w:rPr>
+              <w:t>}</w:t>
             </w:r>
           </w:p>
         </w:tc>
@@ -3493,7 +3595,23 @@
                 <w:spacing w:val="-4"/>
                 <w:sz w:val="16"/>
               </w:rPr>
-              <w:t>{linfocitos_abs}</w:t>
+              <w:t>{</w:t>
+            </w:r>
+            <w:proofErr w:type="spellStart"/>
+            <w:r>
+              <w:rPr>
+                <w:spacing w:val="-4"/>
+                <w:sz w:val="16"/>
+              </w:rPr>
+              <w:t>linfocitos_abs</w:t>
+            </w:r>
+            <w:proofErr w:type="spellEnd"/>
+            <w:r>
+              <w:rPr>
+                <w:spacing w:val="-4"/>
+                <w:sz w:val="16"/>
+              </w:rPr>
+              <w:t>}</w:t>
             </w:r>
           </w:p>
         </w:tc>
@@ -3615,7 +3733,23 @@
                 <w:spacing w:val="-4"/>
                 <w:sz w:val="16"/>
               </w:rPr>
-              <w:t>{neutrofilos_abs}</w:t>
+              <w:t>{</w:t>
+            </w:r>
+            <w:proofErr w:type="spellStart"/>
+            <w:r>
+              <w:rPr>
+                <w:spacing w:val="-4"/>
+                <w:sz w:val="16"/>
+              </w:rPr>
+              <w:t>neutrofilos_abs</w:t>
+            </w:r>
+            <w:proofErr w:type="spellEnd"/>
+            <w:r>
+              <w:rPr>
+                <w:spacing w:val="-4"/>
+                <w:sz w:val="16"/>
+              </w:rPr>
+              <w:t>}</w:t>
             </w:r>
           </w:p>
         </w:tc>
@@ -3737,7 +3871,23 @@
                 <w:spacing w:val="-4"/>
                 <w:sz w:val="16"/>
               </w:rPr>
-              <w:t>{monocitos_abs}</w:t>
+              <w:t>{</w:t>
+            </w:r>
+            <w:proofErr w:type="spellStart"/>
+            <w:r>
+              <w:rPr>
+                <w:spacing w:val="-4"/>
+                <w:sz w:val="16"/>
+              </w:rPr>
+              <w:t>monocitos_abs</w:t>
+            </w:r>
+            <w:proofErr w:type="spellEnd"/>
+            <w:r>
+              <w:rPr>
+                <w:spacing w:val="-4"/>
+                <w:sz w:val="16"/>
+              </w:rPr>
+              <w:t>}</w:t>
             </w:r>
           </w:p>
         </w:tc>
@@ -3859,7 +4009,23 @@
                 <w:spacing w:val="-4"/>
                 <w:sz w:val="16"/>
               </w:rPr>
-              <w:t>{eosinofilos_abs}</w:t>
+              <w:t>{</w:t>
+            </w:r>
+            <w:proofErr w:type="spellStart"/>
+            <w:r>
+              <w:rPr>
+                <w:spacing w:val="-4"/>
+                <w:sz w:val="16"/>
+              </w:rPr>
+              <w:t>eosinofilos_abs</w:t>
+            </w:r>
+            <w:proofErr w:type="spellEnd"/>
+            <w:r>
+              <w:rPr>
+                <w:spacing w:val="-4"/>
+                <w:sz w:val="16"/>
+              </w:rPr>
+              <w:t>}</w:t>
             </w:r>
           </w:p>
         </w:tc>
@@ -3981,7 +4147,23 @@
                 <w:spacing w:val="-4"/>
                 <w:sz w:val="16"/>
               </w:rPr>
-              <w:t>{basofilos_abs}</w:t>
+              <w:t>{</w:t>
+            </w:r>
+            <w:proofErr w:type="spellStart"/>
+            <w:r>
+              <w:rPr>
+                <w:spacing w:val="-4"/>
+                <w:sz w:val="16"/>
+              </w:rPr>
+              <w:t>basofilos_abs</w:t>
+            </w:r>
+            <w:proofErr w:type="spellEnd"/>
+            <w:r>
+              <w:rPr>
+                <w:spacing w:val="-4"/>
+                <w:sz w:val="16"/>
+              </w:rPr>
+              <w:t>}</w:t>
             </w:r>
           </w:p>
         </w:tc>
@@ -4230,7 +4412,21 @@
         <w:rPr>
           <w:sz w:val="16"/>
         </w:rPr>
-        <w:t>Equipo: Sysmex XN-9000</w:t>
+        <w:t xml:space="preserve">Equipo: </w:t>
+      </w:r>
+      <w:proofErr w:type="spellStart"/>
+      <w:r>
+        <w:rPr>
+          <w:sz w:val="16"/>
+        </w:rPr>
+        <w:t>Sysmex</w:t>
+      </w:r>
+      <w:proofErr w:type="spellEnd"/>
+      <w:r>
+        <w:rPr>
+          <w:sz w:val="16"/>
+        </w:rPr>
+        <w:t xml:space="preserve"> XN-9000</w:t>
       </w:r>
     </w:p>
     <w:p>
@@ -4344,8 +4540,17 @@
           <w:rFonts w:ascii="Times New Roman"/>
           <w:spacing w:val="-2"/>
         </w:rPr>
-        <w:t>mg/dL</w:t>
-      </w:r>
+        <w:t>mg/</w:t>
+      </w:r>
+      <w:proofErr w:type="spellStart"/>
+      <w:r>
+        <w:rPr>
+          <w:rFonts w:ascii="Times New Roman"/>
+          <w:spacing w:val="-2"/>
+        </w:rPr>
+        <w:t>dL</w:t>
+      </w:r>
+      <w:proofErr w:type="spellEnd"/>
       <w:r>
         <w:rPr>
           <w:rFonts w:ascii="Times New Roman"/>
@@ -4754,9 +4959,11 @@
         </w:rPr>
         <w:t xml:space="preserve"> </w:t>
       </w:r>
+      <w:proofErr w:type="gramStart"/>
       <w:r>
         <w:t>realizado</w:t>
       </w:r>
+      <w:proofErr w:type="gramEnd"/>
       <w:r>
         <w:rPr>
           <w:spacing w:val="-7"/>
@@ -4953,8 +5160,8 @@
         <w:spacing w:line="247" w:lineRule="auto"/>
         <w:jc w:val="both"/>
         <w:sectPr>
-          <w:headerReference w:type="default" r:id="rId10"/>
-          <w:footerReference w:type="default" r:id="rId11"/>
+          <w:headerReference w:type="default" r:id="rId14"/>
+          <w:footerReference w:type="default" r:id="rId15"/>
           <w:pgSz w:w="12240" w:h="15840"/>
           <w:pgMar w:top="3600" w:right="360" w:bottom="3500" w:left="0" w:header="287" w:footer="3306" w:gutter="0"/>
           <w:cols w:space="720"/>
@@ -5125,8 +5332,17 @@
                 <w:spacing w:val="-2"/>
                 <w:sz w:val="16"/>
               </w:rPr>
-              <w:t>mg/dL</w:t>
-            </w:r>
+              <w:t>mg/</w:t>
+            </w:r>
+            <w:proofErr w:type="spellStart"/>
+            <w:r>
+              <w:rPr>
+                <w:spacing w:val="-2"/>
+                <w:sz w:val="16"/>
+              </w:rPr>
+              <w:t>dL</w:t>
+            </w:r>
+            <w:proofErr w:type="spellEnd"/>
           </w:p>
         </w:tc>
         <w:tc>
@@ -5250,7 +5466,23 @@
                 <w:spacing w:val="-4"/>
                 <w:sz w:val="16"/>
               </w:rPr>
-              <w:t>{bun}</w:t>
+              <w:t>{</w:t>
+            </w:r>
+            <w:proofErr w:type="spellStart"/>
+            <w:r>
+              <w:rPr>
+                <w:spacing w:val="-4"/>
+                <w:sz w:val="16"/>
+              </w:rPr>
+              <w:t>bun</w:t>
+            </w:r>
+            <w:proofErr w:type="spellEnd"/>
+            <w:r>
+              <w:rPr>
+                <w:spacing w:val="-4"/>
+                <w:sz w:val="16"/>
+              </w:rPr>
+              <w:t>}</w:t>
             </w:r>
           </w:p>
         </w:tc>
@@ -5273,8 +5505,17 @@
                 <w:spacing w:val="-2"/>
                 <w:sz w:val="16"/>
               </w:rPr>
-              <w:t>mg/dL</w:t>
-            </w:r>
+              <w:t>mg/</w:t>
+            </w:r>
+            <w:proofErr w:type="spellStart"/>
+            <w:r>
+              <w:rPr>
+                <w:spacing w:val="-2"/>
+                <w:sz w:val="16"/>
+              </w:rPr>
+              <w:t>dL</w:t>
+            </w:r>
+            <w:proofErr w:type="spellEnd"/>
           </w:p>
         </w:tc>
         <w:tc>
@@ -5440,8 +5681,17 @@
                 <w:spacing w:val="-2"/>
                 <w:sz w:val="16"/>
               </w:rPr>
-              <w:t>mg/dL</w:t>
-            </w:r>
+              <w:t>mg/</w:t>
+            </w:r>
+            <w:proofErr w:type="spellStart"/>
+            <w:r>
+              <w:rPr>
+                <w:spacing w:val="-2"/>
+                <w:sz w:val="16"/>
+              </w:rPr>
+              <w:t>dL</w:t>
+            </w:r>
+            <w:proofErr w:type="spellEnd"/>
           </w:p>
         </w:tc>
         <w:tc>
@@ -5597,7 +5847,23 @@
                 <w:spacing w:val="-5"/>
                 <w:sz w:val="16"/>
               </w:rPr>
-              <w:t>{acido_urico}</w:t>
+              <w:t>{</w:t>
+            </w:r>
+            <w:proofErr w:type="spellStart"/>
+            <w:r>
+              <w:rPr>
+                <w:spacing w:val="-5"/>
+                <w:sz w:val="16"/>
+              </w:rPr>
+              <w:t>acido_urico</w:t>
+            </w:r>
+            <w:proofErr w:type="spellEnd"/>
+            <w:r>
+              <w:rPr>
+                <w:spacing w:val="-5"/>
+                <w:sz w:val="16"/>
+              </w:rPr>
+              <w:t>}</w:t>
             </w:r>
           </w:p>
         </w:tc>
@@ -5620,8 +5886,17 @@
                 <w:spacing w:val="-2"/>
                 <w:sz w:val="16"/>
               </w:rPr>
-              <w:t>mg/dL</w:t>
-            </w:r>
+              <w:t>mg/</w:t>
+            </w:r>
+            <w:proofErr w:type="spellStart"/>
+            <w:r>
+              <w:rPr>
+                <w:spacing w:val="-2"/>
+                <w:sz w:val="16"/>
+              </w:rPr>
+              <w:t>dL</w:t>
+            </w:r>
+            <w:proofErr w:type="spellEnd"/>
           </w:p>
         </w:tc>
         <w:tc>
@@ -5753,7 +6028,23 @@
                 <w:spacing w:val="-2"/>
                 <w:sz w:val="16"/>
               </w:rPr>
-              <w:t>{colesterol_total}</w:t>
+              <w:t>{</w:t>
+            </w:r>
+            <w:proofErr w:type="spellStart"/>
+            <w:r>
+              <w:rPr>
+                <w:spacing w:val="-2"/>
+                <w:sz w:val="16"/>
+              </w:rPr>
+              <w:t>colesterol_total</w:t>
+            </w:r>
+            <w:proofErr w:type="spellEnd"/>
+            <w:r>
+              <w:rPr>
+                <w:spacing w:val="-2"/>
+                <w:sz w:val="16"/>
+              </w:rPr>
+              <w:t>}</w:t>
             </w:r>
           </w:p>
         </w:tc>
@@ -5779,8 +6070,17 @@
                 <w:spacing w:val="-2"/>
                 <w:sz w:val="16"/>
               </w:rPr>
-              <w:t>mg/dL</w:t>
-            </w:r>
+              <w:t>mg/</w:t>
+            </w:r>
+            <w:proofErr w:type="spellStart"/>
+            <w:r>
+              <w:rPr>
+                <w:spacing w:val="-2"/>
+                <w:sz w:val="16"/>
+              </w:rPr>
+              <w:t>dL</w:t>
+            </w:r>
+            <w:proofErr w:type="spellEnd"/>
           </w:p>
         </w:tc>
         <w:tc>
@@ -5896,7 +6196,23 @@
                 <w:spacing w:val="-4"/>
                 <w:sz w:val="16"/>
               </w:rPr>
-              <w:t>{trigliceridos}</w:t>
+              <w:t>{</w:t>
+            </w:r>
+            <w:proofErr w:type="spellStart"/>
+            <w:r>
+              <w:rPr>
+                <w:spacing w:val="-4"/>
+                <w:sz w:val="16"/>
+              </w:rPr>
+              <w:t>trigliceridos</w:t>
+            </w:r>
+            <w:proofErr w:type="spellEnd"/>
+            <w:r>
+              <w:rPr>
+                <w:spacing w:val="-4"/>
+                <w:sz w:val="16"/>
+              </w:rPr>
+              <w:t>}</w:t>
             </w:r>
           </w:p>
         </w:tc>
@@ -5933,8 +6249,17 @@
                 <w:spacing w:val="-2"/>
                 <w:sz w:val="16"/>
               </w:rPr>
-              <w:t>mg/dL</w:t>
-            </w:r>
+              <w:t>mg/</w:t>
+            </w:r>
+            <w:proofErr w:type="spellStart"/>
+            <w:r>
+              <w:rPr>
+                <w:spacing w:val="-2"/>
+                <w:sz w:val="16"/>
+              </w:rPr>
+              <w:t>dL</w:t>
+            </w:r>
+            <w:proofErr w:type="spellEnd"/>
           </w:p>
         </w:tc>
         <w:tc>
@@ -6736,9 +7061,11 @@
         </w:rPr>
         <w:t xml:space="preserve"> </w:t>
       </w:r>
+      <w:proofErr w:type="gramStart"/>
       <w:r>
         <w:t>realizado</w:t>
       </w:r>
+      <w:proofErr w:type="gramEnd"/>
       <w:r>
         <w:rPr>
           <w:spacing w:val="-7"/>
@@ -6958,6 +7285,16 @@
 </file>
 
 <file path=word/footer1.xml><?xml version="1.0" encoding="utf-8"?>
+<w:ftr xmlns:wpc="http://schemas.microsoft.com/office/word/2010/wordprocessingCanvas" xmlns:cx="http://schemas.microsoft.com/office/drawing/2014/chartex" xmlns:cx1="http://schemas.microsoft.com/office/drawing/2015/9/8/chartex" xmlns:cx2="http://schemas.microsoft.com/office/drawing/2015/10/21/chartex" xmlns:cx3="http://schemas.microsoft.com/office/drawing/2016/5/9/chartex" xmlns:cx4="http://schemas.microsoft.com/office/drawing/2016/5/10/chartex" xmlns:cx5="http://schemas.microsoft.com/office/drawing/2016/5/11/chartex" xmlns:cx6="http://schemas.microsoft.com/office/drawing/2016/5/12/chartex" xmlns:cx7="http://schemas.microsoft.com/office/drawing/2016/5/13/chartex" xmlns:cx8="http://schemas.microsoft.com/office/drawing/2016/5/14/chartex" xmlns:mc="http://schemas.openxmlformats.org/markup-compatibility/2006" xmlns:aink="http://schemas.microsoft.com/office/drawing/2016/ink" xmlns:am3d="http://schemas.microsoft.com/office/drawing/2017/model3d" xmlns:o="urn:schemas-microsoft-com:office:office" xmlns:oel="http://schemas.microsoft.com/office/2019/extlst" xmlns:r="http://schemas.openxmlformats.org/officeDocument/2006/relationships" xmlns:m="http://schemas.openxmlformats.org/officeDocument/2006/math" xmlns:v="urn:schemas-microsoft-com:vml" xmlns:wp14="http://schemas.microsoft.com/office/word/2010/wordprocessingDrawing" xmlns:wp="http://schemas.openxmlformats.org/drawingml/2006/wordprocessingDrawing" xmlns:w10="urn:schemas-microsoft-com:office:word" xmlns:w="http://schemas.openxmlformats.org/wordprocessingml/2006/main" xmlns:w14="http://schemas.microsoft.com/office/word/2010/wordml" xmlns:w15="http://schemas.microsoft.com/office/word/2012/wordml" xmlns:w16cex="http://schemas.microsoft.com/office/word/2018/wordml/cex" xmlns:w16cid="http://schemas.microsoft.com/office/word/2016/wordml/cid" xmlns:w16="http://schemas.microsoft.com/office/word/2018/wordml" xmlns:w16du="http://schemas.microsoft.com/office/word/2023/wordml/word16du" xmlns:w16sdtdh="http://schemas.microsoft.com/office/word/2020/wordml/sdtdatahash" xmlns:w16sdtfl="http://schemas.microsoft.com/office/word/2024/wordml/sdtformatlock" xmlns:w16se="http://schemas.microsoft.com/office/word/2015/wordml/symex" xmlns:wpg="http://schemas.microsoft.com/office/word/2010/wordprocessingGroup" xmlns:wpi="http://schemas.microsoft.com/office/word/2010/wordprocessingInk" xmlns:wne="http://schemas.microsoft.com/office/word/2006/wordml" xmlns:wps="http://schemas.microsoft.com/office/word/2010/wordprocessingShape" mc:Ignorable="w14 w15 w16se w16cid w16 w16cex w16sdtdh w16sdtfl w16du wp14">
+  <w:p>
+    <w:pPr>
+      <w:pStyle w:val="Piedepgina"/>
+    </w:pPr>
+  </w:p>
+</w:ftr>
+</file>
+
+<file path=word/footer2.xml><?xml version="1.0" encoding="utf-8"?>
 <w:ftr xmlns:wpc="http://schemas.microsoft.com/office/word/2010/wordprocessingCanvas" xmlns:cx="http://schemas.microsoft.com/office/drawing/2014/chartex" xmlns:cx1="http://schemas.microsoft.com/office/drawing/2015/9/8/chartex" xmlns:cx2="http://schemas.microsoft.com/office/drawing/2015/10/21/chartex" xmlns:cx3="http://schemas.microsoft.com/office/drawing/2016/5/9/chartex" xmlns:cx4="http://schemas.microsoft.com/office/drawing/2016/5/10/chartex" xmlns:cx5="http://schemas.microsoft.com/office/drawing/2016/5/11/chartex" xmlns:cx6="http://schemas.microsoft.com/office/drawing/2016/5/12/chartex" xmlns:cx7="http://schemas.microsoft.com/office/drawing/2016/5/13/chartex" xmlns:cx8="http://schemas.microsoft.com/office/drawing/2016/5/14/chartex" xmlns:mc="http://schemas.openxmlformats.org/markup-compatibility/2006" xmlns:aink="http://schemas.microsoft.com/office/drawing/2016/ink" xmlns:am3d="http://schemas.microsoft.com/office/drawing/2017/model3d" xmlns:o="urn:schemas-microsoft-com:office:office" xmlns:oel="http://schemas.microsoft.com/office/2019/extlst" xmlns:r="http://schemas.openxmlformats.org/officeDocument/2006/relationships" xmlns:m="http://schemas.openxmlformats.org/officeDocument/2006/math" xmlns:v="urn:schemas-microsoft-com:vml" xmlns:wp14="http://schemas.microsoft.com/office/word/2010/wordprocessingDrawing" xmlns:wp="http://schemas.openxmlformats.org/drawingml/2006/wordprocessingDrawing" xmlns:w10="urn:schemas-microsoft-com:office:word" xmlns:w="http://schemas.openxmlformats.org/wordprocessingml/2006/main" xmlns:w14="http://schemas.microsoft.com/office/word/2010/wordml" xmlns:w15="http://schemas.microsoft.com/office/word/2012/wordml" xmlns:w16cex="http://schemas.microsoft.com/office/word/2018/wordml/cex" xmlns:w16cid="http://schemas.microsoft.com/office/word/2016/wordml/cid" xmlns:w16="http://schemas.microsoft.com/office/word/2018/wordml" xmlns:w16du="http://schemas.microsoft.com/office/word/2023/wordml/word16du" xmlns:w16sdtdh="http://schemas.microsoft.com/office/word/2020/wordml/sdtdatahash" xmlns:w16sdtfl="http://schemas.microsoft.com/office/word/2024/wordml/sdtformatlock" xmlns:w16se="http://schemas.microsoft.com/office/word/2015/wordml/symex" xmlns:wpg="http://schemas.microsoft.com/office/word/2010/wordprocessingGroup" xmlns:wpi="http://schemas.microsoft.com/office/word/2010/wordprocessingInk" xmlns:wne="http://schemas.microsoft.com/office/word/2006/wordml" xmlns:wps="http://schemas.microsoft.com/office/word/2010/wordprocessingShape" mc:Ignorable="w14 w15 w16se w16cid w16 w16cex w16sdtdh w16sdtfl w16du wp14">
   <w:p>
     <w:pPr>
@@ -7091,7 +7428,7 @@
         </mc:Choice>
         <mc:Fallback>
           <w:pict>
-            <v:shape w14:anchorId="4181DD41" id="Graphic 18" o:spid="_x0000_s1026" style="position:absolute;margin-left:396.55pt;margin-top:633.25pt;width:186.9pt;height:.1pt;z-index:-16055296;visibility:visible;mso-wrap-style:square;mso-wrap-distance-left:0;mso-wrap-distance-top:0;mso-wrap-distance-right:0;mso-wrap-distance-bottom:0;mso-position-horizontal:absolute;mso-position-horizontal-relative:page;mso-position-vertical:absolute;mso-position-vertical-relative:page;v-text-anchor:top" coordsize="2373630,1270" o:gfxdata="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" path="m,l2373248,e" filled="f" strokecolor="#3e3e3e" strokeweight=".17778mm">
+            <v:shape w14:anchorId="6C5DF57A" id="Graphic 18" o:spid="_x0000_s1026" style="position:absolute;margin-left:396.55pt;margin-top:633.25pt;width:186.9pt;height:.1pt;z-index:-16055296;visibility:visible;mso-wrap-style:square;mso-wrap-distance-left:0;mso-wrap-distance-top:0;mso-wrap-distance-right:0;mso-wrap-distance-bottom:0;mso-position-horizontal:absolute;mso-position-horizontal-relative:page;mso-position-vertical:absolute;mso-position-vertical-relative:page;v-text-anchor:top" coordsize="2373630,1270" o:gfxdata="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" path="m,l2373248,e" filled="f" strokecolor="#3e3e3e" strokeweight=".17778mm">
               <v:path arrowok="t"/>
               <w10:wrap anchorx="page" anchory="page"/>
             </v:shape>
@@ -8534,7 +8871,17 @@
 </w:ftr>
 </file>
 
-<file path=word/footer2.xml><?xml version="1.0" encoding="utf-8"?>
+<file path=word/footer3.xml><?xml version="1.0" encoding="utf-8"?>
+<w:ftr xmlns:wpc="http://schemas.microsoft.com/office/word/2010/wordprocessingCanvas" xmlns:cx="http://schemas.microsoft.com/office/drawing/2014/chartex" xmlns:cx1="http://schemas.microsoft.com/office/drawing/2015/9/8/chartex" xmlns:cx2="http://schemas.microsoft.com/office/drawing/2015/10/21/chartex" xmlns:cx3="http://schemas.microsoft.com/office/drawing/2016/5/9/chartex" xmlns:cx4="http://schemas.microsoft.com/office/drawing/2016/5/10/chartex" xmlns:cx5="http://schemas.microsoft.com/office/drawing/2016/5/11/chartex" xmlns:cx6="http://schemas.microsoft.com/office/drawing/2016/5/12/chartex" xmlns:cx7="http://schemas.microsoft.com/office/drawing/2016/5/13/chartex" xmlns:cx8="http://schemas.microsoft.com/office/drawing/2016/5/14/chartex" xmlns:mc="http://schemas.openxmlformats.org/markup-compatibility/2006" xmlns:aink="http://schemas.microsoft.com/office/drawing/2016/ink" xmlns:am3d="http://schemas.microsoft.com/office/drawing/2017/model3d" xmlns:o="urn:schemas-microsoft-com:office:office" xmlns:oel="http://schemas.microsoft.com/office/2019/extlst" xmlns:r="http://schemas.openxmlformats.org/officeDocument/2006/relationships" xmlns:m="http://schemas.openxmlformats.org/officeDocument/2006/math" xmlns:v="urn:schemas-microsoft-com:vml" xmlns:wp14="http://schemas.microsoft.com/office/word/2010/wordprocessingDrawing" xmlns:wp="http://schemas.openxmlformats.org/drawingml/2006/wordprocessingDrawing" xmlns:w10="urn:schemas-microsoft-com:office:word" xmlns:w="http://schemas.openxmlformats.org/wordprocessingml/2006/main" xmlns:w14="http://schemas.microsoft.com/office/word/2010/wordml" xmlns:w15="http://schemas.microsoft.com/office/word/2012/wordml" xmlns:w16cex="http://schemas.microsoft.com/office/word/2018/wordml/cex" xmlns:w16cid="http://schemas.microsoft.com/office/word/2016/wordml/cid" xmlns:w16="http://schemas.microsoft.com/office/word/2018/wordml" xmlns:w16du="http://schemas.microsoft.com/office/word/2023/wordml/word16du" xmlns:w16sdtdh="http://schemas.microsoft.com/office/word/2020/wordml/sdtdatahash" xmlns:w16sdtfl="http://schemas.microsoft.com/office/word/2024/wordml/sdtformatlock" xmlns:w16se="http://schemas.microsoft.com/office/word/2015/wordml/symex" xmlns:wpg="http://schemas.microsoft.com/office/word/2010/wordprocessingGroup" xmlns:wpi="http://schemas.microsoft.com/office/word/2010/wordprocessingInk" xmlns:wne="http://schemas.microsoft.com/office/word/2006/wordml" xmlns:wps="http://schemas.microsoft.com/office/word/2010/wordprocessingShape" mc:Ignorable="w14 w15 w16se w16cid w16 w16cex w16sdtdh w16sdtfl w16du wp14">
+  <w:p>
+    <w:pPr>
+      <w:pStyle w:val="Piedepgina"/>
+    </w:pPr>
+  </w:p>
+</w:ftr>
+</file>
+
+<file path=word/footer4.xml><?xml version="1.0" encoding="utf-8"?>
 <w:ftr xmlns:wpc="http://schemas.microsoft.com/office/word/2010/wordprocessingCanvas" xmlns:cx="http://schemas.microsoft.com/office/drawing/2014/chartex" xmlns:cx1="http://schemas.microsoft.com/office/drawing/2015/9/8/chartex" xmlns:cx2="http://schemas.microsoft.com/office/drawing/2015/10/21/chartex" xmlns:cx3="http://schemas.microsoft.com/office/drawing/2016/5/9/chartex" xmlns:cx4="http://schemas.microsoft.com/office/drawing/2016/5/10/chartex" xmlns:cx5="http://schemas.microsoft.com/office/drawing/2016/5/11/chartex" xmlns:cx6="http://schemas.microsoft.com/office/drawing/2016/5/12/chartex" xmlns:cx7="http://schemas.microsoft.com/office/drawing/2016/5/13/chartex" xmlns:cx8="http://schemas.microsoft.com/office/drawing/2016/5/14/chartex" xmlns:mc="http://schemas.openxmlformats.org/markup-compatibility/2006" xmlns:aink="http://schemas.microsoft.com/office/drawing/2016/ink" xmlns:am3d="http://schemas.microsoft.com/office/drawing/2017/model3d" xmlns:o="urn:schemas-microsoft-com:office:office" xmlns:oel="http://schemas.microsoft.com/office/2019/extlst" xmlns:r="http://schemas.openxmlformats.org/officeDocument/2006/relationships" xmlns:m="http://schemas.openxmlformats.org/officeDocument/2006/math" xmlns:v="urn:schemas-microsoft-com:vml" xmlns:wp14="http://schemas.microsoft.com/office/word/2010/wordprocessingDrawing" xmlns:wp="http://schemas.openxmlformats.org/drawingml/2006/wordprocessingDrawing" xmlns:w10="urn:schemas-microsoft-com:office:word" xmlns:w="http://schemas.openxmlformats.org/wordprocessingml/2006/main" xmlns:w14="http://schemas.microsoft.com/office/word/2010/wordml" xmlns:w15="http://schemas.microsoft.com/office/word/2012/wordml" xmlns:w16cex="http://schemas.microsoft.com/office/word/2018/wordml/cex" xmlns:w16cid="http://schemas.microsoft.com/office/word/2016/wordml/cid" xmlns:w16="http://schemas.microsoft.com/office/word/2018/wordml" xmlns:w16du="http://schemas.microsoft.com/office/word/2023/wordml/word16du" xmlns:w16sdtdh="http://schemas.microsoft.com/office/word/2020/wordml/sdtdatahash" xmlns:w16sdtfl="http://schemas.microsoft.com/office/word/2024/wordml/sdtformatlock" xmlns:w16se="http://schemas.microsoft.com/office/word/2015/wordml/symex" xmlns:wpg="http://schemas.microsoft.com/office/word/2010/wordprocessingGroup" xmlns:wpi="http://schemas.microsoft.com/office/word/2010/wordprocessingInk" xmlns:wne="http://schemas.microsoft.com/office/word/2006/wordml" xmlns:wps="http://schemas.microsoft.com/office/word/2010/wordprocessingShape" mc:Ignorable="w14 w15 w16se w16cid w16 w16cex w16sdtdh w16sdtfl w16du wp14">
   <w:p>
     <w:pPr>
@@ -8668,7 +9015,7 @@
         </mc:Choice>
         <mc:Fallback>
           <w:pict>
-            <v:shape w14:anchorId="5EB7DB10" id="Graphic 45" o:spid="_x0000_s1026" style="position:absolute;margin-left:396.55pt;margin-top:633.25pt;width:186.9pt;height:.1pt;z-index:-16042496;visibility:visible;mso-wrap-style:square;mso-wrap-distance-left:0;mso-wrap-distance-top:0;mso-wrap-distance-right:0;mso-wrap-distance-bottom:0;mso-position-horizontal:absolute;mso-position-horizontal-relative:page;mso-position-vertical:absolute;mso-position-vertical-relative:page;v-text-anchor:top" coordsize="2373630,1270" o:gfxdata="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" path="m,l2373248,e" filled="f" strokecolor="#3e3e3e" strokeweight=".17778mm">
+            <v:shape w14:anchorId="71D2E424" id="Graphic 45" o:spid="_x0000_s1026" style="position:absolute;margin-left:396.55pt;margin-top:633.25pt;width:186.9pt;height:.1pt;z-index:-16042496;visibility:visible;mso-wrap-style:square;mso-wrap-distance-left:0;mso-wrap-distance-top:0;mso-wrap-distance-right:0;mso-wrap-distance-bottom:0;mso-position-horizontal:absolute;mso-position-horizontal-relative:page;mso-position-vertical:absolute;mso-position-vertical-relative:page;v-text-anchor:top" coordsize="2373630,1270" o:gfxdata="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" path="m,l2373248,e" filled="f" strokecolor="#3e3e3e" strokeweight=".17778mm">
               <v:path arrowok="t"/>
               <w10:wrap anchorx="page" anchory="page"/>
             </v:shape>
@@ -10134,6 +10481,16 @@
 <w:hdr xmlns:wpc="http://schemas.microsoft.com/office/word/2010/wordprocessingCanvas" xmlns:cx="http://schemas.microsoft.com/office/drawing/2014/chartex" xmlns:cx1="http://schemas.microsoft.com/office/drawing/2015/9/8/chartex" xmlns:cx2="http://schemas.microsoft.com/office/drawing/2015/10/21/chartex" xmlns:cx3="http://schemas.microsoft.com/office/drawing/2016/5/9/chartex" xmlns:cx4="http://schemas.microsoft.com/office/drawing/2016/5/10/chartex" xmlns:cx5="http://schemas.microsoft.com/office/drawing/2016/5/11/chartex" xmlns:cx6="http://schemas.microsoft.com/office/drawing/2016/5/12/chartex" xmlns:cx7="http://schemas.microsoft.com/office/drawing/2016/5/13/chartex" xmlns:cx8="http://schemas.microsoft.com/office/drawing/2016/5/14/chartex" xmlns:mc="http://schemas.openxmlformats.org/markup-compatibility/2006" xmlns:aink="http://schemas.microsoft.com/office/drawing/2016/ink" xmlns:am3d="http://schemas.microsoft.com/office/drawing/2017/model3d" xmlns:o="urn:schemas-microsoft-com:office:office" xmlns:oel="http://schemas.microsoft.com/office/2019/extlst" xmlns:r="http://schemas.openxmlformats.org/officeDocument/2006/relationships" xmlns:m="http://schemas.openxmlformats.org/officeDocument/2006/math" xmlns:v="urn:schemas-microsoft-com:vml" xmlns:wp14="http://schemas.microsoft.com/office/word/2010/wordprocessingDrawing" xmlns:wp="http://schemas.openxmlformats.org/drawingml/2006/wordprocessingDrawing" xmlns:w10="urn:schemas-microsoft-com:office:word" xmlns:w="http://schemas.openxmlformats.org/wordprocessingml/2006/main" xmlns:w14="http://schemas.microsoft.com/office/word/2010/wordml" xmlns:w15="http://schemas.microsoft.com/office/word/2012/wordml" xmlns:w16cex="http://schemas.microsoft.com/office/word/2018/wordml/cex" xmlns:w16cid="http://schemas.microsoft.com/office/word/2016/wordml/cid" xmlns:w16="http://schemas.microsoft.com/office/word/2018/wordml" xmlns:w16du="http://schemas.microsoft.com/office/word/2023/wordml/word16du" xmlns:w16sdtdh="http://schemas.microsoft.com/office/word/2020/wordml/sdtdatahash" xmlns:w16sdtfl="http://schemas.microsoft.com/office/word/2024/wordml/sdtformatlock" xmlns:w16se="http://schemas.microsoft.com/office/word/2015/wordml/symex" xmlns:wpg="http://schemas.microsoft.com/office/word/2010/wordprocessingGroup" xmlns:wpi="http://schemas.microsoft.com/office/word/2010/wordprocessingInk" xmlns:wne="http://schemas.microsoft.com/office/word/2006/wordml" xmlns:wps="http://schemas.microsoft.com/office/word/2010/wordprocessingShape" mc:Ignorable="w14 w15 w16se w16cid w16 w16cex w16sdtdh w16sdtfl w16du wp14">
   <w:p>
     <w:pPr>
+      <w:pStyle w:val="Encabezado"/>
+    </w:pPr>
+  </w:p>
+</w:hdr>
+</file>
+
+<file path=word/header2.xml><?xml version="1.0" encoding="utf-8"?>
+<w:hdr xmlns:wpc="http://schemas.microsoft.com/office/word/2010/wordprocessingCanvas" xmlns:cx="http://schemas.microsoft.com/office/drawing/2014/chartex" xmlns:cx1="http://schemas.microsoft.com/office/drawing/2015/9/8/chartex" xmlns:cx2="http://schemas.microsoft.com/office/drawing/2015/10/21/chartex" xmlns:cx3="http://schemas.microsoft.com/office/drawing/2016/5/9/chartex" xmlns:cx4="http://schemas.microsoft.com/office/drawing/2016/5/10/chartex" xmlns:cx5="http://schemas.microsoft.com/office/drawing/2016/5/11/chartex" xmlns:cx6="http://schemas.microsoft.com/office/drawing/2016/5/12/chartex" xmlns:cx7="http://schemas.microsoft.com/office/drawing/2016/5/13/chartex" xmlns:cx8="http://schemas.microsoft.com/office/drawing/2016/5/14/chartex" xmlns:mc="http://schemas.openxmlformats.org/markup-compatibility/2006" xmlns:aink="http://schemas.microsoft.com/office/drawing/2016/ink" xmlns:am3d="http://schemas.microsoft.com/office/drawing/2017/model3d" xmlns:o="urn:schemas-microsoft-com:office:office" xmlns:oel="http://schemas.microsoft.com/office/2019/extlst" xmlns:r="http://schemas.openxmlformats.org/officeDocument/2006/relationships" xmlns:m="http://schemas.openxmlformats.org/officeDocument/2006/math" xmlns:v="urn:schemas-microsoft-com:vml" xmlns:wp14="http://schemas.microsoft.com/office/word/2010/wordprocessingDrawing" xmlns:wp="http://schemas.openxmlformats.org/drawingml/2006/wordprocessingDrawing" xmlns:w10="urn:schemas-microsoft-com:office:word" xmlns:w="http://schemas.openxmlformats.org/wordprocessingml/2006/main" xmlns:w14="http://schemas.microsoft.com/office/word/2010/wordml" xmlns:w15="http://schemas.microsoft.com/office/word/2012/wordml" xmlns:w16cex="http://schemas.microsoft.com/office/word/2018/wordml/cex" xmlns:w16cid="http://schemas.microsoft.com/office/word/2016/wordml/cid" xmlns:w16="http://schemas.microsoft.com/office/word/2018/wordml" xmlns:w16du="http://schemas.microsoft.com/office/word/2023/wordml/word16du" xmlns:w16sdtdh="http://schemas.microsoft.com/office/word/2020/wordml/sdtdatahash" xmlns:w16sdtfl="http://schemas.microsoft.com/office/word/2024/wordml/sdtformatlock" xmlns:w16se="http://schemas.microsoft.com/office/word/2015/wordml/symex" xmlns:wpg="http://schemas.microsoft.com/office/word/2010/wordprocessingGroup" xmlns:wpi="http://schemas.microsoft.com/office/word/2010/wordprocessingInk" xmlns:wne="http://schemas.microsoft.com/office/word/2006/wordml" xmlns:wps="http://schemas.microsoft.com/office/word/2010/wordprocessingShape" mc:Ignorable="w14 w15 w16se w16cid w16 w16cex w16sdtdh w16sdtfl w16du wp14">
+  <w:p>
+    <w:pPr>
       <w:pStyle w:val="Textoindependiente"/>
       <w:spacing w:line="14" w:lineRule="auto"/>
       <w:rPr>
@@ -10150,15 +10507,15 @@
       <mc:AlternateContent>
         <mc:Choice Requires="wps">
           <w:drawing>
-            <wp:anchor distT="0" distB="0" distL="0" distR="0" simplePos="0" relativeHeight="251711488" behindDoc="1" locked="0" layoutInCell="1" allowOverlap="1" wp14:anchorId="0898095E" wp14:editId="0813129A">
+            <wp:anchor distT="0" distB="0" distL="0" distR="0" simplePos="0" relativeHeight="251711488" behindDoc="1" locked="0" layoutInCell="1" allowOverlap="1" wp14:anchorId="0898095E" wp14:editId="46718BDD">
               <wp:simplePos x="0" y="0"/>
               <wp:positionH relativeFrom="page">
-                <wp:posOffset>6350312</wp:posOffset>
+                <wp:posOffset>6353175</wp:posOffset>
               </wp:positionH>
               <wp:positionV relativeFrom="page">
-                <wp:posOffset>2070022</wp:posOffset>
+                <wp:posOffset>2066925</wp:posOffset>
               </wp:positionV>
-              <wp:extent cx="650738" cy="152400"/>
+              <wp:extent cx="650738" cy="190500"/>
               <wp:effectExtent l="0" t="0" r="0" b="0"/>
               <wp:wrapNone/>
               <wp:docPr id="14" name="Textbox 14"/>
@@ -10174,7 +10531,7 @@
                     <wps:spPr>
                       <a:xfrm>
                         <a:off x="0" y="0"/>
-                        <a:ext cx="650738" cy="152400"/>
+                        <a:ext cx="650738" cy="190500"/>
                       </a:xfrm>
                       <a:prstGeom prst="rect">
                         <a:avLst/>
@@ -10225,6 +10582,9 @@
               <wp14:sizeRelH relativeFrom="margin">
                 <wp14:pctWidth>0</wp14:pctWidth>
               </wp14:sizeRelH>
+              <wp14:sizeRelV relativeFrom="margin">
+                <wp14:pctHeight>0</wp14:pctHeight>
+              </wp14:sizeRelV>
             </wp:anchor>
           </w:drawing>
         </mc:Choice>
@@ -10234,7 +10594,7 @@
               <v:stroke joinstyle="miter"/>
               <v:path gradientshapeok="t" o:connecttype="rect"/>
             </v:shapetype>
-            <v:shape id="Textbox 14" o:spid="_x0000_s1026" type="#_x0000_t202" style="position:absolute;margin-left:500pt;margin-top:163pt;width:51.25pt;height:12pt;z-index:-251604992;visibility:visible;mso-wrap-style:square;mso-width-percent:0;mso-wrap-distance-left:0;mso-wrap-distance-top:0;mso-wrap-distance-right:0;mso-wrap-distance-bottom:0;mso-position-horizontal:absolute;mso-position-horizontal-relative:page;mso-position-vertical:absolute;mso-position-vertical-relative:page;mso-width-percent:0;mso-width-relative:margin;v-text-anchor:top" o:gfxdata="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" filled="f" stroked="f">
+            <v:shape id="Textbox 14" o:spid="_x0000_s1026" type="#_x0000_t202" style="position:absolute;margin-left:500.25pt;margin-top:162.75pt;width:51.25pt;height:15pt;z-index:-251604992;visibility:visible;mso-wrap-style:square;mso-width-percent:0;mso-height-percent:0;mso-wrap-distance-left:0;mso-wrap-distance-top:0;mso-wrap-distance-right:0;mso-wrap-distance-bottom:0;mso-position-horizontal:absolute;mso-position-horizontal-relative:page;mso-position-vertical:absolute;mso-position-vertical-relative:page;mso-width-percent:0;mso-height-percent:0;mso-width-relative:margin;mso-height-relative:margin;v-text-anchor:top" o:gfxdata="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" filled="f" stroked="f">
               <v:textbox inset="0,0,0,0">
                 <w:txbxContent>
                   <w:p>
@@ -10434,6 +10794,7 @@
                             </w:rPr>
                             <w:t>{</w:t>
                           </w:r>
+                          <w:proofErr w:type="spellStart"/>
                           <w:r>
                             <w:rPr>
                               <w:spacing w:val="-2"/>
@@ -10448,7 +10809,16 @@
                               <w:position w:val="1"/>
                               <w:sz w:val="18"/>
                             </w:rPr>
-                            <w:t>_val}</w:t>
+                            <w:t>_val</w:t>
+                          </w:r>
+                          <w:proofErr w:type="spellEnd"/>
+                          <w:r>
+                            <w:rPr>
+                              <w:spacing w:val="-2"/>
+                              <w:position w:val="1"/>
+                              <w:sz w:val="18"/>
+                            </w:rPr>
+                            <w:t>}</w:t>
                           </w:r>
                         </w:p>
                       </w:txbxContent>
@@ -10486,6 +10856,7 @@
                       </w:rPr>
                       <w:t>{</w:t>
                     </w:r>
+                    <w:proofErr w:type="spellStart"/>
                     <w:r>
                       <w:rPr>
                         <w:spacing w:val="-2"/>
@@ -10500,7 +10871,16 @@
                         <w:position w:val="1"/>
                         <w:sz w:val="18"/>
                       </w:rPr>
-                      <w:t>_val}</w:t>
+                      <w:t>_val</w:t>
+                    </w:r>
+                    <w:proofErr w:type="spellEnd"/>
+                    <w:r>
+                      <w:rPr>
+                        <w:spacing w:val="-2"/>
+                        <w:position w:val="1"/>
+                        <w:sz w:val="18"/>
+                      </w:rPr>
+                      <w:t>}</w:t>
                     </w:r>
                   </w:p>
                 </w:txbxContent>
@@ -10591,12 +10971,21 @@
                             </w:rPr>
                             <w:t xml:space="preserve"> </w:t>
                           </w:r>
+                          <w:proofErr w:type="spellStart"/>
                           <w:r>
                             <w:rPr>
                               <w:b/>
                               <w:sz w:val="18"/>
                             </w:rPr>
-                            <w:t>Validacion:</w:t>
+                            <w:t>Validacion</w:t>
+                          </w:r>
+                          <w:proofErr w:type="spellEnd"/>
+                          <w:r>
+                            <w:rPr>
+                              <w:b/>
+                              <w:sz w:val="18"/>
+                            </w:rPr>
+                            <w:t>:</w:t>
                           </w:r>
                           <w:r>
                             <w:rPr>
@@ -10612,7 +11001,25 @@
                               <w:position w:val="1"/>
                               <w:sz w:val="18"/>
                             </w:rPr>
-                            <w:t>{fecha_val}</w:t>
+                            <w:t>{</w:t>
+                          </w:r>
+                          <w:proofErr w:type="spellStart"/>
+                          <w:r>
+                            <w:rPr>
+                              <w:spacing w:val="-2"/>
+                              <w:position w:val="1"/>
+                              <w:sz w:val="18"/>
+                            </w:rPr>
+                            <w:t>fecha_val</w:t>
+                          </w:r>
+                          <w:proofErr w:type="spellEnd"/>
+                          <w:r>
+                            <w:rPr>
+                              <w:spacing w:val="-2"/>
+                              <w:position w:val="1"/>
+                              <w:sz w:val="18"/>
+                            </w:rPr>
+                            <w:t>}</w:t>
                           </w:r>
                         </w:p>
                       </w:txbxContent>
@@ -10673,12 +11080,21 @@
                       </w:rPr>
                       <w:t xml:space="preserve"> </w:t>
                     </w:r>
+                    <w:proofErr w:type="spellStart"/>
                     <w:r>
                       <w:rPr>
                         <w:b/>
                         <w:sz w:val="18"/>
                       </w:rPr>
-                      <w:t>Validacion:</w:t>
+                      <w:t>Validacion</w:t>
+                    </w:r>
+                    <w:proofErr w:type="spellEnd"/>
+                    <w:r>
+                      <w:rPr>
+                        <w:b/>
+                        <w:sz w:val="18"/>
+                      </w:rPr>
+                      <w:t>:</w:t>
                     </w:r>
                     <w:r>
                       <w:rPr>
@@ -10694,7 +11110,25 @@
                         <w:position w:val="1"/>
                         <w:sz w:val="18"/>
                       </w:rPr>
-                      <w:t>{fecha_val}</w:t>
+                      <w:t>{</w:t>
+                    </w:r>
+                    <w:proofErr w:type="spellStart"/>
+                    <w:r>
+                      <w:rPr>
+                        <w:spacing w:val="-2"/>
+                        <w:position w:val="1"/>
+                        <w:sz w:val="18"/>
+                      </w:rPr>
+                      <w:t>fecha_val</w:t>
+                    </w:r>
+                    <w:proofErr w:type="spellEnd"/>
+                    <w:r>
+                      <w:rPr>
+                        <w:spacing w:val="-2"/>
+                        <w:position w:val="1"/>
+                        <w:sz w:val="18"/>
+                      </w:rPr>
+                      <w:t>}</w:t>
                     </w:r>
                   </w:p>
                 </w:txbxContent>
@@ -10759,7 +11193,23 @@
                               <w:spacing w:val="-2"/>
                               <w:sz w:val="18"/>
                             </w:rPr>
-                            <w:t>{hora_toma}</w:t>
+                            <w:t>{</w:t>
+                          </w:r>
+                          <w:proofErr w:type="spellStart"/>
+                          <w:r>
+                            <w:rPr>
+                              <w:spacing w:val="-2"/>
+                              <w:sz w:val="18"/>
+                            </w:rPr>
+                            <w:t>hora_toma</w:t>
+                          </w:r>
+                          <w:proofErr w:type="spellEnd"/>
+                          <w:r>
+                            <w:rPr>
+                              <w:spacing w:val="-2"/>
+                              <w:sz w:val="18"/>
+                            </w:rPr>
+                            <w:t>}</w:t>
                           </w:r>
                         </w:p>
                       </w:txbxContent>
@@ -10794,7 +11244,23 @@
                         <w:spacing w:val="-2"/>
                         <w:sz w:val="18"/>
                       </w:rPr>
-                      <w:t>{hora_toma}</w:t>
+                      <w:t>{</w:t>
+                    </w:r>
+                    <w:proofErr w:type="spellStart"/>
+                    <w:r>
+                      <w:rPr>
+                        <w:spacing w:val="-2"/>
+                        <w:sz w:val="18"/>
+                      </w:rPr>
+                      <w:t>hora_toma</w:t>
+                    </w:r>
+                    <w:proofErr w:type="spellEnd"/>
+                    <w:r>
+                      <w:rPr>
+                        <w:spacing w:val="-2"/>
+                        <w:sz w:val="18"/>
+                      </w:rPr>
+                      <w:t>}</w:t>
                     </w:r>
                   </w:p>
                 </w:txbxContent>
@@ -10814,7 +11280,7 @@
       <mc:AlternateContent>
         <mc:Choice Requires="wps">
           <w:drawing>
-            <wp:anchor distT="0" distB="0" distL="0" distR="0" simplePos="0" relativeHeight="251658240" behindDoc="1" locked="0" layoutInCell="1" allowOverlap="1" wp14:anchorId="6C53B098" wp14:editId="67B23904">
+            <wp:anchor distT="0" distB="0" distL="0" distR="0" simplePos="0" relativeHeight="251658240" behindDoc="1" locked="0" layoutInCell="1" allowOverlap="1" wp14:anchorId="6C53B098" wp14:editId="0AC9F008">
               <wp:simplePos x="0" y="0"/>
               <wp:positionH relativeFrom="page">
                 <wp:posOffset>5222739</wp:posOffset>
@@ -10904,7 +11370,23 @@
                               <w:spacing w:val="-2"/>
                               <w:sz w:val="18"/>
                             </w:rPr>
-                            <w:t>{fecha_toma}</w:t>
+                            <w:t>{</w:t>
+                          </w:r>
+                          <w:proofErr w:type="spellStart"/>
+                          <w:r>
+                            <w:rPr>
+                              <w:spacing w:val="-2"/>
+                              <w:sz w:val="18"/>
+                            </w:rPr>
+                            <w:t>fecha_toma</w:t>
+                          </w:r>
+                          <w:proofErr w:type="spellEnd"/>
+                          <w:r>
+                            <w:rPr>
+                              <w:spacing w:val="-2"/>
+                              <w:sz w:val="18"/>
+                            </w:rPr>
+                            <w:t>}</w:t>
                           </w:r>
                         </w:p>
                       </w:txbxContent>
@@ -10984,7 +11466,23 @@
                         <w:spacing w:val="-2"/>
                         <w:sz w:val="18"/>
                       </w:rPr>
-                      <w:t>{fecha_toma}</w:t>
+                      <w:t>{</w:t>
+                    </w:r>
+                    <w:proofErr w:type="spellStart"/>
+                    <w:r>
+                      <w:rPr>
+                        <w:spacing w:val="-2"/>
+                        <w:sz w:val="18"/>
+                      </w:rPr>
+                      <w:t>fecha_toma</w:t>
+                    </w:r>
+                    <w:proofErr w:type="spellEnd"/>
+                    <w:r>
+                      <w:rPr>
+                        <w:spacing w:val="-2"/>
+                        <w:sz w:val="18"/>
+                      </w:rPr>
+                      <w:t>}</w:t>
                     </w:r>
                   </w:p>
                 </w:txbxContent>
@@ -11004,7 +11502,7 @@
       <mc:AlternateContent>
         <mc:Choice Requires="wps">
           <w:drawing>
-            <wp:anchor distT="0" distB="0" distL="0" distR="0" simplePos="0" relativeHeight="251727872" behindDoc="1" locked="0" layoutInCell="1" allowOverlap="1" wp14:anchorId="4106CB45" wp14:editId="52B192C1">
+            <wp:anchor distT="0" distB="0" distL="0" distR="0" simplePos="0" relativeHeight="251727872" behindDoc="1" locked="0" layoutInCell="1" allowOverlap="1" wp14:anchorId="4106CB45" wp14:editId="14450084">
               <wp:simplePos x="0" y="0"/>
               <wp:positionH relativeFrom="page">
                 <wp:posOffset>201952</wp:posOffset>
@@ -11063,7 +11561,21 @@
                             <w:rPr>
                               <w:sz w:val="18"/>
                             </w:rPr>
-                            <w:t>{paciente_nombre_completo}</w:t>
+                            <w:t>{</w:t>
+                          </w:r>
+                          <w:proofErr w:type="spellStart"/>
+                          <w:r>
+                            <w:rPr>
+                              <w:sz w:val="18"/>
+                            </w:rPr>
+                            <w:t>paciente_nombre_completo</w:t>
+                          </w:r>
+                          <w:proofErr w:type="spellEnd"/>
+                          <w:r>
+                            <w:rPr>
+                              <w:sz w:val="18"/>
+                            </w:rPr>
+                            <w:t>}</w:t>
                           </w:r>
                         </w:p>
                       </w:txbxContent>
@@ -11112,7 +11624,21 @@
                       <w:rPr>
                         <w:sz w:val="18"/>
                       </w:rPr>
-                      <w:t>{paciente_nombre_completo}</w:t>
+                      <w:t>{</w:t>
+                    </w:r>
+                    <w:proofErr w:type="spellStart"/>
+                    <w:r>
+                      <w:rPr>
+                        <w:sz w:val="18"/>
+                      </w:rPr>
+                      <w:t>paciente_nombre_completo</w:t>
+                    </w:r>
+                    <w:proofErr w:type="spellEnd"/>
+                    <w:r>
+                      <w:rPr>
+                        <w:sz w:val="18"/>
+                      </w:rPr>
+                      <w:t>}</w:t>
                     </w:r>
                   </w:p>
                 </w:txbxContent>
@@ -12076,7 +12602,7 @@
         </mc:Choice>
         <mc:Fallback>
           <w:pict>
-            <v:group w14:anchorId="2CDF9191" id="Group 2" o:spid="_x0000_s1026" style="position:absolute;margin-left:16.9pt;margin-top:112.8pt;width:564.05pt;height:67.6pt;z-index:-251701248;mso-wrap-distance-left:0;mso-wrap-distance-right:0;mso-position-horizontal-relative:page;mso-position-vertical-relative:page" coordsize="71634,8585" o:gfxdata="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">
+            <v:group w14:anchorId="005CF779" id="Group 2" o:spid="_x0000_s1026" style="position:absolute;margin-left:16.9pt;margin-top:112.8pt;width:564.05pt;height:67.6pt;z-index:-251701248;mso-wrap-distance-left:0;mso-wrap-distance-right:0;mso-position-horizontal-relative:page;mso-position-vertical-relative:page" coordsize="71634,8585" o:gfxdata="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">
               <v:shape id="Graphic 3" o:spid="_x0000_s1027" style="position:absolute;width:71634;height:8585;visibility:visible;mso-wrap-style:square;v-text-anchor:top" coordsize="7163434,858519" o:gfxdata="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" path="m5004066,l3024136,r,7620l3024136,160020r-1524,l3022612,177800r,7620l3022612,655320r-25400,l2997212,185420r12700,l3009912,177800r,-17780l3009912,7620r-1219200,l1790712,160020r,17780l1790712,185420r,469900l660400,655320r,40640l,695960,,858520r4991112,l4991112,695960r,-40640l4991112,185420r,-7620l5004066,177800r,-17780l5004066,7620r,-7620xem7162813,7620r-1333501,l5829312,7239r-812800,l5016512,858139r355600,l5372112,858520r787400,l6159512,858139r1003301,l7162813,7620xe" fillcolor="#eae4e4" stroked="f">
                 <v:path arrowok="t"/>
               </v:shape>
@@ -12142,7 +12668,23 @@
                               <w:spacing w:val="-2"/>
                               <w:sz w:val="18"/>
                             </w:rPr>
-                            <w:t>{cliente_numero}</w:t>
+                            <w:t>{</w:t>
+                          </w:r>
+                          <w:proofErr w:type="spellStart"/>
+                          <w:r>
+                            <w:rPr>
+                              <w:spacing w:val="-2"/>
+                              <w:sz w:val="18"/>
+                            </w:rPr>
+                            <w:t>cliente_numero</w:t>
+                          </w:r>
+                          <w:proofErr w:type="spellEnd"/>
+                          <w:r>
+                            <w:rPr>
+                              <w:spacing w:val="-2"/>
+                              <w:sz w:val="18"/>
+                            </w:rPr>
+                            <w:t>}</w:t>
                           </w:r>
                         </w:p>
                         <w:p>
@@ -12176,7 +12718,23 @@
                               <w:spacing w:val="-2"/>
                               <w:sz w:val="18"/>
                             </w:rPr>
-                            <w:t>{fecha_nacimiento}</w:t>
+                            <w:t>{</w:t>
+                          </w:r>
+                          <w:proofErr w:type="spellStart"/>
+                          <w:r>
+                            <w:rPr>
+                              <w:spacing w:val="-2"/>
+                              <w:sz w:val="18"/>
+                            </w:rPr>
+                            <w:t>fecha_nacimiento</w:t>
+                          </w:r>
+                          <w:proofErr w:type="spellEnd"/>
+                          <w:r>
+                            <w:rPr>
+                              <w:spacing w:val="-2"/>
+                              <w:sz w:val="18"/>
+                            </w:rPr>
+                            <w:t>}</w:t>
                           </w:r>
                         </w:p>
                         <w:p>
@@ -12249,7 +12807,23 @@
                         <w:spacing w:val="-2"/>
                         <w:sz w:val="18"/>
                       </w:rPr>
-                      <w:t>{cliente_numero}</w:t>
+                      <w:t>{</w:t>
+                    </w:r>
+                    <w:proofErr w:type="spellStart"/>
+                    <w:r>
+                      <w:rPr>
+                        <w:spacing w:val="-2"/>
+                        <w:sz w:val="18"/>
+                      </w:rPr>
+                      <w:t>cliente_numero</w:t>
+                    </w:r>
+                    <w:proofErr w:type="spellEnd"/>
+                    <w:r>
+                      <w:rPr>
+                        <w:spacing w:val="-2"/>
+                        <w:sz w:val="18"/>
+                      </w:rPr>
+                      <w:t>}</w:t>
                     </w:r>
                   </w:p>
                   <w:p>
@@ -12283,7 +12857,23 @@
                         <w:spacing w:val="-2"/>
                         <w:sz w:val="18"/>
                       </w:rPr>
-                      <w:t>{fecha_nacimiento}</w:t>
+                      <w:t>{</w:t>
+                    </w:r>
+                    <w:proofErr w:type="spellStart"/>
+                    <w:r>
+                      <w:rPr>
+                        <w:spacing w:val="-2"/>
+                        <w:sz w:val="18"/>
+                      </w:rPr>
+                      <w:t>fecha_nacimiento</w:t>
+                    </w:r>
+                    <w:proofErr w:type="spellEnd"/>
+                    <w:r>
+                      <w:rPr>
+                        <w:spacing w:val="-2"/>
+                        <w:sz w:val="18"/>
+                      </w:rPr>
+                      <w:t>}</w:t>
                     </w:r>
                   </w:p>
                   <w:p>
@@ -12386,6 +12976,7 @@
                               <w:sz w:val="18"/>
                             </w:rPr>
                           </w:pPr>
+                          <w:proofErr w:type="spellStart"/>
                           <w:r>
                             <w:rPr>
                               <w:b/>
@@ -12394,6 +12985,7 @@
                             </w:rPr>
                             <w:t>Nº</w:t>
                           </w:r>
+                          <w:proofErr w:type="spellEnd"/>
                           <w:r>
                             <w:rPr>
                               <w:b/>
@@ -12477,13 +13069,23 @@
                               <w:sz w:val="18"/>
                             </w:rPr>
                           </w:pPr>
+                          <w:proofErr w:type="spellStart"/>
                           <w:r>
                             <w:rPr>
                               <w:b/>
                               <w:spacing w:val="-2"/>
                               <w:sz w:val="18"/>
                             </w:rPr>
-                            <w:t>Mèdico:</w:t>
+                            <w:t>Mèdico</w:t>
+                          </w:r>
+                          <w:proofErr w:type="spellEnd"/>
+                          <w:r>
+                            <w:rPr>
+                              <w:b/>
+                              <w:spacing w:val="-2"/>
+                              <w:sz w:val="18"/>
+                            </w:rPr>
+                            <w:t>:</w:t>
                           </w:r>
                         </w:p>
                       </w:txbxContent>
@@ -12511,6 +13113,7 @@
                         <w:sz w:val="18"/>
                       </w:rPr>
                     </w:pPr>
+                    <w:proofErr w:type="spellStart"/>
                     <w:r>
                       <w:rPr>
                         <w:b/>
@@ -12519,6 +13122,7 @@
                       </w:rPr>
                       <w:t>Nº</w:t>
                     </w:r>
+                    <w:proofErr w:type="spellEnd"/>
                     <w:r>
                       <w:rPr>
                         <w:b/>
@@ -12602,13 +13206,23 @@
                         <w:sz w:val="18"/>
                       </w:rPr>
                     </w:pPr>
+                    <w:proofErr w:type="spellStart"/>
                     <w:r>
                       <w:rPr>
                         <w:b/>
                         <w:spacing w:val="-2"/>
                         <w:sz w:val="18"/>
                       </w:rPr>
-                      <w:t>Mèdico:</w:t>
+                      <w:t>Mèdico</w:t>
+                    </w:r>
+                    <w:proofErr w:type="spellEnd"/>
+                    <w:r>
+                      <w:rPr>
+                        <w:b/>
+                        <w:spacing w:val="-2"/>
+                        <w:sz w:val="18"/>
+                      </w:rPr>
+                      <w:t>:</w:t>
                     </w:r>
                   </w:p>
                 </w:txbxContent>
@@ -12674,7 +13288,23 @@
                               <w:spacing w:val="-4"/>
                               <w:sz w:val="18"/>
                             </w:rPr>
-                            <w:t>{codigo_barra}</w:t>
+                            <w:t>{</w:t>
+                          </w:r>
+                          <w:proofErr w:type="spellStart"/>
+                          <w:r>
+                            <w:rPr>
+                              <w:spacing w:val="-4"/>
+                              <w:sz w:val="18"/>
+                            </w:rPr>
+                            <w:t>codigo_barra</w:t>
+                          </w:r>
+                          <w:proofErr w:type="spellEnd"/>
+                          <w:r>
+                            <w:rPr>
+                              <w:spacing w:val="-4"/>
+                              <w:sz w:val="18"/>
+                            </w:rPr>
+                            <w:t>}</w:t>
                           </w:r>
                         </w:p>
                       </w:txbxContent>
@@ -12707,7 +13337,23 @@
                         <w:spacing w:val="-4"/>
                         <w:sz w:val="18"/>
                       </w:rPr>
-                      <w:t>{codigo_barra}</w:t>
+                      <w:t>{</w:t>
+                    </w:r>
+                    <w:proofErr w:type="spellStart"/>
+                    <w:r>
+                      <w:rPr>
+                        <w:spacing w:val="-4"/>
+                        <w:sz w:val="18"/>
+                      </w:rPr>
+                      <w:t>codigo_barra</w:t>
+                    </w:r>
+                    <w:proofErr w:type="spellEnd"/>
+                    <w:r>
+                      <w:rPr>
+                        <w:spacing w:val="-4"/>
+                        <w:sz w:val="18"/>
+                      </w:rPr>
+                      <w:t>}</w:t>
                     </w:r>
                   </w:p>
                 </w:txbxContent>
@@ -12924,7 +13570,17 @@
 </w:hdr>
 </file>
 
-<file path=word/header2.xml><?xml version="1.0" encoding="utf-8"?>
+<file path=word/header3.xml><?xml version="1.0" encoding="utf-8"?>
+<w:hdr xmlns:wpc="http://schemas.microsoft.com/office/word/2010/wordprocessingCanvas" xmlns:cx="http://schemas.microsoft.com/office/drawing/2014/chartex" xmlns:cx1="http://schemas.microsoft.com/office/drawing/2015/9/8/chartex" xmlns:cx2="http://schemas.microsoft.com/office/drawing/2015/10/21/chartex" xmlns:cx3="http://schemas.microsoft.com/office/drawing/2016/5/9/chartex" xmlns:cx4="http://schemas.microsoft.com/office/drawing/2016/5/10/chartex" xmlns:cx5="http://schemas.microsoft.com/office/drawing/2016/5/11/chartex" xmlns:cx6="http://schemas.microsoft.com/office/drawing/2016/5/12/chartex" xmlns:cx7="http://schemas.microsoft.com/office/drawing/2016/5/13/chartex" xmlns:cx8="http://schemas.microsoft.com/office/drawing/2016/5/14/chartex" xmlns:mc="http://schemas.openxmlformats.org/markup-compatibility/2006" xmlns:aink="http://schemas.microsoft.com/office/drawing/2016/ink" xmlns:am3d="http://schemas.microsoft.com/office/drawing/2017/model3d" xmlns:o="urn:schemas-microsoft-com:office:office" xmlns:oel="http://schemas.microsoft.com/office/2019/extlst" xmlns:r="http://schemas.openxmlformats.org/officeDocument/2006/relationships" xmlns:m="http://schemas.openxmlformats.org/officeDocument/2006/math" xmlns:v="urn:schemas-microsoft-com:vml" xmlns:wp14="http://schemas.microsoft.com/office/word/2010/wordprocessingDrawing" xmlns:wp="http://schemas.openxmlformats.org/drawingml/2006/wordprocessingDrawing" xmlns:w10="urn:schemas-microsoft-com:office:word" xmlns:w="http://schemas.openxmlformats.org/wordprocessingml/2006/main" xmlns:w14="http://schemas.microsoft.com/office/word/2010/wordml" xmlns:w15="http://schemas.microsoft.com/office/word/2012/wordml" xmlns:w16cex="http://schemas.microsoft.com/office/word/2018/wordml/cex" xmlns:w16cid="http://schemas.microsoft.com/office/word/2016/wordml/cid" xmlns:w16="http://schemas.microsoft.com/office/word/2018/wordml" xmlns:w16du="http://schemas.microsoft.com/office/word/2023/wordml/word16du" xmlns:w16sdtdh="http://schemas.microsoft.com/office/word/2020/wordml/sdtdatahash" xmlns:w16sdtfl="http://schemas.microsoft.com/office/word/2024/wordml/sdtformatlock" xmlns:w16se="http://schemas.microsoft.com/office/word/2015/wordml/symex" xmlns:wpg="http://schemas.microsoft.com/office/word/2010/wordprocessingGroup" xmlns:wpi="http://schemas.microsoft.com/office/word/2010/wordprocessingInk" xmlns:wne="http://schemas.microsoft.com/office/word/2006/wordml" xmlns:wps="http://schemas.microsoft.com/office/word/2010/wordprocessingShape" mc:Ignorable="w14 w15 w16se w16cid w16 w16cex w16sdtdh w16sdtfl w16du wp14">
+  <w:p>
+    <w:pPr>
+      <w:pStyle w:val="Encabezado"/>
+    </w:pPr>
+  </w:p>
+</w:hdr>
+</file>
+
+<file path=word/header4.xml><?xml version="1.0" encoding="utf-8"?>
 <w:hdr xmlns:wpc="http://schemas.microsoft.com/office/word/2010/wordprocessingCanvas" xmlns:cx="http://schemas.microsoft.com/office/drawing/2014/chartex" xmlns:cx1="http://schemas.microsoft.com/office/drawing/2015/9/8/chartex" xmlns:cx2="http://schemas.microsoft.com/office/drawing/2015/10/21/chartex" xmlns:cx3="http://schemas.microsoft.com/office/drawing/2016/5/9/chartex" xmlns:cx4="http://schemas.microsoft.com/office/drawing/2016/5/10/chartex" xmlns:cx5="http://schemas.microsoft.com/office/drawing/2016/5/11/chartex" xmlns:cx6="http://schemas.microsoft.com/office/drawing/2016/5/12/chartex" xmlns:cx7="http://schemas.microsoft.com/office/drawing/2016/5/13/chartex" xmlns:cx8="http://schemas.microsoft.com/office/drawing/2016/5/14/chartex" xmlns:mc="http://schemas.openxmlformats.org/markup-compatibility/2006" xmlns:aink="http://schemas.microsoft.com/office/drawing/2016/ink" xmlns:am3d="http://schemas.microsoft.com/office/drawing/2017/model3d" xmlns:o="urn:schemas-microsoft-com:office:office" xmlns:oel="http://schemas.microsoft.com/office/2019/extlst" xmlns:r="http://schemas.openxmlformats.org/officeDocument/2006/relationships" xmlns:m="http://schemas.openxmlformats.org/officeDocument/2006/math" xmlns:v="urn:schemas-microsoft-com:vml" xmlns:wp14="http://schemas.microsoft.com/office/word/2010/wordprocessingDrawing" xmlns:wp="http://schemas.openxmlformats.org/drawingml/2006/wordprocessingDrawing" xmlns:w10="urn:schemas-microsoft-com:office:word" xmlns:w="http://schemas.openxmlformats.org/wordprocessingml/2006/main" xmlns:w14="http://schemas.microsoft.com/office/word/2010/wordml" xmlns:w15="http://schemas.microsoft.com/office/word/2012/wordml" xmlns:w16cex="http://schemas.microsoft.com/office/word/2018/wordml/cex" xmlns:w16cid="http://schemas.microsoft.com/office/word/2016/wordml/cid" xmlns:w16="http://schemas.microsoft.com/office/word/2018/wordml" xmlns:w16du="http://schemas.microsoft.com/office/word/2023/wordml/word16du" xmlns:w16sdtdh="http://schemas.microsoft.com/office/word/2020/wordml/sdtdatahash" xmlns:w16sdtfl="http://schemas.microsoft.com/office/word/2024/wordml/sdtformatlock" xmlns:w16se="http://schemas.microsoft.com/office/word/2015/wordml/symex" xmlns:wpg="http://schemas.microsoft.com/office/word/2010/wordprocessingGroup" xmlns:wpi="http://schemas.microsoft.com/office/word/2010/wordprocessingInk" xmlns:wne="http://schemas.microsoft.com/office/word/2006/wordml" xmlns:wps="http://schemas.microsoft.com/office/word/2010/wordprocessingShape" mc:Ignorable="w14 w15 w16se w16cid w16 w16cex w16sdtdh w16sdtfl w16du wp14">
   <w:p>
     <w:pPr>
@@ -12944,7 +13600,1200 @@
       <mc:AlternateContent>
         <mc:Choice Requires="wps">
           <w:drawing>
-            <wp:anchor distT="0" distB="0" distL="0" distR="0" simplePos="0" relativeHeight="487264256" behindDoc="1" locked="0" layoutInCell="1" allowOverlap="1" wp14:anchorId="7966B1D9" wp14:editId="73C1DA33">
+            <wp:anchor distT="0" distB="0" distL="0" distR="0" simplePos="0" relativeHeight="251720704" behindDoc="1" locked="0" layoutInCell="1" allowOverlap="1" wp14:anchorId="779C12A3" wp14:editId="4BAC4229">
+              <wp:simplePos x="0" y="0"/>
+              <wp:positionH relativeFrom="page">
+                <wp:posOffset>6353175</wp:posOffset>
+              </wp:positionH>
+              <wp:positionV relativeFrom="page">
+                <wp:posOffset>2076450</wp:posOffset>
+              </wp:positionV>
+              <wp:extent cx="647700" cy="180975"/>
+              <wp:effectExtent l="0" t="0" r="0" b="0"/>
+              <wp:wrapNone/>
+              <wp:docPr id="38" name="Textbox 38"/>
+              <wp:cNvGraphicFramePr>
+                <a:graphicFrameLocks xmlns:a="http://schemas.openxmlformats.org/drawingml/2006/main"/>
+              </wp:cNvGraphicFramePr>
+              <a:graphic xmlns:a="http://schemas.openxmlformats.org/drawingml/2006/main">
+                <a:graphicData uri="http://schemas.microsoft.com/office/word/2010/wordprocessingShape">
+                  <wps:wsp>
+                    <wps:cNvSpPr txBox="1">
+                      <a:spLocks/>
+                    </wps:cNvSpPr>
+                    <wps:spPr>
+                      <a:xfrm>
+                        <a:off x="0" y="0"/>
+                        <a:ext cx="647700" cy="180975"/>
+                      </a:xfrm>
+                      <a:prstGeom prst="rect">
+                        <a:avLst/>
+                      </a:prstGeom>
+                    </wps:spPr>
+                    <wps:txbx>
+                      <w:txbxContent>
+                        <w:p>
+                          <w:pPr>
+                            <w:spacing w:before="12"/>
+                            <w:ind w:left="20"/>
+                            <w:rPr>
+                              <w:sz w:val="18"/>
+                            </w:rPr>
+                          </w:pPr>
+                          <w:r>
+                            <w:rPr>
+                              <w:b/>
+                              <w:spacing w:val="-2"/>
+                              <w:sz w:val="18"/>
+                            </w:rPr>
+                            <w:t>Edad:</w:t>
+                          </w:r>
+                          <w:r>
+                            <w:rPr>
+                              <w:b/>
+                              <w:spacing w:val="-15"/>
+                              <w:sz w:val="18"/>
+                            </w:rPr>
+                            <w:t xml:space="preserve"> </w:t>
+                          </w:r>
+                          <w:r>
+                            <w:rPr>
+                              <w:spacing w:val="-5"/>
+                              <w:sz w:val="18"/>
+                            </w:rPr>
+                            <w:t>{edad}</w:t>
+                          </w:r>
+                        </w:p>
+                      </w:txbxContent>
+                    </wps:txbx>
+                    <wps:bodyPr wrap="square" lIns="0" tIns="0" rIns="0" bIns="0" rtlCol="0">
+                      <a:noAutofit/>
+                    </wps:bodyPr>
+                  </wps:wsp>
+                </a:graphicData>
+              </a:graphic>
+              <wp14:sizeRelH relativeFrom="margin">
+                <wp14:pctWidth>0</wp14:pctWidth>
+              </wp14:sizeRelH>
+              <wp14:sizeRelV relativeFrom="margin">
+                <wp14:pctHeight>0</wp14:pctHeight>
+              </wp14:sizeRelV>
+            </wp:anchor>
+          </w:drawing>
+        </mc:Choice>
+        <mc:Fallback>
+          <w:pict>
+            <v:shapetype w14:anchorId="779C12A3" id="_x0000_t202" coordsize="21600,21600" o:spt="202" path="m,l,21600r21600,l21600,xe">
+              <v:stroke joinstyle="miter"/>
+              <v:path gradientshapeok="t" o:connecttype="rect"/>
+            </v:shapetype>
+            <v:shape id="Textbox 38" o:spid="_x0000_s1043" type="#_x0000_t202" style="position:absolute;margin-left:500.25pt;margin-top:163.5pt;width:51pt;height:14.25pt;z-index:-251595776;visibility:visible;mso-wrap-style:square;mso-width-percent:0;mso-height-percent:0;mso-wrap-distance-left:0;mso-wrap-distance-top:0;mso-wrap-distance-right:0;mso-wrap-distance-bottom:0;mso-position-horizontal:absolute;mso-position-horizontal-relative:page;mso-position-vertical:absolute;mso-position-vertical-relative:page;mso-width-percent:0;mso-height-percent:0;mso-width-relative:margin;mso-height-relative:margin;v-text-anchor:top" o:gfxdata="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" filled="f" stroked="f">
+              <v:textbox inset="0,0,0,0">
+                <w:txbxContent>
+                  <w:p>
+                    <w:pPr>
+                      <w:spacing w:before="12"/>
+                      <w:ind w:left="20"/>
+                      <w:rPr>
+                        <w:sz w:val="18"/>
+                      </w:rPr>
+                    </w:pPr>
+                    <w:r>
+                      <w:rPr>
+                        <w:b/>
+                        <w:spacing w:val="-2"/>
+                        <w:sz w:val="18"/>
+                      </w:rPr>
+                      <w:t>Edad:</w:t>
+                    </w:r>
+                    <w:r>
+                      <w:rPr>
+                        <w:b/>
+                        <w:spacing w:val="-15"/>
+                        <w:sz w:val="18"/>
+                      </w:rPr>
+                      <w:t xml:space="preserve"> </w:t>
+                    </w:r>
+                    <w:r>
+                      <w:rPr>
+                        <w:spacing w:val="-5"/>
+                        <w:sz w:val="18"/>
+                      </w:rPr>
+                      <w:t>{edad}</w:t>
+                    </w:r>
+                  </w:p>
+                </w:txbxContent>
+              </v:textbox>
+              <w10:wrap anchorx="page" anchory="page"/>
+            </v:shape>
+          </w:pict>
+        </mc:Fallback>
+      </mc:AlternateContent>
+    </w:r>
+    <w:r>
+      <w:rPr>
+        <w:i w:val="0"/>
+        <w:noProof/>
+        <w:sz w:val="20"/>
+      </w:rPr>
+      <mc:AlternateContent>
+        <mc:Choice Requires="wps">
+          <w:drawing>
+            <wp:anchor distT="0" distB="0" distL="0" distR="0" simplePos="0" relativeHeight="251735040" behindDoc="1" locked="0" layoutInCell="1" allowOverlap="1" wp14:anchorId="729AF833" wp14:editId="4B94E5D7">
+              <wp:simplePos x="0" y="0"/>
+              <wp:positionH relativeFrom="page">
+                <wp:posOffset>5791200</wp:posOffset>
+              </wp:positionH>
+              <wp:positionV relativeFrom="page">
+                <wp:posOffset>2076450</wp:posOffset>
+              </wp:positionV>
+              <wp:extent cx="361950" cy="142875"/>
+              <wp:effectExtent l="0" t="0" r="0" b="0"/>
+              <wp:wrapNone/>
+              <wp:docPr id="41" name="Textbox 41"/>
+              <wp:cNvGraphicFramePr>
+                <a:graphicFrameLocks xmlns:a="http://schemas.openxmlformats.org/drawingml/2006/main"/>
+              </wp:cNvGraphicFramePr>
+              <a:graphic xmlns:a="http://schemas.openxmlformats.org/drawingml/2006/main">
+                <a:graphicData uri="http://schemas.microsoft.com/office/word/2010/wordprocessingShape">
+                  <wps:wsp>
+                    <wps:cNvSpPr txBox="1">
+                      <a:spLocks/>
+                    </wps:cNvSpPr>
+                    <wps:spPr>
+                      <a:xfrm>
+                        <a:off x="0" y="0"/>
+                        <a:ext cx="361950" cy="142875"/>
+                      </a:xfrm>
+                      <a:prstGeom prst="rect">
+                        <a:avLst/>
+                      </a:prstGeom>
+                    </wps:spPr>
+                    <wps:txbx>
+                      <w:txbxContent>
+                        <w:p>
+                          <w:pPr>
+                            <w:spacing w:before="12"/>
+                            <w:ind w:left="20"/>
+                            <w:rPr>
+                              <w:sz w:val="18"/>
+                            </w:rPr>
+                          </w:pPr>
+                          <w:r>
+                            <w:rPr>
+                              <w:spacing w:val="-2"/>
+                              <w:sz w:val="18"/>
+                            </w:rPr>
+                            <w:t>{sexo}</w:t>
+                          </w:r>
+                        </w:p>
+                        <w:p>
+                          <w:pPr>
+                            <w:spacing w:before="12"/>
+                            <w:ind w:left="20"/>
+                            <w:rPr>
+                              <w:sz w:val="18"/>
+                            </w:rPr>
+                          </w:pPr>
+                        </w:p>
+                      </w:txbxContent>
+                    </wps:txbx>
+                    <wps:bodyPr wrap="square" lIns="0" tIns="0" rIns="0" bIns="0" rtlCol="0">
+                      <a:noAutofit/>
+                    </wps:bodyPr>
+                  </wps:wsp>
+                </a:graphicData>
+              </a:graphic>
+              <wp14:sizeRelH relativeFrom="margin">
+                <wp14:pctWidth>0</wp14:pctWidth>
+              </wp14:sizeRelH>
+              <wp14:sizeRelV relativeFrom="margin">
+                <wp14:pctHeight>0</wp14:pctHeight>
+              </wp14:sizeRelV>
+            </wp:anchor>
+          </w:drawing>
+        </mc:Choice>
+        <mc:Fallback>
+          <w:pict>
+            <v:shape w14:anchorId="729AF833" id="Textbox 41" o:spid="_x0000_s1044" type="#_x0000_t202" style="position:absolute;margin-left:456pt;margin-top:163.5pt;width:28.5pt;height:11.25pt;z-index:-251581440;visibility:visible;mso-wrap-style:square;mso-width-percent:0;mso-height-percent:0;mso-wrap-distance-left:0;mso-wrap-distance-top:0;mso-wrap-distance-right:0;mso-wrap-distance-bottom:0;mso-position-horizontal:absolute;mso-position-horizontal-relative:page;mso-position-vertical:absolute;mso-position-vertical-relative:page;mso-width-percent:0;mso-height-percent:0;mso-width-relative:margin;mso-height-relative:margin;v-text-anchor:top" o:gfxdata="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" filled="f" stroked="f">
+              <v:textbox inset="0,0,0,0">
+                <w:txbxContent>
+                  <w:p>
+                    <w:pPr>
+                      <w:spacing w:before="12"/>
+                      <w:ind w:left="20"/>
+                      <w:rPr>
+                        <w:sz w:val="18"/>
+                      </w:rPr>
+                    </w:pPr>
+                    <w:r>
+                      <w:rPr>
+                        <w:spacing w:val="-2"/>
+                        <w:sz w:val="18"/>
+                      </w:rPr>
+                      <w:t>{sexo}</w:t>
+                    </w:r>
+                  </w:p>
+                  <w:p>
+                    <w:pPr>
+                      <w:spacing w:before="12"/>
+                      <w:ind w:left="20"/>
+                      <w:rPr>
+                        <w:sz w:val="18"/>
+                      </w:rPr>
+                    </w:pPr>
+                  </w:p>
+                </w:txbxContent>
+              </v:textbox>
+              <w10:wrap anchorx="page" anchory="page"/>
+            </v:shape>
+          </w:pict>
+        </mc:Fallback>
+      </mc:AlternateContent>
+    </w:r>
+    <w:r>
+      <w:rPr>
+        <w:i w:val="0"/>
+        <w:noProof/>
+        <w:sz w:val="20"/>
+      </w:rPr>
+      <mc:AlternateContent>
+        <mc:Choice Requires="wps">
+          <w:drawing>
+            <wp:anchor distT="0" distB="0" distL="0" distR="0" simplePos="0" relativeHeight="251708416" behindDoc="1" locked="0" layoutInCell="1" allowOverlap="1" wp14:anchorId="29E5F682" wp14:editId="6E5059AB">
+              <wp:simplePos x="0" y="0"/>
+              <wp:positionH relativeFrom="page">
+                <wp:posOffset>6867525</wp:posOffset>
+              </wp:positionH>
+              <wp:positionV relativeFrom="page">
+                <wp:posOffset>1790700</wp:posOffset>
+              </wp:positionV>
+              <wp:extent cx="533400" cy="142875"/>
+              <wp:effectExtent l="0" t="0" r="0" b="0"/>
+              <wp:wrapNone/>
+              <wp:docPr id="36" name="Textbox 36"/>
+              <wp:cNvGraphicFramePr>
+                <a:graphicFrameLocks xmlns:a="http://schemas.openxmlformats.org/drawingml/2006/main"/>
+              </wp:cNvGraphicFramePr>
+              <a:graphic xmlns:a="http://schemas.openxmlformats.org/drawingml/2006/main">
+                <a:graphicData uri="http://schemas.microsoft.com/office/word/2010/wordprocessingShape">
+                  <wps:wsp>
+                    <wps:cNvSpPr txBox="1">
+                      <a:spLocks/>
+                    </wps:cNvSpPr>
+                    <wps:spPr>
+                      <a:xfrm>
+                        <a:off x="0" y="0"/>
+                        <a:ext cx="533400" cy="142875"/>
+                      </a:xfrm>
+                      <a:prstGeom prst="rect">
+                        <a:avLst/>
+                      </a:prstGeom>
+                    </wps:spPr>
+                    <wps:txbx>
+                      <w:txbxContent>
+                        <w:p>
+                          <w:pPr>
+                            <w:spacing w:before="12"/>
+                            <w:ind w:left="20"/>
+                            <w:rPr>
+                              <w:sz w:val="18"/>
+                            </w:rPr>
+                          </w:pPr>
+                          <w:r>
+                            <w:rPr>
+                              <w:spacing w:val="-2"/>
+                              <w:position w:val="1"/>
+                              <w:sz w:val="18"/>
+                            </w:rPr>
+                            <w:t>{</w:t>
+                          </w:r>
+                          <w:proofErr w:type="spellStart"/>
+                          <w:r>
+                            <w:rPr>
+                              <w:spacing w:val="-2"/>
+                              <w:position w:val="1"/>
+                              <w:sz w:val="18"/>
+                            </w:rPr>
+                            <w:t>hora</w:t>
+                          </w:r>
+                          <w:r>
+                            <w:rPr>
+                              <w:spacing w:val="-2"/>
+                              <w:position w:val="1"/>
+                              <w:sz w:val="18"/>
+                            </w:rPr>
+                            <w:t>_val</w:t>
+                          </w:r>
+                          <w:proofErr w:type="spellEnd"/>
+                          <w:r>
+                            <w:rPr>
+                              <w:spacing w:val="-2"/>
+                              <w:position w:val="1"/>
+                              <w:sz w:val="18"/>
+                            </w:rPr>
+                            <w:t>}</w:t>
+                          </w:r>
+                        </w:p>
+                        <w:p>
+                          <w:pPr>
+                            <w:spacing w:before="12"/>
+                            <w:ind w:left="20"/>
+                            <w:rPr>
+                              <w:sz w:val="18"/>
+                            </w:rPr>
+                          </w:pPr>
+                        </w:p>
+                      </w:txbxContent>
+                    </wps:txbx>
+                    <wps:bodyPr wrap="square" lIns="0" tIns="0" rIns="0" bIns="0" rtlCol="0">
+                      <a:noAutofit/>
+                    </wps:bodyPr>
+                  </wps:wsp>
+                </a:graphicData>
+              </a:graphic>
+              <wp14:sizeRelH relativeFrom="margin">
+                <wp14:pctWidth>0</wp14:pctWidth>
+              </wp14:sizeRelH>
+              <wp14:sizeRelV relativeFrom="margin">
+                <wp14:pctHeight>0</wp14:pctHeight>
+              </wp14:sizeRelV>
+            </wp:anchor>
+          </w:drawing>
+        </mc:Choice>
+        <mc:Fallback>
+          <w:pict>
+            <v:shape w14:anchorId="29E5F682" id="Textbox 36" o:spid="_x0000_s1045" type="#_x0000_t202" style="position:absolute;margin-left:540.75pt;margin-top:141pt;width:42pt;height:11.25pt;z-index:-251608064;visibility:visible;mso-wrap-style:square;mso-width-percent:0;mso-height-percent:0;mso-wrap-distance-left:0;mso-wrap-distance-top:0;mso-wrap-distance-right:0;mso-wrap-distance-bottom:0;mso-position-horizontal:absolute;mso-position-horizontal-relative:page;mso-position-vertical:absolute;mso-position-vertical-relative:page;mso-width-percent:0;mso-height-percent:0;mso-width-relative:margin;mso-height-relative:margin;v-text-anchor:top" o:gfxdata="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" filled="f" stroked="f">
+              <v:textbox inset="0,0,0,0">
+                <w:txbxContent>
+                  <w:p>
+                    <w:pPr>
+                      <w:spacing w:before="12"/>
+                      <w:ind w:left="20"/>
+                      <w:rPr>
+                        <w:sz w:val="18"/>
+                      </w:rPr>
+                    </w:pPr>
+                    <w:r>
+                      <w:rPr>
+                        <w:spacing w:val="-2"/>
+                        <w:position w:val="1"/>
+                        <w:sz w:val="18"/>
+                      </w:rPr>
+                      <w:t>{</w:t>
+                    </w:r>
+                    <w:proofErr w:type="spellStart"/>
+                    <w:r>
+                      <w:rPr>
+                        <w:spacing w:val="-2"/>
+                        <w:position w:val="1"/>
+                        <w:sz w:val="18"/>
+                      </w:rPr>
+                      <w:t>hora</w:t>
+                    </w:r>
+                    <w:r>
+                      <w:rPr>
+                        <w:spacing w:val="-2"/>
+                        <w:position w:val="1"/>
+                        <w:sz w:val="18"/>
+                      </w:rPr>
+                      <w:t>_val</w:t>
+                    </w:r>
+                    <w:proofErr w:type="spellEnd"/>
+                    <w:r>
+                      <w:rPr>
+                        <w:spacing w:val="-2"/>
+                        <w:position w:val="1"/>
+                        <w:sz w:val="18"/>
+                      </w:rPr>
+                      <w:t>}</w:t>
+                    </w:r>
+                  </w:p>
+                  <w:p>
+                    <w:pPr>
+                      <w:spacing w:before="12"/>
+                      <w:ind w:left="20"/>
+                      <w:rPr>
+                        <w:sz w:val="18"/>
+                      </w:rPr>
+                    </w:pPr>
+                  </w:p>
+                </w:txbxContent>
+              </v:textbox>
+              <w10:wrap anchorx="page" anchory="page"/>
+            </v:shape>
+          </w:pict>
+        </mc:Fallback>
+      </mc:AlternateContent>
+    </w:r>
+    <w:r>
+      <w:rPr>
+        <w:i w:val="0"/>
+        <w:noProof/>
+        <w:sz w:val="20"/>
+      </w:rPr>
+      <mc:AlternateContent>
+        <mc:Choice Requires="wps">
+          <w:drawing>
+            <wp:anchor distT="0" distB="0" distL="0" distR="0" simplePos="0" relativeHeight="251700224" behindDoc="1" locked="0" layoutInCell="1" allowOverlap="1" wp14:anchorId="10820FBA" wp14:editId="4BE90537">
+              <wp:simplePos x="0" y="0"/>
+              <wp:positionH relativeFrom="page">
+                <wp:posOffset>5229225</wp:posOffset>
+              </wp:positionH>
+              <wp:positionV relativeFrom="page">
+                <wp:posOffset>1790700</wp:posOffset>
+              </wp:positionV>
+              <wp:extent cx="1619250" cy="171450"/>
+              <wp:effectExtent l="0" t="0" r="0" b="0"/>
+              <wp:wrapNone/>
+              <wp:docPr id="35" name="Textbox 35"/>
+              <wp:cNvGraphicFramePr>
+                <a:graphicFrameLocks xmlns:a="http://schemas.openxmlformats.org/drawingml/2006/main"/>
+              </wp:cNvGraphicFramePr>
+              <a:graphic xmlns:a="http://schemas.openxmlformats.org/drawingml/2006/main">
+                <a:graphicData uri="http://schemas.microsoft.com/office/word/2010/wordprocessingShape">
+                  <wps:wsp>
+                    <wps:cNvSpPr txBox="1">
+                      <a:spLocks/>
+                    </wps:cNvSpPr>
+                    <wps:spPr>
+                      <a:xfrm>
+                        <a:off x="0" y="0"/>
+                        <a:ext cx="1619250" cy="171450"/>
+                      </a:xfrm>
+                      <a:prstGeom prst="rect">
+                        <a:avLst/>
+                      </a:prstGeom>
+                    </wps:spPr>
+                    <wps:txbx>
+                      <w:txbxContent>
+                        <w:p>
+                          <w:pPr>
+                            <w:spacing w:before="12"/>
+                            <w:ind w:left="20"/>
+                            <w:rPr>
+                              <w:position w:val="1"/>
+                              <w:sz w:val="18"/>
+                            </w:rPr>
+                          </w:pPr>
+                          <w:r>
+                            <w:rPr>
+                              <w:b/>
+                              <w:sz w:val="18"/>
+                            </w:rPr>
+                            <w:t>Fecha</w:t>
+                          </w:r>
+                          <w:r>
+                            <w:rPr>
+                              <w:b/>
+                              <w:spacing w:val="-9"/>
+                              <w:sz w:val="18"/>
+                            </w:rPr>
+                            <w:t xml:space="preserve"> </w:t>
+                          </w:r>
+                          <w:r>
+                            <w:rPr>
+                              <w:b/>
+                              <w:sz w:val="18"/>
+                            </w:rPr>
+                            <w:t>de</w:t>
+                          </w:r>
+                          <w:r>
+                            <w:rPr>
+                              <w:b/>
+                              <w:spacing w:val="-11"/>
+                              <w:sz w:val="18"/>
+                            </w:rPr>
+                            <w:t xml:space="preserve"> </w:t>
+                          </w:r>
+                          <w:proofErr w:type="spellStart"/>
+                          <w:r>
+                            <w:rPr>
+                              <w:b/>
+                              <w:sz w:val="18"/>
+                            </w:rPr>
+                            <w:t>Validacion</w:t>
+                          </w:r>
+                          <w:proofErr w:type="spellEnd"/>
+                          <w:r>
+                            <w:rPr>
+                              <w:b/>
+                              <w:sz w:val="18"/>
+                            </w:rPr>
+                            <w:t>:</w:t>
+                          </w:r>
+                          <w:r>
+                            <w:rPr>
+                              <w:b/>
+                              <w:spacing w:val="17"/>
+                              <w:sz w:val="18"/>
+                            </w:rPr>
+                            <w:t xml:space="preserve"> </w:t>
+                          </w:r>
+                          <w:r>
+                            <w:rPr>
+                              <w:spacing w:val="-2"/>
+                              <w:position w:val="1"/>
+                              <w:sz w:val="18"/>
+                            </w:rPr>
+                            <w:t>{</w:t>
+                          </w:r>
+                          <w:proofErr w:type="spellStart"/>
+                          <w:r>
+                            <w:rPr>
+                              <w:spacing w:val="-2"/>
+                              <w:position w:val="1"/>
+                              <w:sz w:val="18"/>
+                            </w:rPr>
+                            <w:t>fecha_val</w:t>
+                          </w:r>
+                          <w:proofErr w:type="spellEnd"/>
+                          <w:r>
+                            <w:rPr>
+                              <w:spacing w:val="-2"/>
+                              <w:position w:val="1"/>
+                              <w:sz w:val="18"/>
+                            </w:rPr>
+                            <w:t>}</w:t>
+                          </w:r>
+                        </w:p>
+                      </w:txbxContent>
+                    </wps:txbx>
+                    <wps:bodyPr wrap="square" lIns="0" tIns="0" rIns="0" bIns="0" rtlCol="0">
+                      <a:noAutofit/>
+                    </wps:bodyPr>
+                  </wps:wsp>
+                </a:graphicData>
+              </a:graphic>
+              <wp14:sizeRelH relativeFrom="margin">
+                <wp14:pctWidth>0</wp14:pctWidth>
+              </wp14:sizeRelH>
+              <wp14:sizeRelV relativeFrom="margin">
+                <wp14:pctHeight>0</wp14:pctHeight>
+              </wp14:sizeRelV>
+            </wp:anchor>
+          </w:drawing>
+        </mc:Choice>
+        <mc:Fallback>
+          <w:pict>
+            <v:shape w14:anchorId="10820FBA" id="Textbox 35" o:spid="_x0000_s1046" type="#_x0000_t202" style="position:absolute;margin-left:411.75pt;margin-top:141pt;width:127.5pt;height:13.5pt;z-index:-251616256;visibility:visible;mso-wrap-style:square;mso-width-percent:0;mso-height-percent:0;mso-wrap-distance-left:0;mso-wrap-distance-top:0;mso-wrap-distance-right:0;mso-wrap-distance-bottom:0;mso-position-horizontal:absolute;mso-position-horizontal-relative:page;mso-position-vertical:absolute;mso-position-vertical-relative:page;mso-width-percent:0;mso-height-percent:0;mso-width-relative:margin;mso-height-relative:margin;v-text-anchor:top" o:gfxdata="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" filled="f" stroked="f">
+              <v:textbox inset="0,0,0,0">
+                <w:txbxContent>
+                  <w:p>
+                    <w:pPr>
+                      <w:spacing w:before="12"/>
+                      <w:ind w:left="20"/>
+                      <w:rPr>
+                        <w:position w:val="1"/>
+                        <w:sz w:val="18"/>
+                      </w:rPr>
+                    </w:pPr>
+                    <w:r>
+                      <w:rPr>
+                        <w:b/>
+                        <w:sz w:val="18"/>
+                      </w:rPr>
+                      <w:t>Fecha</w:t>
+                    </w:r>
+                    <w:r>
+                      <w:rPr>
+                        <w:b/>
+                        <w:spacing w:val="-9"/>
+                        <w:sz w:val="18"/>
+                      </w:rPr>
+                      <w:t xml:space="preserve"> </w:t>
+                    </w:r>
+                    <w:r>
+                      <w:rPr>
+                        <w:b/>
+                        <w:sz w:val="18"/>
+                      </w:rPr>
+                      <w:t>de</w:t>
+                    </w:r>
+                    <w:r>
+                      <w:rPr>
+                        <w:b/>
+                        <w:spacing w:val="-11"/>
+                        <w:sz w:val="18"/>
+                      </w:rPr>
+                      <w:t xml:space="preserve"> </w:t>
+                    </w:r>
+                    <w:proofErr w:type="spellStart"/>
+                    <w:r>
+                      <w:rPr>
+                        <w:b/>
+                        <w:sz w:val="18"/>
+                      </w:rPr>
+                      <w:t>Validacion</w:t>
+                    </w:r>
+                    <w:proofErr w:type="spellEnd"/>
+                    <w:r>
+                      <w:rPr>
+                        <w:b/>
+                        <w:sz w:val="18"/>
+                      </w:rPr>
+                      <w:t>:</w:t>
+                    </w:r>
+                    <w:r>
+                      <w:rPr>
+                        <w:b/>
+                        <w:spacing w:val="17"/>
+                        <w:sz w:val="18"/>
+                      </w:rPr>
+                      <w:t xml:space="preserve"> </w:t>
+                    </w:r>
+                    <w:r>
+                      <w:rPr>
+                        <w:spacing w:val="-2"/>
+                        <w:position w:val="1"/>
+                        <w:sz w:val="18"/>
+                      </w:rPr>
+                      <w:t>{</w:t>
+                    </w:r>
+                    <w:proofErr w:type="spellStart"/>
+                    <w:r>
+                      <w:rPr>
+                        <w:spacing w:val="-2"/>
+                        <w:position w:val="1"/>
+                        <w:sz w:val="18"/>
+                      </w:rPr>
+                      <w:t>fecha_val</w:t>
+                    </w:r>
+                    <w:proofErr w:type="spellEnd"/>
+                    <w:r>
+                      <w:rPr>
+                        <w:spacing w:val="-2"/>
+                        <w:position w:val="1"/>
+                        <w:sz w:val="18"/>
+                      </w:rPr>
+                      <w:t>}</w:t>
+                    </w:r>
+                  </w:p>
+                </w:txbxContent>
+              </v:textbox>
+              <w10:wrap anchorx="page" anchory="page"/>
+            </v:shape>
+          </w:pict>
+        </mc:Fallback>
+      </mc:AlternateContent>
+    </w:r>
+    <w:r>
+      <w:rPr>
+        <w:i w:val="0"/>
+        <w:noProof/>
+        <w:sz w:val="20"/>
+      </w:rPr>
+      <mc:AlternateContent>
+        <mc:Choice Requires="wps">
+          <w:drawing>
+            <wp:anchor distT="0" distB="0" distL="0" distR="0" simplePos="0" relativeHeight="251689984" behindDoc="1" locked="0" layoutInCell="1" allowOverlap="1" wp14:anchorId="701FE6E0" wp14:editId="3397265D">
+              <wp:simplePos x="0" y="0"/>
+              <wp:positionH relativeFrom="page">
+                <wp:posOffset>6753225</wp:posOffset>
+              </wp:positionH>
+              <wp:positionV relativeFrom="page">
+                <wp:posOffset>1495425</wp:posOffset>
+              </wp:positionV>
+              <wp:extent cx="627380" cy="171450"/>
+              <wp:effectExtent l="0" t="0" r="0" b="0"/>
+              <wp:wrapNone/>
+              <wp:docPr id="34" name="Textbox 34"/>
+              <wp:cNvGraphicFramePr>
+                <a:graphicFrameLocks xmlns:a="http://schemas.openxmlformats.org/drawingml/2006/main"/>
+              </wp:cNvGraphicFramePr>
+              <a:graphic xmlns:a="http://schemas.openxmlformats.org/drawingml/2006/main">
+                <a:graphicData uri="http://schemas.microsoft.com/office/word/2010/wordprocessingShape">
+                  <wps:wsp>
+                    <wps:cNvSpPr txBox="1">
+                      <a:spLocks/>
+                    </wps:cNvSpPr>
+                    <wps:spPr>
+                      <a:xfrm>
+                        <a:off x="0" y="0"/>
+                        <a:ext cx="627380" cy="171450"/>
+                      </a:xfrm>
+                      <a:prstGeom prst="rect">
+                        <a:avLst/>
+                      </a:prstGeom>
+                    </wps:spPr>
+                    <wps:txbx>
+                      <w:txbxContent>
+                        <w:p>
+                          <w:pPr>
+                            <w:spacing w:before="12"/>
+                            <w:ind w:left="20"/>
+                            <w:rPr>
+                              <w:sz w:val="18"/>
+                            </w:rPr>
+                          </w:pPr>
+                          <w:r>
+                            <w:rPr>
+                              <w:spacing w:val="-2"/>
+                              <w:sz w:val="18"/>
+                            </w:rPr>
+                            <w:t>{</w:t>
+                          </w:r>
+                          <w:proofErr w:type="spellStart"/>
+                          <w:r>
+                            <w:rPr>
+                              <w:spacing w:val="-2"/>
+                              <w:sz w:val="18"/>
+                            </w:rPr>
+                            <w:t>hora_toma</w:t>
+                          </w:r>
+                          <w:proofErr w:type="spellEnd"/>
+                          <w:r>
+                            <w:rPr>
+                              <w:spacing w:val="-2"/>
+                              <w:sz w:val="18"/>
+                            </w:rPr>
+                            <w:t>}</w:t>
+                          </w:r>
+                        </w:p>
+                        <w:p>
+                          <w:pPr>
+                            <w:spacing w:before="12"/>
+                            <w:ind w:left="20"/>
+                            <w:rPr>
+                              <w:sz w:val="18"/>
+                            </w:rPr>
+                          </w:pPr>
+                        </w:p>
+                      </w:txbxContent>
+                    </wps:txbx>
+                    <wps:bodyPr wrap="square" lIns="0" tIns="0" rIns="0" bIns="0" rtlCol="0">
+                      <a:noAutofit/>
+                    </wps:bodyPr>
+                  </wps:wsp>
+                </a:graphicData>
+              </a:graphic>
+              <wp14:sizeRelH relativeFrom="margin">
+                <wp14:pctWidth>0</wp14:pctWidth>
+              </wp14:sizeRelH>
+              <wp14:sizeRelV relativeFrom="margin">
+                <wp14:pctHeight>0</wp14:pctHeight>
+              </wp14:sizeRelV>
+            </wp:anchor>
+          </w:drawing>
+        </mc:Choice>
+        <mc:Fallback>
+          <w:pict>
+            <v:shape w14:anchorId="701FE6E0" id="Textbox 34" o:spid="_x0000_s1047" type="#_x0000_t202" style="position:absolute;margin-left:531.75pt;margin-top:117.75pt;width:49.4pt;height:13.5pt;z-index:-251626496;visibility:visible;mso-wrap-style:square;mso-width-percent:0;mso-height-percent:0;mso-wrap-distance-left:0;mso-wrap-distance-top:0;mso-wrap-distance-right:0;mso-wrap-distance-bottom:0;mso-position-horizontal:absolute;mso-position-horizontal-relative:page;mso-position-vertical:absolute;mso-position-vertical-relative:page;mso-width-percent:0;mso-height-percent:0;mso-width-relative:margin;mso-height-relative:margin;v-text-anchor:top" o:gfxdata="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" filled="f" stroked="f">
+              <v:textbox inset="0,0,0,0">
+                <w:txbxContent>
+                  <w:p>
+                    <w:pPr>
+                      <w:spacing w:before="12"/>
+                      <w:ind w:left="20"/>
+                      <w:rPr>
+                        <w:sz w:val="18"/>
+                      </w:rPr>
+                    </w:pPr>
+                    <w:r>
+                      <w:rPr>
+                        <w:spacing w:val="-2"/>
+                        <w:sz w:val="18"/>
+                      </w:rPr>
+                      <w:t>{</w:t>
+                    </w:r>
+                    <w:proofErr w:type="spellStart"/>
+                    <w:r>
+                      <w:rPr>
+                        <w:spacing w:val="-2"/>
+                        <w:sz w:val="18"/>
+                      </w:rPr>
+                      <w:t>hora_toma</w:t>
+                    </w:r>
+                    <w:proofErr w:type="spellEnd"/>
+                    <w:r>
+                      <w:rPr>
+                        <w:spacing w:val="-2"/>
+                        <w:sz w:val="18"/>
+                      </w:rPr>
+                      <w:t>}</w:t>
+                    </w:r>
+                  </w:p>
+                  <w:p>
+                    <w:pPr>
+                      <w:spacing w:before="12"/>
+                      <w:ind w:left="20"/>
+                      <w:rPr>
+                        <w:sz w:val="18"/>
+                      </w:rPr>
+                    </w:pPr>
+                  </w:p>
+                </w:txbxContent>
+              </v:textbox>
+              <w10:wrap anchorx="page" anchory="page"/>
+            </v:shape>
+          </w:pict>
+        </mc:Fallback>
+      </mc:AlternateContent>
+    </w:r>
+    <w:r>
+      <w:rPr>
+        <w:i w:val="0"/>
+        <w:noProof/>
+        <w:sz w:val="20"/>
+      </w:rPr>
+      <mc:AlternateContent>
+        <mc:Choice Requires="wps">
+          <w:drawing>
+            <wp:anchor distT="0" distB="0" distL="0" distR="0" simplePos="0" relativeHeight="251677696" behindDoc="1" locked="0" layoutInCell="1" allowOverlap="1" wp14:anchorId="543F42DF" wp14:editId="5BB934ED">
+              <wp:simplePos x="0" y="0"/>
+              <wp:positionH relativeFrom="page">
+                <wp:posOffset>5229225</wp:posOffset>
+              </wp:positionH>
+              <wp:positionV relativeFrom="page">
+                <wp:posOffset>1495425</wp:posOffset>
+              </wp:positionV>
+              <wp:extent cx="1466850" cy="142875"/>
+              <wp:effectExtent l="0" t="0" r="0" b="0"/>
+              <wp:wrapNone/>
+              <wp:docPr id="33" name="Textbox 33"/>
+              <wp:cNvGraphicFramePr>
+                <a:graphicFrameLocks xmlns:a="http://schemas.openxmlformats.org/drawingml/2006/main"/>
+              </wp:cNvGraphicFramePr>
+              <a:graphic xmlns:a="http://schemas.openxmlformats.org/drawingml/2006/main">
+                <a:graphicData uri="http://schemas.microsoft.com/office/word/2010/wordprocessingShape">
+                  <wps:wsp>
+                    <wps:cNvSpPr txBox="1">
+                      <a:spLocks/>
+                    </wps:cNvSpPr>
+                    <wps:spPr>
+                      <a:xfrm>
+                        <a:off x="0" y="0"/>
+                        <a:ext cx="1466850" cy="142875"/>
+                      </a:xfrm>
+                      <a:prstGeom prst="rect">
+                        <a:avLst/>
+                      </a:prstGeom>
+                    </wps:spPr>
+                    <wps:txbx>
+                      <w:txbxContent>
+                        <w:p>
+                          <w:pPr>
+                            <w:spacing w:before="12"/>
+                            <w:ind w:left="20"/>
+                            <w:rPr>
+                              <w:sz w:val="18"/>
+                            </w:rPr>
+                          </w:pPr>
+                          <w:r>
+                            <w:rPr>
+                              <w:b/>
+                              <w:sz w:val="18"/>
+                            </w:rPr>
+                            <w:t>Fecha</w:t>
+                          </w:r>
+                          <w:r>
+                            <w:rPr>
+                              <w:b/>
+                              <w:spacing w:val="-12"/>
+                              <w:sz w:val="18"/>
+                            </w:rPr>
+                            <w:t xml:space="preserve"> </w:t>
+                          </w:r>
+                          <w:r>
+                            <w:rPr>
+                              <w:b/>
+                              <w:sz w:val="18"/>
+                            </w:rPr>
+                            <w:t>de</w:t>
+                          </w:r>
+                          <w:r>
+                            <w:rPr>
+                              <w:b/>
+                              <w:spacing w:val="-13"/>
+                              <w:sz w:val="18"/>
+                            </w:rPr>
+                            <w:t xml:space="preserve"> </w:t>
+                          </w:r>
+                          <w:r>
+                            <w:rPr>
+                              <w:b/>
+                              <w:sz w:val="18"/>
+                            </w:rPr>
+                            <w:t>Toma:</w:t>
+                          </w:r>
+                          <w:r>
+                            <w:rPr>
+                              <w:b/>
+                              <w:spacing w:val="-3"/>
+                              <w:sz w:val="18"/>
+                            </w:rPr>
+                            <w:t xml:space="preserve"> </w:t>
+                          </w:r>
+                          <w:r>
+                            <w:rPr>
+                              <w:spacing w:val="-2"/>
+                              <w:sz w:val="18"/>
+                            </w:rPr>
+                            <w:t>{</w:t>
+                          </w:r>
+                          <w:proofErr w:type="spellStart"/>
+                          <w:r>
+                            <w:rPr>
+                              <w:spacing w:val="-2"/>
+                              <w:sz w:val="18"/>
+                            </w:rPr>
+                            <w:t>fecha_toma</w:t>
+                          </w:r>
+                          <w:proofErr w:type="spellEnd"/>
+                          <w:r>
+                            <w:rPr>
+                              <w:spacing w:val="-2"/>
+                              <w:sz w:val="18"/>
+                            </w:rPr>
+                            <w:t>}</w:t>
+                          </w:r>
+                        </w:p>
+                      </w:txbxContent>
+                    </wps:txbx>
+                    <wps:bodyPr wrap="square" lIns="0" tIns="0" rIns="0" bIns="0" rtlCol="0">
+                      <a:noAutofit/>
+                    </wps:bodyPr>
+                  </wps:wsp>
+                </a:graphicData>
+              </a:graphic>
+              <wp14:sizeRelH relativeFrom="margin">
+                <wp14:pctWidth>0</wp14:pctWidth>
+              </wp14:sizeRelH>
+              <wp14:sizeRelV relativeFrom="margin">
+                <wp14:pctHeight>0</wp14:pctHeight>
+              </wp14:sizeRelV>
+            </wp:anchor>
+          </w:drawing>
+        </mc:Choice>
+        <mc:Fallback>
+          <w:pict>
+            <v:shape w14:anchorId="543F42DF" id="Textbox 33" o:spid="_x0000_s1048" type="#_x0000_t202" style="position:absolute;margin-left:411.75pt;margin-top:117.75pt;width:115.5pt;height:11.25pt;z-index:-251638784;visibility:visible;mso-wrap-style:square;mso-width-percent:0;mso-height-percent:0;mso-wrap-distance-left:0;mso-wrap-distance-top:0;mso-wrap-distance-right:0;mso-wrap-distance-bottom:0;mso-position-horizontal:absolute;mso-position-horizontal-relative:page;mso-position-vertical:absolute;mso-position-vertical-relative:page;mso-width-percent:0;mso-height-percent:0;mso-width-relative:margin;mso-height-relative:margin;v-text-anchor:top" o:gfxdata="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" filled="f" stroked="f">
+              <v:textbox inset="0,0,0,0">
+                <w:txbxContent>
+                  <w:p>
+                    <w:pPr>
+                      <w:spacing w:before="12"/>
+                      <w:ind w:left="20"/>
+                      <w:rPr>
+                        <w:sz w:val="18"/>
+                      </w:rPr>
+                    </w:pPr>
+                    <w:r>
+                      <w:rPr>
+                        <w:b/>
+                        <w:sz w:val="18"/>
+                      </w:rPr>
+                      <w:t>Fecha</w:t>
+                    </w:r>
+                    <w:r>
+                      <w:rPr>
+                        <w:b/>
+                        <w:spacing w:val="-12"/>
+                        <w:sz w:val="18"/>
+                      </w:rPr>
+                      <w:t xml:space="preserve"> </w:t>
+                    </w:r>
+                    <w:r>
+                      <w:rPr>
+                        <w:b/>
+                        <w:sz w:val="18"/>
+                      </w:rPr>
+                      <w:t>de</w:t>
+                    </w:r>
+                    <w:r>
+                      <w:rPr>
+                        <w:b/>
+                        <w:spacing w:val="-13"/>
+                        <w:sz w:val="18"/>
+                      </w:rPr>
+                      <w:t xml:space="preserve"> </w:t>
+                    </w:r>
+                    <w:r>
+                      <w:rPr>
+                        <w:b/>
+                        <w:sz w:val="18"/>
+                      </w:rPr>
+                      <w:t>Toma:</w:t>
+                    </w:r>
+                    <w:r>
+                      <w:rPr>
+                        <w:b/>
+                        <w:spacing w:val="-3"/>
+                        <w:sz w:val="18"/>
+                      </w:rPr>
+                      <w:t xml:space="preserve"> </w:t>
+                    </w:r>
+                    <w:r>
+                      <w:rPr>
+                        <w:spacing w:val="-2"/>
+                        <w:sz w:val="18"/>
+                      </w:rPr>
+                      <w:t>{</w:t>
+                    </w:r>
+                    <w:proofErr w:type="spellStart"/>
+                    <w:r>
+                      <w:rPr>
+                        <w:spacing w:val="-2"/>
+                        <w:sz w:val="18"/>
+                      </w:rPr>
+                      <w:t>fecha_toma</w:t>
+                    </w:r>
+                    <w:proofErr w:type="spellEnd"/>
+                    <w:r>
+                      <w:rPr>
+                        <w:spacing w:val="-2"/>
+                        <w:sz w:val="18"/>
+                      </w:rPr>
+                      <w:t>}</w:t>
+                    </w:r>
+                  </w:p>
+                </w:txbxContent>
+              </v:textbox>
+              <w10:wrap anchorx="page" anchory="page"/>
+            </v:shape>
+          </w:pict>
+        </mc:Fallback>
+      </mc:AlternateContent>
+    </w:r>
+    <w:r>
+      <w:rPr>
+        <w:i w:val="0"/>
+        <w:noProof/>
+        <w:sz w:val="20"/>
+      </w:rPr>
+      <mc:AlternateContent>
+        <mc:Choice Requires="wps">
+          <w:drawing>
+            <wp:anchor distT="0" distB="0" distL="0" distR="0" simplePos="0" relativeHeight="251751424" behindDoc="1" locked="0" layoutInCell="1" allowOverlap="1" wp14:anchorId="2F1125BB" wp14:editId="6D5612EF">
+              <wp:simplePos x="0" y="0"/>
+              <wp:positionH relativeFrom="page">
+                <wp:posOffset>866775</wp:posOffset>
+              </wp:positionH>
+              <wp:positionV relativeFrom="page">
+                <wp:posOffset>2105024</wp:posOffset>
+              </wp:positionV>
+              <wp:extent cx="4048125" cy="161925"/>
+              <wp:effectExtent l="0" t="0" r="0" b="0"/>
+              <wp:wrapNone/>
+              <wp:docPr id="43" name="Textbox 43"/>
+              <wp:cNvGraphicFramePr>
+                <a:graphicFrameLocks xmlns:a="http://schemas.openxmlformats.org/drawingml/2006/main"/>
+              </wp:cNvGraphicFramePr>
+              <a:graphic xmlns:a="http://schemas.openxmlformats.org/drawingml/2006/main">
+                <a:graphicData uri="http://schemas.microsoft.com/office/word/2010/wordprocessingShape">
+                  <wps:wsp>
+                    <wps:cNvSpPr txBox="1">
+                      <a:spLocks/>
+                    </wps:cNvSpPr>
+                    <wps:spPr>
+                      <a:xfrm>
+                        <a:off x="0" y="0"/>
+                        <a:ext cx="4048125" cy="161925"/>
+                      </a:xfrm>
+                      <a:prstGeom prst="rect">
+                        <a:avLst/>
+                      </a:prstGeom>
+                    </wps:spPr>
+                    <wps:txbx>
+                      <w:txbxContent>
+                        <w:p>
+                          <w:pPr>
+                            <w:spacing w:before="12"/>
+                            <w:ind w:left="20"/>
+                            <w:rPr>
+                              <w:sz w:val="18"/>
+                            </w:rPr>
+                          </w:pPr>
+                          <w:r>
+                            <w:rPr>
+                              <w:sz w:val="18"/>
+                            </w:rPr>
+                            <w:t>{</w:t>
+                          </w:r>
+                          <w:proofErr w:type="spellStart"/>
+                          <w:r>
+                            <w:rPr>
+                              <w:sz w:val="18"/>
+                            </w:rPr>
+                            <w:t>paciente_nombre_completo</w:t>
+                          </w:r>
+                          <w:proofErr w:type="spellEnd"/>
+                          <w:r>
+                            <w:rPr>
+                              <w:sz w:val="18"/>
+                            </w:rPr>
+                            <w:t>}</w:t>
+                          </w:r>
+                        </w:p>
+                      </w:txbxContent>
+                    </wps:txbx>
+                    <wps:bodyPr wrap="square" lIns="0" tIns="0" rIns="0" bIns="0" rtlCol="0">
+                      <a:noAutofit/>
+                    </wps:bodyPr>
+                  </wps:wsp>
+                </a:graphicData>
+              </a:graphic>
+              <wp14:sizeRelH relativeFrom="margin">
+                <wp14:pctWidth>0</wp14:pctWidth>
+              </wp14:sizeRelH>
+              <wp14:sizeRelV relativeFrom="margin">
+                <wp14:pctHeight>0</wp14:pctHeight>
+              </wp14:sizeRelV>
+            </wp:anchor>
+          </w:drawing>
+        </mc:Choice>
+        <mc:Fallback>
+          <w:pict>
+            <v:shape w14:anchorId="2F1125BB" id="Textbox 43" o:spid="_x0000_s1049" type="#_x0000_t202" style="position:absolute;margin-left:68.25pt;margin-top:165.75pt;width:318.75pt;height:12.75pt;z-index:-251565056;visibility:visible;mso-wrap-style:square;mso-width-percent:0;mso-height-percent:0;mso-wrap-distance-left:0;mso-wrap-distance-top:0;mso-wrap-distance-right:0;mso-wrap-distance-bottom:0;mso-position-horizontal:absolute;mso-position-horizontal-relative:page;mso-position-vertical:absolute;mso-position-vertical-relative:page;mso-width-percent:0;mso-height-percent:0;mso-width-relative:margin;mso-height-relative:margin;v-text-anchor:top" o:gfxdata="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" filled="f" stroked="f">
+              <v:textbox inset="0,0,0,0">
+                <w:txbxContent>
+                  <w:p>
+                    <w:pPr>
+                      <w:spacing w:before="12"/>
+                      <w:ind w:left="20"/>
+                      <w:rPr>
+                        <w:sz w:val="18"/>
+                      </w:rPr>
+                    </w:pPr>
+                    <w:r>
+                      <w:rPr>
+                        <w:sz w:val="18"/>
+                      </w:rPr>
+                      <w:t>{</w:t>
+                    </w:r>
+                    <w:proofErr w:type="spellStart"/>
+                    <w:r>
+                      <w:rPr>
+                        <w:sz w:val="18"/>
+                      </w:rPr>
+                      <w:t>paciente_nombre_completo</w:t>
+                    </w:r>
+                    <w:proofErr w:type="spellEnd"/>
+                    <w:r>
+                      <w:rPr>
+                        <w:sz w:val="18"/>
+                      </w:rPr>
+                      <w:t>}</w:t>
+                    </w:r>
+                  </w:p>
+                </w:txbxContent>
+              </v:textbox>
+              <w10:wrap anchorx="page" anchory="page"/>
+            </v:shape>
+          </w:pict>
+        </mc:Fallback>
+      </mc:AlternateContent>
+    </w:r>
+    <w:r>
+      <w:rPr>
+        <w:i w:val="0"/>
+        <w:noProof/>
+        <w:sz w:val="20"/>
+      </w:rPr>
+      <mc:AlternateContent>
+        <mc:Choice Requires="wps">
+          <w:drawing>
+            <wp:anchor distT="0" distB="0" distL="0" distR="0" simplePos="0" relativeHeight="251577344" behindDoc="1" locked="0" layoutInCell="1" allowOverlap="1" wp14:anchorId="7966B1D9" wp14:editId="73C1DA33">
               <wp:simplePos x="0" y="0"/>
               <wp:positionH relativeFrom="page">
                 <wp:posOffset>2005838</wp:posOffset>
@@ -13036,11 +14885,7 @@
         </mc:Choice>
         <mc:Fallback>
           <w:pict>
-            <v:shapetype w14:anchorId="7966B1D9" id="_x0000_t202" coordsize="21600,21600" o:spt="202" path="m,l,21600r21600,l21600,xe">
-              <v:stroke joinstyle="miter"/>
-              <v:path gradientshapeok="t" o:connecttype="rect"/>
-            </v:shapetype>
-            <v:shape id="Textbox 26" o:spid="_x0000_s1043" type="#_x0000_t202" style="position:absolute;margin-left:157.95pt;margin-top:139.95pt;width:82.15pt;height:10pt;z-index:-16052224;visibility:visible;mso-wrap-style:square;mso-wrap-distance-left:0;mso-wrap-distance-top:0;mso-wrap-distance-right:0;mso-wrap-distance-bottom:0;mso-position-horizontal:absolute;mso-position-horizontal-relative:page;mso-position-vertical:absolute;mso-position-vertical-relative:page;v-text-anchor:top" o:gfxdata="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" filled="f" stroked="f">
+            <v:shape w14:anchorId="7966B1D9" id="Textbox 26" o:spid="_x0000_s1050" type="#_x0000_t202" style="position:absolute;margin-left:157.95pt;margin-top:139.95pt;width:82.15pt;height:10pt;z-index:-251739136;visibility:visible;mso-wrap-style:square;mso-wrap-distance-left:0;mso-wrap-distance-top:0;mso-wrap-distance-right:0;mso-wrap-distance-bottom:0;mso-position-horizontal:absolute;mso-position-horizontal-relative:page;mso-position-vertical:absolute;mso-position-vertical-relative:page;v-text-anchor:top" o:gfxdata="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" filled="f" stroked="f">
               <v:textbox inset="0,0,0,0">
                 <w:txbxContent>
                   <w:p>
@@ -13105,7 +14950,7 @@
         <w:sz w:val="20"/>
       </w:rPr>
       <w:drawing>
-        <wp:anchor distT="0" distB="0" distL="0" distR="0" simplePos="0" relativeHeight="487264768" behindDoc="1" locked="0" layoutInCell="1" allowOverlap="1" wp14:anchorId="6EDCC6D8" wp14:editId="26C53119">
+        <wp:anchor distT="0" distB="0" distL="0" distR="0" simplePos="0" relativeHeight="251591680" behindDoc="1" locked="0" layoutInCell="1" allowOverlap="1" wp14:anchorId="6EDCC6D8" wp14:editId="26C53119">
           <wp:simplePos x="0" y="0"/>
           <wp:positionH relativeFrom="page">
             <wp:posOffset>108586</wp:posOffset>
@@ -13157,7 +15002,7 @@
       <mc:AlternateContent>
         <mc:Choice Requires="wps">
           <w:drawing>
-            <wp:anchor distT="0" distB="0" distL="0" distR="0" simplePos="0" relativeHeight="487265280" behindDoc="1" locked="0" layoutInCell="1" allowOverlap="1" wp14:anchorId="75F963D2" wp14:editId="7B776406">
+            <wp:anchor distT="0" distB="0" distL="0" distR="0" simplePos="0" relativeHeight="251606016" behindDoc="1" locked="0" layoutInCell="1" allowOverlap="1" wp14:anchorId="75F963D2" wp14:editId="7B776406">
               <wp:simplePos x="0" y="0"/>
               <wp:positionH relativeFrom="page">
                 <wp:posOffset>220980</wp:posOffset>
@@ -13264,7 +15109,7 @@
         </mc:Choice>
         <mc:Fallback>
           <w:pict>
-            <v:shape w14:anchorId="420026A0" id="Graphic 28" o:spid="_x0000_s1026" style="position:absolute;margin-left:17.4pt;margin-top:113.4pt;width:563.9pt;height:67pt;z-index:-16051200;visibility:visible;mso-wrap-style:square;mso-wrap-distance-left:0;mso-wrap-distance-top:0;mso-wrap-distance-right:0;mso-wrap-distance-bottom:0;mso-position-horizontal:absolute;mso-position-horizontal-relative:page;mso-position-vertical:absolute;mso-position-vertical-relative:page;v-text-anchor:top" coordsize="7161530,850900" o:gfxdata="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" path="m7161276,l5004562,,2929763,r,312420l2929763,647700r-77,-335280l2929686,,1790954,r,312420l1790954,647700,,647700,,850392r5004562,l7161276,850392r,-217932l7161276,312420,7161276,xe" fillcolor="#eae4e4" stroked="f">
+            <v:shape w14:anchorId="1CBFE6AC" id="Graphic 28" o:spid="_x0000_s1026" style="position:absolute;margin-left:17.4pt;margin-top:113.4pt;width:563.9pt;height:67pt;z-index:-251710464;visibility:visible;mso-wrap-style:square;mso-wrap-distance-left:0;mso-wrap-distance-top:0;mso-wrap-distance-right:0;mso-wrap-distance-bottom:0;mso-position-horizontal:absolute;mso-position-horizontal-relative:page;mso-position-vertical:absolute;mso-position-vertical-relative:page;v-text-anchor:top" coordsize="7161530,850900" o:gfxdata="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" path="m7161276,l5004562,,2929763,r,312420l2929763,647700r-77,-335280l2929686,,1790954,r,312420l1790954,647700,,647700,,850392r5004562,l7161276,850392r,-217932l7161276,312420,7161276,xe" fillcolor="#eae4e4" stroked="f">
               <v:path arrowok="t"/>
               <w10:wrap anchorx="page" anchory="page"/>
             </v:shape>
@@ -13281,7 +15126,7 @@
       <mc:AlternateContent>
         <mc:Choice Requires="wps">
           <w:drawing>
-            <wp:anchor distT="0" distB="0" distL="0" distR="0" simplePos="0" relativeHeight="487265792" behindDoc="1" locked="0" layoutInCell="1" allowOverlap="1" wp14:anchorId="2E453A62" wp14:editId="30DD9359">
+            <wp:anchor distT="0" distB="0" distL="0" distR="0" simplePos="0" relativeHeight="251620352" behindDoc="1" locked="0" layoutInCell="1" allowOverlap="1" wp14:anchorId="2E453A62" wp14:editId="30DD9359">
               <wp:simplePos x="0" y="0"/>
               <wp:positionH relativeFrom="page">
                 <wp:posOffset>481952</wp:posOffset>
@@ -13388,7 +15233,7 @@
         </mc:Choice>
         <mc:Fallback>
           <w:pict>
-            <v:shape w14:anchorId="396A95BB" id="Graphic 29" o:spid="_x0000_s1026" style="position:absolute;margin-left:37.95pt;margin-top:116.7pt;width:5.15pt;height:34.5pt;z-index:-16050688;visibility:visible;mso-wrap-style:square;mso-wrap-distance-left:0;mso-wrap-distance-top:0;mso-wrap-distance-right:0;mso-wrap-distance-bottom:0;mso-position-horizontal:absolute;mso-position-horizontal-relative:page;mso-position-vertical:absolute;mso-position-vertical-relative:page;v-text-anchor:top" coordsize="65405,438150" o:gfxdata="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" path="m18656,l,,,437565r18656,l18656,xem37299,l27978,r,437565l37299,437565,37299,xem65278,l55956,r,437565l65278,437565,65278,xe" fillcolor="black" stroked="f">
+            <v:shape w14:anchorId="035A6E96" id="Graphic 29" o:spid="_x0000_s1026" style="position:absolute;margin-left:37.95pt;margin-top:116.7pt;width:5.15pt;height:34.5pt;z-index:-251696128;visibility:visible;mso-wrap-style:square;mso-wrap-distance-left:0;mso-wrap-distance-top:0;mso-wrap-distance-right:0;mso-wrap-distance-bottom:0;mso-position-horizontal:absolute;mso-position-horizontal-relative:page;mso-position-vertical:absolute;mso-position-vertical-relative:page;v-text-anchor:top" coordsize="65405,438150" o:gfxdata="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" path="m18656,l,,,437565r18656,l18656,xem37299,l27978,r,437565l37299,437565,37299,xem65278,l55956,r,437565l65278,437565,65278,xe" fillcolor="black" stroked="f">
               <v:path arrowok="t"/>
               <w10:wrap anchorx="page" anchory="page"/>
             </v:shape>
@@ -13405,7 +15250,7 @@
       <mc:AlternateContent>
         <mc:Choice Requires="wps">
           <w:drawing>
-            <wp:anchor distT="0" distB="0" distL="0" distR="0" simplePos="0" relativeHeight="487266304" behindDoc="1" locked="0" layoutInCell="1" allowOverlap="1" wp14:anchorId="3F6A9DB1" wp14:editId="78305967">
+            <wp:anchor distT="0" distB="0" distL="0" distR="0" simplePos="0" relativeHeight="251634688" behindDoc="1" locked="0" layoutInCell="1" allowOverlap="1" wp14:anchorId="3F6A9DB1" wp14:editId="78305967">
               <wp:simplePos x="0" y="0"/>
               <wp:positionH relativeFrom="page">
                 <wp:posOffset>584187</wp:posOffset>
@@ -14070,7 +15915,7 @@
         </mc:Choice>
         <mc:Fallback>
           <w:pict>
-            <v:shape w14:anchorId="40ED99BB" id="Graphic 30" o:spid="_x0000_s1026" style="position:absolute;margin-left:46pt;margin-top:116.7pt;width:90.35pt;height:34.5pt;z-index:-16050176;visibility:visible;mso-wrap-style:square;mso-wrap-distance-left:0;mso-wrap-distance-top:0;mso-wrap-distance-right:0;mso-wrap-distance-bottom:0;mso-position-horizontal:absolute;mso-position-horizontal-relative:page;mso-position-vertical:absolute;mso-position-vertical-relative:page;v-text-anchor:top" coordsize="1147445,438150" o:gfxdata="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" path="m18656,l,,,437565r18656,l18656,xem56299,l46990,r,437565l56299,437565,56299,xem93624,l65646,r,437565l93624,437565,93624,xem121577,l102946,r,437565l121577,437565,121577,xem158902,l130924,r,437565l158902,437565,158902,xem177546,r-9322,l168224,437565r9322,l177546,xem233718,l205740,r,437565l233718,437565,233718,xem252374,r-9347,l243027,437565r9347,l252374,xem280352,l261696,r,437565l280352,437565,280352,xem317284,r-9309,l307975,437565r9309,l317284,xem354596,l326618,r,437565l354596,437565,354596,xem401231,l363931,r,437565l401231,437565,401231,xem429209,l410565,r,437565l429209,437565,429209,xem457200,r-9335,l447865,437565r9335,l457200,xem494461,r-9321,l485140,437565r9321,l494461,xem522439,r-9321,l513118,437565r9321,l522439,xem559752,l531774,r,437565l559752,437565,559752,xem597065,l578408,r,437565l597065,437565,597065,xem625043,r-9335,l615708,437565r9335,l625043,xem680999,l643686,r,437565l680999,437565,680999,xem699706,r-9322,l690384,437565r9322,l699706,xem746302,l718324,r,437565l746302,437565,746302,xem792962,l755662,r,437565l792962,437565,792962,xem811593,r-9322,l802271,437565r9322,l811593,xem830275,r-9335,l820940,437565r9335,l830275,xem876858,l848880,r,437565l876858,437565,876858,xem904862,l886218,r,437565l904862,437565,904862,xem932751,r-9322,l923429,437565r9322,l932751,xem960818,r-9322,l951496,437565r9322,l960818,xem998093,l979436,r,437565l998093,437565,998093,xem1044816,r-18644,l1026172,437565r18644,l1044816,xem1100505,r-27990,l1072515,437565r27990,l1100505,xem1119187,r-9322,l1109865,437565r9322,l1119187,xem1147178,r-18644,l1128534,437565r18644,l1147178,xe" fillcolor="black" stroked="f">
+            <v:shape w14:anchorId="4EFC636C" id="Graphic 30" o:spid="_x0000_s1026" style="position:absolute;margin-left:46pt;margin-top:116.7pt;width:90.35pt;height:34.5pt;z-index:-251681792;visibility:visible;mso-wrap-style:square;mso-wrap-distance-left:0;mso-wrap-distance-top:0;mso-wrap-distance-right:0;mso-wrap-distance-bottom:0;mso-position-horizontal:absolute;mso-position-horizontal-relative:page;mso-position-vertical:absolute;mso-position-vertical-relative:page;v-text-anchor:top" coordsize="1147445,438150" o:gfxdata="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" path="m18656,l,,,437565r18656,l18656,xem56299,l46990,r,437565l56299,437565,56299,xem93624,l65646,r,437565l93624,437565,93624,xem121577,l102946,r,437565l121577,437565,121577,xem158902,l130924,r,437565l158902,437565,158902,xem177546,r-9322,l168224,437565r9322,l177546,xem233718,l205740,r,437565l233718,437565,233718,xem252374,r-9347,l243027,437565r9347,l252374,xem280352,l261696,r,437565l280352,437565,280352,xem317284,r-9309,l307975,437565r9309,l317284,xem354596,l326618,r,437565l354596,437565,354596,xem401231,l363931,r,437565l401231,437565,401231,xem429209,l410565,r,437565l429209,437565,429209,xem457200,r-9335,l447865,437565r9335,l457200,xem494461,r-9321,l485140,437565r9321,l494461,xem522439,r-9321,l513118,437565r9321,l522439,xem559752,l531774,r,437565l559752,437565,559752,xem597065,l578408,r,437565l597065,437565,597065,xem625043,r-9335,l615708,437565r9335,l625043,xem680999,l643686,r,437565l680999,437565,680999,xem699706,r-9322,l690384,437565r9322,l699706,xem746302,l718324,r,437565l746302,437565,746302,xem792962,l755662,r,437565l792962,437565,792962,xem811593,r-9322,l802271,437565r9322,l811593,xem830275,r-9335,l820940,437565r9335,l830275,xem876858,l848880,r,437565l876858,437565,876858,xem904862,l886218,r,437565l904862,437565,904862,xem932751,r-9322,l923429,437565r9322,l932751,xem960818,r-9322,l951496,437565r9322,l960818,xem998093,l979436,r,437565l998093,437565,998093,xem1044816,r-18644,l1026172,437565r18644,l1044816,xem1100505,r-27990,l1072515,437565r27990,l1100505,xem1119187,r-9322,l1109865,437565r9322,l1119187,xem1147178,r-18644,l1128534,437565r18644,l1147178,xe" fillcolor="black" stroked="f">
               <v:path arrowok="t"/>
               <w10:wrap anchorx="page" anchory="page"/>
             </v:shape>
@@ -14087,7 +15932,7 @@
       <mc:AlternateContent>
         <mc:Choice Requires="wps">
           <w:drawing>
-            <wp:anchor distT="0" distB="0" distL="0" distR="0" simplePos="0" relativeHeight="487266816" behindDoc="1" locked="0" layoutInCell="1" allowOverlap="1" wp14:anchorId="71E2B6E8" wp14:editId="218FD11A">
+            <wp:anchor distT="0" distB="0" distL="0" distR="0" simplePos="0" relativeHeight="251649024" behindDoc="1" locked="0" layoutInCell="1" allowOverlap="1" wp14:anchorId="71E2B6E8" wp14:editId="218FD11A">
               <wp:simplePos x="0" y="0"/>
               <wp:positionH relativeFrom="page">
                 <wp:posOffset>1999233</wp:posOffset>
@@ -14128,6 +15973,7 @@
                               <w:sz w:val="18"/>
                             </w:rPr>
                           </w:pPr>
+                          <w:proofErr w:type="spellStart"/>
                           <w:r>
                             <w:rPr>
                               <w:b/>
@@ -14136,6 +15982,7 @@
                             </w:rPr>
                             <w:t>Nº</w:t>
                           </w:r>
+                          <w:proofErr w:type="spellEnd"/>
                           <w:r>
                             <w:rPr>
                               <w:b/>
@@ -14218,13 +16065,23 @@
                               <w:sz w:val="18"/>
                             </w:rPr>
                           </w:pPr>
+                          <w:proofErr w:type="spellStart"/>
                           <w:r>
                             <w:rPr>
                               <w:b/>
                               <w:spacing w:val="-2"/>
                               <w:sz w:val="18"/>
                             </w:rPr>
-                            <w:t>Mèdico:</w:t>
+                            <w:t>Mèdico</w:t>
+                          </w:r>
+                          <w:proofErr w:type="spellEnd"/>
+                          <w:r>
+                            <w:rPr>
+                              <w:b/>
+                              <w:spacing w:val="-2"/>
+                              <w:sz w:val="18"/>
+                            </w:rPr>
+                            <w:t>:</w:t>
                           </w:r>
                         </w:p>
                       </w:txbxContent>
@@ -14240,7 +16097,7 @@
         </mc:Choice>
         <mc:Fallback>
           <w:pict>
-            <v:shape w14:anchorId="71E2B6E8" id="Textbox 31" o:spid="_x0000_s1044" type="#_x0000_t202" style="position:absolute;margin-left:157.4pt;margin-top:113.5pt;width:84.15pt;height:49.9pt;z-index:-16049664;visibility:visible;mso-wrap-style:square;mso-wrap-distance-left:0;mso-wrap-distance-top:0;mso-wrap-distance-right:0;mso-wrap-distance-bottom:0;mso-position-horizontal:absolute;mso-position-horizontal-relative:page;mso-position-vertical:absolute;mso-position-vertical-relative:page;v-text-anchor:top" o:gfxdata="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" filled="f" stroked="f">
+            <v:shape w14:anchorId="71E2B6E8" id="Textbox 31" o:spid="_x0000_s1051" type="#_x0000_t202" style="position:absolute;margin-left:157.4pt;margin-top:113.5pt;width:84.15pt;height:49.9pt;z-index:-251667456;visibility:visible;mso-wrap-style:square;mso-wrap-distance-left:0;mso-wrap-distance-top:0;mso-wrap-distance-right:0;mso-wrap-distance-bottom:0;mso-position-horizontal:absolute;mso-position-horizontal-relative:page;mso-position-vertical:absolute;mso-position-vertical-relative:page;v-text-anchor:top" o:gfxdata="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" filled="f" stroked="f">
               <v:textbox inset="0,0,0,0">
                 <w:txbxContent>
                   <w:p>
@@ -14252,6 +16109,7 @@
                         <w:sz w:val="18"/>
                       </w:rPr>
                     </w:pPr>
+                    <w:proofErr w:type="spellStart"/>
                     <w:r>
                       <w:rPr>
                         <w:b/>
@@ -14260,6 +16118,7 @@
                       </w:rPr>
                       <w:t>Nº</w:t>
                     </w:r>
+                    <w:proofErr w:type="spellEnd"/>
                     <w:r>
                       <w:rPr>
                         <w:b/>
@@ -14342,13 +16201,23 @@
                         <w:sz w:val="18"/>
                       </w:rPr>
                     </w:pPr>
+                    <w:proofErr w:type="spellStart"/>
                     <w:r>
                       <w:rPr>
                         <w:b/>
                         <w:spacing w:val="-2"/>
                         <w:sz w:val="18"/>
                       </w:rPr>
-                      <w:t>Mèdico:</w:t>
+                      <w:t>Mèdico</w:t>
+                    </w:r>
+                    <w:proofErr w:type="spellEnd"/>
+                    <w:r>
+                      <w:rPr>
+                        <w:b/>
+                        <w:spacing w:val="-2"/>
+                        <w:sz w:val="18"/>
+                      </w:rPr>
+                      <w:t>:</w:t>
                     </w:r>
                   </w:p>
                 </w:txbxContent>
@@ -14368,7 +16237,7 @@
       <mc:AlternateContent>
         <mc:Choice Requires="wps">
           <w:drawing>
-            <wp:anchor distT="0" distB="0" distL="0" distR="0" simplePos="0" relativeHeight="487267328" behindDoc="1" locked="0" layoutInCell="1" allowOverlap="1" wp14:anchorId="25559ECD" wp14:editId="60B9D578">
+            <wp:anchor distT="0" distB="0" distL="0" distR="0" simplePos="0" relativeHeight="251663360" behindDoc="1" locked="0" layoutInCell="1" allowOverlap="1" wp14:anchorId="25559ECD" wp14:editId="61BC7436">
               <wp:simplePos x="0" y="0"/>
               <wp:positionH relativeFrom="page">
                 <wp:posOffset>3229482</wp:posOffset>
@@ -14403,7 +16272,6 @@
                         <w:p>
                           <w:pPr>
                             <w:spacing w:before="12"/>
-                            <w:ind w:left="20"/>
                             <w:rPr>
                               <w:sz w:val="18"/>
                             </w:rPr>
@@ -14413,39 +16281,40 @@
                               <w:spacing w:val="-2"/>
                               <w:sz w:val="18"/>
                             </w:rPr>
-                            <w:t>{cliente_numero}</w:t>
+                            <w:t>{</w:t>
+                          </w:r>
+                          <w:proofErr w:type="spellStart"/>
+                          <w:r>
+                            <w:rPr>
+                              <w:spacing w:val="-2"/>
+                              <w:sz w:val="18"/>
+                            </w:rPr>
+                            <w:t>cliente_numero</w:t>
+                          </w:r>
+                          <w:proofErr w:type="spellEnd"/>
+                          <w:r>
+                            <w:rPr>
+                              <w:spacing w:val="-2"/>
+                              <w:sz w:val="18"/>
+                            </w:rPr>
+                            <w:t>}</w:t>
                           </w:r>
                         </w:p>
                         <w:p>
                           <w:pPr>
-                            <w:spacing w:before="43"/>
+                            <w:spacing w:before="52"/>
                             <w:ind w:left="20"/>
-                            <w:rPr>
-                              <w:sz w:val="18"/>
-                            </w:rPr>
-                          </w:pPr>
-                          <w:r>
                             <w:rPr>
                               <w:spacing w:val="-2"/>
                               <w:sz w:val="18"/>
                             </w:rPr>
-                            <w:t>{folio}</w:t>
-                          </w:r>
-                        </w:p>
-                        <w:p>
-                          <w:pPr>
-                            <w:spacing w:before="13"/>
-                            <w:ind w:left="20"/>
-                            <w:rPr>
-                              <w:sz w:val="18"/>
-                            </w:rPr>
                           </w:pPr>
                           <w:r>
                             <w:rPr>
                               <w:spacing w:val="-2"/>
                               <w:sz w:val="18"/>
                             </w:rPr>
-                            <w:t>{fecha_nacimiento}</w:t>
+                            <w:t>{folio}</w:t>
                           </w:r>
                         </w:p>
                         <w:p>
@@ -14453,6 +16322,39 @@
                             <w:spacing w:before="53"/>
                             <w:ind w:left="20"/>
                             <w:rPr>
+                              <w:spacing w:val="-2"/>
+                              <w:sz w:val="18"/>
+                            </w:rPr>
+                          </w:pPr>
+                          <w:r>
+                            <w:rPr>
+                              <w:spacing w:val="-2"/>
+                              <w:sz w:val="18"/>
+                            </w:rPr>
+                            <w:t>{</w:t>
+                          </w:r>
+                          <w:proofErr w:type="spellStart"/>
+                          <w:r>
+                            <w:rPr>
+                              <w:spacing w:val="-2"/>
+                              <w:sz w:val="18"/>
+                            </w:rPr>
+                            <w:t>fecha_nacimiento</w:t>
+                          </w:r>
+                          <w:proofErr w:type="spellEnd"/>
+                          <w:r>
+                            <w:rPr>
+                              <w:spacing w:val="-2"/>
+                              <w:sz w:val="18"/>
+                            </w:rPr>
+                            <w:t>}</w:t>
+                          </w:r>
+                        </w:p>
+                        <w:p>
+                          <w:pPr>
+                            <w:spacing w:before="53"/>
+                            <w:ind w:left="20"/>
+                            <w:rPr>
                               <w:sz w:val="18"/>
                             </w:rPr>
                           </w:pPr>
@@ -14484,11 +16386,20 @@
                           </w:r>
                           <w:r>
                             <w:rPr>
-                              <w:spacing w:val="-2"/>
+                              <w:spacing w:val="-4"/>
                               <w:sz w:val="18"/>
                             </w:rPr>
                             <w:t>CORRESPONDA</w:t>
                           </w:r>
+                        </w:p>
+                        <w:p>
+                          <w:pPr>
+                            <w:spacing w:before="53"/>
+                            <w:ind w:left="20"/>
+                            <w:rPr>
+                              <w:sz w:val="18"/>
+                            </w:rPr>
+                          </w:pPr>
                         </w:p>
                       </w:txbxContent>
                     </wps:txbx>
@@ -14503,13 +16414,12 @@
         </mc:Choice>
         <mc:Fallback>
           <w:pict>
-            <v:shape w14:anchorId="25559ECD" id="Textbox 32" o:spid="_x0000_s1045" type="#_x0000_t202" style="position:absolute;margin-left:254.3pt;margin-top:114.95pt;width:105.4pt;height:48.45pt;z-index:-16049152;visibility:visible;mso-wrap-style:square;mso-wrap-distance-left:0;mso-wrap-distance-top:0;mso-wrap-distance-right:0;mso-wrap-distance-bottom:0;mso-position-horizontal:absolute;mso-position-horizontal-relative:page;mso-position-vertical:absolute;mso-position-vertical-relative:page;v-text-anchor:top" o:gfxdata="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" filled="f" stroked="f">
+            <v:shape w14:anchorId="25559ECD" id="Textbox 32" o:spid="_x0000_s1052" type="#_x0000_t202" style="position:absolute;margin-left:254.3pt;margin-top:114.95pt;width:105.4pt;height:48.45pt;z-index:-251653120;visibility:visible;mso-wrap-style:square;mso-wrap-distance-left:0;mso-wrap-distance-top:0;mso-wrap-distance-right:0;mso-wrap-distance-bottom:0;mso-position-horizontal:absolute;mso-position-horizontal-relative:page;mso-position-vertical:absolute;mso-position-vertical-relative:page;v-text-anchor:top" o:gfxdata="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" filled="f" stroked="f">
               <v:textbox inset="0,0,0,0">
                 <w:txbxContent>
                   <w:p>
                     <w:pPr>
                       <w:spacing w:before="12"/>
-                      <w:ind w:left="20"/>
                       <w:rPr>
                         <w:sz w:val="18"/>
                       </w:rPr>
@@ -14519,39 +16429,40 @@
                         <w:spacing w:val="-2"/>
                         <w:sz w:val="18"/>
                       </w:rPr>
-                      <w:t>{cliente_numero}</w:t>
+                      <w:t>{</w:t>
+                    </w:r>
+                    <w:proofErr w:type="spellStart"/>
+                    <w:r>
+                      <w:rPr>
+                        <w:spacing w:val="-2"/>
+                        <w:sz w:val="18"/>
+                      </w:rPr>
+                      <w:t>cliente_numero</w:t>
+                    </w:r>
+                    <w:proofErr w:type="spellEnd"/>
+                    <w:r>
+                      <w:rPr>
+                        <w:spacing w:val="-2"/>
+                        <w:sz w:val="18"/>
+                      </w:rPr>
+                      <w:t>}</w:t>
                     </w:r>
                   </w:p>
                   <w:p>
                     <w:pPr>
-                      <w:spacing w:before="43"/>
+                      <w:spacing w:before="52"/>
                       <w:ind w:left="20"/>
-                      <w:rPr>
-                        <w:sz w:val="18"/>
-                      </w:rPr>
-                    </w:pPr>
-                    <w:r>
                       <w:rPr>
                         <w:spacing w:val="-2"/>
                         <w:sz w:val="18"/>
                       </w:rPr>
-                      <w:t>{folio}</w:t>
-                    </w:r>
-                  </w:p>
-                  <w:p>
-                    <w:pPr>
-                      <w:spacing w:before="13"/>
-                      <w:ind w:left="20"/>
-                      <w:rPr>
-                        <w:sz w:val="18"/>
-                      </w:rPr>
                     </w:pPr>
                     <w:r>
                       <w:rPr>
                         <w:spacing w:val="-2"/>
                         <w:sz w:val="18"/>
                       </w:rPr>
-                      <w:t>{fecha_nacimiento}</w:t>
+                      <w:t>{folio}</w:t>
                     </w:r>
                   </w:p>
                   <w:p>
@@ -14559,6 +16470,39 @@
                       <w:spacing w:before="53"/>
                       <w:ind w:left="20"/>
                       <w:rPr>
+                        <w:spacing w:val="-2"/>
+                        <w:sz w:val="18"/>
+                      </w:rPr>
+                    </w:pPr>
+                    <w:r>
+                      <w:rPr>
+                        <w:spacing w:val="-2"/>
+                        <w:sz w:val="18"/>
+                      </w:rPr>
+                      <w:t>{</w:t>
+                    </w:r>
+                    <w:proofErr w:type="spellStart"/>
+                    <w:r>
+                      <w:rPr>
+                        <w:spacing w:val="-2"/>
+                        <w:sz w:val="18"/>
+                      </w:rPr>
+                      <w:t>fecha_nacimiento</w:t>
+                    </w:r>
+                    <w:proofErr w:type="spellEnd"/>
+                    <w:r>
+                      <w:rPr>
+                        <w:spacing w:val="-2"/>
+                        <w:sz w:val="18"/>
+                      </w:rPr>
+                      <w:t>}</w:t>
+                    </w:r>
+                  </w:p>
+                  <w:p>
+                    <w:pPr>
+                      <w:spacing w:before="53"/>
+                      <w:ind w:left="20"/>
+                      <w:rPr>
                         <w:sz w:val="18"/>
                       </w:rPr>
                     </w:pPr>
@@ -14590,11 +16534,20 @@
                     </w:r>
                     <w:r>
                       <w:rPr>
-                        <w:spacing w:val="-2"/>
+                        <w:spacing w:val="-4"/>
                         <w:sz w:val="18"/>
                       </w:rPr>
                       <w:t>CORRESPONDA</w:t>
                     </w:r>
+                  </w:p>
+                  <w:p>
+                    <w:pPr>
+                      <w:spacing w:before="53"/>
+                      <w:ind w:left="20"/>
+                      <w:rPr>
+                        <w:sz w:val="18"/>
+                      </w:rPr>
+                    </w:pPr>
                   </w:p>
                 </w:txbxContent>
               </v:textbox>
@@ -14613,579 +16566,7 @@
       <mc:AlternateContent>
         <mc:Choice Requires="wps">
           <w:drawing>
-            <wp:anchor distT="0" distB="0" distL="0" distR="0" simplePos="0" relativeHeight="487267840" behindDoc="1" locked="0" layoutInCell="1" allowOverlap="1" wp14:anchorId="543F42DF" wp14:editId="19F53C88">
-              <wp:simplePos x="0" y="0"/>
-              <wp:positionH relativeFrom="page">
-                <wp:posOffset>5226558</wp:posOffset>
-              </wp:positionH>
-              <wp:positionV relativeFrom="page">
-                <wp:posOffset>1499615</wp:posOffset>
-              </wp:positionV>
-              <wp:extent cx="1337310" cy="152400"/>
-              <wp:effectExtent l="0" t="0" r="0" b="0"/>
-              <wp:wrapNone/>
-              <wp:docPr id="33" name="Textbox 33"/>
-              <wp:cNvGraphicFramePr>
-                <a:graphicFrameLocks xmlns:a="http://schemas.openxmlformats.org/drawingml/2006/main"/>
-              </wp:cNvGraphicFramePr>
-              <a:graphic xmlns:a="http://schemas.openxmlformats.org/drawingml/2006/main">
-                <a:graphicData uri="http://schemas.microsoft.com/office/word/2010/wordprocessingShape">
-                  <wps:wsp>
-                    <wps:cNvSpPr txBox="1">
-                      <a:spLocks/>
-                    </wps:cNvSpPr>
-                    <wps:spPr>
-                      <a:xfrm>
-                        <a:off x="0" y="0"/>
-                        <a:ext cx="1337310" cy="152400"/>
-                      </a:xfrm>
-                      <a:prstGeom prst="rect">
-                        <a:avLst/>
-                      </a:prstGeom>
-                    </wps:spPr>
-                    <wps:txbx>
-                      <w:txbxContent>
-                        <w:p>
-                          <w:pPr>
-                            <w:spacing w:before="12"/>
-                            <w:ind w:left="20"/>
-                            <w:rPr>
-                              <w:sz w:val="18"/>
-                            </w:rPr>
-                          </w:pPr>
-                          <w:r>
-                            <w:rPr>
-                              <w:b/>
-                              <w:sz w:val="18"/>
-                            </w:rPr>
-                            <w:t>Fecha</w:t>
-                          </w:r>
-                          <w:r>
-                            <w:rPr>
-                              <w:b/>
-                              <w:spacing w:val="-12"/>
-                              <w:sz w:val="18"/>
-                            </w:rPr>
-                            <w:t xml:space="preserve"> </w:t>
-                          </w:r>
-                          <w:r>
-                            <w:rPr>
-                              <w:b/>
-                              <w:sz w:val="18"/>
-                            </w:rPr>
-                            <w:t>de</w:t>
-                          </w:r>
-                          <w:r>
-                            <w:rPr>
-                              <w:b/>
-                              <w:spacing w:val="-13"/>
-                              <w:sz w:val="18"/>
-                            </w:rPr>
-                            <w:t xml:space="preserve"> </w:t>
-                          </w:r>
-                          <w:r>
-                            <w:rPr>
-                              <w:b/>
-                              <w:sz w:val="18"/>
-                            </w:rPr>
-                            <w:t>Toma:</w:t>
-                          </w:r>
-                          <w:r>
-                            <w:rPr>
-                              <w:b/>
-                              <w:spacing w:val="-3"/>
-                              <w:sz w:val="18"/>
-                            </w:rPr>
-                            <w:t xml:space="preserve"> </w:t>
-                          </w:r>
-                          <w:r>
-                            <w:rPr>
-                              <w:spacing w:val="-2"/>
-                              <w:sz w:val="18"/>
-                            </w:rPr>
-                            <w:t>{fecha_toma}</w:t>
-                          </w:r>
-                        </w:p>
-                      </w:txbxContent>
-                    </wps:txbx>
-                    <wps:bodyPr wrap="square" lIns="0" tIns="0" rIns="0" bIns="0" rtlCol="0">
-                      <a:noAutofit/>
-                    </wps:bodyPr>
-                  </wps:wsp>
-                </a:graphicData>
-              </a:graphic>
-            </wp:anchor>
-          </w:drawing>
-        </mc:Choice>
-        <mc:Fallback>
-          <w:pict>
-            <v:shape w14:anchorId="543F42DF" id="Textbox 33" o:spid="_x0000_s1046" type="#_x0000_t202" style="position:absolute;margin-left:411.55pt;margin-top:118.1pt;width:105.3pt;height:12pt;z-index:-16048640;visibility:visible;mso-wrap-style:square;mso-wrap-distance-left:0;mso-wrap-distance-top:0;mso-wrap-distance-right:0;mso-wrap-distance-bottom:0;mso-position-horizontal:absolute;mso-position-horizontal-relative:page;mso-position-vertical:absolute;mso-position-vertical-relative:page;v-text-anchor:top" o:gfxdata="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" filled="f" stroked="f">
-              <v:textbox inset="0,0,0,0">
-                <w:txbxContent>
-                  <w:p>
-                    <w:pPr>
-                      <w:spacing w:before="12"/>
-                      <w:ind w:left="20"/>
-                      <w:rPr>
-                        <w:sz w:val="18"/>
-                      </w:rPr>
-                    </w:pPr>
-                    <w:r>
-                      <w:rPr>
-                        <w:b/>
-                        <w:sz w:val="18"/>
-                      </w:rPr>
-                      <w:t>Fecha</w:t>
-                    </w:r>
-                    <w:r>
-                      <w:rPr>
-                        <w:b/>
-                        <w:spacing w:val="-12"/>
-                        <w:sz w:val="18"/>
-                      </w:rPr>
-                      <w:t xml:space="preserve"> </w:t>
-                    </w:r>
-                    <w:r>
-                      <w:rPr>
-                        <w:b/>
-                        <w:sz w:val="18"/>
-                      </w:rPr>
-                      <w:t>de</w:t>
-                    </w:r>
-                    <w:r>
-                      <w:rPr>
-                        <w:b/>
-                        <w:spacing w:val="-13"/>
-                        <w:sz w:val="18"/>
-                      </w:rPr>
-                      <w:t xml:space="preserve"> </w:t>
-                    </w:r>
-                    <w:r>
-                      <w:rPr>
-                        <w:b/>
-                        <w:sz w:val="18"/>
-                      </w:rPr>
-                      <w:t>Toma:</w:t>
-                    </w:r>
-                    <w:r>
-                      <w:rPr>
-                        <w:b/>
-                        <w:spacing w:val="-3"/>
-                        <w:sz w:val="18"/>
-                      </w:rPr>
-                      <w:t xml:space="preserve"> </w:t>
-                    </w:r>
-                    <w:r>
-                      <w:rPr>
-                        <w:spacing w:val="-2"/>
-                        <w:sz w:val="18"/>
-                      </w:rPr>
-                      <w:t>{fecha_toma}</w:t>
-                    </w:r>
-                  </w:p>
-                </w:txbxContent>
-              </v:textbox>
-              <w10:wrap anchorx="page" anchory="page"/>
-            </v:shape>
-          </w:pict>
-        </mc:Fallback>
-      </mc:AlternateContent>
-    </w:r>
-    <w:r>
-      <w:rPr>
-        <w:i w:val="0"/>
-        <w:noProof/>
-        <w:sz w:val="20"/>
-      </w:rPr>
-      <mc:AlternateContent>
-        <mc:Choice Requires="wps">
-          <w:drawing>
-            <wp:anchor distT="0" distB="0" distL="0" distR="0" simplePos="0" relativeHeight="487268352" behindDoc="1" locked="0" layoutInCell="1" allowOverlap="1" wp14:anchorId="701FE6E0" wp14:editId="12E9056E">
-              <wp:simplePos x="0" y="0"/>
-              <wp:positionH relativeFrom="page">
-                <wp:posOffset>6750811</wp:posOffset>
-              </wp:positionH>
-              <wp:positionV relativeFrom="page">
-                <wp:posOffset>1499615</wp:posOffset>
-              </wp:positionV>
-              <wp:extent cx="424180" cy="152400"/>
-              <wp:effectExtent l="0" t="0" r="0" b="0"/>
-              <wp:wrapNone/>
-              <wp:docPr id="34" name="Textbox 34"/>
-              <wp:cNvGraphicFramePr>
-                <a:graphicFrameLocks xmlns:a="http://schemas.openxmlformats.org/drawingml/2006/main"/>
-              </wp:cNvGraphicFramePr>
-              <a:graphic xmlns:a="http://schemas.openxmlformats.org/drawingml/2006/main">
-                <a:graphicData uri="http://schemas.microsoft.com/office/word/2010/wordprocessingShape">
-                  <wps:wsp>
-                    <wps:cNvSpPr txBox="1">
-                      <a:spLocks/>
-                    </wps:cNvSpPr>
-                    <wps:spPr>
-                      <a:xfrm>
-                        <a:off x="0" y="0"/>
-                        <a:ext cx="424180" cy="152400"/>
-                      </a:xfrm>
-                      <a:prstGeom prst="rect">
-                        <a:avLst/>
-                      </a:prstGeom>
-                    </wps:spPr>
-                    <wps:txbx>
-                      <w:txbxContent>
-                        <w:p>
-                          <w:pPr>
-                            <w:spacing w:before="12"/>
-                            <w:ind w:left="20"/>
-                            <w:rPr>
-                              <w:sz w:val="18"/>
-                            </w:rPr>
-                          </w:pPr>
-                          <w:r>
-                            <w:rPr>
-                              <w:spacing w:val="-2"/>
-                              <w:sz w:val="18"/>
-                            </w:rPr>
-                            <w:t>{hora_toma}</w:t>
-                          </w:r>
-                        </w:p>
-                      </w:txbxContent>
-                    </wps:txbx>
-                    <wps:bodyPr wrap="square" lIns="0" tIns="0" rIns="0" bIns="0" rtlCol="0">
-                      <a:noAutofit/>
-                    </wps:bodyPr>
-                  </wps:wsp>
-                </a:graphicData>
-              </a:graphic>
-            </wp:anchor>
-          </w:drawing>
-        </mc:Choice>
-        <mc:Fallback>
-          <w:pict>
-            <v:shape w14:anchorId="701FE6E0" id="Textbox 34" o:spid="_x0000_s1047" type="#_x0000_t202" style="position:absolute;margin-left:531.55pt;margin-top:118.1pt;width:33.4pt;height:12pt;z-index:-16048128;visibility:visible;mso-wrap-style:square;mso-wrap-distance-left:0;mso-wrap-distance-top:0;mso-wrap-distance-right:0;mso-wrap-distance-bottom:0;mso-position-horizontal:absolute;mso-position-horizontal-relative:page;mso-position-vertical:absolute;mso-position-vertical-relative:page;v-text-anchor:top" o:gfxdata="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" filled="f" stroked="f">
-              <v:textbox inset="0,0,0,0">
-                <w:txbxContent>
-                  <w:p>
-                    <w:pPr>
-                      <w:spacing w:before="12"/>
-                      <w:ind w:left="20"/>
-                      <w:rPr>
-                        <w:sz w:val="18"/>
-                      </w:rPr>
-                    </w:pPr>
-                    <w:r>
-                      <w:rPr>
-                        <w:spacing w:val="-2"/>
-                        <w:sz w:val="18"/>
-                      </w:rPr>
-                      <w:t>{hora_toma}</w:t>
-                    </w:r>
-                  </w:p>
-                </w:txbxContent>
-              </v:textbox>
-              <w10:wrap anchorx="page" anchory="page"/>
-            </v:shape>
-          </w:pict>
-        </mc:Fallback>
-      </mc:AlternateContent>
-    </w:r>
-    <w:r>
-      <w:rPr>
-        <w:i w:val="0"/>
-        <w:noProof/>
-        <w:sz w:val="20"/>
-      </w:rPr>
-      <mc:AlternateContent>
-        <mc:Choice Requires="wps">
-          <w:drawing>
-            <wp:anchor distT="0" distB="0" distL="0" distR="0" simplePos="0" relativeHeight="487268864" behindDoc="1" locked="0" layoutInCell="1" allowOverlap="1" wp14:anchorId="10820FBA" wp14:editId="68A1FFFA">
-              <wp:simplePos x="0" y="0"/>
-              <wp:positionH relativeFrom="page">
-                <wp:posOffset>5226558</wp:posOffset>
-              </wp:positionH>
-              <wp:positionV relativeFrom="page">
-                <wp:posOffset>1792223</wp:posOffset>
-              </wp:positionV>
-              <wp:extent cx="1603375" cy="158115"/>
-              <wp:effectExtent l="0" t="0" r="0" b="0"/>
-              <wp:wrapNone/>
-              <wp:docPr id="35" name="Textbox 35"/>
-              <wp:cNvGraphicFramePr>
-                <a:graphicFrameLocks xmlns:a="http://schemas.openxmlformats.org/drawingml/2006/main"/>
-              </wp:cNvGraphicFramePr>
-              <a:graphic xmlns:a="http://schemas.openxmlformats.org/drawingml/2006/main">
-                <a:graphicData uri="http://schemas.microsoft.com/office/word/2010/wordprocessingShape">
-                  <wps:wsp>
-                    <wps:cNvSpPr txBox="1">
-                      <a:spLocks/>
-                    </wps:cNvSpPr>
-                    <wps:spPr>
-                      <a:xfrm>
-                        <a:off x="0" y="0"/>
-                        <a:ext cx="1603375" cy="158115"/>
-                      </a:xfrm>
-                      <a:prstGeom prst="rect">
-                        <a:avLst/>
-                      </a:prstGeom>
-                    </wps:spPr>
-                    <wps:txbx>
-                      <w:txbxContent>
-                        <w:p>
-                          <w:pPr>
-                            <w:spacing w:before="12"/>
-                            <w:ind w:left="20"/>
-                            <w:rPr>
-                              <w:position w:val="1"/>
-                              <w:sz w:val="18"/>
-                            </w:rPr>
-                          </w:pPr>
-                          <w:r>
-                            <w:rPr>
-                              <w:b/>
-                              <w:sz w:val="18"/>
-                            </w:rPr>
-                            <w:t>Fecha</w:t>
-                          </w:r>
-                          <w:r>
-                            <w:rPr>
-                              <w:b/>
-                              <w:spacing w:val="-9"/>
-                              <w:sz w:val="18"/>
-                            </w:rPr>
-                            <w:t xml:space="preserve"> </w:t>
-                          </w:r>
-                          <w:r>
-                            <w:rPr>
-                              <w:b/>
-                              <w:sz w:val="18"/>
-                            </w:rPr>
-                            <w:t>de</w:t>
-                          </w:r>
-                          <w:r>
-                            <w:rPr>
-                              <w:b/>
-                              <w:spacing w:val="-11"/>
-                              <w:sz w:val="18"/>
-                            </w:rPr>
-                            <w:t xml:space="preserve"> </w:t>
-                          </w:r>
-                          <w:r>
-                            <w:rPr>
-                              <w:b/>
-                              <w:sz w:val="18"/>
-                            </w:rPr>
-                            <w:t>Validacion:</w:t>
-                          </w:r>
-                          <w:r>
-                            <w:rPr>
-                              <w:b/>
-                              <w:spacing w:val="17"/>
-                              <w:sz w:val="18"/>
-                            </w:rPr>
-                            <w:t xml:space="preserve"> </w:t>
-                          </w:r>
-                          <w:r>
-                            <w:rPr>
-                              <w:spacing w:val="-2"/>
-                              <w:position w:val="1"/>
-                              <w:sz w:val="18"/>
-                            </w:rPr>
-                            <w:t>{fecha_val}</w:t>
-                          </w:r>
-                        </w:p>
-                      </w:txbxContent>
-                    </wps:txbx>
-                    <wps:bodyPr wrap="square" lIns="0" tIns="0" rIns="0" bIns="0" rtlCol="0">
-                      <a:noAutofit/>
-                    </wps:bodyPr>
-                  </wps:wsp>
-                </a:graphicData>
-              </a:graphic>
-            </wp:anchor>
-          </w:drawing>
-        </mc:Choice>
-        <mc:Fallback>
-          <w:pict>
-            <v:shape w14:anchorId="10820FBA" id="Textbox 35" o:spid="_x0000_s1048" type="#_x0000_t202" style="position:absolute;margin-left:411.55pt;margin-top:141.1pt;width:126.25pt;height:12.45pt;z-index:-16047616;visibility:visible;mso-wrap-style:square;mso-wrap-distance-left:0;mso-wrap-distance-top:0;mso-wrap-distance-right:0;mso-wrap-distance-bottom:0;mso-position-horizontal:absolute;mso-position-horizontal-relative:page;mso-position-vertical:absolute;mso-position-vertical-relative:page;v-text-anchor:top" o:gfxdata="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" filled="f" stroked="f">
-              <v:textbox inset="0,0,0,0">
-                <w:txbxContent>
-                  <w:p>
-                    <w:pPr>
-                      <w:spacing w:before="12"/>
-                      <w:ind w:left="20"/>
-                      <w:rPr>
-                        <w:position w:val="1"/>
-                        <w:sz w:val="18"/>
-                      </w:rPr>
-                    </w:pPr>
-                    <w:r>
-                      <w:rPr>
-                        <w:b/>
-                        <w:sz w:val="18"/>
-                      </w:rPr>
-                      <w:t>Fecha</w:t>
-                    </w:r>
-                    <w:r>
-                      <w:rPr>
-                        <w:b/>
-                        <w:spacing w:val="-9"/>
-                        <w:sz w:val="18"/>
-                      </w:rPr>
-                      <w:t xml:space="preserve"> </w:t>
-                    </w:r>
-                    <w:r>
-                      <w:rPr>
-                        <w:b/>
-                        <w:sz w:val="18"/>
-                      </w:rPr>
-                      <w:t>de</w:t>
-                    </w:r>
-                    <w:r>
-                      <w:rPr>
-                        <w:b/>
-                        <w:spacing w:val="-11"/>
-                        <w:sz w:val="18"/>
-                      </w:rPr>
-                      <w:t xml:space="preserve"> </w:t>
-                    </w:r>
-                    <w:r>
-                      <w:rPr>
-                        <w:b/>
-                        <w:sz w:val="18"/>
-                      </w:rPr>
-                      <w:t>Validacion:</w:t>
-                    </w:r>
-                    <w:r>
-                      <w:rPr>
-                        <w:b/>
-                        <w:spacing w:val="17"/>
-                        <w:sz w:val="18"/>
-                      </w:rPr>
-                      <w:t xml:space="preserve"> </w:t>
-                    </w:r>
-                    <w:r>
-                      <w:rPr>
-                        <w:spacing w:val="-2"/>
-                        <w:position w:val="1"/>
-                        <w:sz w:val="18"/>
-                      </w:rPr>
-                      <w:t>{fecha_val}</w:t>
-                    </w:r>
-                  </w:p>
-                </w:txbxContent>
-              </v:textbox>
-              <w10:wrap anchorx="page" anchory="page"/>
-            </v:shape>
-          </w:pict>
-        </mc:Fallback>
-      </mc:AlternateContent>
-    </w:r>
-    <w:r>
-      <w:rPr>
-        <w:i w:val="0"/>
-        <w:noProof/>
-        <w:sz w:val="20"/>
-      </w:rPr>
-      <mc:AlternateContent>
-        <mc:Choice Requires="wps">
-          <w:drawing>
-            <wp:anchor distT="0" distB="0" distL="0" distR="0" simplePos="0" relativeHeight="487269376" behindDoc="1" locked="0" layoutInCell="1" allowOverlap="1" wp14:anchorId="29E5F682" wp14:editId="762EA726">
-              <wp:simplePos x="0" y="0"/>
-              <wp:positionH relativeFrom="page">
-                <wp:posOffset>6863588</wp:posOffset>
-              </wp:positionH>
-              <wp:positionV relativeFrom="page">
-                <wp:posOffset>1792223</wp:posOffset>
-              </wp:positionV>
-              <wp:extent cx="431800" cy="152400"/>
-              <wp:effectExtent l="0" t="0" r="0" b="0"/>
-              <wp:wrapNone/>
-              <wp:docPr id="36" name="Textbox 36"/>
-              <wp:cNvGraphicFramePr>
-                <a:graphicFrameLocks xmlns:a="http://schemas.openxmlformats.org/drawingml/2006/main"/>
-              </wp:cNvGraphicFramePr>
-              <a:graphic xmlns:a="http://schemas.openxmlformats.org/drawingml/2006/main">
-                <a:graphicData uri="http://schemas.microsoft.com/office/word/2010/wordprocessingShape">
-                  <wps:wsp>
-                    <wps:cNvSpPr txBox="1">
-                      <a:spLocks/>
-                    </wps:cNvSpPr>
-                    <wps:spPr>
-                      <a:xfrm>
-                        <a:off x="0" y="0"/>
-                        <a:ext cx="431800" cy="152400"/>
-                      </a:xfrm>
-                      <a:prstGeom prst="rect">
-                        <a:avLst/>
-                      </a:prstGeom>
-                    </wps:spPr>
-                    <wps:txbx>
-                      <w:txbxContent>
-                        <w:p>
-                          <w:pPr>
-                            <w:spacing w:before="12"/>
-                            <w:ind w:left="20"/>
-                            <w:rPr>
-                              <w:sz w:val="18"/>
-                            </w:rPr>
-                          </w:pPr>
-                          <w:r>
-                            <w:rPr>
-                              <w:spacing w:val="-2"/>
-                              <w:sz w:val="18"/>
-                            </w:rPr>
-                            <w:t>{hora_val}</w:t>
-                          </w:r>
-                        </w:p>
-                      </w:txbxContent>
-                    </wps:txbx>
-                    <wps:bodyPr wrap="square" lIns="0" tIns="0" rIns="0" bIns="0" rtlCol="0">
-                      <a:noAutofit/>
-                    </wps:bodyPr>
-                  </wps:wsp>
-                </a:graphicData>
-              </a:graphic>
-            </wp:anchor>
-          </w:drawing>
-        </mc:Choice>
-        <mc:Fallback>
-          <w:pict>
-            <v:shape w14:anchorId="29E5F682" id="Textbox 36" o:spid="_x0000_s1049" type="#_x0000_t202" style="position:absolute;margin-left:540.45pt;margin-top:141.1pt;width:34pt;height:12pt;z-index:-16047104;visibility:visible;mso-wrap-style:square;mso-wrap-distance-left:0;mso-wrap-distance-top:0;mso-wrap-distance-right:0;mso-wrap-distance-bottom:0;mso-position-horizontal:absolute;mso-position-horizontal-relative:page;mso-position-vertical:absolute;mso-position-vertical-relative:page;v-text-anchor:top" o:gfxdata="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" filled="f" stroked="f">
-              <v:textbox inset="0,0,0,0">
-                <w:txbxContent>
-                  <w:p>
-                    <w:pPr>
-                      <w:spacing w:before="12"/>
-                      <w:ind w:left="20"/>
-                      <w:rPr>
-                        <w:sz w:val="18"/>
-                      </w:rPr>
-                    </w:pPr>
-                    <w:r>
-                      <w:rPr>
-                        <w:spacing w:val="-2"/>
-                        <w:sz w:val="18"/>
-                      </w:rPr>
-                      <w:t>{hora_val}</w:t>
-                    </w:r>
-                  </w:p>
-                </w:txbxContent>
-              </v:textbox>
-              <w10:wrap anchorx="page" anchory="page"/>
-            </v:shape>
-          </w:pict>
-        </mc:Fallback>
-      </mc:AlternateContent>
-    </w:r>
-    <w:r>
-      <w:rPr>
-        <w:i w:val="0"/>
-        <w:noProof/>
-        <w:sz w:val="20"/>
-      </w:rPr>
-      <mc:AlternateContent>
-        <mc:Choice Requires="wps">
-          <w:drawing>
-            <wp:anchor distT="0" distB="0" distL="0" distR="0" simplePos="0" relativeHeight="487269888" behindDoc="1" locked="0" layoutInCell="1" allowOverlap="1" wp14:anchorId="76CF5968" wp14:editId="0BA5EDAF">
+            <wp:anchor distT="0" distB="0" distL="0" distR="0" simplePos="0" relativeHeight="251714560" behindDoc="1" locked="0" layoutInCell="1" allowOverlap="1" wp14:anchorId="76CF5968" wp14:editId="1FC0ADE1">
               <wp:simplePos x="0" y="0"/>
               <wp:positionH relativeFrom="page">
                 <wp:posOffset>696264</wp:posOffset>
@@ -15230,7 +16611,7 @@
                               <w:spacing w:val="-2"/>
                               <w:sz w:val="18"/>
                             </w:rPr>
-                            <w:t>{codigo_barra}</w:t>
+                            <w:t>ANC8349230417</w:t>
                           </w:r>
                         </w:p>
                       </w:txbxContent>
@@ -15246,7 +16627,7 @@
         </mc:Choice>
         <mc:Fallback>
           <w:pict>
-            <v:shape w14:anchorId="76CF5968" id="Textbox 37" o:spid="_x0000_s1050" type="#_x0000_t202" style="position:absolute;margin-left:54.8pt;margin-top:150.5pt;width:64.95pt;height:12pt;z-index:-16046592;visibility:visible;mso-wrap-style:square;mso-wrap-distance-left:0;mso-wrap-distance-top:0;mso-wrap-distance-right:0;mso-wrap-distance-bottom:0;mso-position-horizontal:absolute;mso-position-horizontal-relative:page;mso-position-vertical:absolute;mso-position-vertical-relative:page;v-text-anchor:top" o:gfxdata="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" filled="f" stroked="f">
+            <v:shape w14:anchorId="76CF5968" id="Textbox 37" o:spid="_x0000_s1053" type="#_x0000_t202" style="position:absolute;margin-left:54.8pt;margin-top:150.5pt;width:64.95pt;height:12pt;z-index:-251601920;visibility:visible;mso-wrap-style:square;mso-wrap-distance-left:0;mso-wrap-distance-top:0;mso-wrap-distance-right:0;mso-wrap-distance-bottom:0;mso-position-horizontal:absolute;mso-position-horizontal-relative:page;mso-position-vertical:absolute;mso-position-vertical-relative:page;v-text-anchor:top" o:gfxdata="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" filled="f" stroked="f">
               <v:textbox inset="0,0,0,0">
                 <w:txbxContent>
                   <w:p>
@@ -15262,7 +16643,7 @@
                         <w:spacing w:val="-2"/>
                         <w:sz w:val="18"/>
                       </w:rPr>
-                      <w:t>{codigo_barra}</w:t>
+                      <w:t>ANC8349230417</w:t>
                     </w:r>
                   </w:p>
                 </w:txbxContent>
@@ -15282,136 +16663,7 @@
       <mc:AlternateContent>
         <mc:Choice Requires="wps">
           <w:drawing>
-            <wp:anchor distT="0" distB="0" distL="0" distR="0" simplePos="0" relativeHeight="487270400" behindDoc="1" locked="0" layoutInCell="1" allowOverlap="1" wp14:anchorId="779C12A3" wp14:editId="3983DCAB">
-              <wp:simplePos x="0" y="0"/>
-              <wp:positionH relativeFrom="page">
-                <wp:posOffset>6357365</wp:posOffset>
-              </wp:positionH>
-              <wp:positionV relativeFrom="page">
-                <wp:posOffset>2072639</wp:posOffset>
-              </wp:positionV>
-              <wp:extent cx="449580" cy="152400"/>
-              <wp:effectExtent l="0" t="0" r="0" b="0"/>
-              <wp:wrapNone/>
-              <wp:docPr id="38" name="Textbox 38"/>
-              <wp:cNvGraphicFramePr>
-                <a:graphicFrameLocks xmlns:a="http://schemas.openxmlformats.org/drawingml/2006/main"/>
-              </wp:cNvGraphicFramePr>
-              <a:graphic xmlns:a="http://schemas.openxmlformats.org/drawingml/2006/main">
-                <a:graphicData uri="http://schemas.microsoft.com/office/word/2010/wordprocessingShape">
-                  <wps:wsp>
-                    <wps:cNvSpPr txBox="1">
-                      <a:spLocks/>
-                    </wps:cNvSpPr>
-                    <wps:spPr>
-                      <a:xfrm>
-                        <a:off x="0" y="0"/>
-                        <a:ext cx="449580" cy="152400"/>
-                      </a:xfrm>
-                      <a:prstGeom prst="rect">
-                        <a:avLst/>
-                      </a:prstGeom>
-                    </wps:spPr>
-                    <wps:txbx>
-                      <w:txbxContent>
-                        <w:p>
-                          <w:pPr>
-                            <w:spacing w:before="12"/>
-                            <w:ind w:left="20"/>
-                            <w:rPr>
-                              <w:sz w:val="18"/>
-                            </w:rPr>
-                          </w:pPr>
-                          <w:r>
-                            <w:rPr>
-                              <w:b/>
-                              <w:spacing w:val="-2"/>
-                              <w:sz w:val="18"/>
-                            </w:rPr>
-                            <w:t>Edad:</w:t>
-                          </w:r>
-                          <w:r>
-                            <w:rPr>
-                              <w:b/>
-                              <w:spacing w:val="-15"/>
-                              <w:sz w:val="18"/>
-                            </w:rPr>
-                            <w:t xml:space="preserve"> </w:t>
-                          </w:r>
-                          <w:r>
-                            <w:rPr>
-                              <w:spacing w:val="-5"/>
-                              <w:sz w:val="18"/>
-                            </w:rPr>
-                            <w:t>{edad}</w:t>
-                          </w:r>
-                        </w:p>
-                      </w:txbxContent>
-                    </wps:txbx>
-                    <wps:bodyPr wrap="square" lIns="0" tIns="0" rIns="0" bIns="0" rtlCol="0">
-                      <a:noAutofit/>
-                    </wps:bodyPr>
-                  </wps:wsp>
-                </a:graphicData>
-              </a:graphic>
-            </wp:anchor>
-          </w:drawing>
-        </mc:Choice>
-        <mc:Fallback>
-          <w:pict>
-            <v:shape w14:anchorId="779C12A3" id="Textbox 38" o:spid="_x0000_s1051" type="#_x0000_t202" style="position:absolute;margin-left:500.6pt;margin-top:163.2pt;width:35.4pt;height:12pt;z-index:-16046080;visibility:visible;mso-wrap-style:square;mso-wrap-distance-left:0;mso-wrap-distance-top:0;mso-wrap-distance-right:0;mso-wrap-distance-bottom:0;mso-position-horizontal:absolute;mso-position-horizontal-relative:page;mso-position-vertical:absolute;mso-position-vertical-relative:page;v-text-anchor:top" o:gfxdata="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" filled="f" stroked="f">
-              <v:textbox inset="0,0,0,0">
-                <w:txbxContent>
-                  <w:p>
-                    <w:pPr>
-                      <w:spacing w:before="12"/>
-                      <w:ind w:left="20"/>
-                      <w:rPr>
-                        <w:sz w:val="18"/>
-                      </w:rPr>
-                    </w:pPr>
-                    <w:r>
-                      <w:rPr>
-                        <w:b/>
-                        <w:spacing w:val="-2"/>
-                        <w:sz w:val="18"/>
-                      </w:rPr>
-                      <w:t>Edad:</w:t>
-                    </w:r>
-                    <w:r>
-                      <w:rPr>
-                        <w:b/>
-                        <w:spacing w:val="-15"/>
-                        <w:sz w:val="18"/>
-                      </w:rPr>
-                      <w:t xml:space="preserve"> </w:t>
-                    </w:r>
-                    <w:r>
-                      <w:rPr>
-                        <w:spacing w:val="-5"/>
-                        <w:sz w:val="18"/>
-                      </w:rPr>
-                      <w:t>{edad}</w:t>
-                    </w:r>
-                  </w:p>
-                </w:txbxContent>
-              </v:textbox>
-              <w10:wrap anchorx="page" anchory="page"/>
-            </v:shape>
-          </w:pict>
-        </mc:Fallback>
-      </mc:AlternateContent>
-    </w:r>
-    <w:r>
-      <w:rPr>
-        <w:i w:val="0"/>
-        <w:noProof/>
-        <w:sz w:val="20"/>
-      </w:rPr>
-      <mc:AlternateContent>
-        <mc:Choice Requires="wps">
-          <w:drawing>
-            <wp:anchor distT="0" distB="0" distL="0" distR="0" simplePos="0" relativeHeight="487270912" behindDoc="1" locked="0" layoutInCell="1" allowOverlap="1" wp14:anchorId="12B563DD" wp14:editId="53C4E3A9">
+            <wp:anchor distT="0" distB="0" distL="0" distR="0" simplePos="0" relativeHeight="251724800" behindDoc="1" locked="0" layoutInCell="1" allowOverlap="1" wp14:anchorId="12B563DD" wp14:editId="53C4E3A9">
               <wp:simplePos x="0" y="0"/>
               <wp:positionH relativeFrom="page">
                 <wp:posOffset>7040371</wp:posOffset>
@@ -15474,7 +16726,7 @@
         </mc:Choice>
         <mc:Fallback>
           <w:pict>
-            <v:shape w14:anchorId="12B563DD" id="Textbox 39" o:spid="_x0000_s1052" type="#_x0000_t202" style="position:absolute;margin-left:554.35pt;margin-top:163.2pt;width:20.9pt;height:12pt;z-index:-16045568;visibility:visible;mso-wrap-style:square;mso-wrap-distance-left:0;mso-wrap-distance-top:0;mso-wrap-distance-right:0;mso-wrap-distance-bottom:0;mso-position-horizontal:absolute;mso-position-horizontal-relative:page;mso-position-vertical:absolute;mso-position-vertical-relative:page;v-text-anchor:top" o:gfxdata="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" filled="f" stroked="f">
+            <v:shape w14:anchorId="12B563DD" id="Textbox 39" o:spid="_x0000_s1054" type="#_x0000_t202" style="position:absolute;margin-left:554.35pt;margin-top:163.2pt;width:20.9pt;height:12pt;z-index:-251591680;visibility:visible;mso-wrap-style:square;mso-wrap-distance-left:0;mso-wrap-distance-top:0;mso-wrap-distance-right:0;mso-wrap-distance-bottom:0;mso-position-horizontal:absolute;mso-position-horizontal-relative:page;mso-position-vertical:absolute;mso-position-vertical-relative:page;v-text-anchor:top" o:gfxdata="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" filled="f" stroked="f">
               <v:textbox inset="0,0,0,0">
                 <w:txbxContent>
                   <w:p>
@@ -15512,7 +16764,7 @@
       <mc:AlternateContent>
         <mc:Choice Requires="wps">
           <w:drawing>
-            <wp:anchor distT="0" distB="0" distL="0" distR="0" simplePos="0" relativeHeight="487271424" behindDoc="1" locked="0" layoutInCell="1" allowOverlap="1" wp14:anchorId="435EA415" wp14:editId="20C9A3BB">
+            <wp:anchor distT="0" distB="0" distL="0" distR="0" simplePos="0" relativeHeight="251728896" behindDoc="1" locked="0" layoutInCell="1" allowOverlap="1" wp14:anchorId="435EA415" wp14:editId="4DA51FA4">
               <wp:simplePos x="0" y="0"/>
               <wp:positionH relativeFrom="page">
                 <wp:posOffset>5226558</wp:posOffset>
@@ -15575,7 +16827,7 @@
         </mc:Choice>
         <mc:Fallback>
           <w:pict>
-            <v:shape w14:anchorId="435EA415" id="Textbox 40" o:spid="_x0000_s1053" type="#_x0000_t202" style="position:absolute;margin-left:411.55pt;margin-top:163.7pt;width:22.65pt;height:12pt;z-index:-16045056;visibility:visible;mso-wrap-style:square;mso-wrap-distance-left:0;mso-wrap-distance-top:0;mso-wrap-distance-right:0;mso-wrap-distance-bottom:0;mso-position-horizontal:absolute;mso-position-horizontal-relative:page;mso-position-vertical:absolute;mso-position-vertical-relative:page;v-text-anchor:top" o:gfxdata="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" filled="f" stroked="f">
+            <v:shape w14:anchorId="435EA415" id="Textbox 40" o:spid="_x0000_s1055" type="#_x0000_t202" style="position:absolute;margin-left:411.55pt;margin-top:163.7pt;width:22.65pt;height:12pt;z-index:-251587584;visibility:visible;mso-wrap-style:square;mso-wrap-distance-left:0;mso-wrap-distance-top:0;mso-wrap-distance-right:0;mso-wrap-distance-bottom:0;mso-position-horizontal:absolute;mso-position-horizontal-relative:page;mso-position-vertical:absolute;mso-position-vertical-relative:page;v-text-anchor:top" o:gfxdata="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" filled="f" stroked="f">
               <v:textbox inset="0,0,0,0">
                 <w:txbxContent>
                   <w:p>
@@ -15613,104 +16865,7 @@
       <mc:AlternateContent>
         <mc:Choice Requires="wps">
           <w:drawing>
-            <wp:anchor distT="0" distB="0" distL="0" distR="0" simplePos="0" relativeHeight="487271936" behindDoc="1" locked="0" layoutInCell="1" allowOverlap="1" wp14:anchorId="729AF833" wp14:editId="3E30B05E">
-              <wp:simplePos x="0" y="0"/>
-              <wp:positionH relativeFrom="page">
-                <wp:posOffset>5787390</wp:posOffset>
-              </wp:positionH>
-              <wp:positionV relativeFrom="page">
-                <wp:posOffset>2078735</wp:posOffset>
-              </wp:positionV>
-              <wp:extent cx="299720" cy="152400"/>
-              <wp:effectExtent l="0" t="0" r="0" b="0"/>
-              <wp:wrapNone/>
-              <wp:docPr id="41" name="Textbox 41"/>
-              <wp:cNvGraphicFramePr>
-                <a:graphicFrameLocks xmlns:a="http://schemas.openxmlformats.org/drawingml/2006/main"/>
-              </wp:cNvGraphicFramePr>
-              <a:graphic xmlns:a="http://schemas.openxmlformats.org/drawingml/2006/main">
-                <a:graphicData uri="http://schemas.microsoft.com/office/word/2010/wordprocessingShape">
-                  <wps:wsp>
-                    <wps:cNvSpPr txBox="1">
-                      <a:spLocks/>
-                    </wps:cNvSpPr>
-                    <wps:spPr>
-                      <a:xfrm>
-                        <a:off x="0" y="0"/>
-                        <a:ext cx="299720" cy="152400"/>
-                      </a:xfrm>
-                      <a:prstGeom prst="rect">
-                        <a:avLst/>
-                      </a:prstGeom>
-                    </wps:spPr>
-                    <wps:txbx>
-                      <w:txbxContent>
-                        <w:p>
-                          <w:pPr>
-                            <w:spacing w:before="12"/>
-                            <w:ind w:left="20"/>
-                            <w:rPr>
-                              <w:sz w:val="18"/>
-                            </w:rPr>
-                          </w:pPr>
-                          <w:r>
-                            <w:rPr>
-                              <w:spacing w:val="-2"/>
-                              <w:sz w:val="18"/>
-                            </w:rPr>
-                            <w:t>{sexo}</w:t>
-                          </w:r>
-                        </w:p>
-                      </w:txbxContent>
-                    </wps:txbx>
-                    <wps:bodyPr wrap="square" lIns="0" tIns="0" rIns="0" bIns="0" rtlCol="0">
-                      <a:noAutofit/>
-                    </wps:bodyPr>
-                  </wps:wsp>
-                </a:graphicData>
-              </a:graphic>
-            </wp:anchor>
-          </w:drawing>
-        </mc:Choice>
-        <mc:Fallback>
-          <w:pict>
-            <v:shape w14:anchorId="729AF833" id="Textbox 41" o:spid="_x0000_s1054" type="#_x0000_t202" style="position:absolute;margin-left:455.7pt;margin-top:163.7pt;width:23.6pt;height:12pt;z-index:-16044544;visibility:visible;mso-wrap-style:square;mso-wrap-distance-left:0;mso-wrap-distance-top:0;mso-wrap-distance-right:0;mso-wrap-distance-bottom:0;mso-position-horizontal:absolute;mso-position-horizontal-relative:page;mso-position-vertical:absolute;mso-position-vertical-relative:page;v-text-anchor:top" o:gfxdata="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" filled="f" stroked="f">
-              <v:textbox inset="0,0,0,0">
-                <w:txbxContent>
-                  <w:p>
-                    <w:pPr>
-                      <w:spacing w:before="12"/>
-                      <w:ind w:left="20"/>
-                      <w:rPr>
-                        <w:sz w:val="18"/>
-                      </w:rPr>
-                    </w:pPr>
-                    <w:r>
-                      <w:rPr>
-                        <w:spacing w:val="-2"/>
-                        <w:sz w:val="18"/>
-                      </w:rPr>
-                      <w:t>{sexo}</w:t>
-                    </w:r>
-                  </w:p>
-                </w:txbxContent>
-              </v:textbox>
-              <w10:wrap anchorx="page" anchory="page"/>
-            </v:shape>
-          </w:pict>
-        </mc:Fallback>
-      </mc:AlternateContent>
-    </w:r>
-    <w:r>
-      <w:rPr>
-        <w:i w:val="0"/>
-        <w:noProof/>
-        <w:sz w:val="20"/>
-      </w:rPr>
-      <mc:AlternateContent>
-        <mc:Choice Requires="wps">
-          <w:drawing>
-            <wp:anchor distT="0" distB="0" distL="0" distR="0" simplePos="0" relativeHeight="487272448" behindDoc="1" locked="0" layoutInCell="1" allowOverlap="1" wp14:anchorId="6CEAD917" wp14:editId="08974A7C">
+            <wp:anchor distT="0" distB="0" distL="0" distR="0" simplePos="0" relativeHeight="251737088" behindDoc="1" locked="0" layoutInCell="1" allowOverlap="1" wp14:anchorId="6CEAD917" wp14:editId="62F2F3FA">
               <wp:simplePos x="0" y="0"/>
               <wp:positionH relativeFrom="page">
                 <wp:posOffset>208279</wp:posOffset>
@@ -15773,7 +16928,7 @@
         </mc:Choice>
         <mc:Fallback>
           <w:pict>
-            <v:shape w14:anchorId="6CEAD917" id="Textbox 42" o:spid="_x0000_s1055" type="#_x0000_t202" style="position:absolute;margin-left:16.4pt;margin-top:165.6pt;width:36.6pt;height:12pt;z-index:-16044032;visibility:visible;mso-wrap-style:square;mso-wrap-distance-left:0;mso-wrap-distance-top:0;mso-wrap-distance-right:0;mso-wrap-distance-bottom:0;mso-position-horizontal:absolute;mso-position-horizontal-relative:page;mso-position-vertical:absolute;mso-position-vertical-relative:page;v-text-anchor:top" o:gfxdata="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" filled="f" stroked="f">
+            <v:shape w14:anchorId="6CEAD917" id="Textbox 42" o:spid="_x0000_s1056" type="#_x0000_t202" style="position:absolute;margin-left:16.4pt;margin-top:165.6pt;width:36.6pt;height:12pt;z-index:-251579392;visibility:visible;mso-wrap-style:square;mso-wrap-distance-left:0;mso-wrap-distance-top:0;mso-wrap-distance-right:0;mso-wrap-distance-bottom:0;mso-position-horizontal:absolute;mso-position-horizontal-relative:page;mso-position-vertical:absolute;mso-position-vertical-relative:page;v-text-anchor:top" o:gfxdata="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" filled="f" stroked="f">
               <v:textbox inset="0,0,0,0">
                 <w:txbxContent>
                   <w:p>
@@ -15792,155 +16947,6 @@
                         <w:sz w:val="18"/>
                       </w:rPr>
                       <w:t>Paciente:</w:t>
-                    </w:r>
-                  </w:p>
-                </w:txbxContent>
-              </v:textbox>
-              <w10:wrap anchorx="page" anchory="page"/>
-            </v:shape>
-          </w:pict>
-        </mc:Fallback>
-      </mc:AlternateContent>
-    </w:r>
-    <w:r>
-      <w:rPr>
-        <w:i w:val="0"/>
-        <w:noProof/>
-        <w:sz w:val="20"/>
-      </w:rPr>
-      <mc:AlternateContent>
-        <mc:Choice Requires="wps">
-          <w:drawing>
-            <wp:anchor distT="0" distB="0" distL="0" distR="0" simplePos="0" relativeHeight="487272960" behindDoc="1" locked="0" layoutInCell="1" allowOverlap="1" wp14:anchorId="2F1125BB" wp14:editId="3FE130A1">
-              <wp:simplePos x="0" y="0"/>
-              <wp:positionH relativeFrom="page">
-                <wp:posOffset>866952</wp:posOffset>
-              </wp:positionH>
-              <wp:positionV relativeFrom="page">
-                <wp:posOffset>2103119</wp:posOffset>
-              </wp:positionV>
-              <wp:extent cx="2411095" cy="152400"/>
-              <wp:effectExtent l="0" t="0" r="0" b="0"/>
-              <wp:wrapNone/>
-              <wp:docPr id="43" name="Textbox 43"/>
-              <wp:cNvGraphicFramePr>
-                <a:graphicFrameLocks xmlns:a="http://schemas.openxmlformats.org/drawingml/2006/main"/>
-              </wp:cNvGraphicFramePr>
-              <a:graphic xmlns:a="http://schemas.openxmlformats.org/drawingml/2006/main">
-                <a:graphicData uri="http://schemas.microsoft.com/office/word/2010/wordprocessingShape">
-                  <wps:wsp>
-                    <wps:cNvSpPr txBox="1">
-                      <a:spLocks/>
-                    </wps:cNvSpPr>
-                    <wps:spPr>
-                      <a:xfrm>
-                        <a:off x="0" y="0"/>
-                        <a:ext cx="2411095" cy="152400"/>
-                      </a:xfrm>
-                      <a:prstGeom prst="rect">
-                        <a:avLst/>
-                      </a:prstGeom>
-                    </wps:spPr>
-                    <wps:txbx>
-                      <w:txbxContent>
-                        <w:p>
-                          <w:pPr>
-                            <w:spacing w:before="12"/>
-                            <w:ind w:left="20"/>
-                            <w:rPr>
-                              <w:sz w:val="18"/>
-                            </w:rPr>
-                          </w:pPr>
-                          <w:r>
-                            <w:rPr>
-                              <w:sz w:val="18"/>
-                            </w:rPr>
-                            <w:t>{paciente_nombre_completo}</w:t>
-                          </w:r>
-                          <w:r>
-                            <w:rPr>
-                              <w:spacing w:val="-5"/>
-                              <w:sz w:val="18"/>
-                            </w:rPr>
-                            <w:t xml:space="preserve"> </w:t>
-                          </w:r>
-                          <w:r>
-                            <w:rPr>
-                              <w:sz w:val="18"/>
-                            </w:rPr>
-                            <w:t/>
-                          </w:r>
-                          <w:r>
-                            <w:rPr>
-                              <w:spacing w:val="-4"/>
-                              <w:sz w:val="18"/>
-                            </w:rPr>
-                            <w:t xml:space="preserve"> </w:t>
-                          </w:r>
-                          <w:r>
-                            <w:rPr>
-                              <w:spacing w:val="-2"/>
-                              <w:sz w:val="18"/>
-                            </w:rPr>
-                            <w:t/>
-                          </w:r>
-                        </w:p>
-                      </w:txbxContent>
-                    </wps:txbx>
-                    <wps:bodyPr wrap="square" lIns="0" tIns="0" rIns="0" bIns="0" rtlCol="0">
-                      <a:noAutofit/>
-                    </wps:bodyPr>
-                  </wps:wsp>
-                </a:graphicData>
-              </a:graphic>
-            </wp:anchor>
-          </w:drawing>
-        </mc:Choice>
-        <mc:Fallback>
-          <w:pict>
-            <v:shape w14:anchorId="2F1125BB" id="Textbox 43" o:spid="_x0000_s1056" type="#_x0000_t202" style="position:absolute;margin-left:68.25pt;margin-top:165.6pt;width:189.85pt;height:12pt;z-index:-16043520;visibility:visible;mso-wrap-style:square;mso-wrap-distance-left:0;mso-wrap-distance-top:0;mso-wrap-distance-right:0;mso-wrap-distance-bottom:0;mso-position-horizontal:absolute;mso-position-horizontal-relative:page;mso-position-vertical:absolute;mso-position-vertical-relative:page;v-text-anchor:top" o:gfxdata="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" filled="f" stroked="f">
-              <v:textbox inset="0,0,0,0">
-                <w:txbxContent>
-                  <w:p>
-                    <w:pPr>
-                      <w:spacing w:before="12"/>
-                      <w:ind w:left="20"/>
-                      <w:rPr>
-                        <w:sz w:val="18"/>
-                      </w:rPr>
-                    </w:pPr>
-                    <w:r>
-                      <w:rPr>
-                        <w:sz w:val="18"/>
-                      </w:rPr>
-                      <w:t>{paciente_nombre_completo}</w:t>
-                    </w:r>
-                    <w:r>
-                      <w:rPr>
-                        <w:spacing w:val="-5"/>
-                        <w:sz w:val="18"/>
-                      </w:rPr>
-                      <w:t xml:space="preserve"> </w:t>
-                    </w:r>
-                    <w:r>
-                      <w:rPr>
-                        <w:sz w:val="18"/>
-                      </w:rPr>
-                      <w:t/>
-                    </w:r>
-                    <w:r>
-                      <w:rPr>
-                        <w:spacing w:val="-4"/>
-                        <w:sz w:val="18"/>
-                      </w:rPr>
-                      <w:t xml:space="preserve"> </w:t>
-                    </w:r>
-                    <w:r>
-                      <w:rPr>
-                        <w:spacing w:val="-2"/>
-                        <w:sz w:val="18"/>
-                      </w:rPr>
-                      <w:t/>
                     </w:r>
                   </w:p>
                 </w:txbxContent>
@@ -16355,6 +17361,7 @@
   <w:style w:type="paragraph" w:default="1" w:styleId="Normal">
     <w:name w:val="Normal"/>
     <w:qFormat/>
+    <w:rsid w:val="00DB1498"/>
     <w:rPr>
       <w:rFonts w:ascii="Times New Roman" w:eastAsia="Times New Roman" w:hAnsi="Times New Roman" w:cs="Times New Roman"/>
       <w:lang w:val="es-ES"/>
@@ -16393,6 +17400,7 @@
   <w:style w:type="character" w:default="1" w:styleId="Fuentedeprrafopredeter">
     <w:name w:val="Default Paragraph Font"/>
     <w:uiPriority w:val="1"/>
+    <w:semiHidden/>
     <w:unhideWhenUsed/>
   </w:style>
   <w:style w:type="table" w:default="1" w:styleId="Tablanormal">

</xml_diff>

<commit_message>
fix(examenes): corregir layout y paginación de exportaciones de sangre y orina
</commit_message>
<xml_diff>
--- a/examenes_medicos_templates/FORMATO EXAMEN DE SANGRE.docx
+++ b/examenes_medicos_templates/FORMATO EXAMEN DE SANGRE.docx
@@ -13600,18 +13600,18 @@
       <mc:AlternateContent>
         <mc:Choice Requires="wps">
           <w:drawing>
-            <wp:anchor distT="0" distB="0" distL="0" distR="0" simplePos="0" relativeHeight="251720704" behindDoc="1" locked="0" layoutInCell="1" allowOverlap="1" wp14:anchorId="779C12A3" wp14:editId="4BAC4229">
+            <wp:anchor distT="0" distB="0" distL="0" distR="0" simplePos="0" relativeHeight="251711488" behindDoc="1" locked="0" layoutInCell="1" allowOverlap="1" wp14:anchorId="0898095E" wp14:editId="46718BDD">
               <wp:simplePos x="0" y="0"/>
               <wp:positionH relativeFrom="page">
                 <wp:posOffset>6353175</wp:posOffset>
               </wp:positionH>
               <wp:positionV relativeFrom="page">
-                <wp:posOffset>2076450</wp:posOffset>
+                <wp:posOffset>2066925</wp:posOffset>
               </wp:positionV>
-              <wp:extent cx="647700" cy="180975"/>
+              <wp:extent cx="650738" cy="190500"/>
               <wp:effectExtent l="0" t="0" r="0" b="0"/>
               <wp:wrapNone/>
-              <wp:docPr id="38" name="Textbox 38"/>
+              <wp:docPr id="14" name="Textbox 14"/>
               <wp:cNvGraphicFramePr>
                 <a:graphicFrameLocks xmlns:a="http://schemas.openxmlformats.org/drawingml/2006/main"/>
               </wp:cNvGraphicFramePr>
@@ -13624,7 +13624,7 @@
                     <wps:spPr>
                       <a:xfrm>
                         <a:off x="0" y="0"/>
-                        <a:ext cx="647700" cy="180975"/>
+                        <a:ext cx="650738" cy="190500"/>
                       </a:xfrm>
                       <a:prstGeom prst="rect">
                         <a:avLst/>
@@ -13683,11 +13683,11 @@
         </mc:Choice>
         <mc:Fallback>
           <w:pict>
-            <v:shapetype w14:anchorId="779C12A3" id="_x0000_t202" coordsize="21600,21600" o:spt="202" path="m,l,21600r21600,l21600,xe">
+            <v:shapetype w14:anchorId="0898095E" id="_x0000_t202" coordsize="21600,21600" o:spt="202" path="m,l,21600r21600,l21600,xe">
               <v:stroke joinstyle="miter"/>
               <v:path gradientshapeok="t" o:connecttype="rect"/>
             </v:shapetype>
-            <v:shape id="Textbox 38" o:spid="_x0000_s1043" type="#_x0000_t202" style="position:absolute;margin-left:500.25pt;margin-top:163.5pt;width:51pt;height:14.25pt;z-index:-251595776;visibility:visible;mso-wrap-style:square;mso-width-percent:0;mso-height-percent:0;mso-wrap-distance-left:0;mso-wrap-distance-top:0;mso-wrap-distance-right:0;mso-wrap-distance-bottom:0;mso-position-horizontal:absolute;mso-position-horizontal-relative:page;mso-position-vertical:absolute;mso-position-vertical-relative:page;mso-width-percent:0;mso-height-percent:0;mso-width-relative:margin;mso-height-relative:margin;v-text-anchor:top" o:gfxdata="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" filled="f" stroked="f">
+            <v:shape id="Textbox 14" o:spid="_x0000_s1026" type="#_x0000_t202" style="position:absolute;margin-left:500.25pt;margin-top:162.75pt;width:51.25pt;height:15pt;z-index:-251604992;visibility:visible;mso-wrap-style:square;mso-width-percent:0;mso-height-percent:0;mso-wrap-distance-left:0;mso-wrap-distance-top:0;mso-wrap-distance-right:0;mso-wrap-distance-bottom:0;mso-position-horizontal:absolute;mso-position-horizontal-relative:page;mso-position-vertical:absolute;mso-position-vertical-relative:page;mso-width-percent:0;mso-height-percent:0;mso-width-relative:margin;mso-height-relative:margin;v-text-anchor:top" o:gfxdata="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" filled="f" stroked="f">
               <v:textbox inset="0,0,0,0">
                 <w:txbxContent>
                   <w:p>
@@ -13739,18 +13739,18 @@
       <mc:AlternateContent>
         <mc:Choice Requires="wps">
           <w:drawing>
-            <wp:anchor distT="0" distB="0" distL="0" distR="0" simplePos="0" relativeHeight="251735040" behindDoc="1" locked="0" layoutInCell="1" allowOverlap="1" wp14:anchorId="729AF833" wp14:editId="4B94E5D7">
+            <wp:anchor distT="0" distB="0" distL="0" distR="0" simplePos="0" relativeHeight="251707392" behindDoc="1" locked="0" layoutInCell="1" allowOverlap="1" wp14:anchorId="69BD5EE8" wp14:editId="2D8E03C0">
               <wp:simplePos x="0" y="0"/>
               <wp:positionH relativeFrom="page">
-                <wp:posOffset>5791200</wp:posOffset>
+                <wp:posOffset>5778109</wp:posOffset>
               </wp:positionH>
               <wp:positionV relativeFrom="page">
-                <wp:posOffset>2076450</wp:posOffset>
+                <wp:posOffset>2075632</wp:posOffset>
               </wp:positionV>
-              <wp:extent cx="361950" cy="142875"/>
+              <wp:extent cx="342199" cy="152400"/>
               <wp:effectExtent l="0" t="0" r="0" b="0"/>
               <wp:wrapNone/>
-              <wp:docPr id="41" name="Textbox 41"/>
+              <wp:docPr id="13" name="Textbox 13"/>
               <wp:cNvGraphicFramePr>
                 <a:graphicFrameLocks xmlns:a="http://schemas.openxmlformats.org/drawingml/2006/main"/>
               </wp:cNvGraphicFramePr>
@@ -13763,7 +13763,7 @@
                     <wps:spPr>
                       <a:xfrm>
                         <a:off x="0" y="0"/>
-                        <a:ext cx="361950" cy="142875"/>
+                        <a:ext cx="342199" cy="152400"/>
                       </a:xfrm>
                       <a:prstGeom prst="rect">
                         <a:avLst/>
@@ -13786,15 +13786,6 @@
                             </w:rPr>
                             <w:t>{sexo}</w:t>
                           </w:r>
-                        </w:p>
-                        <w:p>
-                          <w:pPr>
-                            <w:spacing w:before="12"/>
-                            <w:ind w:left="20"/>
-                            <w:rPr>
-                              <w:sz w:val="18"/>
-                            </w:rPr>
-                          </w:pPr>
                         </w:p>
                       </w:txbxContent>
                     </wps:txbx>
@@ -13807,15 +13798,12 @@
               <wp14:sizeRelH relativeFrom="margin">
                 <wp14:pctWidth>0</wp14:pctWidth>
               </wp14:sizeRelH>
-              <wp14:sizeRelV relativeFrom="margin">
-                <wp14:pctHeight>0</wp14:pctHeight>
-              </wp14:sizeRelV>
             </wp:anchor>
           </w:drawing>
         </mc:Choice>
         <mc:Fallback>
           <w:pict>
-            <v:shape w14:anchorId="729AF833" id="Textbox 41" o:spid="_x0000_s1044" type="#_x0000_t202" style="position:absolute;margin-left:456pt;margin-top:163.5pt;width:28.5pt;height:11.25pt;z-index:-251581440;visibility:visible;mso-wrap-style:square;mso-width-percent:0;mso-height-percent:0;mso-wrap-distance-left:0;mso-wrap-distance-top:0;mso-wrap-distance-right:0;mso-wrap-distance-bottom:0;mso-position-horizontal:absolute;mso-position-horizontal-relative:page;mso-position-vertical:absolute;mso-position-vertical-relative:page;mso-width-percent:0;mso-height-percent:0;mso-width-relative:margin;mso-height-relative:margin;v-text-anchor:top" o:gfxdata="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" filled="f" stroked="f">
+            <v:shape w14:anchorId="69BD5EE8" id="Textbox 13" o:spid="_x0000_s1027" type="#_x0000_t202" style="position:absolute;margin-left:454.95pt;margin-top:163.45pt;width:26.95pt;height:12pt;z-index:-251609088;visibility:visible;mso-wrap-style:square;mso-width-percent:0;mso-wrap-distance-left:0;mso-wrap-distance-top:0;mso-wrap-distance-right:0;mso-wrap-distance-bottom:0;mso-position-horizontal:absolute;mso-position-horizontal-relative:page;mso-position-vertical:absolute;mso-position-vertical-relative:page;mso-width-percent:0;mso-width-relative:margin;v-text-anchor:top" o:gfxdata="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" filled="f" stroked="f">
               <v:textbox inset="0,0,0,0">
                 <w:txbxContent>
                   <w:p>
@@ -13833,15 +13821,6 @@
                       </w:rPr>
                       <w:t>{sexo}</w:t>
                     </w:r>
-                  </w:p>
-                  <w:p>
-                    <w:pPr>
-                      <w:spacing w:before="12"/>
-                      <w:ind w:left="20"/>
-                      <w:rPr>
-                        <w:sz w:val="18"/>
-                      </w:rPr>
-                    </w:pPr>
                   </w:p>
                 </w:txbxContent>
               </v:textbox>
@@ -13860,18 +13839,18 @@
       <mc:AlternateContent>
         <mc:Choice Requires="wps">
           <w:drawing>
-            <wp:anchor distT="0" distB="0" distL="0" distR="0" simplePos="0" relativeHeight="251708416" behindDoc="1" locked="0" layoutInCell="1" allowOverlap="1" wp14:anchorId="29E5F682" wp14:editId="6E5059AB">
+            <wp:anchor distT="0" distB="0" distL="0" distR="0" simplePos="0" relativeHeight="251688960" behindDoc="1" locked="0" layoutInCell="1" allowOverlap="1" wp14:anchorId="6997D6B6" wp14:editId="72983E13">
               <wp:simplePos x="0" y="0"/>
               <wp:positionH relativeFrom="page">
-                <wp:posOffset>6867525</wp:posOffset>
+                <wp:posOffset>6900074</wp:posOffset>
               </wp:positionH>
               <wp:positionV relativeFrom="page">
-                <wp:posOffset>1790700</wp:posOffset>
+                <wp:posOffset>1789531</wp:posOffset>
               </wp:positionV>
-              <wp:extent cx="533400" cy="142875"/>
+              <wp:extent cx="527322" cy="152400"/>
               <wp:effectExtent l="0" t="0" r="0" b="0"/>
               <wp:wrapNone/>
-              <wp:docPr id="36" name="Textbox 36"/>
+              <wp:docPr id="10" name="Textbox 10"/>
               <wp:cNvGraphicFramePr>
                 <a:graphicFrameLocks xmlns:a="http://schemas.openxmlformats.org/drawingml/2006/main"/>
               </wp:cNvGraphicFramePr>
@@ -13884,7 +13863,7 @@
                     <wps:spPr>
                       <a:xfrm>
                         <a:off x="0" y="0"/>
-                        <a:ext cx="533400" cy="142875"/>
+                        <a:ext cx="527322" cy="152400"/>
                       </a:xfrm>
                       <a:prstGeom prst="rect">
                         <a:avLst/>
@@ -13934,15 +13913,6 @@
                             </w:rPr>
                             <w:t>}</w:t>
                           </w:r>
-                        </w:p>
-                        <w:p>
-                          <w:pPr>
-                            <w:spacing w:before="12"/>
-                            <w:ind w:left="20"/>
-                            <w:rPr>
-                              <w:sz w:val="18"/>
-                            </w:rPr>
-                          </w:pPr>
                         </w:p>
                       </w:txbxContent>
                     </wps:txbx>
@@ -13955,15 +13925,12 @@
               <wp14:sizeRelH relativeFrom="margin">
                 <wp14:pctWidth>0</wp14:pctWidth>
               </wp14:sizeRelH>
-              <wp14:sizeRelV relativeFrom="margin">
-                <wp14:pctHeight>0</wp14:pctHeight>
-              </wp14:sizeRelV>
             </wp:anchor>
           </w:drawing>
         </mc:Choice>
         <mc:Fallback>
           <w:pict>
-            <v:shape w14:anchorId="29E5F682" id="Textbox 36" o:spid="_x0000_s1045" type="#_x0000_t202" style="position:absolute;margin-left:540.75pt;margin-top:141pt;width:42pt;height:11.25pt;z-index:-251608064;visibility:visible;mso-wrap-style:square;mso-width-percent:0;mso-height-percent:0;mso-wrap-distance-left:0;mso-wrap-distance-top:0;mso-wrap-distance-right:0;mso-wrap-distance-bottom:0;mso-position-horizontal:absolute;mso-position-horizontal-relative:page;mso-position-vertical:absolute;mso-position-vertical-relative:page;mso-width-percent:0;mso-height-percent:0;mso-width-relative:margin;mso-height-relative:margin;v-text-anchor:top" o:gfxdata="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" filled="f" stroked="f">
+            <v:shape w14:anchorId="6997D6B6" id="Textbox 10" o:spid="_x0000_s1028" type="#_x0000_t202" style="position:absolute;margin-left:543.3pt;margin-top:140.9pt;width:41.5pt;height:12pt;z-index:-251627520;visibility:visible;mso-wrap-style:square;mso-width-percent:0;mso-wrap-distance-left:0;mso-wrap-distance-top:0;mso-wrap-distance-right:0;mso-wrap-distance-bottom:0;mso-position-horizontal:absolute;mso-position-horizontal-relative:page;mso-position-vertical:absolute;mso-position-vertical-relative:page;mso-width-percent:0;mso-width-relative:margin;v-text-anchor:top" o:gfxdata="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" filled="f" stroked="f">
               <v:textbox inset="0,0,0,0">
                 <w:txbxContent>
                   <w:p>
@@ -14008,15 +13975,6 @@
                       </w:rPr>
                       <w:t>}</w:t>
                     </w:r>
-                  </w:p>
-                  <w:p>
-                    <w:pPr>
-                      <w:spacing w:before="12"/>
-                      <w:ind w:left="20"/>
-                      <w:rPr>
-                        <w:sz w:val="18"/>
-                      </w:rPr>
-                    </w:pPr>
                   </w:p>
                 </w:txbxContent>
               </v:textbox>
@@ -14035,18 +13993,18 @@
       <mc:AlternateContent>
         <mc:Choice Requires="wps">
           <w:drawing>
-            <wp:anchor distT="0" distB="0" distL="0" distR="0" simplePos="0" relativeHeight="251700224" behindDoc="1" locked="0" layoutInCell="1" allowOverlap="1" wp14:anchorId="10820FBA" wp14:editId="4BE90537">
+            <wp:anchor distT="0" distB="0" distL="0" distR="0" simplePos="0" relativeHeight="251680768" behindDoc="1" locked="0" layoutInCell="1" allowOverlap="1" wp14:anchorId="748918DC" wp14:editId="42CA9B3A">
               <wp:simplePos x="0" y="0"/>
               <wp:positionH relativeFrom="page">
-                <wp:posOffset>5229225</wp:posOffset>
+                <wp:posOffset>5222739</wp:posOffset>
               </wp:positionH>
               <wp:positionV relativeFrom="page">
-                <wp:posOffset>1790700</wp:posOffset>
+                <wp:posOffset>1789531</wp:posOffset>
               </wp:positionV>
-              <wp:extent cx="1619250" cy="171450"/>
+              <wp:extent cx="1626846" cy="158115"/>
               <wp:effectExtent l="0" t="0" r="0" b="0"/>
               <wp:wrapNone/>
-              <wp:docPr id="35" name="Textbox 35"/>
+              <wp:docPr id="9" name="Textbox 9"/>
               <wp:cNvGraphicFramePr>
                 <a:graphicFrameLocks xmlns:a="http://schemas.openxmlformats.org/drawingml/2006/main"/>
               </wp:cNvGraphicFramePr>
@@ -14059,7 +14017,7 @@
                     <wps:spPr>
                       <a:xfrm>
                         <a:off x="0" y="0"/>
-                        <a:ext cx="1619250" cy="171450"/>
+                        <a:ext cx="1626846" cy="158115"/>
                       </a:xfrm>
                       <a:prstGeom prst="rect">
                         <a:avLst/>
@@ -14168,15 +14126,12 @@
               <wp14:sizeRelH relativeFrom="margin">
                 <wp14:pctWidth>0</wp14:pctWidth>
               </wp14:sizeRelH>
-              <wp14:sizeRelV relativeFrom="margin">
-                <wp14:pctHeight>0</wp14:pctHeight>
-              </wp14:sizeRelV>
             </wp:anchor>
           </w:drawing>
         </mc:Choice>
         <mc:Fallback>
           <w:pict>
-            <v:shape w14:anchorId="10820FBA" id="Textbox 35" o:spid="_x0000_s1046" type="#_x0000_t202" style="position:absolute;margin-left:411.75pt;margin-top:141pt;width:127.5pt;height:13.5pt;z-index:-251616256;visibility:visible;mso-wrap-style:square;mso-width-percent:0;mso-height-percent:0;mso-wrap-distance-left:0;mso-wrap-distance-top:0;mso-wrap-distance-right:0;mso-wrap-distance-bottom:0;mso-position-horizontal:absolute;mso-position-horizontal-relative:page;mso-position-vertical:absolute;mso-position-vertical-relative:page;mso-width-percent:0;mso-height-percent:0;mso-width-relative:margin;mso-height-relative:margin;v-text-anchor:top" o:gfxdata="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" filled="f" stroked="f">
+            <v:shape w14:anchorId="748918DC" id="Textbox 9" o:spid="_x0000_s1029" type="#_x0000_t202" style="position:absolute;margin-left:411.25pt;margin-top:140.9pt;width:128.1pt;height:12.45pt;z-index:-251635712;visibility:visible;mso-wrap-style:square;mso-width-percent:0;mso-wrap-distance-left:0;mso-wrap-distance-top:0;mso-wrap-distance-right:0;mso-wrap-distance-bottom:0;mso-position-horizontal:absolute;mso-position-horizontal-relative:page;mso-position-vertical:absolute;mso-position-vertical-relative:page;mso-width-percent:0;mso-width-relative:margin;v-text-anchor:top" o:gfxdata="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" filled="f" stroked="f">
               <v:textbox inset="0,0,0,0">
                 <w:txbxContent>
                   <w:p>
@@ -14286,18 +14241,18 @@
       <mc:AlternateContent>
         <mc:Choice Requires="wps">
           <w:drawing>
-            <wp:anchor distT="0" distB="0" distL="0" distR="0" simplePos="0" relativeHeight="251689984" behindDoc="1" locked="0" layoutInCell="1" allowOverlap="1" wp14:anchorId="701FE6E0" wp14:editId="3397265D">
+            <wp:anchor distT="0" distB="0" distL="0" distR="0" simplePos="0" relativeHeight="251670528" behindDoc="1" locked="0" layoutInCell="1" allowOverlap="1" wp14:anchorId="6BC1ADC5" wp14:editId="1E075418">
               <wp:simplePos x="0" y="0"/>
               <wp:positionH relativeFrom="page">
-                <wp:posOffset>6753225</wp:posOffset>
+                <wp:posOffset>6748609</wp:posOffset>
               </wp:positionH>
               <wp:positionV relativeFrom="page">
-                <wp:posOffset>1495425</wp:posOffset>
+                <wp:posOffset>1497821</wp:posOffset>
               </wp:positionV>
-              <wp:extent cx="627380" cy="171450"/>
+              <wp:extent cx="605860" cy="152400"/>
               <wp:effectExtent l="0" t="0" r="0" b="0"/>
               <wp:wrapNone/>
-              <wp:docPr id="34" name="Textbox 34"/>
+              <wp:docPr id="8" name="Textbox 8"/>
               <wp:cNvGraphicFramePr>
                 <a:graphicFrameLocks xmlns:a="http://schemas.openxmlformats.org/drawingml/2006/main"/>
               </wp:cNvGraphicFramePr>
@@ -14310,7 +14265,7 @@
                     <wps:spPr>
                       <a:xfrm>
                         <a:off x="0" y="0"/>
-                        <a:ext cx="627380" cy="171450"/>
+                        <a:ext cx="605860" cy="152400"/>
                       </a:xfrm>
                       <a:prstGeom prst="rect">
                         <a:avLst/>
@@ -14349,15 +14304,6 @@
                             </w:rPr>
                             <w:t>}</w:t>
                           </w:r>
-                        </w:p>
-                        <w:p>
-                          <w:pPr>
-                            <w:spacing w:before="12"/>
-                            <w:ind w:left="20"/>
-                            <w:rPr>
-                              <w:sz w:val="18"/>
-                            </w:rPr>
-                          </w:pPr>
                         </w:p>
                       </w:txbxContent>
                     </wps:txbx>
@@ -14370,15 +14316,12 @@
               <wp14:sizeRelH relativeFrom="margin">
                 <wp14:pctWidth>0</wp14:pctWidth>
               </wp14:sizeRelH>
-              <wp14:sizeRelV relativeFrom="margin">
-                <wp14:pctHeight>0</wp14:pctHeight>
-              </wp14:sizeRelV>
             </wp:anchor>
           </w:drawing>
         </mc:Choice>
         <mc:Fallback>
           <w:pict>
-            <v:shape w14:anchorId="701FE6E0" id="Textbox 34" o:spid="_x0000_s1047" type="#_x0000_t202" style="position:absolute;margin-left:531.75pt;margin-top:117.75pt;width:49.4pt;height:13.5pt;z-index:-251626496;visibility:visible;mso-wrap-style:square;mso-width-percent:0;mso-height-percent:0;mso-wrap-distance-left:0;mso-wrap-distance-top:0;mso-wrap-distance-right:0;mso-wrap-distance-bottom:0;mso-position-horizontal:absolute;mso-position-horizontal-relative:page;mso-position-vertical:absolute;mso-position-vertical-relative:page;mso-width-percent:0;mso-height-percent:0;mso-width-relative:margin;mso-height-relative:margin;v-text-anchor:top" o:gfxdata="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" filled="f" stroked="f">
+            <v:shape w14:anchorId="6BC1ADC5" id="Textbox 8" o:spid="_x0000_s1030" type="#_x0000_t202" style="position:absolute;margin-left:531.4pt;margin-top:117.95pt;width:47.7pt;height:12pt;z-index:-251645952;visibility:visible;mso-wrap-style:square;mso-width-percent:0;mso-wrap-distance-left:0;mso-wrap-distance-top:0;mso-wrap-distance-right:0;mso-wrap-distance-bottom:0;mso-position-horizontal:absolute;mso-position-horizontal-relative:page;mso-position-vertical:absolute;mso-position-vertical-relative:page;mso-width-percent:0;mso-width-relative:margin;v-text-anchor:top" o:gfxdata="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" filled="f" stroked="f">
               <v:textbox inset="0,0,0,0">
                 <w:txbxContent>
                   <w:p>
@@ -14412,15 +14355,6 @@
                       </w:rPr>
                       <w:t>}</w:t>
                     </w:r>
-                  </w:p>
-                  <w:p>
-                    <w:pPr>
-                      <w:spacing w:before="12"/>
-                      <w:ind w:left="20"/>
-                      <w:rPr>
-                        <w:sz w:val="18"/>
-                      </w:rPr>
-                    </w:pPr>
                   </w:p>
                 </w:txbxContent>
               </v:textbox>
@@ -14439,18 +14373,18 @@
       <mc:AlternateContent>
         <mc:Choice Requires="wps">
           <w:drawing>
-            <wp:anchor distT="0" distB="0" distL="0" distR="0" simplePos="0" relativeHeight="251677696" behindDoc="1" locked="0" layoutInCell="1" allowOverlap="1" wp14:anchorId="543F42DF" wp14:editId="5BB934ED">
+            <wp:anchor distT="0" distB="0" distL="0" distR="0" simplePos="0" relativeHeight="251658240" behindDoc="1" locked="0" layoutInCell="1" allowOverlap="1" wp14:anchorId="6C53B098" wp14:editId="0AC9F008">
               <wp:simplePos x="0" y="0"/>
               <wp:positionH relativeFrom="page">
-                <wp:posOffset>5229225</wp:posOffset>
+                <wp:posOffset>5222739</wp:posOffset>
               </wp:positionH>
               <wp:positionV relativeFrom="page">
-                <wp:posOffset>1495425</wp:posOffset>
+                <wp:posOffset>1497821</wp:posOffset>
               </wp:positionV>
-              <wp:extent cx="1466850" cy="142875"/>
+              <wp:extent cx="1447332" cy="152400"/>
               <wp:effectExtent l="0" t="0" r="0" b="0"/>
               <wp:wrapNone/>
-              <wp:docPr id="33" name="Textbox 33"/>
+              <wp:docPr id="7" name="Textbox 7"/>
               <wp:cNvGraphicFramePr>
                 <a:graphicFrameLocks xmlns:a="http://schemas.openxmlformats.org/drawingml/2006/main"/>
               </wp:cNvGraphicFramePr>
@@ -14463,7 +14397,7 @@
                     <wps:spPr>
                       <a:xfrm>
                         <a:off x="0" y="0"/>
-                        <a:ext cx="1466850" cy="142875"/>
+                        <a:ext cx="1447332" cy="152400"/>
                       </a:xfrm>
                       <a:prstGeom prst="rect">
                         <a:avLst/>
@@ -14559,15 +14493,12 @@
               <wp14:sizeRelH relativeFrom="margin">
                 <wp14:pctWidth>0</wp14:pctWidth>
               </wp14:sizeRelH>
-              <wp14:sizeRelV relativeFrom="margin">
-                <wp14:pctHeight>0</wp14:pctHeight>
-              </wp14:sizeRelV>
             </wp:anchor>
           </w:drawing>
         </mc:Choice>
         <mc:Fallback>
           <w:pict>
-            <v:shape w14:anchorId="543F42DF" id="Textbox 33" o:spid="_x0000_s1048" type="#_x0000_t202" style="position:absolute;margin-left:411.75pt;margin-top:117.75pt;width:115.5pt;height:11.25pt;z-index:-251638784;visibility:visible;mso-wrap-style:square;mso-width-percent:0;mso-height-percent:0;mso-wrap-distance-left:0;mso-wrap-distance-top:0;mso-wrap-distance-right:0;mso-wrap-distance-bottom:0;mso-position-horizontal:absolute;mso-position-horizontal-relative:page;mso-position-vertical:absolute;mso-position-vertical-relative:page;mso-width-percent:0;mso-height-percent:0;mso-width-relative:margin;mso-height-relative:margin;v-text-anchor:top" o:gfxdata="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" filled="f" stroked="f">
+            <v:shape w14:anchorId="6C53B098" id="Textbox 7" o:spid="_x0000_s1031" type="#_x0000_t202" style="position:absolute;margin-left:411.25pt;margin-top:117.95pt;width:113.95pt;height:12pt;z-index:-251658240;visibility:visible;mso-wrap-style:square;mso-width-percent:0;mso-wrap-distance-left:0;mso-wrap-distance-top:0;mso-wrap-distance-right:0;mso-wrap-distance-bottom:0;mso-position-horizontal:absolute;mso-position-horizontal-relative:page;mso-position-vertical:absolute;mso-position-vertical-relative:page;mso-width-percent:0;mso-width-relative:margin;v-text-anchor:top" o:gfxdata="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" filled="f" stroked="f">
               <v:textbox inset="0,0,0,0">
                 <w:txbxContent>
                   <w:p>
@@ -14664,18 +14595,18 @@
       <mc:AlternateContent>
         <mc:Choice Requires="wps">
           <w:drawing>
-            <wp:anchor distT="0" distB="0" distL="0" distR="0" simplePos="0" relativeHeight="251751424" behindDoc="1" locked="0" layoutInCell="1" allowOverlap="1" wp14:anchorId="2F1125BB" wp14:editId="6D5612EF">
+            <wp:anchor distT="0" distB="0" distL="0" distR="0" simplePos="0" relativeHeight="251727872" behindDoc="1" locked="0" layoutInCell="1" allowOverlap="1" wp14:anchorId="4106CB45" wp14:editId="14450084">
               <wp:simplePos x="0" y="0"/>
               <wp:positionH relativeFrom="page">
-                <wp:posOffset>866775</wp:posOffset>
+                <wp:posOffset>201952</wp:posOffset>
               </wp:positionH>
               <wp:positionV relativeFrom="page">
-                <wp:posOffset>2105024</wp:posOffset>
+                <wp:posOffset>2103681</wp:posOffset>
               </wp:positionV>
-              <wp:extent cx="4048125" cy="161925"/>
+              <wp:extent cx="4499073" cy="152400"/>
               <wp:effectExtent l="0" t="0" r="0" b="0"/>
               <wp:wrapNone/>
-              <wp:docPr id="43" name="Textbox 43"/>
+              <wp:docPr id="16" name="Textbox 16"/>
               <wp:cNvGraphicFramePr>
                 <a:graphicFrameLocks xmlns:a="http://schemas.openxmlformats.org/drawingml/2006/main"/>
               </wp:cNvGraphicFramePr>
@@ -14688,7 +14619,7 @@
                     <wps:spPr>
                       <a:xfrm>
                         <a:off x="0" y="0"/>
-                        <a:ext cx="4048125" cy="161925"/>
+                        <a:ext cx="4499073" cy="152400"/>
                       </a:xfrm>
                       <a:prstGeom prst="rect">
                         <a:avLst/>
@@ -14704,6 +14635,21 @@
                               <w:sz w:val="18"/>
                             </w:rPr>
                           </w:pPr>
+                          <w:r>
+                            <w:rPr>
+                              <w:b/>
+                              <w:sz w:val="18"/>
+                            </w:rPr>
+                            <w:t>Paciente:</w:t>
+                          </w:r>
+                          <w:r>
+                            <w:rPr>
+                              <w:b/>
+                              <w:spacing w:val="-12"/>
+                              <w:sz w:val="18"/>
+                            </w:rPr>
+                            <w:t xml:space="preserve"> </w:t>
+                          </w:r>
                           <w:r>
                             <w:rPr>
                               <w:sz w:val="18"/>
@@ -14736,15 +14682,12 @@
               <wp14:sizeRelH relativeFrom="margin">
                 <wp14:pctWidth>0</wp14:pctWidth>
               </wp14:sizeRelH>
-              <wp14:sizeRelV relativeFrom="margin">
-                <wp14:pctHeight>0</wp14:pctHeight>
-              </wp14:sizeRelV>
             </wp:anchor>
           </w:drawing>
         </mc:Choice>
         <mc:Fallback>
           <w:pict>
-            <v:shape w14:anchorId="2F1125BB" id="Textbox 43" o:spid="_x0000_s1049" type="#_x0000_t202" style="position:absolute;margin-left:68.25pt;margin-top:165.75pt;width:318.75pt;height:12.75pt;z-index:-251565056;visibility:visible;mso-wrap-style:square;mso-width-percent:0;mso-height-percent:0;mso-wrap-distance-left:0;mso-wrap-distance-top:0;mso-wrap-distance-right:0;mso-wrap-distance-bottom:0;mso-position-horizontal:absolute;mso-position-horizontal-relative:page;mso-position-vertical:absolute;mso-position-vertical-relative:page;mso-width-percent:0;mso-height-percent:0;mso-width-relative:margin;mso-height-relative:margin;v-text-anchor:top" o:gfxdata="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" filled="f" stroked="f">
+            <v:shape w14:anchorId="4106CB45" id="Textbox 16" o:spid="_x0000_s1032" type="#_x0000_t202" style="position:absolute;margin-left:15.9pt;margin-top:165.65pt;width:354.25pt;height:12pt;z-index:-251588608;visibility:visible;mso-wrap-style:square;mso-width-percent:0;mso-wrap-distance-left:0;mso-wrap-distance-top:0;mso-wrap-distance-right:0;mso-wrap-distance-bottom:0;mso-position-horizontal:absolute;mso-position-horizontal-relative:page;mso-position-vertical:absolute;mso-position-vertical-relative:page;mso-width-percent:0;mso-width-relative:margin;v-text-anchor:top" o:gfxdata="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" filled="f" stroked="f">
               <v:textbox inset="0,0,0,0">
                 <w:txbxContent>
                   <w:p>
@@ -14757,182 +14700,38 @@
                     </w:pPr>
                     <w:r>
                       <w:rPr>
-                        <w:sz w:val="18"/>
-                      </w:rPr>
-                      <w:t>{</w:t>
-                    </w:r>
-                    <w:proofErr w:type="spellStart"/>
-                    <w:r>
-                      <w:rPr>
-                        <w:sz w:val="18"/>
-                      </w:rPr>
-                      <w:t>paciente_nombre_completo</w:t>
-                    </w:r>
-                    <w:proofErr w:type="spellEnd"/>
-                    <w:r>
-                      <w:rPr>
-                        <w:sz w:val="18"/>
-                      </w:rPr>
-                      <w:t>}</w:t>
-                    </w:r>
-                  </w:p>
-                </w:txbxContent>
-              </v:textbox>
-              <w10:wrap anchorx="page" anchory="page"/>
-            </v:shape>
-          </w:pict>
-        </mc:Fallback>
-      </mc:AlternateContent>
-    </w:r>
-    <w:r>
-      <w:rPr>
-        <w:i w:val="0"/>
-        <w:noProof/>
-        <w:sz w:val="20"/>
-      </w:rPr>
-      <mc:AlternateContent>
-        <mc:Choice Requires="wps">
-          <w:drawing>
-            <wp:anchor distT="0" distB="0" distL="0" distR="0" simplePos="0" relativeHeight="251577344" behindDoc="1" locked="0" layoutInCell="1" allowOverlap="1" wp14:anchorId="7966B1D9" wp14:editId="73C1DA33">
-              <wp:simplePos x="0" y="0"/>
-              <wp:positionH relativeFrom="page">
-                <wp:posOffset>2005838</wp:posOffset>
-              </wp:positionH>
-              <wp:positionV relativeFrom="page">
-                <wp:posOffset>1777491</wp:posOffset>
-              </wp:positionV>
-              <wp:extent cx="1043305" cy="127000"/>
-              <wp:effectExtent l="0" t="0" r="0" b="0"/>
-              <wp:wrapNone/>
-              <wp:docPr id="26" name="Textbox 26"/>
-              <wp:cNvGraphicFramePr>
-                <a:graphicFrameLocks xmlns:a="http://schemas.openxmlformats.org/drawingml/2006/main"/>
-              </wp:cNvGraphicFramePr>
-              <a:graphic xmlns:a="http://schemas.openxmlformats.org/drawingml/2006/main">
-                <a:graphicData uri="http://schemas.microsoft.com/office/word/2010/wordprocessingShape">
-                  <wps:wsp>
-                    <wps:cNvSpPr txBox="1">
-                      <a:spLocks/>
-                    </wps:cNvSpPr>
-                    <wps:spPr>
-                      <a:xfrm>
-                        <a:off x="0" y="0"/>
-                        <a:ext cx="1043305" cy="127000"/>
-                      </a:xfrm>
-                      <a:prstGeom prst="rect">
-                        <a:avLst/>
-                      </a:prstGeom>
-                    </wps:spPr>
-                    <wps:txbx>
-                      <w:txbxContent>
-                        <w:p>
-                          <w:pPr>
-                            <w:spacing w:line="199" w:lineRule="exact"/>
-                            <w:rPr>
-                              <w:b/>
-                              <w:sz w:val="18"/>
-                            </w:rPr>
-                          </w:pPr>
-                          <w:r>
-                            <w:rPr>
-                              <w:b/>
-                              <w:sz w:val="18"/>
-                            </w:rPr>
-                            <w:t>Fecha</w:t>
-                          </w:r>
-                          <w:r>
-                            <w:rPr>
-                              <w:b/>
-                              <w:spacing w:val="-5"/>
-                              <w:sz w:val="18"/>
-                            </w:rPr>
-                            <w:t xml:space="preserve"> </w:t>
-                          </w:r>
-                          <w:r>
-                            <w:rPr>
-                              <w:b/>
-                              <w:sz w:val="18"/>
-                            </w:rPr>
-                            <w:t>de</w:t>
-                          </w:r>
-                          <w:r>
-                            <w:rPr>
-                              <w:b/>
-                              <w:spacing w:val="-5"/>
-                              <w:sz w:val="18"/>
-                            </w:rPr>
-                            <w:t xml:space="preserve"> </w:t>
-                          </w:r>
-                          <w:r>
-                            <w:rPr>
-                              <w:b/>
-                              <w:spacing w:val="-4"/>
-                              <w:sz w:val="18"/>
-                            </w:rPr>
-                            <w:t>Nacimiento:</w:t>
-                          </w:r>
-                        </w:p>
-                      </w:txbxContent>
-                    </wps:txbx>
-                    <wps:bodyPr wrap="square" lIns="0" tIns="0" rIns="0" bIns="0" rtlCol="0">
-                      <a:noAutofit/>
-                    </wps:bodyPr>
-                  </wps:wsp>
-                </a:graphicData>
-              </a:graphic>
-            </wp:anchor>
-          </w:drawing>
-        </mc:Choice>
-        <mc:Fallback>
-          <w:pict>
-            <v:shape w14:anchorId="7966B1D9" id="Textbox 26" o:spid="_x0000_s1050" type="#_x0000_t202" style="position:absolute;margin-left:157.95pt;margin-top:139.95pt;width:82.15pt;height:10pt;z-index:-251739136;visibility:visible;mso-wrap-style:square;mso-wrap-distance-left:0;mso-wrap-distance-top:0;mso-wrap-distance-right:0;mso-wrap-distance-bottom:0;mso-position-horizontal:absolute;mso-position-horizontal-relative:page;mso-position-vertical:absolute;mso-position-vertical-relative:page;v-text-anchor:top" o:gfxdata="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" filled="f" stroked="f">
-              <v:textbox inset="0,0,0,0">
-                <w:txbxContent>
-                  <w:p>
-                    <w:pPr>
-                      <w:spacing w:line="199" w:lineRule="exact"/>
-                      <w:rPr>
                         <w:b/>
                         <w:sz w:val="18"/>
                       </w:rPr>
-                    </w:pPr>
+                      <w:t>Paciente:</w:t>
+                    </w:r>
                     <w:r>
                       <w:rPr>
                         <w:b/>
+                        <w:spacing w:val="-12"/>
                         <w:sz w:val="18"/>
                       </w:rPr>
-                      <w:t>Fecha</w:t>
-                    </w:r>
-                    <w:r>
-                      <w:rPr>
-                        <w:b/>
-                        <w:spacing w:val="-5"/>
+                      <w:t xml:space="preserve"> </w:t>
+                    </w:r>
+                    <w:r>
+                      <w:rPr>
                         <w:sz w:val="18"/>
                       </w:rPr>
-                      <w:t xml:space="preserve"> </w:t>
-                    </w:r>
-                    <w:r>
-                      <w:rPr>
-                        <w:b/>
+                      <w:t>{</w:t>
+                    </w:r>
+                    <w:proofErr w:type="spellStart"/>
+                    <w:r>
+                      <w:rPr>
                         <w:sz w:val="18"/>
                       </w:rPr>
-                      <w:t>de</w:t>
-                    </w:r>
-                    <w:r>
-                      <w:rPr>
-                        <w:b/>
-                        <w:spacing w:val="-5"/>
+                      <w:t>paciente_nombre_completo</w:t>
+                    </w:r>
+                    <w:proofErr w:type="spellEnd"/>
+                    <w:r>
+                      <w:rPr>
                         <w:sz w:val="18"/>
                       </w:rPr>
-                      <w:t xml:space="preserve"> </w:t>
-                    </w:r>
-                    <w:r>
-                      <w:rPr>
-                        <w:b/>
-                        <w:spacing w:val="-4"/>
-                        <w:sz w:val="18"/>
-                      </w:rPr>
-                      <w:t>Nacimiento:</w:t>
+                      <w:t>}</w:t>
                     </w:r>
                   </w:p>
                 </w:txbxContent>
@@ -14950,7 +14749,7 @@
         <w:sz w:val="20"/>
       </w:rPr>
       <w:drawing>
-        <wp:anchor distT="0" distB="0" distL="0" distR="0" simplePos="0" relativeHeight="251591680" behindDoc="1" locked="0" layoutInCell="1" allowOverlap="1" wp14:anchorId="6EDCC6D8" wp14:editId="26C53119">
+        <wp:anchor distT="0" distB="0" distL="0" distR="0" simplePos="0" relativeHeight="251600896" behindDoc="1" locked="0" layoutInCell="1" allowOverlap="1" wp14:anchorId="750A143C" wp14:editId="1EB72933">
           <wp:simplePos x="0" y="0"/>
           <wp:positionH relativeFrom="page">
             <wp:posOffset>108586</wp:posOffset>
@@ -14961,7 +14760,7 @@
           <wp:extent cx="7415530" cy="951865"/>
           <wp:effectExtent l="0" t="0" r="0" b="0"/>
           <wp:wrapNone/>
-          <wp:docPr id="27" name="Image 27"/>
+          <wp:docPr id="1" name="Image 1"/>
           <wp:cNvGraphicFramePr>
             <a:graphicFrameLocks xmlns:a="http://schemas.openxmlformats.org/drawingml/2006/main"/>
           </wp:cNvGraphicFramePr>
@@ -14969,7 +14768,7 @@
             <a:graphicData uri="http://schemas.openxmlformats.org/drawingml/2006/picture">
               <pic:pic xmlns:pic="http://schemas.openxmlformats.org/drawingml/2006/picture">
                 <pic:nvPicPr>
-                  <pic:cNvPr id="27" name="Image 27"/>
+                  <pic:cNvPr id="1" name="Image 1"/>
                   <pic:cNvPicPr/>
                 </pic:nvPicPr>
                 <pic:blipFill>
@@ -15000,108 +14799,895 @@
         <w:sz w:val="20"/>
       </w:rPr>
       <mc:AlternateContent>
-        <mc:Choice Requires="wps">
+        <mc:Choice Requires="wpg">
           <w:drawing>
-            <wp:anchor distT="0" distB="0" distL="0" distR="0" simplePos="0" relativeHeight="251606016" behindDoc="1" locked="0" layoutInCell="1" allowOverlap="1" wp14:anchorId="75F963D2" wp14:editId="7B776406">
+            <wp:anchor distT="0" distB="0" distL="0" distR="0" simplePos="0" relativeHeight="251615232" behindDoc="1" locked="0" layoutInCell="1" allowOverlap="1" wp14:anchorId="73B4567A" wp14:editId="68667510">
               <wp:simplePos x="0" y="0"/>
               <wp:positionH relativeFrom="page">
-                <wp:posOffset>220980</wp:posOffset>
+                <wp:posOffset>214617</wp:posOffset>
               </wp:positionH>
               <wp:positionV relativeFrom="page">
-                <wp:posOffset>1440433</wp:posOffset>
+                <wp:posOffset>1432560</wp:posOffset>
               </wp:positionV>
-              <wp:extent cx="7161530" cy="850900"/>
+              <wp:extent cx="7163434" cy="858519"/>
               <wp:effectExtent l="0" t="0" r="0" b="0"/>
               <wp:wrapNone/>
-              <wp:docPr id="28" name="Graphic 28"/>
+              <wp:docPr id="2" name="Group 2"/>
               <wp:cNvGraphicFramePr>
                 <a:graphicFrameLocks xmlns:a="http://schemas.openxmlformats.org/drawingml/2006/main"/>
               </wp:cNvGraphicFramePr>
               <a:graphic xmlns:a="http://schemas.openxmlformats.org/drawingml/2006/main">
-                <a:graphicData uri="http://schemas.microsoft.com/office/word/2010/wordprocessingShape">
-                  <wps:wsp>
-                    <wps:cNvSpPr>
-                      <a:spLocks/>
-                    </wps:cNvSpPr>
-                    <wps:spPr>
+                <a:graphicData uri="http://schemas.microsoft.com/office/word/2010/wordprocessingGroup">
+                  <wpg:wgp>
+                    <wpg:cNvGrpSpPr>
+                      <a:grpSpLocks/>
+                    </wpg:cNvGrpSpPr>
+                    <wpg:grpSpPr>
                       <a:xfrm>
                         <a:off x="0" y="0"/>
-                        <a:ext cx="7161530" cy="850900"/>
+                        <a:ext cx="7163434" cy="858519"/>
+                        <a:chOff x="0" y="0"/>
+                        <a:chExt cx="7163434" cy="858519"/>
                       </a:xfrm>
-                      <a:custGeom>
-                        <a:avLst/>
-                        <a:gdLst/>
-                        <a:ahLst/>
-                        <a:cxnLst/>
-                        <a:rect l="l" t="t" r="r" b="b"/>
-                        <a:pathLst>
-                          <a:path w="7161530" h="850900">
-                            <a:moveTo>
-                              <a:pt x="7161276" y="0"/>
-                            </a:moveTo>
-                            <a:lnTo>
-                              <a:pt x="5004562" y="0"/>
-                            </a:lnTo>
-                            <a:lnTo>
-                              <a:pt x="2929763" y="0"/>
-                            </a:lnTo>
-                            <a:lnTo>
-                              <a:pt x="2929763" y="312420"/>
-                            </a:lnTo>
-                            <a:lnTo>
-                              <a:pt x="2929763" y="647700"/>
-                            </a:lnTo>
-                            <a:lnTo>
-                              <a:pt x="2929686" y="312420"/>
-                            </a:lnTo>
-                            <a:lnTo>
-                              <a:pt x="2929686" y="0"/>
-                            </a:lnTo>
-                            <a:lnTo>
-                              <a:pt x="1790954" y="0"/>
-                            </a:lnTo>
-                            <a:lnTo>
-                              <a:pt x="1790954" y="312420"/>
-                            </a:lnTo>
-                            <a:lnTo>
-                              <a:pt x="1790954" y="647700"/>
-                            </a:lnTo>
-                            <a:lnTo>
-                              <a:pt x="0" y="647700"/>
-                            </a:lnTo>
-                            <a:lnTo>
-                              <a:pt x="0" y="850392"/>
-                            </a:lnTo>
-                            <a:lnTo>
-                              <a:pt x="5004562" y="850392"/>
-                            </a:lnTo>
-                            <a:lnTo>
-                              <a:pt x="7161276" y="850392"/>
-                            </a:lnTo>
-                            <a:lnTo>
-                              <a:pt x="7161276" y="632460"/>
-                            </a:lnTo>
-                            <a:lnTo>
-                              <a:pt x="7161276" y="312420"/>
-                            </a:lnTo>
-                            <a:lnTo>
-                              <a:pt x="7161276" y="0"/>
-                            </a:lnTo>
-                            <a:close/>
-                          </a:path>
-                        </a:pathLst>
-                      </a:custGeom>
-                      <a:solidFill>
-                        <a:srgbClr val="EAE4E4"/>
-                      </a:solidFill>
-                    </wps:spPr>
-                    <wps:bodyPr wrap="square" lIns="0" tIns="0" rIns="0" bIns="0" rtlCol="0">
-                      <a:prstTxWarp prst="textNoShape">
-                        <a:avLst/>
-                      </a:prstTxWarp>
-                      <a:noAutofit/>
-                    </wps:bodyPr>
-                  </wps:wsp>
+                    </wpg:grpSpPr>
+                    <wps:wsp>
+                      <wps:cNvPr id="3" name="Graphic 3"/>
+                      <wps:cNvSpPr/>
+                      <wps:spPr>
+                        <a:xfrm>
+                          <a:off x="0" y="0"/>
+                          <a:ext cx="7163434" cy="858519"/>
+                        </a:xfrm>
+                        <a:custGeom>
+                          <a:avLst/>
+                          <a:gdLst/>
+                          <a:ahLst/>
+                          <a:cxnLst/>
+                          <a:rect l="l" t="t" r="r" b="b"/>
+                          <a:pathLst>
+                            <a:path w="7163434" h="858519">
+                              <a:moveTo>
+                                <a:pt x="5004066" y="0"/>
+                              </a:moveTo>
+                              <a:lnTo>
+                                <a:pt x="3024136" y="0"/>
+                              </a:lnTo>
+                              <a:lnTo>
+                                <a:pt x="3024136" y="7620"/>
+                              </a:lnTo>
+                              <a:lnTo>
+                                <a:pt x="3024136" y="160020"/>
+                              </a:lnTo>
+                              <a:lnTo>
+                                <a:pt x="3022612" y="160020"/>
+                              </a:lnTo>
+                              <a:lnTo>
+                                <a:pt x="3022612" y="177800"/>
+                              </a:lnTo>
+                              <a:lnTo>
+                                <a:pt x="3022612" y="185420"/>
+                              </a:lnTo>
+                              <a:lnTo>
+                                <a:pt x="3022612" y="655320"/>
+                              </a:lnTo>
+                              <a:lnTo>
+                                <a:pt x="2997212" y="655320"/>
+                              </a:lnTo>
+                              <a:lnTo>
+                                <a:pt x="2997212" y="185420"/>
+                              </a:lnTo>
+                              <a:lnTo>
+                                <a:pt x="3009912" y="185420"/>
+                              </a:lnTo>
+                              <a:lnTo>
+                                <a:pt x="3009912" y="177800"/>
+                              </a:lnTo>
+                              <a:lnTo>
+                                <a:pt x="3009912" y="160020"/>
+                              </a:lnTo>
+                              <a:lnTo>
+                                <a:pt x="3009912" y="7620"/>
+                              </a:lnTo>
+                              <a:lnTo>
+                                <a:pt x="1790712" y="7620"/>
+                              </a:lnTo>
+                              <a:lnTo>
+                                <a:pt x="1790712" y="160020"/>
+                              </a:lnTo>
+                              <a:lnTo>
+                                <a:pt x="1790712" y="177800"/>
+                              </a:lnTo>
+                              <a:lnTo>
+                                <a:pt x="1790712" y="185420"/>
+                              </a:lnTo>
+                              <a:lnTo>
+                                <a:pt x="1790712" y="655320"/>
+                              </a:lnTo>
+                              <a:lnTo>
+                                <a:pt x="660400" y="655320"/>
+                              </a:lnTo>
+                              <a:lnTo>
+                                <a:pt x="660400" y="695960"/>
+                              </a:lnTo>
+                              <a:lnTo>
+                                <a:pt x="0" y="695960"/>
+                              </a:lnTo>
+                              <a:lnTo>
+                                <a:pt x="0" y="858520"/>
+                              </a:lnTo>
+                              <a:lnTo>
+                                <a:pt x="4991112" y="858520"/>
+                              </a:lnTo>
+                              <a:lnTo>
+                                <a:pt x="4991112" y="695960"/>
+                              </a:lnTo>
+                              <a:lnTo>
+                                <a:pt x="4991112" y="655320"/>
+                              </a:lnTo>
+                              <a:lnTo>
+                                <a:pt x="4991112" y="185420"/>
+                              </a:lnTo>
+                              <a:lnTo>
+                                <a:pt x="4991112" y="177800"/>
+                              </a:lnTo>
+                              <a:lnTo>
+                                <a:pt x="5004066" y="177800"/>
+                              </a:lnTo>
+                              <a:lnTo>
+                                <a:pt x="5004066" y="160020"/>
+                              </a:lnTo>
+                              <a:lnTo>
+                                <a:pt x="5004066" y="7620"/>
+                              </a:lnTo>
+                              <a:lnTo>
+                                <a:pt x="5004066" y="0"/>
+                              </a:lnTo>
+                              <a:close/>
+                            </a:path>
+                            <a:path w="7163434" h="858519">
+                              <a:moveTo>
+                                <a:pt x="7162813" y="7620"/>
+                              </a:moveTo>
+                              <a:lnTo>
+                                <a:pt x="5829312" y="7620"/>
+                              </a:lnTo>
+                              <a:lnTo>
+                                <a:pt x="5829312" y="7239"/>
+                              </a:lnTo>
+                              <a:lnTo>
+                                <a:pt x="5016512" y="7239"/>
+                              </a:lnTo>
+                              <a:lnTo>
+                                <a:pt x="5016512" y="858139"/>
+                              </a:lnTo>
+                              <a:lnTo>
+                                <a:pt x="5372112" y="858139"/>
+                              </a:lnTo>
+                              <a:lnTo>
+                                <a:pt x="5372112" y="858520"/>
+                              </a:lnTo>
+                              <a:lnTo>
+                                <a:pt x="6159512" y="858520"/>
+                              </a:lnTo>
+                              <a:lnTo>
+                                <a:pt x="6159512" y="858139"/>
+                              </a:lnTo>
+                              <a:lnTo>
+                                <a:pt x="7162813" y="858139"/>
+                              </a:lnTo>
+                              <a:lnTo>
+                                <a:pt x="7162813" y="7620"/>
+                              </a:lnTo>
+                              <a:close/>
+                            </a:path>
+                          </a:pathLst>
+                        </a:custGeom>
+                        <a:solidFill>
+                          <a:srgbClr val="EAE4E4"/>
+                        </a:solidFill>
+                      </wps:spPr>
+                      <wps:bodyPr wrap="square" lIns="0" tIns="0" rIns="0" bIns="0" rtlCol="0">
+                        <a:prstTxWarp prst="textNoShape">
+                          <a:avLst/>
+                        </a:prstTxWarp>
+                        <a:noAutofit/>
+                      </wps:bodyPr>
+                    </wps:wsp>
+                    <wps:wsp>
+                      <wps:cNvPr id="4" name="Graphic 4"/>
+                      <wps:cNvSpPr/>
+                      <wps:spPr>
+                        <a:xfrm>
+                          <a:off x="263537" y="49237"/>
+                          <a:ext cx="1250315" cy="438150"/>
+                        </a:xfrm>
+                        <a:custGeom>
+                          <a:avLst/>
+                          <a:gdLst/>
+                          <a:ahLst/>
+                          <a:cxnLst/>
+                          <a:rect l="l" t="t" r="r" b="b"/>
+                          <a:pathLst>
+                            <a:path w="1250315" h="438150">
+                              <a:moveTo>
+                                <a:pt x="18656" y="0"/>
+                              </a:moveTo>
+                              <a:lnTo>
+                                <a:pt x="0" y="0"/>
+                              </a:lnTo>
+                              <a:lnTo>
+                                <a:pt x="0" y="437553"/>
+                              </a:lnTo>
+                              <a:lnTo>
+                                <a:pt x="18656" y="437553"/>
+                              </a:lnTo>
+                              <a:lnTo>
+                                <a:pt x="18656" y="0"/>
+                              </a:lnTo>
+                              <a:close/>
+                            </a:path>
+                            <a:path w="1250315" h="438150">
+                              <a:moveTo>
+                                <a:pt x="37299" y="0"/>
+                              </a:moveTo>
+                              <a:lnTo>
+                                <a:pt x="27978" y="0"/>
+                              </a:lnTo>
+                              <a:lnTo>
+                                <a:pt x="27978" y="437553"/>
+                              </a:lnTo>
+                              <a:lnTo>
+                                <a:pt x="37299" y="437553"/>
+                              </a:lnTo>
+                              <a:lnTo>
+                                <a:pt x="37299" y="0"/>
+                              </a:lnTo>
+                              <a:close/>
+                            </a:path>
+                            <a:path w="1250315" h="438150">
+                              <a:moveTo>
+                                <a:pt x="65278" y="0"/>
+                              </a:moveTo>
+                              <a:lnTo>
+                                <a:pt x="55956" y="0"/>
+                              </a:lnTo>
+                              <a:lnTo>
+                                <a:pt x="55956" y="437553"/>
+                              </a:lnTo>
+                              <a:lnTo>
+                                <a:pt x="65278" y="437553"/>
+                              </a:lnTo>
+                              <a:lnTo>
+                                <a:pt x="65278" y="0"/>
+                              </a:lnTo>
+                              <a:close/>
+                            </a:path>
+                            <a:path w="1250315" h="438150">
+                              <a:moveTo>
+                                <a:pt x="121246" y="0"/>
+                              </a:moveTo>
+                              <a:lnTo>
+                                <a:pt x="102590" y="0"/>
+                              </a:lnTo>
+                              <a:lnTo>
+                                <a:pt x="102590" y="437553"/>
+                              </a:lnTo>
+                              <a:lnTo>
+                                <a:pt x="121246" y="437553"/>
+                              </a:lnTo>
+                              <a:lnTo>
+                                <a:pt x="121246" y="0"/>
+                              </a:lnTo>
+                              <a:close/>
+                            </a:path>
+                            <a:path w="1250315" h="438150">
+                              <a:moveTo>
+                                <a:pt x="158534" y="0"/>
+                              </a:moveTo>
+                              <a:lnTo>
+                                <a:pt x="149225" y="0"/>
+                              </a:lnTo>
+                              <a:lnTo>
+                                <a:pt x="149225" y="437553"/>
+                              </a:lnTo>
+                              <a:lnTo>
+                                <a:pt x="158534" y="437553"/>
+                              </a:lnTo>
+                              <a:lnTo>
+                                <a:pt x="158534" y="0"/>
+                              </a:lnTo>
+                              <a:close/>
+                            </a:path>
+                            <a:path w="1250315" h="438150">
+                              <a:moveTo>
+                                <a:pt x="195859" y="0"/>
+                              </a:moveTo>
+                              <a:lnTo>
+                                <a:pt x="167881" y="0"/>
+                              </a:lnTo>
+                              <a:lnTo>
+                                <a:pt x="167881" y="437553"/>
+                              </a:lnTo>
+                              <a:lnTo>
+                                <a:pt x="195859" y="437553"/>
+                              </a:lnTo>
+                              <a:lnTo>
+                                <a:pt x="195859" y="0"/>
+                              </a:lnTo>
+                              <a:close/>
+                            </a:path>
+                            <a:path w="1250315" h="438150">
+                              <a:moveTo>
+                                <a:pt x="223824" y="0"/>
+                              </a:moveTo>
+                              <a:lnTo>
+                                <a:pt x="205181" y="0"/>
+                              </a:lnTo>
+                              <a:lnTo>
+                                <a:pt x="205181" y="437553"/>
+                              </a:lnTo>
+                              <a:lnTo>
+                                <a:pt x="223824" y="437553"/>
+                              </a:lnTo>
+                              <a:lnTo>
+                                <a:pt x="223824" y="0"/>
+                              </a:lnTo>
+                              <a:close/>
+                            </a:path>
+                            <a:path w="1250315" h="438150">
+                              <a:moveTo>
+                                <a:pt x="261137" y="0"/>
+                              </a:moveTo>
+                              <a:lnTo>
+                                <a:pt x="233159" y="0"/>
+                              </a:lnTo>
+                              <a:lnTo>
+                                <a:pt x="233159" y="437553"/>
+                              </a:lnTo>
+                              <a:lnTo>
+                                <a:pt x="261137" y="437553"/>
+                              </a:lnTo>
+                              <a:lnTo>
+                                <a:pt x="261137" y="0"/>
+                              </a:lnTo>
+                              <a:close/>
+                            </a:path>
+                            <a:path w="1250315" h="438150">
+                              <a:moveTo>
+                                <a:pt x="279781" y="0"/>
+                              </a:moveTo>
+                              <a:lnTo>
+                                <a:pt x="270459" y="0"/>
+                              </a:lnTo>
+                              <a:lnTo>
+                                <a:pt x="270459" y="437553"/>
+                              </a:lnTo>
+                              <a:lnTo>
+                                <a:pt x="279781" y="437553"/>
+                              </a:lnTo>
+                              <a:lnTo>
+                                <a:pt x="279781" y="0"/>
+                              </a:lnTo>
+                              <a:close/>
+                            </a:path>
+                            <a:path w="1250315" h="438150">
+                              <a:moveTo>
+                                <a:pt x="335749" y="0"/>
+                              </a:moveTo>
+                              <a:lnTo>
+                                <a:pt x="307771" y="0"/>
+                              </a:lnTo>
+                              <a:lnTo>
+                                <a:pt x="307771" y="437553"/>
+                              </a:lnTo>
+                              <a:lnTo>
+                                <a:pt x="335749" y="437553"/>
+                              </a:lnTo>
+                              <a:lnTo>
+                                <a:pt x="335749" y="0"/>
+                              </a:lnTo>
+                              <a:close/>
+                            </a:path>
+                            <a:path w="1250315" h="438150">
+                              <a:moveTo>
+                                <a:pt x="354406" y="0"/>
+                              </a:moveTo>
+                              <a:lnTo>
+                                <a:pt x="345071" y="0"/>
+                              </a:lnTo>
+                              <a:lnTo>
+                                <a:pt x="345071" y="437553"/>
+                              </a:lnTo>
+                              <a:lnTo>
+                                <a:pt x="354406" y="437553"/>
+                              </a:lnTo>
+                              <a:lnTo>
+                                <a:pt x="354406" y="0"/>
+                              </a:lnTo>
+                              <a:close/>
+                            </a:path>
+                            <a:path w="1250315" h="438150">
+                              <a:moveTo>
+                                <a:pt x="382384" y="0"/>
+                              </a:moveTo>
+                              <a:lnTo>
+                                <a:pt x="363728" y="0"/>
+                              </a:lnTo>
+                              <a:lnTo>
+                                <a:pt x="363728" y="437553"/>
+                              </a:lnTo>
+                              <a:lnTo>
+                                <a:pt x="382384" y="437553"/>
+                              </a:lnTo>
+                              <a:lnTo>
+                                <a:pt x="382384" y="0"/>
+                              </a:lnTo>
+                              <a:close/>
+                            </a:path>
+                            <a:path w="1250315" h="438150">
+                              <a:moveTo>
+                                <a:pt x="419684" y="0"/>
+                              </a:moveTo>
+                              <a:lnTo>
+                                <a:pt x="410362" y="0"/>
+                              </a:lnTo>
+                              <a:lnTo>
+                                <a:pt x="410362" y="437553"/>
+                              </a:lnTo>
+                              <a:lnTo>
+                                <a:pt x="419684" y="437553"/>
+                              </a:lnTo>
+                              <a:lnTo>
+                                <a:pt x="419684" y="0"/>
+                              </a:lnTo>
+                              <a:close/>
+                            </a:path>
+                            <a:path w="1250315" h="438150">
+                              <a:moveTo>
+                                <a:pt x="456984" y="0"/>
+                              </a:moveTo>
+                              <a:lnTo>
+                                <a:pt x="429006" y="0"/>
+                              </a:lnTo>
+                              <a:lnTo>
+                                <a:pt x="429006" y="437553"/>
+                              </a:lnTo>
+                              <a:lnTo>
+                                <a:pt x="456984" y="437553"/>
+                              </a:lnTo>
+                              <a:lnTo>
+                                <a:pt x="456984" y="0"/>
+                              </a:lnTo>
+                              <a:close/>
+                            </a:path>
+                            <a:path w="1250315" h="438150">
+                              <a:moveTo>
+                                <a:pt x="503605" y="0"/>
+                              </a:moveTo>
+                              <a:lnTo>
+                                <a:pt x="466318" y="0"/>
+                              </a:lnTo>
+                              <a:lnTo>
+                                <a:pt x="466318" y="437553"/>
+                              </a:lnTo>
+                              <a:lnTo>
+                                <a:pt x="503605" y="437553"/>
+                              </a:lnTo>
+                              <a:lnTo>
+                                <a:pt x="503605" y="0"/>
+                              </a:lnTo>
+                              <a:close/>
+                            </a:path>
+                            <a:path w="1250315" h="438150">
+                              <a:moveTo>
+                                <a:pt x="531583" y="0"/>
+                              </a:moveTo>
+                              <a:lnTo>
+                                <a:pt x="512953" y="0"/>
+                              </a:lnTo>
+                              <a:lnTo>
+                                <a:pt x="512953" y="437553"/>
+                              </a:lnTo>
+                              <a:lnTo>
+                                <a:pt x="531583" y="437553"/>
+                              </a:lnTo>
+                              <a:lnTo>
+                                <a:pt x="531583" y="0"/>
+                              </a:lnTo>
+                              <a:close/>
+                            </a:path>
+                            <a:path w="1250315" h="438150">
+                              <a:moveTo>
+                                <a:pt x="559587" y="0"/>
+                              </a:moveTo>
+                              <a:lnTo>
+                                <a:pt x="550252" y="0"/>
+                              </a:lnTo>
+                              <a:lnTo>
+                                <a:pt x="550252" y="437553"/>
+                              </a:lnTo>
+                              <a:lnTo>
+                                <a:pt x="559587" y="437553"/>
+                              </a:lnTo>
+                              <a:lnTo>
+                                <a:pt x="559587" y="0"/>
+                              </a:lnTo>
+                              <a:close/>
+                            </a:path>
+                            <a:path w="1250315" h="438150">
+                              <a:moveTo>
+                                <a:pt x="596887" y="0"/>
+                              </a:moveTo>
+                              <a:lnTo>
+                                <a:pt x="587552" y="0"/>
+                              </a:lnTo>
+                              <a:lnTo>
+                                <a:pt x="587552" y="437553"/>
+                              </a:lnTo>
+                              <a:lnTo>
+                                <a:pt x="596887" y="437553"/>
+                              </a:lnTo>
+                              <a:lnTo>
+                                <a:pt x="596887" y="0"/>
+                              </a:lnTo>
+                              <a:close/>
+                            </a:path>
+                            <a:path w="1250315" h="438150">
+                              <a:moveTo>
+                                <a:pt x="624865" y="0"/>
+                              </a:moveTo>
+                              <a:lnTo>
+                                <a:pt x="615530" y="0"/>
+                              </a:lnTo>
+                              <a:lnTo>
+                                <a:pt x="615530" y="437553"/>
+                              </a:lnTo>
+                              <a:lnTo>
+                                <a:pt x="624865" y="437553"/>
+                              </a:lnTo>
+                              <a:lnTo>
+                                <a:pt x="624865" y="0"/>
+                              </a:lnTo>
+                              <a:close/>
+                            </a:path>
+                            <a:path w="1250315" h="438150">
+                              <a:moveTo>
+                                <a:pt x="662165" y="0"/>
+                              </a:moveTo>
+                              <a:lnTo>
+                                <a:pt x="634187" y="0"/>
+                              </a:lnTo>
+                              <a:lnTo>
+                                <a:pt x="634187" y="437553"/>
+                              </a:lnTo>
+                              <a:lnTo>
+                                <a:pt x="662165" y="437553"/>
+                              </a:lnTo>
+                              <a:lnTo>
+                                <a:pt x="662165" y="0"/>
+                              </a:lnTo>
+                              <a:close/>
+                            </a:path>
+                            <a:path w="1250315" h="438150">
+                              <a:moveTo>
+                                <a:pt x="699465" y="0"/>
+                              </a:moveTo>
+                              <a:lnTo>
+                                <a:pt x="680821" y="0"/>
+                              </a:lnTo>
+                              <a:lnTo>
+                                <a:pt x="680821" y="437553"/>
+                              </a:lnTo>
+                              <a:lnTo>
+                                <a:pt x="699465" y="437553"/>
+                              </a:lnTo>
+                              <a:lnTo>
+                                <a:pt x="699465" y="0"/>
+                              </a:lnTo>
+                              <a:close/>
+                            </a:path>
+                            <a:path w="1250315" h="438150">
+                              <a:moveTo>
+                                <a:pt x="727456" y="0"/>
+                              </a:moveTo>
+                              <a:lnTo>
+                                <a:pt x="718121" y="0"/>
+                              </a:lnTo>
+                              <a:lnTo>
+                                <a:pt x="718121" y="437553"/>
+                              </a:lnTo>
+                              <a:lnTo>
+                                <a:pt x="727456" y="437553"/>
+                              </a:lnTo>
+                              <a:lnTo>
+                                <a:pt x="727456" y="0"/>
+                              </a:lnTo>
+                              <a:close/>
+                            </a:path>
+                            <a:path w="1250315" h="438150">
+                              <a:moveTo>
+                                <a:pt x="783412" y="0"/>
+                              </a:moveTo>
+                              <a:lnTo>
+                                <a:pt x="746099" y="0"/>
+                              </a:lnTo>
+                              <a:lnTo>
+                                <a:pt x="746099" y="437553"/>
+                              </a:lnTo>
+                              <a:lnTo>
+                                <a:pt x="783412" y="437553"/>
+                              </a:lnTo>
+                              <a:lnTo>
+                                <a:pt x="783412" y="0"/>
+                              </a:lnTo>
+                              <a:close/>
+                            </a:path>
+                            <a:path w="1250315" h="438150">
+                              <a:moveTo>
+                                <a:pt x="802055" y="0"/>
+                              </a:moveTo>
+                              <a:lnTo>
+                                <a:pt x="792734" y="0"/>
+                              </a:lnTo>
+                              <a:lnTo>
+                                <a:pt x="792734" y="437553"/>
+                              </a:lnTo>
+                              <a:lnTo>
+                                <a:pt x="802055" y="437553"/>
+                              </a:lnTo>
+                              <a:lnTo>
+                                <a:pt x="802055" y="0"/>
+                              </a:lnTo>
+                              <a:close/>
+                            </a:path>
+                            <a:path w="1250315" h="438150">
+                              <a:moveTo>
+                                <a:pt x="848639" y="0"/>
+                              </a:moveTo>
+                              <a:lnTo>
+                                <a:pt x="820674" y="0"/>
+                              </a:lnTo>
+                              <a:lnTo>
+                                <a:pt x="820674" y="437553"/>
+                              </a:lnTo>
+                              <a:lnTo>
+                                <a:pt x="848639" y="437553"/>
+                              </a:lnTo>
+                              <a:lnTo>
+                                <a:pt x="848639" y="0"/>
+                              </a:lnTo>
+                              <a:close/>
+                            </a:path>
+                            <a:path w="1250315" h="438150">
+                              <a:moveTo>
+                                <a:pt x="895299" y="0"/>
+                              </a:moveTo>
+                              <a:lnTo>
+                                <a:pt x="858012" y="0"/>
+                              </a:lnTo>
+                              <a:lnTo>
+                                <a:pt x="858012" y="437553"/>
+                              </a:lnTo>
+                              <a:lnTo>
+                                <a:pt x="895299" y="437553"/>
+                              </a:lnTo>
+                              <a:lnTo>
+                                <a:pt x="895299" y="0"/>
+                              </a:lnTo>
+                              <a:close/>
+                            </a:path>
+                            <a:path w="1250315" h="438150">
+                              <a:moveTo>
+                                <a:pt x="913917" y="0"/>
+                              </a:moveTo>
+                              <a:lnTo>
+                                <a:pt x="904621" y="0"/>
+                              </a:lnTo>
+                              <a:lnTo>
+                                <a:pt x="904621" y="437553"/>
+                              </a:lnTo>
+                              <a:lnTo>
+                                <a:pt x="913917" y="437553"/>
+                              </a:lnTo>
+                              <a:lnTo>
+                                <a:pt x="913917" y="0"/>
+                              </a:lnTo>
+                              <a:close/>
+                            </a:path>
+                            <a:path w="1250315" h="438150">
+                              <a:moveTo>
+                                <a:pt x="932624" y="0"/>
+                              </a:moveTo>
+                              <a:lnTo>
+                                <a:pt x="923290" y="0"/>
+                              </a:lnTo>
+                              <a:lnTo>
+                                <a:pt x="923290" y="437553"/>
+                              </a:lnTo>
+                              <a:lnTo>
+                                <a:pt x="932624" y="437553"/>
+                              </a:lnTo>
+                              <a:lnTo>
+                                <a:pt x="932624" y="0"/>
+                              </a:lnTo>
+                              <a:close/>
+                            </a:path>
+                            <a:path w="1250315" h="438150">
+                              <a:moveTo>
+                                <a:pt x="979208" y="0"/>
+                              </a:moveTo>
+                              <a:lnTo>
+                                <a:pt x="951230" y="0"/>
+                              </a:lnTo>
+                              <a:lnTo>
+                                <a:pt x="951230" y="437553"/>
+                              </a:lnTo>
+                              <a:lnTo>
+                                <a:pt x="979208" y="437553"/>
+                              </a:lnTo>
+                              <a:lnTo>
+                                <a:pt x="979208" y="0"/>
+                              </a:lnTo>
+                              <a:close/>
+                            </a:path>
+                            <a:path w="1250315" h="438150">
+                              <a:moveTo>
+                                <a:pt x="1007198" y="0"/>
+                              </a:moveTo>
+                              <a:lnTo>
+                                <a:pt x="988568" y="0"/>
+                              </a:lnTo>
+                              <a:lnTo>
+                                <a:pt x="988568" y="437553"/>
+                              </a:lnTo>
+                              <a:lnTo>
+                                <a:pt x="1007198" y="437553"/>
+                              </a:lnTo>
+                              <a:lnTo>
+                                <a:pt x="1007198" y="0"/>
+                              </a:lnTo>
+                              <a:close/>
+                            </a:path>
+                            <a:path w="1250315" h="438150">
+                              <a:moveTo>
+                                <a:pt x="1035215" y="0"/>
+                              </a:moveTo>
+                              <a:lnTo>
+                                <a:pt x="1025906" y="0"/>
+                              </a:lnTo>
+                              <a:lnTo>
+                                <a:pt x="1025906" y="437553"/>
+                              </a:lnTo>
+                              <a:lnTo>
+                                <a:pt x="1035215" y="437553"/>
+                              </a:lnTo>
+                              <a:lnTo>
+                                <a:pt x="1035215" y="0"/>
+                              </a:lnTo>
+                              <a:close/>
+                            </a:path>
+                            <a:path w="1250315" h="438150">
+                              <a:moveTo>
+                                <a:pt x="1063155" y="0"/>
+                              </a:moveTo>
+                              <a:lnTo>
+                                <a:pt x="1053846" y="0"/>
+                              </a:lnTo>
+                              <a:lnTo>
+                                <a:pt x="1053846" y="437553"/>
+                              </a:lnTo>
+                              <a:lnTo>
+                                <a:pt x="1063155" y="437553"/>
+                              </a:lnTo>
+                              <a:lnTo>
+                                <a:pt x="1063155" y="0"/>
+                              </a:lnTo>
+                              <a:close/>
+                            </a:path>
+                            <a:path w="1250315" h="438150">
+                              <a:moveTo>
+                                <a:pt x="1100556" y="0"/>
+                              </a:moveTo>
+                              <a:lnTo>
+                                <a:pt x="1081913" y="0"/>
+                              </a:lnTo>
+                              <a:lnTo>
+                                <a:pt x="1081913" y="437553"/>
+                              </a:lnTo>
+                              <a:lnTo>
+                                <a:pt x="1100556" y="437553"/>
+                              </a:lnTo>
+                              <a:lnTo>
+                                <a:pt x="1100556" y="0"/>
+                              </a:lnTo>
+                              <a:close/>
+                            </a:path>
+                            <a:path w="1250315" h="438150">
+                              <a:moveTo>
+                                <a:pt x="1147165" y="0"/>
+                              </a:moveTo>
+                              <a:lnTo>
+                                <a:pt x="1128522" y="0"/>
+                              </a:lnTo>
+                              <a:lnTo>
+                                <a:pt x="1128522" y="437553"/>
+                              </a:lnTo>
+                              <a:lnTo>
+                                <a:pt x="1147165" y="437553"/>
+                              </a:lnTo>
+                              <a:lnTo>
+                                <a:pt x="1147165" y="0"/>
+                              </a:lnTo>
+                              <a:close/>
+                            </a:path>
+                            <a:path w="1250315" h="438150">
+                              <a:moveTo>
+                                <a:pt x="1203096" y="0"/>
+                              </a:moveTo>
+                              <a:lnTo>
+                                <a:pt x="1175131" y="0"/>
+                              </a:lnTo>
+                              <a:lnTo>
+                                <a:pt x="1175131" y="437553"/>
+                              </a:lnTo>
+                              <a:lnTo>
+                                <a:pt x="1203096" y="437553"/>
+                              </a:lnTo>
+                              <a:lnTo>
+                                <a:pt x="1203096" y="0"/>
+                              </a:lnTo>
+                              <a:close/>
+                            </a:path>
+                            <a:path w="1250315" h="438150">
+                              <a:moveTo>
+                                <a:pt x="1221790" y="0"/>
+                              </a:moveTo>
+                              <a:lnTo>
+                                <a:pt x="1212469" y="0"/>
+                              </a:lnTo>
+                              <a:lnTo>
+                                <a:pt x="1212469" y="437553"/>
+                              </a:lnTo>
+                              <a:lnTo>
+                                <a:pt x="1221790" y="437553"/>
+                              </a:lnTo>
+                              <a:lnTo>
+                                <a:pt x="1221790" y="0"/>
+                              </a:lnTo>
+                              <a:close/>
+                            </a:path>
+                            <a:path w="1250315" h="438150">
+                              <a:moveTo>
+                                <a:pt x="1249781" y="0"/>
+                              </a:moveTo>
+                              <a:lnTo>
+                                <a:pt x="1231138" y="0"/>
+                              </a:lnTo>
+                              <a:lnTo>
+                                <a:pt x="1231138" y="437553"/>
+                              </a:lnTo>
+                              <a:lnTo>
+                                <a:pt x="1249781" y="437553"/>
+                              </a:lnTo>
+                              <a:lnTo>
+                                <a:pt x="1249781" y="0"/>
+                              </a:lnTo>
+                              <a:close/>
+                            </a:path>
+                          </a:pathLst>
+                        </a:custGeom>
+                        <a:solidFill>
+                          <a:srgbClr val="000000"/>
+                        </a:solidFill>
+                      </wps:spPr>
+                      <wps:bodyPr wrap="square" lIns="0" tIns="0" rIns="0" bIns="0" rtlCol="0">
+                        <a:prstTxWarp prst="textNoShape">
+                          <a:avLst/>
+                        </a:prstTxWarp>
+                        <a:noAutofit/>
+                      </wps:bodyPr>
+                    </wps:wsp>
+                  </wpg:wgp>
                 </a:graphicData>
               </a:graphic>
             </wp:anchor>
@@ -15109,10 +15695,15 @@
         </mc:Choice>
         <mc:Fallback>
           <w:pict>
-            <v:shape w14:anchorId="1CBFE6AC" id="Graphic 28" o:spid="_x0000_s1026" style="position:absolute;margin-left:17.4pt;margin-top:113.4pt;width:563.9pt;height:67pt;z-index:-251710464;visibility:visible;mso-wrap-style:square;mso-wrap-distance-left:0;mso-wrap-distance-top:0;mso-wrap-distance-right:0;mso-wrap-distance-bottom:0;mso-position-horizontal:absolute;mso-position-horizontal-relative:page;mso-position-vertical:absolute;mso-position-vertical-relative:page;v-text-anchor:top" coordsize="7161530,850900" o:gfxdata="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" path="m7161276,l5004562,,2929763,r,312420l2929763,647700r-77,-335280l2929686,,1790954,r,312420l1790954,647700,,647700,,850392r5004562,l7161276,850392r,-217932l7161276,312420,7161276,xe" fillcolor="#eae4e4" stroked="f">
-              <v:path arrowok="t"/>
+            <v:group w14:anchorId="005CF779" id="Group 2" o:spid="_x0000_s1026" style="position:absolute;margin-left:16.9pt;margin-top:112.8pt;width:564.05pt;height:67.6pt;z-index:-251701248;mso-wrap-distance-left:0;mso-wrap-distance-right:0;mso-position-horizontal-relative:page;mso-position-vertical-relative:page" coordsize="71634,8585" o:gfxdata="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">
+              <v:shape id="Graphic 3" o:spid="_x0000_s1027" style="position:absolute;width:71634;height:8585;visibility:visible;mso-wrap-style:square;v-text-anchor:top" coordsize="7163434,858519" o:gfxdata="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" path="m5004066,l3024136,r,7620l3024136,160020r-1524,l3022612,177800r,7620l3022612,655320r-25400,l2997212,185420r12700,l3009912,177800r,-17780l3009912,7620r-1219200,l1790712,160020r,17780l1790712,185420r,469900l660400,655320r,40640l,695960,,858520r4991112,l4991112,695960r,-40640l4991112,185420r,-7620l5004066,177800r,-17780l5004066,7620r,-7620xem7162813,7620r-1333501,l5829312,7239r-812800,l5016512,858139r355600,l5372112,858520r787400,l6159512,858139r1003301,l7162813,7620xe" fillcolor="#eae4e4" stroked="f">
+                <v:path arrowok="t"/>
+              </v:shape>
+              <v:shape id="Graphic 4" o:spid="_x0000_s1028" style="position:absolute;left:2635;top:492;width:12503;height:4381;visibility:visible;mso-wrap-style:square;v-text-anchor:top" coordsize="1250315,438150" o:gfxdata="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" path="m18656,l,,,437553r18656,l18656,xem37299,l27978,r,437553l37299,437553,37299,xem65278,l55956,r,437553l65278,437553,65278,xem121246,l102590,r,437553l121246,437553,121246,xem158534,r-9309,l149225,437553r9309,l158534,xem195859,l167881,r,437553l195859,437553,195859,xem223824,l205181,r,437553l223824,437553,223824,xem261137,l233159,r,437553l261137,437553,261137,xem279781,r-9322,l270459,437553r9322,l279781,xem335749,l307771,r,437553l335749,437553,335749,xem354406,r-9335,l345071,437553r9335,l354406,xem382384,l363728,r,437553l382384,437553,382384,xem419684,r-9322,l410362,437553r9322,l419684,xem456984,l429006,r,437553l456984,437553,456984,xem503605,l466318,r,437553l503605,437553,503605,xem531583,l512953,r,437553l531583,437553,531583,xem559587,r-9335,l550252,437553r9335,l559587,xem596887,r-9335,l587552,437553r9335,l596887,xem624865,r-9335,l615530,437553r9335,l624865,xem662165,l634187,r,437553l662165,437553,662165,xem699465,l680821,r,437553l699465,437553,699465,xem727456,r-9335,l718121,437553r9335,l727456,xem783412,l746099,r,437553l783412,437553,783412,xem802055,r-9321,l792734,437553r9321,l802055,xem848639,l820674,r,437553l848639,437553,848639,xem895299,l858012,r,437553l895299,437553,895299,xem913917,r-9296,l904621,437553r9296,l913917,xem932624,r-9334,l923290,437553r9334,l932624,xem979208,l951230,r,437553l979208,437553,979208,xem1007198,l988568,r,437553l1007198,437553,1007198,xem1035215,r-9309,l1025906,437553r9309,l1035215,xem1063155,r-9309,l1053846,437553r9309,l1063155,xem1100556,r-18643,l1081913,437553r18643,l1100556,xem1147165,r-18643,l1128522,437553r18643,l1147165,xem1203096,r-27965,l1175131,437553r27965,l1203096,xem1221790,r-9321,l1212469,437553r9321,l1221790,xem1249781,r-18643,l1231138,437553r18643,l1249781,xe" fillcolor="black" stroked="f">
+                <v:path arrowok="t"/>
+              </v:shape>
               <w10:wrap anchorx="page" anchory="page"/>
-            </v:shape>
+            </v:group>
           </w:pict>
         </mc:Fallback>
       </mc:AlternateContent>
@@ -15126,824 +15717,18 @@
       <mc:AlternateContent>
         <mc:Choice Requires="wps">
           <w:drawing>
-            <wp:anchor distT="0" distB="0" distL="0" distR="0" simplePos="0" relativeHeight="251620352" behindDoc="1" locked="0" layoutInCell="1" allowOverlap="1" wp14:anchorId="2E453A62" wp14:editId="30DD9359">
+            <wp:anchor distT="0" distB="0" distL="0" distR="0" simplePos="0" relativeHeight="251629568" behindDoc="1" locked="0" layoutInCell="1" allowOverlap="1" wp14:anchorId="3DA5D2A3" wp14:editId="1D8E794E">
               <wp:simplePos x="0" y="0"/>
               <wp:positionH relativeFrom="page">
-                <wp:posOffset>481952</wp:posOffset>
+                <wp:posOffset>3224910</wp:posOffset>
               </wp:positionH>
               <wp:positionV relativeFrom="page">
-                <wp:posOffset>1482038</wp:posOffset>
+                <wp:posOffset>1437131</wp:posOffset>
               </wp:positionV>
-              <wp:extent cx="65405" cy="438150"/>
+              <wp:extent cx="1326515" cy="645795"/>
               <wp:effectExtent l="0" t="0" r="0" b="0"/>
               <wp:wrapNone/>
-              <wp:docPr id="29" name="Graphic 29"/>
-              <wp:cNvGraphicFramePr>
-                <a:graphicFrameLocks xmlns:a="http://schemas.openxmlformats.org/drawingml/2006/main"/>
-              </wp:cNvGraphicFramePr>
-              <a:graphic xmlns:a="http://schemas.openxmlformats.org/drawingml/2006/main">
-                <a:graphicData uri="http://schemas.microsoft.com/office/word/2010/wordprocessingShape">
-                  <wps:wsp>
-                    <wps:cNvSpPr>
-                      <a:spLocks/>
-                    </wps:cNvSpPr>
-                    <wps:spPr>
-                      <a:xfrm>
-                        <a:off x="0" y="0"/>
-                        <a:ext cx="65405" cy="438150"/>
-                      </a:xfrm>
-                      <a:custGeom>
-                        <a:avLst/>
-                        <a:gdLst/>
-                        <a:ahLst/>
-                        <a:cxnLst/>
-                        <a:rect l="l" t="t" r="r" b="b"/>
-                        <a:pathLst>
-                          <a:path w="65405" h="438150">
-                            <a:moveTo>
-                              <a:pt x="18656" y="0"/>
-                            </a:moveTo>
-                            <a:lnTo>
-                              <a:pt x="0" y="0"/>
-                            </a:lnTo>
-                            <a:lnTo>
-                              <a:pt x="0" y="437565"/>
-                            </a:lnTo>
-                            <a:lnTo>
-                              <a:pt x="18656" y="437565"/>
-                            </a:lnTo>
-                            <a:lnTo>
-                              <a:pt x="18656" y="0"/>
-                            </a:lnTo>
-                            <a:close/>
-                          </a:path>
-                          <a:path w="65405" h="438150">
-                            <a:moveTo>
-                              <a:pt x="37299" y="0"/>
-                            </a:moveTo>
-                            <a:lnTo>
-                              <a:pt x="27978" y="0"/>
-                            </a:lnTo>
-                            <a:lnTo>
-                              <a:pt x="27978" y="437565"/>
-                            </a:lnTo>
-                            <a:lnTo>
-                              <a:pt x="37299" y="437565"/>
-                            </a:lnTo>
-                            <a:lnTo>
-                              <a:pt x="37299" y="0"/>
-                            </a:lnTo>
-                            <a:close/>
-                          </a:path>
-                          <a:path w="65405" h="438150">
-                            <a:moveTo>
-                              <a:pt x="65278" y="0"/>
-                            </a:moveTo>
-                            <a:lnTo>
-                              <a:pt x="55956" y="0"/>
-                            </a:lnTo>
-                            <a:lnTo>
-                              <a:pt x="55956" y="437565"/>
-                            </a:lnTo>
-                            <a:lnTo>
-                              <a:pt x="65278" y="437565"/>
-                            </a:lnTo>
-                            <a:lnTo>
-                              <a:pt x="65278" y="0"/>
-                            </a:lnTo>
-                            <a:close/>
-                          </a:path>
-                        </a:pathLst>
-                      </a:custGeom>
-                      <a:solidFill>
-                        <a:srgbClr val="000000"/>
-                      </a:solidFill>
-                    </wps:spPr>
-                    <wps:bodyPr wrap="square" lIns="0" tIns="0" rIns="0" bIns="0" rtlCol="0">
-                      <a:prstTxWarp prst="textNoShape">
-                        <a:avLst/>
-                      </a:prstTxWarp>
-                      <a:noAutofit/>
-                    </wps:bodyPr>
-                  </wps:wsp>
-                </a:graphicData>
-              </a:graphic>
-            </wp:anchor>
-          </w:drawing>
-        </mc:Choice>
-        <mc:Fallback>
-          <w:pict>
-            <v:shape w14:anchorId="035A6E96" id="Graphic 29" o:spid="_x0000_s1026" style="position:absolute;margin-left:37.95pt;margin-top:116.7pt;width:5.15pt;height:34.5pt;z-index:-251696128;visibility:visible;mso-wrap-style:square;mso-wrap-distance-left:0;mso-wrap-distance-top:0;mso-wrap-distance-right:0;mso-wrap-distance-bottom:0;mso-position-horizontal:absolute;mso-position-horizontal-relative:page;mso-position-vertical:absolute;mso-position-vertical-relative:page;v-text-anchor:top" coordsize="65405,438150" o:gfxdata="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" path="m18656,l,,,437565r18656,l18656,xem37299,l27978,r,437565l37299,437565,37299,xem65278,l55956,r,437565l65278,437565,65278,xe" fillcolor="black" stroked="f">
-              <v:path arrowok="t"/>
-              <w10:wrap anchorx="page" anchory="page"/>
-            </v:shape>
-          </w:pict>
-        </mc:Fallback>
-      </mc:AlternateContent>
-    </w:r>
-    <w:r>
-      <w:rPr>
-        <w:i w:val="0"/>
-        <w:noProof/>
-        <w:sz w:val="20"/>
-      </w:rPr>
-      <mc:AlternateContent>
-        <mc:Choice Requires="wps">
-          <w:drawing>
-            <wp:anchor distT="0" distB="0" distL="0" distR="0" simplePos="0" relativeHeight="251634688" behindDoc="1" locked="0" layoutInCell="1" allowOverlap="1" wp14:anchorId="3F6A9DB1" wp14:editId="78305967">
-              <wp:simplePos x="0" y="0"/>
-              <wp:positionH relativeFrom="page">
-                <wp:posOffset>584187</wp:posOffset>
-              </wp:positionH>
-              <wp:positionV relativeFrom="page">
-                <wp:posOffset>1482038</wp:posOffset>
-              </wp:positionV>
-              <wp:extent cx="1147445" cy="438150"/>
-              <wp:effectExtent l="0" t="0" r="0" b="0"/>
-              <wp:wrapNone/>
-              <wp:docPr id="30" name="Graphic 30"/>
-              <wp:cNvGraphicFramePr>
-                <a:graphicFrameLocks xmlns:a="http://schemas.openxmlformats.org/drawingml/2006/main"/>
-              </wp:cNvGraphicFramePr>
-              <a:graphic xmlns:a="http://schemas.openxmlformats.org/drawingml/2006/main">
-                <a:graphicData uri="http://schemas.microsoft.com/office/word/2010/wordprocessingShape">
-                  <wps:wsp>
-                    <wps:cNvSpPr>
-                      <a:spLocks/>
-                    </wps:cNvSpPr>
-                    <wps:spPr>
-                      <a:xfrm>
-                        <a:off x="0" y="0"/>
-                        <a:ext cx="1147445" cy="438150"/>
-                      </a:xfrm>
-                      <a:custGeom>
-                        <a:avLst/>
-                        <a:gdLst/>
-                        <a:ahLst/>
-                        <a:cxnLst/>
-                        <a:rect l="l" t="t" r="r" b="b"/>
-                        <a:pathLst>
-                          <a:path w="1147445" h="438150">
-                            <a:moveTo>
-                              <a:pt x="18656" y="0"/>
-                            </a:moveTo>
-                            <a:lnTo>
-                              <a:pt x="0" y="0"/>
-                            </a:lnTo>
-                            <a:lnTo>
-                              <a:pt x="0" y="437565"/>
-                            </a:lnTo>
-                            <a:lnTo>
-                              <a:pt x="18656" y="437565"/>
-                            </a:lnTo>
-                            <a:lnTo>
-                              <a:pt x="18656" y="0"/>
-                            </a:lnTo>
-                            <a:close/>
-                          </a:path>
-                          <a:path w="1147445" h="438150">
-                            <a:moveTo>
-                              <a:pt x="56299" y="0"/>
-                            </a:moveTo>
-                            <a:lnTo>
-                              <a:pt x="46990" y="0"/>
-                            </a:lnTo>
-                            <a:lnTo>
-                              <a:pt x="46990" y="437565"/>
-                            </a:lnTo>
-                            <a:lnTo>
-                              <a:pt x="56299" y="437565"/>
-                            </a:lnTo>
-                            <a:lnTo>
-                              <a:pt x="56299" y="0"/>
-                            </a:lnTo>
-                            <a:close/>
-                          </a:path>
-                          <a:path w="1147445" h="438150">
-                            <a:moveTo>
-                              <a:pt x="93624" y="0"/>
-                            </a:moveTo>
-                            <a:lnTo>
-                              <a:pt x="65646" y="0"/>
-                            </a:lnTo>
-                            <a:lnTo>
-                              <a:pt x="65646" y="437565"/>
-                            </a:lnTo>
-                            <a:lnTo>
-                              <a:pt x="93624" y="437565"/>
-                            </a:lnTo>
-                            <a:lnTo>
-                              <a:pt x="93624" y="0"/>
-                            </a:lnTo>
-                            <a:close/>
-                          </a:path>
-                          <a:path w="1147445" h="438150">
-                            <a:moveTo>
-                              <a:pt x="121577" y="0"/>
-                            </a:moveTo>
-                            <a:lnTo>
-                              <a:pt x="102946" y="0"/>
-                            </a:lnTo>
-                            <a:lnTo>
-                              <a:pt x="102946" y="437565"/>
-                            </a:lnTo>
-                            <a:lnTo>
-                              <a:pt x="121577" y="437565"/>
-                            </a:lnTo>
-                            <a:lnTo>
-                              <a:pt x="121577" y="0"/>
-                            </a:lnTo>
-                            <a:close/>
-                          </a:path>
-                          <a:path w="1147445" h="438150">
-                            <a:moveTo>
-                              <a:pt x="158902" y="0"/>
-                            </a:moveTo>
-                            <a:lnTo>
-                              <a:pt x="130924" y="0"/>
-                            </a:lnTo>
-                            <a:lnTo>
-                              <a:pt x="130924" y="437565"/>
-                            </a:lnTo>
-                            <a:lnTo>
-                              <a:pt x="158902" y="437565"/>
-                            </a:lnTo>
-                            <a:lnTo>
-                              <a:pt x="158902" y="0"/>
-                            </a:lnTo>
-                            <a:close/>
-                          </a:path>
-                          <a:path w="1147445" h="438150">
-                            <a:moveTo>
-                              <a:pt x="177546" y="0"/>
-                            </a:moveTo>
-                            <a:lnTo>
-                              <a:pt x="168224" y="0"/>
-                            </a:lnTo>
-                            <a:lnTo>
-                              <a:pt x="168224" y="437565"/>
-                            </a:lnTo>
-                            <a:lnTo>
-                              <a:pt x="177546" y="437565"/>
-                            </a:lnTo>
-                            <a:lnTo>
-                              <a:pt x="177546" y="0"/>
-                            </a:lnTo>
-                            <a:close/>
-                          </a:path>
-                          <a:path w="1147445" h="438150">
-                            <a:moveTo>
-                              <a:pt x="233718" y="0"/>
-                            </a:moveTo>
-                            <a:lnTo>
-                              <a:pt x="205740" y="0"/>
-                            </a:lnTo>
-                            <a:lnTo>
-                              <a:pt x="205740" y="437565"/>
-                            </a:lnTo>
-                            <a:lnTo>
-                              <a:pt x="233718" y="437565"/>
-                            </a:lnTo>
-                            <a:lnTo>
-                              <a:pt x="233718" y="0"/>
-                            </a:lnTo>
-                            <a:close/>
-                          </a:path>
-                          <a:path w="1147445" h="438150">
-                            <a:moveTo>
-                              <a:pt x="252374" y="0"/>
-                            </a:moveTo>
-                            <a:lnTo>
-                              <a:pt x="243027" y="0"/>
-                            </a:lnTo>
-                            <a:lnTo>
-                              <a:pt x="243027" y="437565"/>
-                            </a:lnTo>
-                            <a:lnTo>
-                              <a:pt x="252374" y="437565"/>
-                            </a:lnTo>
-                            <a:lnTo>
-                              <a:pt x="252374" y="0"/>
-                            </a:lnTo>
-                            <a:close/>
-                          </a:path>
-                          <a:path w="1147445" h="438150">
-                            <a:moveTo>
-                              <a:pt x="280352" y="0"/>
-                            </a:moveTo>
-                            <a:lnTo>
-                              <a:pt x="261696" y="0"/>
-                            </a:lnTo>
-                            <a:lnTo>
-                              <a:pt x="261696" y="437565"/>
-                            </a:lnTo>
-                            <a:lnTo>
-                              <a:pt x="280352" y="437565"/>
-                            </a:lnTo>
-                            <a:lnTo>
-                              <a:pt x="280352" y="0"/>
-                            </a:lnTo>
-                            <a:close/>
-                          </a:path>
-                          <a:path w="1147445" h="438150">
-                            <a:moveTo>
-                              <a:pt x="317284" y="0"/>
-                            </a:moveTo>
-                            <a:lnTo>
-                              <a:pt x="307975" y="0"/>
-                            </a:lnTo>
-                            <a:lnTo>
-                              <a:pt x="307975" y="437565"/>
-                            </a:lnTo>
-                            <a:lnTo>
-                              <a:pt x="317284" y="437565"/>
-                            </a:lnTo>
-                            <a:lnTo>
-                              <a:pt x="317284" y="0"/>
-                            </a:lnTo>
-                            <a:close/>
-                          </a:path>
-                          <a:path w="1147445" h="438150">
-                            <a:moveTo>
-                              <a:pt x="354596" y="0"/>
-                            </a:moveTo>
-                            <a:lnTo>
-                              <a:pt x="326618" y="0"/>
-                            </a:lnTo>
-                            <a:lnTo>
-                              <a:pt x="326618" y="437565"/>
-                            </a:lnTo>
-                            <a:lnTo>
-                              <a:pt x="354596" y="437565"/>
-                            </a:lnTo>
-                            <a:lnTo>
-                              <a:pt x="354596" y="0"/>
-                            </a:lnTo>
-                            <a:close/>
-                          </a:path>
-                          <a:path w="1147445" h="438150">
-                            <a:moveTo>
-                              <a:pt x="401231" y="0"/>
-                            </a:moveTo>
-                            <a:lnTo>
-                              <a:pt x="363931" y="0"/>
-                            </a:lnTo>
-                            <a:lnTo>
-                              <a:pt x="363931" y="437565"/>
-                            </a:lnTo>
-                            <a:lnTo>
-                              <a:pt x="401231" y="437565"/>
-                            </a:lnTo>
-                            <a:lnTo>
-                              <a:pt x="401231" y="0"/>
-                            </a:lnTo>
-                            <a:close/>
-                          </a:path>
-                          <a:path w="1147445" h="438150">
-                            <a:moveTo>
-                              <a:pt x="429209" y="0"/>
-                            </a:moveTo>
-                            <a:lnTo>
-                              <a:pt x="410565" y="0"/>
-                            </a:lnTo>
-                            <a:lnTo>
-                              <a:pt x="410565" y="437565"/>
-                            </a:lnTo>
-                            <a:lnTo>
-                              <a:pt x="429209" y="437565"/>
-                            </a:lnTo>
-                            <a:lnTo>
-                              <a:pt x="429209" y="0"/>
-                            </a:lnTo>
-                            <a:close/>
-                          </a:path>
-                          <a:path w="1147445" h="438150">
-                            <a:moveTo>
-                              <a:pt x="457200" y="0"/>
-                            </a:moveTo>
-                            <a:lnTo>
-                              <a:pt x="447865" y="0"/>
-                            </a:lnTo>
-                            <a:lnTo>
-                              <a:pt x="447865" y="437565"/>
-                            </a:lnTo>
-                            <a:lnTo>
-                              <a:pt x="457200" y="437565"/>
-                            </a:lnTo>
-                            <a:lnTo>
-                              <a:pt x="457200" y="0"/>
-                            </a:lnTo>
-                            <a:close/>
-                          </a:path>
-                          <a:path w="1147445" h="438150">
-                            <a:moveTo>
-                              <a:pt x="494461" y="0"/>
-                            </a:moveTo>
-                            <a:lnTo>
-                              <a:pt x="485140" y="0"/>
-                            </a:lnTo>
-                            <a:lnTo>
-                              <a:pt x="485140" y="437565"/>
-                            </a:lnTo>
-                            <a:lnTo>
-                              <a:pt x="494461" y="437565"/>
-                            </a:lnTo>
-                            <a:lnTo>
-                              <a:pt x="494461" y="0"/>
-                            </a:lnTo>
-                            <a:close/>
-                          </a:path>
-                          <a:path w="1147445" h="438150">
-                            <a:moveTo>
-                              <a:pt x="522439" y="0"/>
-                            </a:moveTo>
-                            <a:lnTo>
-                              <a:pt x="513118" y="0"/>
-                            </a:lnTo>
-                            <a:lnTo>
-                              <a:pt x="513118" y="437565"/>
-                            </a:lnTo>
-                            <a:lnTo>
-                              <a:pt x="522439" y="437565"/>
-                            </a:lnTo>
-                            <a:lnTo>
-                              <a:pt x="522439" y="0"/>
-                            </a:lnTo>
-                            <a:close/>
-                          </a:path>
-                          <a:path w="1147445" h="438150">
-                            <a:moveTo>
-                              <a:pt x="559752" y="0"/>
-                            </a:moveTo>
-                            <a:lnTo>
-                              <a:pt x="531774" y="0"/>
-                            </a:lnTo>
-                            <a:lnTo>
-                              <a:pt x="531774" y="437565"/>
-                            </a:lnTo>
-                            <a:lnTo>
-                              <a:pt x="559752" y="437565"/>
-                            </a:lnTo>
-                            <a:lnTo>
-                              <a:pt x="559752" y="0"/>
-                            </a:lnTo>
-                            <a:close/>
-                          </a:path>
-                          <a:path w="1147445" h="438150">
-                            <a:moveTo>
-                              <a:pt x="597065" y="0"/>
-                            </a:moveTo>
-                            <a:lnTo>
-                              <a:pt x="578408" y="0"/>
-                            </a:lnTo>
-                            <a:lnTo>
-                              <a:pt x="578408" y="437565"/>
-                            </a:lnTo>
-                            <a:lnTo>
-                              <a:pt x="597065" y="437565"/>
-                            </a:lnTo>
-                            <a:lnTo>
-                              <a:pt x="597065" y="0"/>
-                            </a:lnTo>
-                            <a:close/>
-                          </a:path>
-                          <a:path w="1147445" h="438150">
-                            <a:moveTo>
-                              <a:pt x="625043" y="0"/>
-                            </a:moveTo>
-                            <a:lnTo>
-                              <a:pt x="615708" y="0"/>
-                            </a:lnTo>
-                            <a:lnTo>
-                              <a:pt x="615708" y="437565"/>
-                            </a:lnTo>
-                            <a:lnTo>
-                              <a:pt x="625043" y="437565"/>
-                            </a:lnTo>
-                            <a:lnTo>
-                              <a:pt x="625043" y="0"/>
-                            </a:lnTo>
-                            <a:close/>
-                          </a:path>
-                          <a:path w="1147445" h="438150">
-                            <a:moveTo>
-                              <a:pt x="680999" y="0"/>
-                            </a:moveTo>
-                            <a:lnTo>
-                              <a:pt x="643686" y="0"/>
-                            </a:lnTo>
-                            <a:lnTo>
-                              <a:pt x="643686" y="437565"/>
-                            </a:lnTo>
-                            <a:lnTo>
-                              <a:pt x="680999" y="437565"/>
-                            </a:lnTo>
-                            <a:lnTo>
-                              <a:pt x="680999" y="0"/>
-                            </a:lnTo>
-                            <a:close/>
-                          </a:path>
-                          <a:path w="1147445" h="438150">
-                            <a:moveTo>
-                              <a:pt x="699706" y="0"/>
-                            </a:moveTo>
-                            <a:lnTo>
-                              <a:pt x="690384" y="0"/>
-                            </a:lnTo>
-                            <a:lnTo>
-                              <a:pt x="690384" y="437565"/>
-                            </a:lnTo>
-                            <a:lnTo>
-                              <a:pt x="699706" y="437565"/>
-                            </a:lnTo>
-                            <a:lnTo>
-                              <a:pt x="699706" y="0"/>
-                            </a:lnTo>
-                            <a:close/>
-                          </a:path>
-                          <a:path w="1147445" h="438150">
-                            <a:moveTo>
-                              <a:pt x="746302" y="0"/>
-                            </a:moveTo>
-                            <a:lnTo>
-                              <a:pt x="718324" y="0"/>
-                            </a:lnTo>
-                            <a:lnTo>
-                              <a:pt x="718324" y="437565"/>
-                            </a:lnTo>
-                            <a:lnTo>
-                              <a:pt x="746302" y="437565"/>
-                            </a:lnTo>
-                            <a:lnTo>
-                              <a:pt x="746302" y="0"/>
-                            </a:lnTo>
-                            <a:close/>
-                          </a:path>
-                          <a:path w="1147445" h="438150">
-                            <a:moveTo>
-                              <a:pt x="792962" y="0"/>
-                            </a:moveTo>
-                            <a:lnTo>
-                              <a:pt x="755662" y="0"/>
-                            </a:lnTo>
-                            <a:lnTo>
-                              <a:pt x="755662" y="437565"/>
-                            </a:lnTo>
-                            <a:lnTo>
-                              <a:pt x="792962" y="437565"/>
-                            </a:lnTo>
-                            <a:lnTo>
-                              <a:pt x="792962" y="0"/>
-                            </a:lnTo>
-                            <a:close/>
-                          </a:path>
-                          <a:path w="1147445" h="438150">
-                            <a:moveTo>
-                              <a:pt x="811593" y="0"/>
-                            </a:moveTo>
-                            <a:lnTo>
-                              <a:pt x="802271" y="0"/>
-                            </a:lnTo>
-                            <a:lnTo>
-                              <a:pt x="802271" y="437565"/>
-                            </a:lnTo>
-                            <a:lnTo>
-                              <a:pt x="811593" y="437565"/>
-                            </a:lnTo>
-                            <a:lnTo>
-                              <a:pt x="811593" y="0"/>
-                            </a:lnTo>
-                            <a:close/>
-                          </a:path>
-                          <a:path w="1147445" h="438150">
-                            <a:moveTo>
-                              <a:pt x="830275" y="0"/>
-                            </a:moveTo>
-                            <a:lnTo>
-                              <a:pt x="820940" y="0"/>
-                            </a:lnTo>
-                            <a:lnTo>
-                              <a:pt x="820940" y="437565"/>
-                            </a:lnTo>
-                            <a:lnTo>
-                              <a:pt x="830275" y="437565"/>
-                            </a:lnTo>
-                            <a:lnTo>
-                              <a:pt x="830275" y="0"/>
-                            </a:lnTo>
-                            <a:close/>
-                          </a:path>
-                          <a:path w="1147445" h="438150">
-                            <a:moveTo>
-                              <a:pt x="876858" y="0"/>
-                            </a:moveTo>
-                            <a:lnTo>
-                              <a:pt x="848880" y="0"/>
-                            </a:lnTo>
-                            <a:lnTo>
-                              <a:pt x="848880" y="437565"/>
-                            </a:lnTo>
-                            <a:lnTo>
-                              <a:pt x="876858" y="437565"/>
-                            </a:lnTo>
-                            <a:lnTo>
-                              <a:pt x="876858" y="0"/>
-                            </a:lnTo>
-                            <a:close/>
-                          </a:path>
-                          <a:path w="1147445" h="438150">
-                            <a:moveTo>
-                              <a:pt x="904862" y="0"/>
-                            </a:moveTo>
-                            <a:lnTo>
-                              <a:pt x="886218" y="0"/>
-                            </a:lnTo>
-                            <a:lnTo>
-                              <a:pt x="886218" y="437565"/>
-                            </a:lnTo>
-                            <a:lnTo>
-                              <a:pt x="904862" y="437565"/>
-                            </a:lnTo>
-                            <a:lnTo>
-                              <a:pt x="904862" y="0"/>
-                            </a:lnTo>
-                            <a:close/>
-                          </a:path>
-                          <a:path w="1147445" h="438150">
-                            <a:moveTo>
-                              <a:pt x="932751" y="0"/>
-                            </a:moveTo>
-                            <a:lnTo>
-                              <a:pt x="923429" y="0"/>
-                            </a:lnTo>
-                            <a:lnTo>
-                              <a:pt x="923429" y="437565"/>
-                            </a:lnTo>
-                            <a:lnTo>
-                              <a:pt x="932751" y="437565"/>
-                            </a:lnTo>
-                            <a:lnTo>
-                              <a:pt x="932751" y="0"/>
-                            </a:lnTo>
-                            <a:close/>
-                          </a:path>
-                          <a:path w="1147445" h="438150">
-                            <a:moveTo>
-                              <a:pt x="960818" y="0"/>
-                            </a:moveTo>
-                            <a:lnTo>
-                              <a:pt x="951496" y="0"/>
-                            </a:lnTo>
-                            <a:lnTo>
-                              <a:pt x="951496" y="437565"/>
-                            </a:lnTo>
-                            <a:lnTo>
-                              <a:pt x="960818" y="437565"/>
-                            </a:lnTo>
-                            <a:lnTo>
-                              <a:pt x="960818" y="0"/>
-                            </a:lnTo>
-                            <a:close/>
-                          </a:path>
-                          <a:path w="1147445" h="438150">
-                            <a:moveTo>
-                              <a:pt x="998093" y="0"/>
-                            </a:moveTo>
-                            <a:lnTo>
-                              <a:pt x="979436" y="0"/>
-                            </a:lnTo>
-                            <a:lnTo>
-                              <a:pt x="979436" y="437565"/>
-                            </a:lnTo>
-                            <a:lnTo>
-                              <a:pt x="998093" y="437565"/>
-                            </a:lnTo>
-                            <a:lnTo>
-                              <a:pt x="998093" y="0"/>
-                            </a:lnTo>
-                            <a:close/>
-                          </a:path>
-                          <a:path w="1147445" h="438150">
-                            <a:moveTo>
-                              <a:pt x="1044816" y="0"/>
-                            </a:moveTo>
-                            <a:lnTo>
-                              <a:pt x="1026172" y="0"/>
-                            </a:lnTo>
-                            <a:lnTo>
-                              <a:pt x="1026172" y="437565"/>
-                            </a:lnTo>
-                            <a:lnTo>
-                              <a:pt x="1044816" y="437565"/>
-                            </a:lnTo>
-                            <a:lnTo>
-                              <a:pt x="1044816" y="0"/>
-                            </a:lnTo>
-                            <a:close/>
-                          </a:path>
-                          <a:path w="1147445" h="438150">
-                            <a:moveTo>
-                              <a:pt x="1100505" y="0"/>
-                            </a:moveTo>
-                            <a:lnTo>
-                              <a:pt x="1072515" y="0"/>
-                            </a:lnTo>
-                            <a:lnTo>
-                              <a:pt x="1072515" y="437565"/>
-                            </a:lnTo>
-                            <a:lnTo>
-                              <a:pt x="1100505" y="437565"/>
-                            </a:lnTo>
-                            <a:lnTo>
-                              <a:pt x="1100505" y="0"/>
-                            </a:lnTo>
-                            <a:close/>
-                          </a:path>
-                          <a:path w="1147445" h="438150">
-                            <a:moveTo>
-                              <a:pt x="1119187" y="0"/>
-                            </a:moveTo>
-                            <a:lnTo>
-                              <a:pt x="1109865" y="0"/>
-                            </a:lnTo>
-                            <a:lnTo>
-                              <a:pt x="1109865" y="437565"/>
-                            </a:lnTo>
-                            <a:lnTo>
-                              <a:pt x="1119187" y="437565"/>
-                            </a:lnTo>
-                            <a:lnTo>
-                              <a:pt x="1119187" y="0"/>
-                            </a:lnTo>
-                            <a:close/>
-                          </a:path>
-                          <a:path w="1147445" h="438150">
-                            <a:moveTo>
-                              <a:pt x="1147178" y="0"/>
-                            </a:moveTo>
-                            <a:lnTo>
-                              <a:pt x="1128534" y="0"/>
-                            </a:lnTo>
-                            <a:lnTo>
-                              <a:pt x="1128534" y="437565"/>
-                            </a:lnTo>
-                            <a:lnTo>
-                              <a:pt x="1147178" y="437565"/>
-                            </a:lnTo>
-                            <a:lnTo>
-                              <a:pt x="1147178" y="0"/>
-                            </a:lnTo>
-                            <a:close/>
-                          </a:path>
-                        </a:pathLst>
-                      </a:custGeom>
-                      <a:solidFill>
-                        <a:srgbClr val="000000"/>
-                      </a:solidFill>
-                    </wps:spPr>
-                    <wps:bodyPr wrap="square" lIns="0" tIns="0" rIns="0" bIns="0" rtlCol="0">
-                      <a:prstTxWarp prst="textNoShape">
-                        <a:avLst/>
-                      </a:prstTxWarp>
-                      <a:noAutofit/>
-                    </wps:bodyPr>
-                  </wps:wsp>
-                </a:graphicData>
-              </a:graphic>
-            </wp:anchor>
-          </w:drawing>
-        </mc:Choice>
-        <mc:Fallback>
-          <w:pict>
-            <v:shape w14:anchorId="4EFC636C" id="Graphic 30" o:spid="_x0000_s1026" style="position:absolute;margin-left:46pt;margin-top:116.7pt;width:90.35pt;height:34.5pt;z-index:-251681792;visibility:visible;mso-wrap-style:square;mso-wrap-distance-left:0;mso-wrap-distance-top:0;mso-wrap-distance-right:0;mso-wrap-distance-bottom:0;mso-position-horizontal:absolute;mso-position-horizontal-relative:page;mso-position-vertical:absolute;mso-position-vertical-relative:page;v-text-anchor:top" coordsize="1147445,438150" o:gfxdata="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" path="m18656,l,,,437565r18656,l18656,xem56299,l46990,r,437565l56299,437565,56299,xem93624,l65646,r,437565l93624,437565,93624,xem121577,l102946,r,437565l121577,437565,121577,xem158902,l130924,r,437565l158902,437565,158902,xem177546,r-9322,l168224,437565r9322,l177546,xem233718,l205740,r,437565l233718,437565,233718,xem252374,r-9347,l243027,437565r9347,l252374,xem280352,l261696,r,437565l280352,437565,280352,xem317284,r-9309,l307975,437565r9309,l317284,xem354596,l326618,r,437565l354596,437565,354596,xem401231,l363931,r,437565l401231,437565,401231,xem429209,l410565,r,437565l429209,437565,429209,xem457200,r-9335,l447865,437565r9335,l457200,xem494461,r-9321,l485140,437565r9321,l494461,xem522439,r-9321,l513118,437565r9321,l522439,xem559752,l531774,r,437565l559752,437565,559752,xem597065,l578408,r,437565l597065,437565,597065,xem625043,r-9335,l615708,437565r9335,l625043,xem680999,l643686,r,437565l680999,437565,680999,xem699706,r-9322,l690384,437565r9322,l699706,xem746302,l718324,r,437565l746302,437565,746302,xem792962,l755662,r,437565l792962,437565,792962,xem811593,r-9322,l802271,437565r9322,l811593,xem830275,r-9335,l820940,437565r9335,l830275,xem876858,l848880,r,437565l876858,437565,876858,xem904862,l886218,r,437565l904862,437565,904862,xem932751,r-9322,l923429,437565r9322,l932751,xem960818,r-9322,l951496,437565r9322,l960818,xem998093,l979436,r,437565l998093,437565,998093,xem1044816,r-18644,l1026172,437565r18644,l1044816,xem1100505,r-27990,l1072515,437565r27990,l1100505,xem1119187,r-9322,l1109865,437565r9322,l1119187,xem1147178,r-18644,l1128534,437565r18644,l1147178,xe" fillcolor="black" stroked="f">
-              <v:path arrowok="t"/>
-              <w10:wrap anchorx="page" anchory="page"/>
-            </v:shape>
-          </w:pict>
-        </mc:Fallback>
-      </mc:AlternateContent>
-    </w:r>
-    <w:r>
-      <w:rPr>
-        <w:i w:val="0"/>
-        <w:noProof/>
-        <w:sz w:val="20"/>
-      </w:rPr>
-      <mc:AlternateContent>
-        <mc:Choice Requires="wps">
-          <w:drawing>
-            <wp:anchor distT="0" distB="0" distL="0" distR="0" simplePos="0" relativeHeight="251649024" behindDoc="1" locked="0" layoutInCell="1" allowOverlap="1" wp14:anchorId="71E2B6E8" wp14:editId="218FD11A">
-              <wp:simplePos x="0" y="0"/>
-              <wp:positionH relativeFrom="page">
-                <wp:posOffset>1999233</wp:posOffset>
-              </wp:positionH>
-              <wp:positionV relativeFrom="page">
-                <wp:posOffset>1441703</wp:posOffset>
-              </wp:positionV>
-              <wp:extent cx="1068705" cy="633730"/>
-              <wp:effectExtent l="0" t="0" r="0" b="0"/>
-              <wp:wrapNone/>
-              <wp:docPr id="31" name="Textbox 31"/>
+              <wp:docPr id="5" name="Textbox 5"/>
               <wp:cNvGraphicFramePr>
                 <a:graphicFrameLocks xmlns:a="http://schemas.openxmlformats.org/drawingml/2006/main"/>
               </wp:cNvGraphicFramePr>
@@ -15956,7 +15741,7 @@
                     <wps:spPr>
                       <a:xfrm>
                         <a:off x="0" y="0"/>
-                        <a:ext cx="1068705" cy="633730"/>
+                        <a:ext cx="1326515" cy="645795"/>
                       </a:xfrm>
                       <a:prstGeom prst="rect">
                         <a:avLst/>
@@ -15966,94 +15751,33 @@
                       <w:txbxContent>
                         <w:p>
                           <w:pPr>
-                            <w:spacing w:before="12" w:line="278" w:lineRule="auto"/>
-                            <w:ind w:left="20" w:right="453"/>
-                            <w:rPr>
-                              <w:b/>
+                            <w:spacing w:before="12"/>
+                            <w:rPr>
                               <w:sz w:val="18"/>
                             </w:rPr>
                           </w:pPr>
-                          <w:proofErr w:type="spellStart"/>
-                          <w:r>
-                            <w:rPr>
-                              <w:b/>
-                              <w:spacing w:val="-4"/>
-                              <w:sz w:val="18"/>
-                            </w:rPr>
-                            <w:t>Nº</w:t>
-                          </w:r>
-                          <w:proofErr w:type="spellEnd"/>
-                          <w:r>
-                            <w:rPr>
-                              <w:b/>
-                              <w:spacing w:val="-13"/>
-                              <w:sz w:val="18"/>
-                            </w:rPr>
-                            <w:t xml:space="preserve"> </w:t>
-                          </w:r>
-                          <w:r>
-                            <w:rPr>
-                              <w:b/>
-                              <w:spacing w:val="-4"/>
-                              <w:sz w:val="18"/>
-                            </w:rPr>
-                            <w:t xml:space="preserve">Cliente: </w:t>
-                          </w:r>
-                          <w:r>
-                            <w:rPr>
-                              <w:b/>
+                          <w:r>
+                            <w:rPr>
                               <w:spacing w:val="-2"/>
                               <w:sz w:val="18"/>
                             </w:rPr>
-                            <w:t>Folio:</w:t>
-                          </w:r>
-                        </w:p>
-                        <w:p>
-                          <w:pPr>
-                            <w:spacing w:before="19"/>
-                            <w:ind w:left="20"/>
-                            <w:rPr>
-                              <w:b/>
-                              <w:sz w:val="18"/>
-                            </w:rPr>
-                          </w:pPr>
-                          <w:r>
-                            <w:rPr>
-                              <w:b/>
-                              <w:sz w:val="18"/>
-                            </w:rPr>
-                            <w:t>Fecha</w:t>
-                          </w:r>
-                          <w:r>
-                            <w:rPr>
-                              <w:b/>
-                              <w:spacing w:val="-5"/>
-                              <w:sz w:val="18"/>
-                            </w:rPr>
-                            <w:t xml:space="preserve"> </w:t>
-                          </w:r>
-                          <w:r>
-                            <w:rPr>
-                              <w:b/>
-                              <w:sz w:val="18"/>
-                            </w:rPr>
-                            <w:t>de</w:t>
-                          </w:r>
-                          <w:r>
-                            <w:rPr>
-                              <w:b/>
-                              <w:spacing w:val="-5"/>
-                              <w:sz w:val="18"/>
-                            </w:rPr>
-                            <w:t xml:space="preserve"> </w:t>
-                          </w:r>
-                          <w:r>
-                            <w:rPr>
-                              <w:b/>
+                            <w:t>{</w:t>
+                          </w:r>
+                          <w:proofErr w:type="spellStart"/>
+                          <w:r>
+                            <w:rPr>
                               <w:spacing w:val="-2"/>
                               <w:sz w:val="18"/>
                             </w:rPr>
-                            <w:t>Nacimiento:</w:t>
+                            <w:t>cliente_numero</w:t>
+                          </w:r>
+                          <w:proofErr w:type="spellEnd"/>
+                          <w:r>
+                            <w:rPr>
+                              <w:spacing w:val="-2"/>
+                              <w:sz w:val="18"/>
+                            </w:rPr>
+                            <w:t>}</w:t>
                           </w:r>
                         </w:p>
                         <w:p>
@@ -16061,27 +15785,91 @@
                             <w:spacing w:before="52"/>
                             <w:ind w:left="20"/>
                             <w:rPr>
-                              <w:b/>
-                              <w:sz w:val="18"/>
-                            </w:rPr>
-                          </w:pPr>
-                          <w:proofErr w:type="spellStart"/>
-                          <w:r>
-                            <w:rPr>
-                              <w:b/>
                               <w:spacing w:val="-2"/>
                               <w:sz w:val="18"/>
                             </w:rPr>
-                            <w:t>Mèdico</w:t>
-                          </w:r>
-                          <w:proofErr w:type="spellEnd"/>
-                          <w:r>
-                            <w:rPr>
-                              <w:b/>
+                          </w:pPr>
+                          <w:r>
+                            <w:rPr>
                               <w:spacing w:val="-2"/>
                               <w:sz w:val="18"/>
                             </w:rPr>
-                            <w:t>:</w:t>
+                            <w:t>{folio}</w:t>
+                          </w:r>
+                        </w:p>
+                        <w:p>
+                          <w:pPr>
+                            <w:spacing w:before="53"/>
+                            <w:ind w:left="20"/>
+                            <w:rPr>
+                              <w:spacing w:val="-2"/>
+                              <w:sz w:val="18"/>
+                            </w:rPr>
+                          </w:pPr>
+                          <w:r>
+                            <w:rPr>
+                              <w:spacing w:val="-2"/>
+                              <w:sz w:val="18"/>
+                            </w:rPr>
+                            <w:t>{</w:t>
+                          </w:r>
+                          <w:proofErr w:type="spellStart"/>
+                          <w:r>
+                            <w:rPr>
+                              <w:spacing w:val="-2"/>
+                              <w:sz w:val="18"/>
+                            </w:rPr>
+                            <w:t>fecha_nacimiento</w:t>
+                          </w:r>
+                          <w:proofErr w:type="spellEnd"/>
+                          <w:r>
+                            <w:rPr>
+                              <w:spacing w:val="-2"/>
+                              <w:sz w:val="18"/>
+                            </w:rPr>
+                            <w:t>}</w:t>
+                          </w:r>
+                        </w:p>
+                        <w:p>
+                          <w:pPr>
+                            <w:spacing w:before="53"/>
+                            <w:ind w:left="20"/>
+                            <w:rPr>
+                              <w:sz w:val="18"/>
+                            </w:rPr>
+                          </w:pPr>
+                          <w:r>
+                            <w:rPr>
+                              <w:sz w:val="18"/>
+                            </w:rPr>
+                            <w:t>A</w:t>
+                          </w:r>
+                          <w:r>
+                            <w:rPr>
+                              <w:spacing w:val="-9"/>
+                              <w:sz w:val="18"/>
+                            </w:rPr>
+                            <w:t xml:space="preserve"> </w:t>
+                          </w:r>
+                          <w:r>
+                            <w:rPr>
+                              <w:sz w:val="18"/>
+                            </w:rPr>
+                            <w:t>QUIEN</w:t>
+                          </w:r>
+                          <w:r>
+                            <w:rPr>
+                              <w:spacing w:val="-6"/>
+                              <w:sz w:val="18"/>
+                            </w:rPr>
+                            <w:t xml:space="preserve"> </w:t>
+                          </w:r>
+                          <w:r>
+                            <w:rPr>
+                              <w:spacing w:val="-4"/>
+                              <w:sz w:val="18"/>
+                            </w:rPr>
+                            <w:t>CORRESPONDA</w:t>
                           </w:r>
                         </w:p>
                       </w:txbxContent>
@@ -16097,99 +15885,38 @@
         </mc:Choice>
         <mc:Fallback>
           <w:pict>
-            <v:shape w14:anchorId="71E2B6E8" id="Textbox 31" o:spid="_x0000_s1051" type="#_x0000_t202" style="position:absolute;margin-left:157.4pt;margin-top:113.5pt;width:84.15pt;height:49.9pt;z-index:-251667456;visibility:visible;mso-wrap-style:square;mso-wrap-distance-left:0;mso-wrap-distance-top:0;mso-wrap-distance-right:0;mso-wrap-distance-bottom:0;mso-position-horizontal:absolute;mso-position-horizontal-relative:page;mso-position-vertical:absolute;mso-position-vertical-relative:page;v-text-anchor:top" o:gfxdata="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" filled="f" stroked="f">
+            <v:shape w14:anchorId="3DA5D2A3" id="Textbox 5" o:spid="_x0000_s1033" type="#_x0000_t202" style="position:absolute;margin-left:253.95pt;margin-top:113.15pt;width:104.45pt;height:50.85pt;z-index:-251686912;visibility:visible;mso-wrap-style:square;mso-wrap-distance-left:0;mso-wrap-distance-top:0;mso-wrap-distance-right:0;mso-wrap-distance-bottom:0;mso-position-horizontal:absolute;mso-position-horizontal-relative:page;mso-position-vertical:absolute;mso-position-vertical-relative:page;v-text-anchor:top" o:gfxdata="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" filled="f" stroked="f">
               <v:textbox inset="0,0,0,0">
                 <w:txbxContent>
                   <w:p>
                     <w:pPr>
-                      <w:spacing w:before="12" w:line="278" w:lineRule="auto"/>
-                      <w:ind w:left="20" w:right="453"/>
-                      <w:rPr>
-                        <w:b/>
+                      <w:spacing w:before="12"/>
+                      <w:rPr>
                         <w:sz w:val="18"/>
                       </w:rPr>
                     </w:pPr>
-                    <w:proofErr w:type="spellStart"/>
-                    <w:r>
-                      <w:rPr>
-                        <w:b/>
-                        <w:spacing w:val="-4"/>
-                        <w:sz w:val="18"/>
-                      </w:rPr>
-                      <w:t>Nº</w:t>
-                    </w:r>
-                    <w:proofErr w:type="spellEnd"/>
-                    <w:r>
-                      <w:rPr>
-                        <w:b/>
-                        <w:spacing w:val="-13"/>
-                        <w:sz w:val="18"/>
-                      </w:rPr>
-                      <w:t xml:space="preserve"> </w:t>
-                    </w:r>
-                    <w:r>
-                      <w:rPr>
-                        <w:b/>
-                        <w:spacing w:val="-4"/>
-                        <w:sz w:val="18"/>
-                      </w:rPr>
-                      <w:t xml:space="preserve">Cliente: </w:t>
-                    </w:r>
-                    <w:r>
-                      <w:rPr>
-                        <w:b/>
+                    <w:r>
+                      <w:rPr>
                         <w:spacing w:val="-2"/>
                         <w:sz w:val="18"/>
                       </w:rPr>
-                      <w:t>Folio:</w:t>
-                    </w:r>
-                  </w:p>
-                  <w:p>
-                    <w:pPr>
-                      <w:spacing w:before="19"/>
-                      <w:ind w:left="20"/>
-                      <w:rPr>
-                        <w:b/>
-                        <w:sz w:val="18"/>
-                      </w:rPr>
-                    </w:pPr>
-                    <w:r>
-                      <w:rPr>
-                        <w:b/>
-                        <w:sz w:val="18"/>
-                      </w:rPr>
-                      <w:t>Fecha</w:t>
-                    </w:r>
-                    <w:r>
-                      <w:rPr>
-                        <w:b/>
-                        <w:spacing w:val="-5"/>
-                        <w:sz w:val="18"/>
-                      </w:rPr>
-                      <w:t xml:space="preserve"> </w:t>
-                    </w:r>
-                    <w:r>
-                      <w:rPr>
-                        <w:b/>
-                        <w:sz w:val="18"/>
-                      </w:rPr>
-                      <w:t>de</w:t>
-                    </w:r>
-                    <w:r>
-                      <w:rPr>
-                        <w:b/>
-                        <w:spacing w:val="-5"/>
-                        <w:sz w:val="18"/>
-                      </w:rPr>
-                      <w:t xml:space="preserve"> </w:t>
-                    </w:r>
-                    <w:r>
-                      <w:rPr>
-                        <w:b/>
+                      <w:t>{</w:t>
+                    </w:r>
+                    <w:proofErr w:type="spellStart"/>
+                    <w:r>
+                      <w:rPr>
                         <w:spacing w:val="-2"/>
                         <w:sz w:val="18"/>
                       </w:rPr>
-                      <w:t>Nacimiento:</w:t>
+                      <w:t>cliente_numero</w:t>
+                    </w:r>
+                    <w:proofErr w:type="spellEnd"/>
+                    <w:r>
+                      <w:rPr>
+                        <w:spacing w:val="-2"/>
+                        <w:sz w:val="18"/>
+                      </w:rPr>
+                      <w:t>}</w:t>
                     </w:r>
                   </w:p>
                   <w:p>
@@ -16197,27 +15924,91 @@
                       <w:spacing w:before="52"/>
                       <w:ind w:left="20"/>
                       <w:rPr>
-                        <w:b/>
-                        <w:sz w:val="18"/>
-                      </w:rPr>
-                    </w:pPr>
-                    <w:proofErr w:type="spellStart"/>
-                    <w:r>
-                      <w:rPr>
-                        <w:b/>
                         <w:spacing w:val="-2"/>
                         <w:sz w:val="18"/>
                       </w:rPr>
-                      <w:t>Mèdico</w:t>
-                    </w:r>
-                    <w:proofErr w:type="spellEnd"/>
-                    <w:r>
-                      <w:rPr>
-                        <w:b/>
+                    </w:pPr>
+                    <w:r>
+                      <w:rPr>
                         <w:spacing w:val="-2"/>
                         <w:sz w:val="18"/>
                       </w:rPr>
-                      <w:t>:</w:t>
+                      <w:t>{folio}</w:t>
+                    </w:r>
+                  </w:p>
+                  <w:p>
+                    <w:pPr>
+                      <w:spacing w:before="53"/>
+                      <w:ind w:left="20"/>
+                      <w:rPr>
+                        <w:spacing w:val="-2"/>
+                        <w:sz w:val="18"/>
+                      </w:rPr>
+                    </w:pPr>
+                    <w:r>
+                      <w:rPr>
+                        <w:spacing w:val="-2"/>
+                        <w:sz w:val="18"/>
+                      </w:rPr>
+                      <w:t>{</w:t>
+                    </w:r>
+                    <w:proofErr w:type="spellStart"/>
+                    <w:r>
+                      <w:rPr>
+                        <w:spacing w:val="-2"/>
+                        <w:sz w:val="18"/>
+                      </w:rPr>
+                      <w:t>fecha_nacimiento</w:t>
+                    </w:r>
+                    <w:proofErr w:type="spellEnd"/>
+                    <w:r>
+                      <w:rPr>
+                        <w:spacing w:val="-2"/>
+                        <w:sz w:val="18"/>
+                      </w:rPr>
+                      <w:t>}</w:t>
+                    </w:r>
+                  </w:p>
+                  <w:p>
+                    <w:pPr>
+                      <w:spacing w:before="53"/>
+                      <w:ind w:left="20"/>
+                      <w:rPr>
+                        <w:sz w:val="18"/>
+                      </w:rPr>
+                    </w:pPr>
+                    <w:r>
+                      <w:rPr>
+                        <w:sz w:val="18"/>
+                      </w:rPr>
+                      <w:t>A</w:t>
+                    </w:r>
+                    <w:r>
+                      <w:rPr>
+                        <w:spacing w:val="-9"/>
+                        <w:sz w:val="18"/>
+                      </w:rPr>
+                      <w:t xml:space="preserve"> </w:t>
+                    </w:r>
+                    <w:r>
+                      <w:rPr>
+                        <w:sz w:val="18"/>
+                      </w:rPr>
+                      <w:t>QUIEN</w:t>
+                    </w:r>
+                    <w:r>
+                      <w:rPr>
+                        <w:spacing w:val="-6"/>
+                        <w:sz w:val="18"/>
+                      </w:rPr>
+                      <w:t xml:space="preserve"> </w:t>
+                    </w:r>
+                    <w:r>
+                      <w:rPr>
+                        <w:spacing w:val="-4"/>
+                        <w:sz w:val="18"/>
+                      </w:rPr>
+                      <w:t>CORRESPONDA</w:t>
                     </w:r>
                   </w:p>
                 </w:txbxContent>
@@ -16237,18 +16028,18 @@
       <mc:AlternateContent>
         <mc:Choice Requires="wps">
           <w:drawing>
-            <wp:anchor distT="0" distB="0" distL="0" distR="0" simplePos="0" relativeHeight="251663360" behindDoc="1" locked="0" layoutInCell="1" allowOverlap="1" wp14:anchorId="25559ECD" wp14:editId="61BC7436">
+            <wp:anchor distT="0" distB="0" distL="0" distR="0" simplePos="0" relativeHeight="251643904" behindDoc="1" locked="0" layoutInCell="1" allowOverlap="1" wp14:anchorId="7DD060C0" wp14:editId="6F7C9F14">
               <wp:simplePos x="0" y="0"/>
               <wp:positionH relativeFrom="page">
-                <wp:posOffset>3229482</wp:posOffset>
+                <wp:posOffset>1993138</wp:posOffset>
               </wp:positionH>
               <wp:positionV relativeFrom="page">
-                <wp:posOffset>1459991</wp:posOffset>
+                <wp:posOffset>1441703</wp:posOffset>
               </wp:positionV>
-              <wp:extent cx="1338580" cy="615315"/>
+              <wp:extent cx="1052195" cy="621665"/>
               <wp:effectExtent l="0" t="0" r="0" b="0"/>
               <wp:wrapNone/>
-              <wp:docPr id="32" name="Textbox 32"/>
+              <wp:docPr id="6" name="Textbox 6"/>
               <wp:cNvGraphicFramePr>
                 <a:graphicFrameLocks xmlns:a="http://schemas.openxmlformats.org/drawingml/2006/main"/>
               </wp:cNvGraphicFramePr>
@@ -16261,7 +16052,7 @@
                     <wps:spPr>
                       <a:xfrm>
                         <a:off x="0" y="0"/>
-                        <a:ext cx="1338580" cy="615315"/>
+                        <a:ext cx="1052195" cy="621665"/>
                       </a:xfrm>
                       <a:prstGeom prst="rect">
                         <a:avLst/>
@@ -16271,33 +16062,95 @@
                       <w:txbxContent>
                         <w:p>
                           <w:pPr>
-                            <w:spacing w:before="12"/>
-                            <w:rPr>
+                            <w:spacing w:before="12" w:line="278" w:lineRule="auto"/>
+                            <w:ind w:left="20" w:right="429"/>
+                            <w:rPr>
+                              <w:b/>
                               <w:sz w:val="18"/>
                             </w:rPr>
                           </w:pPr>
-                          <w:r>
-                            <w:rPr>
+                          <w:proofErr w:type="spellStart"/>
+                          <w:r>
+                            <w:rPr>
+                              <w:b/>
+                              <w:spacing w:val="-4"/>
+                              <w:sz w:val="18"/>
+                            </w:rPr>
+                            <w:t>Nº</w:t>
+                          </w:r>
+                          <w:proofErr w:type="spellEnd"/>
+                          <w:r>
+                            <w:rPr>
+                              <w:b/>
+                              <w:spacing w:val="-15"/>
+                              <w:sz w:val="18"/>
+                            </w:rPr>
+                            <w:t xml:space="preserve"> </w:t>
+                          </w:r>
+                          <w:r>
+                            <w:rPr>
+                              <w:b/>
+                              <w:spacing w:val="-4"/>
+                              <w:sz w:val="18"/>
+                            </w:rPr>
+                            <w:t xml:space="preserve">Cliente: </w:t>
+                          </w:r>
+                          <w:r>
+                            <w:rPr>
+                              <w:b/>
                               <w:spacing w:val="-2"/>
                               <w:sz w:val="18"/>
                             </w:rPr>
-                            <w:t>{</w:t>
-                          </w:r>
-                          <w:proofErr w:type="spellStart"/>
-                          <w:r>
-                            <w:rPr>
+                            <w:t>Folio:</w:t>
+                          </w:r>
+                        </w:p>
+                        <w:p>
+                          <w:pPr>
+                            <w:ind w:left="20"/>
+                            <w:rPr>
+                              <w:b/>
+                              <w:sz w:val="18"/>
+                            </w:rPr>
+                          </w:pPr>
+                          <w:r>
+                            <w:rPr>
+                              <w:b/>
                               <w:spacing w:val="-2"/>
                               <w:sz w:val="18"/>
                             </w:rPr>
-                            <w:t>cliente_numero</w:t>
-                          </w:r>
-                          <w:proofErr w:type="spellEnd"/>
-                          <w:r>
-                            <w:rPr>
+                            <w:t>Fecha</w:t>
+                          </w:r>
+                          <w:r>
+                            <w:rPr>
+                              <w:b/>
+                              <w:spacing w:val="-10"/>
+                              <w:sz w:val="18"/>
+                            </w:rPr>
+                            <w:t xml:space="preserve"> </w:t>
+                          </w:r>
+                          <w:r>
+                            <w:rPr>
+                              <w:b/>
                               <w:spacing w:val="-2"/>
                               <w:sz w:val="18"/>
                             </w:rPr>
-                            <w:t>}</w:t>
+                            <w:t>de</w:t>
+                          </w:r>
+                          <w:r>
+                            <w:rPr>
+                              <w:b/>
+                              <w:spacing w:val="-13"/>
+                              <w:sz w:val="18"/>
+                            </w:rPr>
+                            <w:t xml:space="preserve"> </w:t>
+                          </w:r>
+                          <w:r>
+                            <w:rPr>
+                              <w:b/>
+                              <w:spacing w:val="-2"/>
+                              <w:sz w:val="18"/>
+                            </w:rPr>
+                            <w:t>Nacimiento:</w:t>
                           </w:r>
                         </w:p>
                         <w:p>
@@ -16305,101 +16158,28 @@
                             <w:spacing w:before="52"/>
                             <w:ind w:left="20"/>
                             <w:rPr>
+                              <w:b/>
+                              <w:sz w:val="18"/>
+                            </w:rPr>
+                          </w:pPr>
+                          <w:proofErr w:type="spellStart"/>
+                          <w:r>
+                            <w:rPr>
+                              <w:b/>
                               <w:spacing w:val="-2"/>
                               <w:sz w:val="18"/>
                             </w:rPr>
-                          </w:pPr>
-                          <w:r>
-                            <w:rPr>
+                            <w:t>Mèdico</w:t>
+                          </w:r>
+                          <w:proofErr w:type="spellEnd"/>
+                          <w:r>
+                            <w:rPr>
+                              <w:b/>
                               <w:spacing w:val="-2"/>
                               <w:sz w:val="18"/>
                             </w:rPr>
-                            <w:t>{folio}</w:t>
-                          </w:r>
-                        </w:p>
-                        <w:p>
-                          <w:pPr>
-                            <w:spacing w:before="53"/>
-                            <w:ind w:left="20"/>
-                            <w:rPr>
-                              <w:spacing w:val="-2"/>
-                              <w:sz w:val="18"/>
-                            </w:rPr>
-                          </w:pPr>
-                          <w:r>
-                            <w:rPr>
-                              <w:spacing w:val="-2"/>
-                              <w:sz w:val="18"/>
-                            </w:rPr>
-                            <w:t>{</w:t>
-                          </w:r>
-                          <w:proofErr w:type="spellStart"/>
-                          <w:r>
-                            <w:rPr>
-                              <w:spacing w:val="-2"/>
-                              <w:sz w:val="18"/>
-                            </w:rPr>
-                            <w:t>fecha_nacimiento</w:t>
-                          </w:r>
-                          <w:proofErr w:type="spellEnd"/>
-                          <w:r>
-                            <w:rPr>
-                              <w:spacing w:val="-2"/>
-                              <w:sz w:val="18"/>
-                            </w:rPr>
-                            <w:t>}</w:t>
-                          </w:r>
-                        </w:p>
-                        <w:p>
-                          <w:pPr>
-                            <w:spacing w:before="53"/>
-                            <w:ind w:left="20"/>
-                            <w:rPr>
-                              <w:sz w:val="18"/>
-                            </w:rPr>
-                          </w:pPr>
-                          <w:r>
-                            <w:rPr>
-                              <w:sz w:val="18"/>
-                            </w:rPr>
-                            <w:t>A</w:t>
-                          </w:r>
-                          <w:r>
-                            <w:rPr>
-                              <w:spacing w:val="-9"/>
-                              <w:sz w:val="18"/>
-                            </w:rPr>
-                            <w:t xml:space="preserve"> </w:t>
-                          </w:r>
-                          <w:r>
-                            <w:rPr>
-                              <w:sz w:val="18"/>
-                            </w:rPr>
-                            <w:t>QUIEN</w:t>
-                          </w:r>
-                          <w:r>
-                            <w:rPr>
-                              <w:spacing w:val="-6"/>
-                              <w:sz w:val="18"/>
-                            </w:rPr>
-                            <w:t xml:space="preserve"> </w:t>
-                          </w:r>
-                          <w:r>
-                            <w:rPr>
-                              <w:spacing w:val="-4"/>
-                              <w:sz w:val="18"/>
-                            </w:rPr>
-                            <w:t>CORRESPONDA</w:t>
-                          </w:r>
-                        </w:p>
-                        <w:p>
-                          <w:pPr>
-                            <w:spacing w:before="53"/>
-                            <w:ind w:left="20"/>
-                            <w:rPr>
-                              <w:sz w:val="18"/>
-                            </w:rPr>
-                          </w:pPr>
+                            <w:t>:</w:t>
+                          </w:r>
                         </w:p>
                       </w:txbxContent>
                     </wps:txbx>
@@ -16414,38 +16194,100 @@
         </mc:Choice>
         <mc:Fallback>
           <w:pict>
-            <v:shape w14:anchorId="25559ECD" id="Textbox 32" o:spid="_x0000_s1052" type="#_x0000_t202" style="position:absolute;margin-left:254.3pt;margin-top:114.95pt;width:105.4pt;height:48.45pt;z-index:-251653120;visibility:visible;mso-wrap-style:square;mso-wrap-distance-left:0;mso-wrap-distance-top:0;mso-wrap-distance-right:0;mso-wrap-distance-bottom:0;mso-position-horizontal:absolute;mso-position-horizontal-relative:page;mso-position-vertical:absolute;mso-position-vertical-relative:page;v-text-anchor:top" o:gfxdata="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" filled="f" stroked="f">
+            <v:shape w14:anchorId="7DD060C0" id="Textbox 6" o:spid="_x0000_s1034" type="#_x0000_t202" style="position:absolute;margin-left:156.95pt;margin-top:113.5pt;width:82.85pt;height:48.95pt;z-index:-251672576;visibility:visible;mso-wrap-style:square;mso-wrap-distance-left:0;mso-wrap-distance-top:0;mso-wrap-distance-right:0;mso-wrap-distance-bottom:0;mso-position-horizontal:absolute;mso-position-horizontal-relative:page;mso-position-vertical:absolute;mso-position-vertical-relative:page;v-text-anchor:top" o:gfxdata="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" filled="f" stroked="f">
               <v:textbox inset="0,0,0,0">
                 <w:txbxContent>
                   <w:p>
                     <w:pPr>
-                      <w:spacing w:before="12"/>
-                      <w:rPr>
+                      <w:spacing w:before="12" w:line="278" w:lineRule="auto"/>
+                      <w:ind w:left="20" w:right="429"/>
+                      <w:rPr>
+                        <w:b/>
                         <w:sz w:val="18"/>
                       </w:rPr>
                     </w:pPr>
-                    <w:r>
-                      <w:rPr>
+                    <w:proofErr w:type="spellStart"/>
+                    <w:r>
+                      <w:rPr>
+                        <w:b/>
+                        <w:spacing w:val="-4"/>
+                        <w:sz w:val="18"/>
+                      </w:rPr>
+                      <w:t>Nº</w:t>
+                    </w:r>
+                    <w:proofErr w:type="spellEnd"/>
+                    <w:r>
+                      <w:rPr>
+                        <w:b/>
+                        <w:spacing w:val="-15"/>
+                        <w:sz w:val="18"/>
+                      </w:rPr>
+                      <w:t xml:space="preserve"> </w:t>
+                    </w:r>
+                    <w:r>
+                      <w:rPr>
+                        <w:b/>
+                        <w:spacing w:val="-4"/>
+                        <w:sz w:val="18"/>
+                      </w:rPr>
+                      <w:t xml:space="preserve">Cliente: </w:t>
+                    </w:r>
+                    <w:r>
+                      <w:rPr>
+                        <w:b/>
                         <w:spacing w:val="-2"/>
                         <w:sz w:val="18"/>
                       </w:rPr>
-                      <w:t>{</w:t>
-                    </w:r>
-                    <w:proofErr w:type="spellStart"/>
-                    <w:r>
-                      <w:rPr>
+                      <w:t>Folio:</w:t>
+                    </w:r>
+                  </w:p>
+                  <w:p>
+                    <w:pPr>
+                      <w:ind w:left="20"/>
+                      <w:rPr>
+                        <w:b/>
+                        <w:sz w:val="18"/>
+                      </w:rPr>
+                    </w:pPr>
+                    <w:r>
+                      <w:rPr>
+                        <w:b/>
                         <w:spacing w:val="-2"/>
                         <w:sz w:val="18"/>
                       </w:rPr>
-                      <w:t>cliente_numero</w:t>
-                    </w:r>
-                    <w:proofErr w:type="spellEnd"/>
-                    <w:r>
-                      <w:rPr>
+                      <w:t>Fecha</w:t>
+                    </w:r>
+                    <w:r>
+                      <w:rPr>
+                        <w:b/>
+                        <w:spacing w:val="-10"/>
+                        <w:sz w:val="18"/>
+                      </w:rPr>
+                      <w:t xml:space="preserve"> </w:t>
+                    </w:r>
+                    <w:r>
+                      <w:rPr>
+                        <w:b/>
                         <w:spacing w:val="-2"/>
                         <w:sz w:val="18"/>
                       </w:rPr>
-                      <w:t>}</w:t>
+                      <w:t>de</w:t>
+                    </w:r>
+                    <w:r>
+                      <w:rPr>
+                        <w:b/>
+                        <w:spacing w:val="-13"/>
+                        <w:sz w:val="18"/>
+                      </w:rPr>
+                      <w:t xml:space="preserve"> </w:t>
+                    </w:r>
+                    <w:r>
+                      <w:rPr>
+                        <w:b/>
+                        <w:spacing w:val="-2"/>
+                        <w:sz w:val="18"/>
+                      </w:rPr>
+                      <w:t>Nacimiento:</w:t>
                     </w:r>
                   </w:p>
                   <w:p>
@@ -16453,101 +16295,28 @@
                       <w:spacing w:before="52"/>
                       <w:ind w:left="20"/>
                       <w:rPr>
+                        <w:b/>
+                        <w:sz w:val="18"/>
+                      </w:rPr>
+                    </w:pPr>
+                    <w:proofErr w:type="spellStart"/>
+                    <w:r>
+                      <w:rPr>
+                        <w:b/>
                         <w:spacing w:val="-2"/>
                         <w:sz w:val="18"/>
                       </w:rPr>
-                    </w:pPr>
-                    <w:r>
-                      <w:rPr>
+                      <w:t>Mèdico</w:t>
+                    </w:r>
+                    <w:proofErr w:type="spellEnd"/>
+                    <w:r>
+                      <w:rPr>
+                        <w:b/>
                         <w:spacing w:val="-2"/>
                         <w:sz w:val="18"/>
                       </w:rPr>
-                      <w:t>{folio}</w:t>
-                    </w:r>
-                  </w:p>
-                  <w:p>
-                    <w:pPr>
-                      <w:spacing w:before="53"/>
-                      <w:ind w:left="20"/>
-                      <w:rPr>
-                        <w:spacing w:val="-2"/>
-                        <w:sz w:val="18"/>
-                      </w:rPr>
-                    </w:pPr>
-                    <w:r>
-                      <w:rPr>
-                        <w:spacing w:val="-2"/>
-                        <w:sz w:val="18"/>
-                      </w:rPr>
-                      <w:t>{</w:t>
-                    </w:r>
-                    <w:proofErr w:type="spellStart"/>
-                    <w:r>
-                      <w:rPr>
-                        <w:spacing w:val="-2"/>
-                        <w:sz w:val="18"/>
-                      </w:rPr>
-                      <w:t>fecha_nacimiento</w:t>
-                    </w:r>
-                    <w:proofErr w:type="spellEnd"/>
-                    <w:r>
-                      <w:rPr>
-                        <w:spacing w:val="-2"/>
-                        <w:sz w:val="18"/>
-                      </w:rPr>
-                      <w:t>}</w:t>
-                    </w:r>
-                  </w:p>
-                  <w:p>
-                    <w:pPr>
-                      <w:spacing w:before="53"/>
-                      <w:ind w:left="20"/>
-                      <w:rPr>
-                        <w:sz w:val="18"/>
-                      </w:rPr>
-                    </w:pPr>
-                    <w:r>
-                      <w:rPr>
-                        <w:sz w:val="18"/>
-                      </w:rPr>
-                      <w:t>A</w:t>
-                    </w:r>
-                    <w:r>
-                      <w:rPr>
-                        <w:spacing w:val="-9"/>
-                        <w:sz w:val="18"/>
-                      </w:rPr>
-                      <w:t xml:space="preserve"> </w:t>
-                    </w:r>
-                    <w:r>
-                      <w:rPr>
-                        <w:sz w:val="18"/>
-                      </w:rPr>
-                      <w:t>QUIEN</w:t>
-                    </w:r>
-                    <w:r>
-                      <w:rPr>
-                        <w:spacing w:val="-6"/>
-                        <w:sz w:val="18"/>
-                      </w:rPr>
-                      <w:t xml:space="preserve"> </w:t>
-                    </w:r>
-                    <w:r>
-                      <w:rPr>
-                        <w:spacing w:val="-4"/>
-                        <w:sz w:val="18"/>
-                      </w:rPr>
-                      <w:t>CORRESPONDA</w:t>
-                    </w:r>
-                  </w:p>
-                  <w:p>
-                    <w:pPr>
-                      <w:spacing w:before="53"/>
-                      <w:ind w:left="20"/>
-                      <w:rPr>
-                        <w:sz w:val="18"/>
-                      </w:rPr>
-                    </w:pPr>
+                      <w:t>:</w:t>
+                    </w:r>
                   </w:p>
                 </w:txbxContent>
               </v:textbox>
@@ -16566,18 +16335,18 @@
       <mc:AlternateContent>
         <mc:Choice Requires="wps">
           <w:drawing>
-            <wp:anchor distT="0" distB="0" distL="0" distR="0" simplePos="0" relativeHeight="251714560" behindDoc="1" locked="0" layoutInCell="1" allowOverlap="1" wp14:anchorId="76CF5968" wp14:editId="1FC0ADE1">
+            <wp:anchor distT="0" distB="0" distL="0" distR="0" simplePos="0" relativeHeight="251695104" behindDoc="1" locked="0" layoutInCell="1" allowOverlap="1" wp14:anchorId="1A629CDB" wp14:editId="54284BA2">
               <wp:simplePos x="0" y="0"/>
               <wp:positionH relativeFrom="page">
-                <wp:posOffset>696264</wp:posOffset>
+                <wp:posOffset>691692</wp:posOffset>
               </wp:positionH>
               <wp:positionV relativeFrom="page">
-                <wp:posOffset>1911095</wp:posOffset>
+                <wp:posOffset>1912619</wp:posOffset>
               </wp:positionV>
-              <wp:extent cx="824865" cy="152400"/>
+              <wp:extent cx="808355" cy="152400"/>
               <wp:effectExtent l="0" t="0" r="0" b="0"/>
               <wp:wrapNone/>
-              <wp:docPr id="37" name="Textbox 37"/>
+              <wp:docPr id="11" name="Textbox 11"/>
               <wp:cNvGraphicFramePr>
                 <a:graphicFrameLocks xmlns:a="http://schemas.openxmlformats.org/drawingml/2006/main"/>
               </wp:cNvGraphicFramePr>
@@ -16590,7 +16359,7 @@
                     <wps:spPr>
                       <a:xfrm>
                         <a:off x="0" y="0"/>
-                        <a:ext cx="824865" cy="152400"/>
+                        <a:ext cx="808355" cy="152400"/>
                       </a:xfrm>
                       <a:prstGeom prst="rect">
                         <a:avLst/>
@@ -16602,16 +16371,33 @@
                           <w:pPr>
                             <w:spacing w:before="12"/>
                             <w:ind w:left="20"/>
+                            <w:jc w:val="center"/>
                             <w:rPr>
                               <w:sz w:val="18"/>
                             </w:rPr>
                           </w:pPr>
                           <w:r>
                             <w:rPr>
-                              <w:spacing w:val="-2"/>
+                              <w:spacing w:val="-4"/>
                               <w:sz w:val="18"/>
                             </w:rPr>
-                            <w:t>ANC8349230417</w:t>
+                            <w:t>{</w:t>
+                          </w:r>
+                          <w:proofErr w:type="spellStart"/>
+                          <w:r>
+                            <w:rPr>
+                              <w:spacing w:val="-4"/>
+                              <w:sz w:val="18"/>
+                            </w:rPr>
+                            <w:t>codigo_barra</w:t>
+                          </w:r>
+                          <w:proofErr w:type="spellEnd"/>
+                          <w:r>
+                            <w:rPr>
+                              <w:spacing w:val="-4"/>
+                              <w:sz w:val="18"/>
+                            </w:rPr>
+                            <w:t>}</w:t>
                           </w:r>
                         </w:p>
                       </w:txbxContent>
@@ -16627,23 +16413,40 @@
         </mc:Choice>
         <mc:Fallback>
           <w:pict>
-            <v:shape w14:anchorId="76CF5968" id="Textbox 37" o:spid="_x0000_s1053" type="#_x0000_t202" style="position:absolute;margin-left:54.8pt;margin-top:150.5pt;width:64.95pt;height:12pt;z-index:-251601920;visibility:visible;mso-wrap-style:square;mso-wrap-distance-left:0;mso-wrap-distance-top:0;mso-wrap-distance-right:0;mso-wrap-distance-bottom:0;mso-position-horizontal:absolute;mso-position-horizontal-relative:page;mso-position-vertical:absolute;mso-position-vertical-relative:page;v-text-anchor:top" o:gfxdata="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" filled="f" stroked="f">
+            <v:shape w14:anchorId="1A629CDB" id="Textbox 11" o:spid="_x0000_s1035" type="#_x0000_t202" style="position:absolute;margin-left:54.45pt;margin-top:150.6pt;width:63.65pt;height:12pt;z-index:-251621376;visibility:visible;mso-wrap-style:square;mso-wrap-distance-left:0;mso-wrap-distance-top:0;mso-wrap-distance-right:0;mso-wrap-distance-bottom:0;mso-position-horizontal:absolute;mso-position-horizontal-relative:page;mso-position-vertical:absolute;mso-position-vertical-relative:page;v-text-anchor:top" o:gfxdata="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" filled="f" stroked="f">
               <v:textbox inset="0,0,0,0">
                 <w:txbxContent>
                   <w:p>
                     <w:pPr>
                       <w:spacing w:before="12"/>
                       <w:ind w:left="20"/>
+                      <w:jc w:val="center"/>
                       <w:rPr>
                         <w:sz w:val="18"/>
                       </w:rPr>
                     </w:pPr>
                     <w:r>
                       <w:rPr>
-                        <w:spacing w:val="-2"/>
+                        <w:spacing w:val="-4"/>
                         <w:sz w:val="18"/>
                       </w:rPr>
-                      <w:t>ANC8349230417</w:t>
+                      <w:t>{</w:t>
+                    </w:r>
+                    <w:proofErr w:type="spellStart"/>
+                    <w:r>
+                      <w:rPr>
+                        <w:spacing w:val="-4"/>
+                        <w:sz w:val="18"/>
+                      </w:rPr>
+                      <w:t>codigo_barra</w:t>
+                    </w:r>
+                    <w:proofErr w:type="spellEnd"/>
+                    <w:r>
+                      <w:rPr>
+                        <w:spacing w:val="-4"/>
+                        <w:sz w:val="18"/>
+                      </w:rPr>
+                      <w:t>}</w:t>
                     </w:r>
                   </w:p>
                 </w:txbxContent>
@@ -16663,18 +16466,119 @@
       <mc:AlternateContent>
         <mc:Choice Requires="wps">
           <w:drawing>
-            <wp:anchor distT="0" distB="0" distL="0" distR="0" simplePos="0" relativeHeight="251724800" behindDoc="1" locked="0" layoutInCell="1" allowOverlap="1" wp14:anchorId="12B563DD" wp14:editId="53C4E3A9">
+            <wp:anchor distT="0" distB="0" distL="0" distR="0" simplePos="0" relativeHeight="251701248" behindDoc="1" locked="0" layoutInCell="1" allowOverlap="1" wp14:anchorId="28EA7589" wp14:editId="1EB763C2">
               <wp:simplePos x="0" y="0"/>
               <wp:positionH relativeFrom="page">
-                <wp:posOffset>7040371</wp:posOffset>
+                <wp:posOffset>5221985</wp:posOffset>
               </wp:positionH>
               <wp:positionV relativeFrom="page">
-                <wp:posOffset>2072639</wp:posOffset>
+                <wp:posOffset>2075687</wp:posOffset>
+              </wp:positionV>
+              <wp:extent cx="287655" cy="152400"/>
+              <wp:effectExtent l="0" t="0" r="0" b="0"/>
+              <wp:wrapNone/>
+              <wp:docPr id="12" name="Textbox 12"/>
+              <wp:cNvGraphicFramePr>
+                <a:graphicFrameLocks xmlns:a="http://schemas.openxmlformats.org/drawingml/2006/main"/>
+              </wp:cNvGraphicFramePr>
+              <a:graphic xmlns:a="http://schemas.openxmlformats.org/drawingml/2006/main">
+                <a:graphicData uri="http://schemas.microsoft.com/office/word/2010/wordprocessingShape">
+                  <wps:wsp>
+                    <wps:cNvSpPr txBox="1">
+                      <a:spLocks/>
+                    </wps:cNvSpPr>
+                    <wps:spPr>
+                      <a:xfrm>
+                        <a:off x="0" y="0"/>
+                        <a:ext cx="287655" cy="152400"/>
+                      </a:xfrm>
+                      <a:prstGeom prst="rect">
+                        <a:avLst/>
+                      </a:prstGeom>
+                    </wps:spPr>
+                    <wps:txbx>
+                      <w:txbxContent>
+                        <w:p>
+                          <w:pPr>
+                            <w:spacing w:before="12"/>
+                            <w:ind w:left="20"/>
+                            <w:rPr>
+                              <w:b/>
+                              <w:sz w:val="18"/>
+                            </w:rPr>
+                          </w:pPr>
+                          <w:r>
+                            <w:rPr>
+                              <w:b/>
+                              <w:spacing w:val="-2"/>
+                              <w:sz w:val="18"/>
+                            </w:rPr>
+                            <w:t>Sexo:</w:t>
+                          </w:r>
+                        </w:p>
+                      </w:txbxContent>
+                    </wps:txbx>
+                    <wps:bodyPr wrap="square" lIns="0" tIns="0" rIns="0" bIns="0" rtlCol="0">
+                      <a:noAutofit/>
+                    </wps:bodyPr>
+                  </wps:wsp>
+                </a:graphicData>
+              </a:graphic>
+            </wp:anchor>
+          </w:drawing>
+        </mc:Choice>
+        <mc:Fallback>
+          <w:pict>
+            <v:shape w14:anchorId="28EA7589" id="Textbox 12" o:spid="_x0000_s1036" type="#_x0000_t202" style="position:absolute;margin-left:411.2pt;margin-top:163.45pt;width:22.65pt;height:12pt;z-index:-251615232;visibility:visible;mso-wrap-style:square;mso-wrap-distance-left:0;mso-wrap-distance-top:0;mso-wrap-distance-right:0;mso-wrap-distance-bottom:0;mso-position-horizontal:absolute;mso-position-horizontal-relative:page;mso-position-vertical:absolute;mso-position-vertical-relative:page;v-text-anchor:top" o:gfxdata="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" filled="f" stroked="f">
+              <v:textbox inset="0,0,0,0">
+                <w:txbxContent>
+                  <w:p>
+                    <w:pPr>
+                      <w:spacing w:before="12"/>
+                      <w:ind w:left="20"/>
+                      <w:rPr>
+                        <w:b/>
+                        <w:sz w:val="18"/>
+                      </w:rPr>
+                    </w:pPr>
+                    <w:r>
+                      <w:rPr>
+                        <w:b/>
+                        <w:spacing w:val="-2"/>
+                        <w:sz w:val="18"/>
+                      </w:rPr>
+                      <w:t>Sexo:</w:t>
+                    </w:r>
+                  </w:p>
+                </w:txbxContent>
+              </v:textbox>
+              <w10:wrap anchorx="page" anchory="page"/>
+            </v:shape>
+          </w:pict>
+        </mc:Fallback>
+      </mc:AlternateContent>
+    </w:r>
+    <w:r>
+      <w:rPr>
+        <w:i w:val="0"/>
+        <w:noProof/>
+        <w:sz w:val="20"/>
+      </w:rPr>
+      <mc:AlternateContent>
+        <mc:Choice Requires="wps">
+          <w:drawing>
+            <wp:anchor distT="0" distB="0" distL="0" distR="0" simplePos="0" relativeHeight="251713536" behindDoc="1" locked="0" layoutInCell="1" allowOverlap="1" wp14:anchorId="25BF1F03" wp14:editId="7C525E9B">
+              <wp:simplePos x="0" y="0"/>
+              <wp:positionH relativeFrom="page">
+                <wp:posOffset>7035800</wp:posOffset>
+              </wp:positionH>
+              <wp:positionV relativeFrom="page">
+                <wp:posOffset>2069591</wp:posOffset>
               </wp:positionV>
               <wp:extent cx="265430" cy="152400"/>
               <wp:effectExtent l="0" t="0" r="0" b="0"/>
               <wp:wrapNone/>
-              <wp:docPr id="39" name="Textbox 39"/>
+              <wp:docPr id="15" name="Textbox 15"/>
               <wp:cNvGraphicFramePr>
                 <a:graphicFrameLocks xmlns:a="http://schemas.openxmlformats.org/drawingml/2006/main"/>
               </wp:cNvGraphicFramePr>
@@ -16726,7 +16630,7 @@
         </mc:Choice>
         <mc:Fallback>
           <w:pict>
-            <v:shape w14:anchorId="12B563DD" id="Textbox 39" o:spid="_x0000_s1054" type="#_x0000_t202" style="position:absolute;margin-left:554.35pt;margin-top:163.2pt;width:20.9pt;height:12pt;z-index:-251591680;visibility:visible;mso-wrap-style:square;mso-wrap-distance-left:0;mso-wrap-distance-top:0;mso-wrap-distance-right:0;mso-wrap-distance-bottom:0;mso-position-horizontal:absolute;mso-position-horizontal-relative:page;mso-position-vertical:absolute;mso-position-vertical-relative:page;v-text-anchor:top" o:gfxdata="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" filled="f" stroked="f">
+            <v:shape w14:anchorId="25BF1F03" id="Textbox 15" o:spid="_x0000_s1037" type="#_x0000_t202" style="position:absolute;margin-left:554pt;margin-top:162.95pt;width:20.9pt;height:12pt;z-index:-251602944;visibility:visible;mso-wrap-style:square;mso-wrap-distance-left:0;mso-wrap-distance-top:0;mso-wrap-distance-right:0;mso-wrap-distance-bottom:0;mso-position-horizontal:absolute;mso-position-horizontal-relative:page;mso-position-vertical:absolute;mso-position-vertical-relative:page;v-text-anchor:top" o:gfxdata="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" filled="f" stroked="f">
               <v:textbox inset="0,0,0,0">
                 <w:txbxContent>
                   <w:p>
@@ -16745,208 +16649,6 @@
                         <w:sz w:val="18"/>
                       </w:rPr>
                       <w:t>Años</w:t>
-                    </w:r>
-                  </w:p>
-                </w:txbxContent>
-              </v:textbox>
-              <w10:wrap anchorx="page" anchory="page"/>
-            </v:shape>
-          </w:pict>
-        </mc:Fallback>
-      </mc:AlternateContent>
-    </w:r>
-    <w:r>
-      <w:rPr>
-        <w:i w:val="0"/>
-        <w:noProof/>
-        <w:sz w:val="20"/>
-      </w:rPr>
-      <mc:AlternateContent>
-        <mc:Choice Requires="wps">
-          <w:drawing>
-            <wp:anchor distT="0" distB="0" distL="0" distR="0" simplePos="0" relativeHeight="251728896" behindDoc="1" locked="0" layoutInCell="1" allowOverlap="1" wp14:anchorId="435EA415" wp14:editId="4DA51FA4">
-              <wp:simplePos x="0" y="0"/>
-              <wp:positionH relativeFrom="page">
-                <wp:posOffset>5226558</wp:posOffset>
-              </wp:positionH>
-              <wp:positionV relativeFrom="page">
-                <wp:posOffset>2078735</wp:posOffset>
-              </wp:positionV>
-              <wp:extent cx="287655" cy="152400"/>
-              <wp:effectExtent l="0" t="0" r="0" b="0"/>
-              <wp:wrapNone/>
-              <wp:docPr id="40" name="Textbox 40"/>
-              <wp:cNvGraphicFramePr>
-                <a:graphicFrameLocks xmlns:a="http://schemas.openxmlformats.org/drawingml/2006/main"/>
-              </wp:cNvGraphicFramePr>
-              <a:graphic xmlns:a="http://schemas.openxmlformats.org/drawingml/2006/main">
-                <a:graphicData uri="http://schemas.microsoft.com/office/word/2010/wordprocessingShape">
-                  <wps:wsp>
-                    <wps:cNvSpPr txBox="1">
-                      <a:spLocks/>
-                    </wps:cNvSpPr>
-                    <wps:spPr>
-                      <a:xfrm>
-                        <a:off x="0" y="0"/>
-                        <a:ext cx="287655" cy="152400"/>
-                      </a:xfrm>
-                      <a:prstGeom prst="rect">
-                        <a:avLst/>
-                      </a:prstGeom>
-                    </wps:spPr>
-                    <wps:txbx>
-                      <w:txbxContent>
-                        <w:p>
-                          <w:pPr>
-                            <w:spacing w:before="12"/>
-                            <w:ind w:left="20"/>
-                            <w:rPr>
-                              <w:b/>
-                              <w:sz w:val="18"/>
-                            </w:rPr>
-                          </w:pPr>
-                          <w:r>
-                            <w:rPr>
-                              <w:b/>
-                              <w:spacing w:val="-2"/>
-                              <w:sz w:val="18"/>
-                            </w:rPr>
-                            <w:t>Sexo:</w:t>
-                          </w:r>
-                        </w:p>
-                      </w:txbxContent>
-                    </wps:txbx>
-                    <wps:bodyPr wrap="square" lIns="0" tIns="0" rIns="0" bIns="0" rtlCol="0">
-                      <a:noAutofit/>
-                    </wps:bodyPr>
-                  </wps:wsp>
-                </a:graphicData>
-              </a:graphic>
-            </wp:anchor>
-          </w:drawing>
-        </mc:Choice>
-        <mc:Fallback>
-          <w:pict>
-            <v:shape w14:anchorId="435EA415" id="Textbox 40" o:spid="_x0000_s1055" type="#_x0000_t202" style="position:absolute;margin-left:411.55pt;margin-top:163.7pt;width:22.65pt;height:12pt;z-index:-251587584;visibility:visible;mso-wrap-style:square;mso-wrap-distance-left:0;mso-wrap-distance-top:0;mso-wrap-distance-right:0;mso-wrap-distance-bottom:0;mso-position-horizontal:absolute;mso-position-horizontal-relative:page;mso-position-vertical:absolute;mso-position-vertical-relative:page;v-text-anchor:top" o:gfxdata="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" filled="f" stroked="f">
-              <v:textbox inset="0,0,0,0">
-                <w:txbxContent>
-                  <w:p>
-                    <w:pPr>
-                      <w:spacing w:before="12"/>
-                      <w:ind w:left="20"/>
-                      <w:rPr>
-                        <w:b/>
-                        <w:sz w:val="18"/>
-                      </w:rPr>
-                    </w:pPr>
-                    <w:r>
-                      <w:rPr>
-                        <w:b/>
-                        <w:spacing w:val="-2"/>
-                        <w:sz w:val="18"/>
-                      </w:rPr>
-                      <w:t>Sexo:</w:t>
-                    </w:r>
-                  </w:p>
-                </w:txbxContent>
-              </v:textbox>
-              <w10:wrap anchorx="page" anchory="page"/>
-            </v:shape>
-          </w:pict>
-        </mc:Fallback>
-      </mc:AlternateContent>
-    </w:r>
-    <w:r>
-      <w:rPr>
-        <w:i w:val="0"/>
-        <w:noProof/>
-        <w:sz w:val="20"/>
-      </w:rPr>
-      <mc:AlternateContent>
-        <mc:Choice Requires="wps">
-          <w:drawing>
-            <wp:anchor distT="0" distB="0" distL="0" distR="0" simplePos="0" relativeHeight="251737088" behindDoc="1" locked="0" layoutInCell="1" allowOverlap="1" wp14:anchorId="6CEAD917" wp14:editId="62F2F3FA">
-              <wp:simplePos x="0" y="0"/>
-              <wp:positionH relativeFrom="page">
-                <wp:posOffset>208279</wp:posOffset>
-              </wp:positionH>
-              <wp:positionV relativeFrom="page">
-                <wp:posOffset>2103119</wp:posOffset>
-              </wp:positionV>
-              <wp:extent cx="464820" cy="152400"/>
-              <wp:effectExtent l="0" t="0" r="0" b="0"/>
-              <wp:wrapNone/>
-              <wp:docPr id="42" name="Textbox 42"/>
-              <wp:cNvGraphicFramePr>
-                <a:graphicFrameLocks xmlns:a="http://schemas.openxmlformats.org/drawingml/2006/main"/>
-              </wp:cNvGraphicFramePr>
-              <a:graphic xmlns:a="http://schemas.openxmlformats.org/drawingml/2006/main">
-                <a:graphicData uri="http://schemas.microsoft.com/office/word/2010/wordprocessingShape">
-                  <wps:wsp>
-                    <wps:cNvSpPr txBox="1">
-                      <a:spLocks/>
-                    </wps:cNvSpPr>
-                    <wps:spPr>
-                      <a:xfrm>
-                        <a:off x="0" y="0"/>
-                        <a:ext cx="464820" cy="152400"/>
-                      </a:xfrm>
-                      <a:prstGeom prst="rect">
-                        <a:avLst/>
-                      </a:prstGeom>
-                    </wps:spPr>
-                    <wps:txbx>
-                      <w:txbxContent>
-                        <w:p>
-                          <w:pPr>
-                            <w:spacing w:before="12"/>
-                            <w:ind w:left="20"/>
-                            <w:rPr>
-                              <w:b/>
-                              <w:sz w:val="18"/>
-                            </w:rPr>
-                          </w:pPr>
-                          <w:r>
-                            <w:rPr>
-                              <w:b/>
-                              <w:spacing w:val="-2"/>
-                              <w:sz w:val="18"/>
-                            </w:rPr>
-                            <w:t>Paciente:</w:t>
-                          </w:r>
-                        </w:p>
-                      </w:txbxContent>
-                    </wps:txbx>
-                    <wps:bodyPr wrap="square" lIns="0" tIns="0" rIns="0" bIns="0" rtlCol="0">
-                      <a:noAutofit/>
-                    </wps:bodyPr>
-                  </wps:wsp>
-                </a:graphicData>
-              </a:graphic>
-            </wp:anchor>
-          </w:drawing>
-        </mc:Choice>
-        <mc:Fallback>
-          <w:pict>
-            <v:shape w14:anchorId="6CEAD917" id="Textbox 42" o:spid="_x0000_s1056" type="#_x0000_t202" style="position:absolute;margin-left:16.4pt;margin-top:165.6pt;width:36.6pt;height:12pt;z-index:-251579392;visibility:visible;mso-wrap-style:square;mso-wrap-distance-left:0;mso-wrap-distance-top:0;mso-wrap-distance-right:0;mso-wrap-distance-bottom:0;mso-position-horizontal:absolute;mso-position-horizontal-relative:page;mso-position-vertical:absolute;mso-position-vertical-relative:page;v-text-anchor:top" o:gfxdata="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" filled="f" stroked="f">
-              <v:textbox inset="0,0,0,0">
-                <w:txbxContent>
-                  <w:p>
-                    <w:pPr>
-                      <w:spacing w:before="12"/>
-                      <w:ind w:left="20"/>
-                      <w:rPr>
-                        <w:b/>
-                        <w:sz w:val="18"/>
-                      </w:rPr>
-                    </w:pPr>
-                    <w:r>
-                      <w:rPr>
-                        <w:b/>
-                        <w:spacing w:val="-2"/>
-                        <w:sz w:val="18"/>
-                      </w:rPr>
-                      <w:t>Paciente:</w:t>
                     </w:r>
                   </w:p>
                 </w:txbxContent>

</xml_diff>

<commit_message>
fix(examenes): corregir recorte del bloque inferior institucional en sangre
</commit_message>
<xml_diff>
--- a/examenes_medicos_templates/FORMATO EXAMEN DE SANGRE.docx
+++ b/examenes_medicos_templates/FORMATO EXAMEN DE SANGRE.docx
@@ -7370,7 +7370,7 @@
                 <wp:posOffset>5036184</wp:posOffset>
               </wp:positionH>
               <wp:positionV relativeFrom="page">
-                <wp:posOffset>8042275</wp:posOffset>
+                <wp:posOffset>7762275</wp:posOffset>
               </wp:positionV>
               <wp:extent cx="2373630" cy="1270"/>
               <wp:effectExtent l="0" t="0" r="0" b="0"/>
@@ -7428,7 +7428,7 @@
         </mc:Choice>
         <mc:Fallback>
           <w:pict>
-            <v:shape w14:anchorId="6C5DF57A" id="Graphic 18" o:spid="_x0000_s1026" style="position:absolute;margin-left:396.55pt;margin-top:633.25pt;width:186.9pt;height:.1pt;z-index:-16055296;visibility:visible;mso-wrap-style:square;mso-wrap-distance-left:0;mso-wrap-distance-top:0;mso-wrap-distance-right:0;mso-wrap-distance-bottom:0;mso-position-horizontal:absolute;mso-position-horizontal-relative:page;mso-position-vertical:absolute;mso-position-vertical-relative:page;v-text-anchor:top" coordsize="2373630,1270" o:gfxdata="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" path="m,l2373248,e" filled="f" strokecolor="#3e3e3e" strokeweight=".17778mm">
+            <v:shape w14:anchorId="6C5DF57A" id="Graphic 18" o:spid="_x0000_s1026" style="position:absolute;margin-left:396.55pt;margin-top:611.20pt;width:186.9pt;height:.1pt;z-index:-16055296;visibility:visible;mso-wrap-style:square;mso-wrap-distance-left:0;mso-wrap-distance-top:0;mso-wrap-distance-right:0;mso-wrap-distance-bottom:0;mso-position-horizontal:absolute;mso-position-horizontal-relative:page;mso-position-vertical:absolute;mso-position-vertical-relative:page;v-text-anchor:top" coordsize="2373630,1270" o:gfxdata="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" path="m,l2373248,e" filled="f" strokecolor="#3e3e3e" strokeweight=".17778mm">
               <v:path arrowok="t"/>
               <w10:wrap anchorx="page" anchory="page"/>
             </v:shape>
@@ -7451,9 +7451,9 @@
                 <wp:posOffset>5292090</wp:posOffset>
               </wp:positionH>
               <wp:positionV relativeFrom="page">
-                <wp:posOffset>7793502</wp:posOffset>
+                <wp:posOffset>7513502</wp:posOffset>
               </wp:positionV>
-              <wp:extent cx="1841500" cy="139700"/>
+              <wp:extent cx="1841500" cy="170000"/>
               <wp:effectExtent l="0" t="0" r="0" b="0"/>
               <wp:wrapNone/>
               <wp:docPr id="19" name="Textbox 19"/>
@@ -7469,7 +7469,7 @@
                     <wps:spPr>
                       <a:xfrm>
                         <a:off x="0" y="0"/>
-                        <a:ext cx="1841500" cy="139700"/>
+                        <a:ext cx="1841500" cy="170000"/>
                       </a:xfrm>
                       <a:prstGeom prst="rect">
                         <a:avLst/>
@@ -7581,7 +7581,7 @@
               <v:stroke joinstyle="miter"/>
               <v:path gradientshapeok="t" o:connecttype="rect"/>
             </v:shapetype>
-            <v:shape id="Textbox 19" o:spid="_x0000_s1038" type="#_x0000_t202" style="position:absolute;margin-left:416.7pt;margin-top:613.65pt;width:145pt;height:11pt;z-index:-16054784;visibility:visible;mso-wrap-style:square;mso-wrap-distance-left:0;mso-wrap-distance-top:0;mso-wrap-distance-right:0;mso-wrap-distance-bottom:0;mso-position-horizontal:absolute;mso-position-horizontal-relative:page;mso-position-vertical:absolute;mso-position-vertical-relative:page;v-text-anchor:top" o:gfxdata="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" filled="f" stroked="f">
+            <v:shape id="Textbox 19" o:spid="_x0000_s1038" type="#_x0000_t202" style="position:absolute;margin-left:416.7pt;margin-top:591.61pt;width:145pt;height:13.39pt;z-index:-16054784;visibility:visible;mso-wrap-style:square;mso-wrap-distance-left:0;mso-wrap-distance-top:0;mso-wrap-distance-right:0;mso-wrap-distance-bottom:0;mso-position-horizontal:absolute;mso-position-horizontal-relative:page;mso-position-vertical:absolute;mso-position-vertical-relative:page;v-text-anchor:top" o:gfxdata="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" filled="f" stroked="f">
               <v:textbox inset="0,0,0,0">
                 <w:txbxContent>
                   <w:p>
@@ -8179,9 +8179,9 @@
                 <wp:posOffset>5348478</wp:posOffset>
               </wp:positionH>
               <wp:positionV relativeFrom="page">
-                <wp:posOffset>8052582</wp:posOffset>
+                <wp:posOffset>7772582</wp:posOffset>
               </wp:positionV>
-              <wp:extent cx="1751330" cy="389890"/>
+              <wp:extent cx="1751330" cy="590000"/>
               <wp:effectExtent l="0" t="0" r="0" b="0"/>
               <wp:wrapNone/>
               <wp:docPr id="21" name="Textbox 21"/>
@@ -8197,7 +8197,7 @@
                     <wps:spPr>
                       <a:xfrm>
                         <a:off x="0" y="0"/>
-                        <a:ext cx="1751330" cy="389890"/>
+                        <a:ext cx="1751330" cy="590000"/>
                       </a:xfrm>
                       <a:prstGeom prst="rect">
                         <a:avLst/>
@@ -8332,7 +8332,7 @@
         </mc:Choice>
         <mc:Fallback>
           <w:pict>
-            <v:shape w14:anchorId="6C52562A" id="Textbox 21" o:spid="_x0000_s1040" type="#_x0000_t202" style="position:absolute;margin-left:421.15pt;margin-top:634.05pt;width:137.9pt;height:30.7pt;z-index:-16053760;visibility:visible;mso-wrap-style:square;mso-wrap-distance-left:0;mso-wrap-distance-top:0;mso-wrap-distance-right:0;mso-wrap-distance-bottom:0;mso-position-horizontal:absolute;mso-position-horizontal-relative:page;mso-position-vertical:absolute;mso-position-vertical-relative:page;v-text-anchor:top" o:gfxdata="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" filled="f" stroked="f">
+            <v:shape w14:anchorId="6C52562A" id="Textbox 21" o:spid="_x0000_s1040" type="#_x0000_t202" style="position:absolute;margin-left:421.15pt;margin-top:612.01pt;width:137.9pt;height:46.46pt;z-index:-16053760;visibility:visible;mso-wrap-style:square;mso-wrap-distance-left:0;mso-wrap-distance-top:0;mso-wrap-distance-right:0;mso-wrap-distance-bottom:0;mso-position-horizontal:absolute;mso-position-horizontal-relative:page;mso-position-vertical:absolute;mso-position-vertical-relative:page;v-text-anchor:top" o:gfxdata="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" filled="f" stroked="f">
               <v:textbox inset="0,0,0,0">
                 <w:txbxContent>
                   <w:p>
@@ -8957,7 +8957,7 @@
                 <wp:posOffset>5036184</wp:posOffset>
               </wp:positionH>
               <wp:positionV relativeFrom="page">
-                <wp:posOffset>8042275</wp:posOffset>
+                <wp:posOffset>7762275</wp:posOffset>
               </wp:positionV>
               <wp:extent cx="2373630" cy="1270"/>
               <wp:effectExtent l="0" t="0" r="0" b="0"/>
@@ -9015,7 +9015,7 @@
         </mc:Choice>
         <mc:Fallback>
           <w:pict>
-            <v:shape w14:anchorId="71D2E424" id="Graphic 45" o:spid="_x0000_s1026" style="position:absolute;margin-left:396.55pt;margin-top:633.25pt;width:186.9pt;height:.1pt;z-index:-16042496;visibility:visible;mso-wrap-style:square;mso-wrap-distance-left:0;mso-wrap-distance-top:0;mso-wrap-distance-right:0;mso-wrap-distance-bottom:0;mso-position-horizontal:absolute;mso-position-horizontal-relative:page;mso-position-vertical:absolute;mso-position-vertical-relative:page;v-text-anchor:top" coordsize="2373630,1270" o:gfxdata="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" path="m,l2373248,e" filled="f" strokecolor="#3e3e3e" strokeweight=".17778mm">
+            <v:shape w14:anchorId="71D2E424" id="Graphic 45" o:spid="_x0000_s1026" style="position:absolute;margin-left:396.55pt;margin-top:611.20pt;width:186.9pt;height:.1pt;z-index:-16042496;visibility:visible;mso-wrap-style:square;mso-wrap-distance-left:0;mso-wrap-distance-top:0;mso-wrap-distance-right:0;mso-wrap-distance-bottom:0;mso-position-horizontal:absolute;mso-position-horizontal-relative:page;mso-position-vertical:absolute;mso-position-vertical-relative:page;v-text-anchor:top" coordsize="2373630,1270" o:gfxdata="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" path="m,l2373248,e" filled="f" strokecolor="#3e3e3e" strokeweight=".17778mm">
               <v:path arrowok="t"/>
               <w10:wrap anchorx="page" anchory="page"/>
             </v:shape>
@@ -9038,9 +9038,9 @@
                 <wp:posOffset>5292090</wp:posOffset>
               </wp:positionH>
               <wp:positionV relativeFrom="page">
-                <wp:posOffset>7793502</wp:posOffset>
+                <wp:posOffset>7513502</wp:posOffset>
               </wp:positionV>
-              <wp:extent cx="1841500" cy="139700"/>
+              <wp:extent cx="1841500" cy="170000"/>
               <wp:effectExtent l="0" t="0" r="0" b="0"/>
               <wp:wrapNone/>
               <wp:docPr id="46" name="Textbox 46"/>
@@ -9056,7 +9056,7 @@
                     <wps:spPr>
                       <a:xfrm>
                         <a:off x="0" y="0"/>
-                        <a:ext cx="1841500" cy="139700"/>
+                        <a:ext cx="1841500" cy="170000"/>
                       </a:xfrm>
                       <a:prstGeom prst="rect">
                         <a:avLst/>
@@ -9168,7 +9168,7 @@
               <v:stroke joinstyle="miter"/>
               <v:path gradientshapeok="t" o:connecttype="rect"/>
             </v:shapetype>
-            <v:shape id="Textbox 46" o:spid="_x0000_s1057" type="#_x0000_t202" style="position:absolute;margin-left:416.7pt;margin-top:613.65pt;width:145pt;height:11pt;z-index:-16041984;visibility:visible;mso-wrap-style:square;mso-wrap-distance-left:0;mso-wrap-distance-top:0;mso-wrap-distance-right:0;mso-wrap-distance-bottom:0;mso-position-horizontal:absolute;mso-position-horizontal-relative:page;mso-position-vertical:absolute;mso-position-vertical-relative:page;v-text-anchor:top" o:gfxdata="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" filled="f" stroked="f">
+            <v:shape id="Textbox 46" o:spid="_x0000_s1057" type="#_x0000_t202" style="position:absolute;margin-left:416.7pt;margin-top:591.61pt;width:145pt;height:13.39pt;z-index:-16041984;visibility:visible;mso-wrap-style:square;mso-wrap-distance-left:0;mso-wrap-distance-top:0;mso-wrap-distance-right:0;mso-wrap-distance-bottom:0;mso-position-horizontal:absolute;mso-position-horizontal-relative:page;mso-position-vertical:absolute;mso-position-vertical-relative:page;v-text-anchor:top" o:gfxdata="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" filled="f" stroked="f">
               <v:textbox inset="0,0,0,0">
                 <w:txbxContent>
                   <w:p>
@@ -9766,9 +9766,9 @@
                 <wp:posOffset>5348478</wp:posOffset>
               </wp:positionH>
               <wp:positionV relativeFrom="page">
-                <wp:posOffset>8052582</wp:posOffset>
+                <wp:posOffset>7772582</wp:posOffset>
               </wp:positionV>
-              <wp:extent cx="1751330" cy="389890"/>
+              <wp:extent cx="1751330" cy="590000"/>
               <wp:effectExtent l="0" t="0" r="0" b="0"/>
               <wp:wrapNone/>
               <wp:docPr id="48" name="Textbox 48"/>
@@ -9784,7 +9784,7 @@
                     <wps:spPr>
                       <a:xfrm>
                         <a:off x="0" y="0"/>
-                        <a:ext cx="1751330" cy="389890"/>
+                        <a:ext cx="1751330" cy="590000"/>
                       </a:xfrm>
                       <a:prstGeom prst="rect">
                         <a:avLst/>
@@ -9919,7 +9919,7 @@
         </mc:Choice>
         <mc:Fallback>
           <w:pict>
-            <v:shape w14:anchorId="40093C03" id="Textbox 48" o:spid="_x0000_s1059" type="#_x0000_t202" style="position:absolute;margin-left:421.15pt;margin-top:634.05pt;width:137.9pt;height:30.7pt;z-index:-16040960;visibility:visible;mso-wrap-style:square;mso-wrap-distance-left:0;mso-wrap-distance-top:0;mso-wrap-distance-right:0;mso-wrap-distance-bottom:0;mso-position-horizontal:absolute;mso-position-horizontal-relative:page;mso-position-vertical:absolute;mso-position-vertical-relative:page;v-text-anchor:top" o:gfxdata="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" filled="f" stroked="f">
+            <v:shape w14:anchorId="40093C03" id="Textbox 48" o:spid="_x0000_s1059" type="#_x0000_t202" style="position:absolute;margin-left:421.15pt;margin-top:612.01pt;width:137.9pt;height:46.46pt;z-index:-16040960;visibility:visible;mso-wrap-style:square;mso-wrap-distance-left:0;mso-wrap-distance-top:0;mso-wrap-distance-right:0;mso-wrap-distance-bottom:0;mso-position-horizontal:absolute;mso-position-horizontal-relative:page;mso-position-vertical:absolute;mso-position-vertical-relative:page;v-text-anchor:top" o:gfxdata="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" filled="f" stroked="f">
               <v:textbox inset="0,0,0,0">
                 <w:txbxContent>
                   <w:p>

</xml_diff>

<commit_message>
fix(examenes): estabilizar bloque inferior y numeración del examen de sangre
</commit_message>
<xml_diff>
--- a/examenes_medicos_templates/FORMATO EXAMEN DE SANGRE.docx
+++ b/examenes_medicos_templates/FORMATO EXAMEN DE SANGRE.docx
@@ -7288,8 +7288,1575 @@
 <w:ftr xmlns:wpc="http://schemas.microsoft.com/office/word/2010/wordprocessingCanvas" xmlns:cx="http://schemas.microsoft.com/office/drawing/2014/chartex" xmlns:cx1="http://schemas.microsoft.com/office/drawing/2015/9/8/chartex" xmlns:cx2="http://schemas.microsoft.com/office/drawing/2015/10/21/chartex" xmlns:cx3="http://schemas.microsoft.com/office/drawing/2016/5/9/chartex" xmlns:cx4="http://schemas.microsoft.com/office/drawing/2016/5/10/chartex" xmlns:cx5="http://schemas.microsoft.com/office/drawing/2016/5/11/chartex" xmlns:cx6="http://schemas.microsoft.com/office/drawing/2016/5/12/chartex" xmlns:cx7="http://schemas.microsoft.com/office/drawing/2016/5/13/chartex" xmlns:cx8="http://schemas.microsoft.com/office/drawing/2016/5/14/chartex" xmlns:mc="http://schemas.openxmlformats.org/markup-compatibility/2006" xmlns:aink="http://schemas.microsoft.com/office/drawing/2016/ink" xmlns:am3d="http://schemas.microsoft.com/office/drawing/2017/model3d" xmlns:o="urn:schemas-microsoft-com:office:office" xmlns:oel="http://schemas.microsoft.com/office/2019/extlst" xmlns:r="http://schemas.openxmlformats.org/officeDocument/2006/relationships" xmlns:m="http://schemas.openxmlformats.org/officeDocument/2006/math" xmlns:v="urn:schemas-microsoft-com:vml" xmlns:wp14="http://schemas.microsoft.com/office/word/2010/wordprocessingDrawing" xmlns:wp="http://schemas.openxmlformats.org/drawingml/2006/wordprocessingDrawing" xmlns:w10="urn:schemas-microsoft-com:office:word" xmlns:w="http://schemas.openxmlformats.org/wordprocessingml/2006/main" xmlns:w14="http://schemas.microsoft.com/office/word/2010/wordml" xmlns:w15="http://schemas.microsoft.com/office/word/2012/wordml" xmlns:w16cex="http://schemas.microsoft.com/office/word/2018/wordml/cex" xmlns:w16cid="http://schemas.microsoft.com/office/word/2016/wordml/cid" xmlns:w16="http://schemas.microsoft.com/office/word/2018/wordml" xmlns:w16du="http://schemas.microsoft.com/office/word/2023/wordml/word16du" xmlns:w16sdtdh="http://schemas.microsoft.com/office/word/2020/wordml/sdtdatahash" xmlns:w16sdtfl="http://schemas.microsoft.com/office/word/2024/wordml/sdtformatlock" xmlns:w16se="http://schemas.microsoft.com/office/word/2015/wordml/symex" xmlns:wpg="http://schemas.microsoft.com/office/word/2010/wordprocessingGroup" xmlns:wpi="http://schemas.microsoft.com/office/word/2010/wordprocessingInk" xmlns:wne="http://schemas.microsoft.com/office/word/2006/wordml" xmlns:wps="http://schemas.microsoft.com/office/word/2010/wordprocessingShape" mc:Ignorable="w14 w15 w16se w16cid w16 w16cex w16sdtdh w16sdtfl w16du wp14">
   <w:p>
     <w:pPr>
-      <w:pStyle w:val="Piedepgina"/>
+      <w:pStyle w:val="Textoindependiente"/>
+      <w:spacing w:line="14" w:lineRule="auto"/>
+      <w:rPr>
+        <w:i w:val="0"/>
+        <w:sz w:val="20"/>
+      </w:rPr>
     </w:pPr>
+    <w:r>
+      <w:rPr>
+        <w:i w:val="0"/>
+        <w:noProof/>
+        <w:sz w:val="20"/>
+      </w:rPr>
+      <w:drawing>
+        <wp:anchor distT="0" distB="0" distL="0" distR="0" simplePos="0" relativeHeight="487260672" behindDoc="1" locked="0" layoutInCell="1" allowOverlap="1" wp14:anchorId="6A974CF6" wp14:editId="49705F6B">
+          <wp:simplePos x="0" y="0"/>
+          <wp:positionH relativeFrom="page">
+            <wp:posOffset>137795</wp:posOffset>
+          </wp:positionH>
+          <wp:positionV relativeFrom="page">
+            <wp:posOffset>8538843</wp:posOffset>
+          </wp:positionV>
+          <wp:extent cx="7466583" cy="1490980"/>
+          <wp:effectExtent l="0" t="0" r="0" b="0"/>
+          <wp:wrapNone/>
+          <wp:docPr id="17" name="Image 17"/>
+          <wp:cNvGraphicFramePr>
+            <a:graphicFrameLocks xmlns:a="http://schemas.openxmlformats.org/drawingml/2006/main"/>
+          </wp:cNvGraphicFramePr>
+          <a:graphic xmlns:a="http://schemas.openxmlformats.org/drawingml/2006/main">
+            <a:graphicData uri="http://schemas.openxmlformats.org/drawingml/2006/picture">
+              <pic:pic xmlns:pic="http://schemas.openxmlformats.org/drawingml/2006/picture">
+                <pic:nvPicPr>
+                  <pic:cNvPr id="17" name="Image 17"/>
+                  <pic:cNvPicPr/>
+                </pic:nvPicPr>
+                <pic:blipFill>
+                  <a:blip r:embed="rId1" cstate="print"/>
+                  <a:stretch>
+                    <a:fillRect/>
+                  </a:stretch>
+                </pic:blipFill>
+                <pic:spPr>
+                  <a:xfrm>
+                    <a:off x="0" y="0"/>
+                    <a:ext cx="7466583" cy="1490980"/>
+                  </a:xfrm>
+                  <a:prstGeom prst="rect">
+                    <a:avLst/>
+                  </a:prstGeom>
+                </pic:spPr>
+              </pic:pic>
+            </a:graphicData>
+          </a:graphic>
+        </wp:anchor>
+      </w:drawing>
+    </w:r>
+    <w:r>
+      <w:rPr>
+        <w:i w:val="0"/>
+        <w:noProof/>
+        <w:sz w:val="20"/>
+      </w:rPr>
+      <mc:AlternateContent>
+        <mc:Choice Requires="wps">
+          <w:drawing>
+            <wp:anchor distT="0" distB="0" distL="0" distR="0" simplePos="0" relativeHeight="487261184" behindDoc="1" locked="0" layoutInCell="1" allowOverlap="1" wp14:anchorId="770974D8" wp14:editId="40D46EAA">
+              <wp:simplePos x="0" y="0"/>
+              <wp:positionH relativeFrom="page">
+                <wp:posOffset>5036184</wp:posOffset>
+              </wp:positionH>
+              <wp:positionV relativeFrom="page">
+                <wp:posOffset>7762275</wp:posOffset>
+              </wp:positionV>
+              <wp:extent cx="2373630" cy="1270"/>
+              <wp:effectExtent l="0" t="0" r="0" b="0"/>
+              <wp:wrapNone/>
+              <wp:docPr id="18" name="Graphic 18"/>
+              <wp:cNvGraphicFramePr>
+                <a:graphicFrameLocks xmlns:a="http://schemas.openxmlformats.org/drawingml/2006/main"/>
+              </wp:cNvGraphicFramePr>
+              <a:graphic xmlns:a="http://schemas.openxmlformats.org/drawingml/2006/main">
+                <a:graphicData uri="http://schemas.microsoft.com/office/word/2010/wordprocessingShape">
+                  <wps:wsp>
+                    <wps:cNvSpPr>
+                      <a:spLocks/>
+                    </wps:cNvSpPr>
+                    <wps:spPr>
+                      <a:xfrm>
+                        <a:off x="0" y="0"/>
+                        <a:ext cx="2373630" cy="1270"/>
+                      </a:xfrm>
+                      <a:custGeom>
+                        <a:avLst/>
+                        <a:gdLst/>
+                        <a:ahLst/>
+                        <a:cxnLst/>
+                        <a:rect l="l" t="t" r="r" b="b"/>
+                        <a:pathLst>
+                          <a:path w="2373630">
+                            <a:moveTo>
+                              <a:pt x="0" y="0"/>
+                            </a:moveTo>
+                            <a:lnTo>
+                              <a:pt x="2373248" y="0"/>
+                            </a:lnTo>
+                          </a:path>
+                        </a:pathLst>
+                      </a:custGeom>
+                      <a:ln w="6400">
+                        <a:solidFill>
+                          <a:srgbClr val="3E3E3E"/>
+                        </a:solidFill>
+                        <a:prstDash val="solid"/>
+                      </a:ln>
+                    </wps:spPr>
+                    <wps:bodyPr wrap="square" lIns="0" tIns="0" rIns="0" bIns="0" rtlCol="0">
+                      <a:prstTxWarp prst="textNoShape">
+                        <a:avLst/>
+                      </a:prstTxWarp>
+                      <a:noAutofit/>
+                    </wps:bodyPr>
+                  </wps:wsp>
+                </a:graphicData>
+              </a:graphic>
+            </wp:anchor>
+          </w:drawing>
+        </mc:Choice>
+        <mc:Fallback>
+          <w:pict>
+            <v:shape w14:anchorId="6C5DF57A" id="Graphic 18" o:spid="_x0000_s1026" style="position:absolute;margin-left:396.55pt;margin-top:611.20pt;width:186.9pt;height:.1pt;z-index:-16055296;visibility:visible;mso-wrap-style:square;mso-wrap-distance-left:0;mso-wrap-distance-top:0;mso-wrap-distance-right:0;mso-wrap-distance-bottom:0;mso-position-horizontal:absolute;mso-position-horizontal-relative:page;mso-position-vertical:absolute;mso-position-vertical-relative:page;v-text-anchor:top" coordsize="2373630,1270" o:gfxdata="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" path="m,l2373248,e" filled="f" strokecolor="#3e3e3e" strokeweight=".17778mm">
+              <v:path arrowok="t"/>
+              <w10:wrap anchorx="page" anchory="page"/>
+            </v:shape>
+          </w:pict>
+        </mc:Fallback>
+      </mc:AlternateContent>
+    </w:r>
+    <w:r>
+      <w:rPr>
+        <w:i w:val="0"/>
+        <w:noProof/>
+        <w:sz w:val="20"/>
+      </w:rPr>
+      <mc:AlternateContent>
+        <mc:Choice Requires="wps">
+          <w:drawing>
+            <wp:anchor distT="0" distB="0" distL="0" distR="0" simplePos="0" relativeHeight="487261696" behindDoc="1" locked="0" layoutInCell="1" allowOverlap="1" wp14:anchorId="30A654B0" wp14:editId="780BB11C">
+              <wp:simplePos x="0" y="0"/>
+              <wp:positionH relativeFrom="page">
+                <wp:posOffset>5292090</wp:posOffset>
+              </wp:positionH>
+              <wp:positionV relativeFrom="page">
+                <wp:posOffset>7513502</wp:posOffset>
+              </wp:positionV>
+              <wp:extent cx="1841500" cy="170000"/>
+              <wp:effectExtent l="0" t="0" r="0" b="0"/>
+              <wp:wrapNone/>
+              <wp:docPr id="19" name="Textbox 19"/>
+              <wp:cNvGraphicFramePr>
+                <a:graphicFrameLocks xmlns:a="http://schemas.openxmlformats.org/drawingml/2006/main"/>
+              </wp:cNvGraphicFramePr>
+              <a:graphic xmlns:a="http://schemas.openxmlformats.org/drawingml/2006/main">
+                <a:graphicData uri="http://schemas.microsoft.com/office/word/2010/wordprocessingShape">
+                  <wps:wsp>
+                    <wps:cNvSpPr txBox="1">
+                      <a:spLocks/>
+                    </wps:cNvSpPr>
+                    <wps:spPr>
+                      <a:xfrm>
+                        <a:off x="0" y="0"/>
+                        <a:ext cx="1841500" cy="170000"/>
+                      </a:xfrm>
+                      <a:prstGeom prst="rect">
+                        <a:avLst/>
+                      </a:prstGeom>
+                    </wps:spPr>
+                    <wps:txbx>
+                      <w:txbxContent>
+                        <w:p>
+                          <w:pPr>
+                            <w:spacing w:before="15"/>
+                            <w:ind w:left="20"/>
+                            <w:rPr>
+                              <w:rFonts w:ascii="Arial MT" w:hAnsi="Arial MT"/>
+                              <w:sz w:val="16"/>
+                            </w:rPr>
+                          </w:pPr>
+                          <w:r>
+                            <w:rPr>
+                              <w:rFonts w:ascii="Arial MT" w:hAnsi="Arial MT"/>
+                              <w:color w:val="404040"/>
+                              <w:sz w:val="16"/>
+                            </w:rPr>
+                            <w:t>Q.B.P.</w:t>
+                          </w:r>
+                          <w:r>
+                            <w:rPr>
+                              <w:rFonts w:ascii="Arial MT" w:hAnsi="Arial MT"/>
+                              <w:color w:val="404040"/>
+                              <w:spacing w:val="-9"/>
+                              <w:sz w:val="16"/>
+                            </w:rPr>
+                            <w:t xml:space="preserve"> </w:t>
+                          </w:r>
+                          <w:r>
+                            <w:rPr>
+                              <w:rFonts w:ascii="Arial MT" w:hAnsi="Arial MT"/>
+                              <w:color w:val="404040"/>
+                              <w:sz w:val="16"/>
+                            </w:rPr>
+                            <w:t>Josshiner</w:t>
+                          </w:r>
+                          <w:r>
+                            <w:rPr>
+                              <w:rFonts w:ascii="Arial MT" w:hAnsi="Arial MT"/>
+                              <w:color w:val="404040"/>
+                              <w:spacing w:val="-9"/>
+                              <w:sz w:val="16"/>
+                            </w:rPr>
+                            <w:t xml:space="preserve"> </w:t>
+                          </w:r>
+                          <w:r>
+                            <w:rPr>
+                              <w:rFonts w:ascii="Arial MT" w:hAnsi="Arial MT"/>
+                              <w:color w:val="404040"/>
+                              <w:sz w:val="16"/>
+                            </w:rPr>
+                            <w:t>Noé</w:t>
+                          </w:r>
+                          <w:r>
+                            <w:rPr>
+                              <w:rFonts w:ascii="Arial MT" w:hAnsi="Arial MT"/>
+                              <w:color w:val="404040"/>
+                              <w:spacing w:val="-8"/>
+                              <w:sz w:val="16"/>
+                            </w:rPr>
+                            <w:t xml:space="preserve"> </w:t>
+                          </w:r>
+                          <w:r>
+                            <w:rPr>
+                              <w:rFonts w:ascii="Arial MT" w:hAnsi="Arial MT"/>
+                              <w:color w:val="404040"/>
+                              <w:sz w:val="16"/>
+                            </w:rPr>
+                            <w:t>García</w:t>
+                          </w:r>
+                          <w:r>
+                            <w:rPr>
+                              <w:rFonts w:ascii="Arial MT" w:hAnsi="Arial MT"/>
+                              <w:color w:val="404040"/>
+                              <w:spacing w:val="-9"/>
+                              <w:sz w:val="16"/>
+                            </w:rPr>
+                            <w:t xml:space="preserve"> </w:t>
+                          </w:r>
+                          <w:r>
+                            <w:rPr>
+                              <w:rFonts w:ascii="Arial MT" w:hAnsi="Arial MT"/>
+                              <w:color w:val="404040"/>
+                              <w:spacing w:val="-2"/>
+                              <w:sz w:val="16"/>
+                            </w:rPr>
+                            <w:t>Hernández</w:t>
+                          </w:r>
+                        </w:p>
+                      </w:txbxContent>
+                    </wps:txbx>
+                    <wps:bodyPr wrap="square" lIns="0" tIns="0" rIns="0" bIns="0" rtlCol="0">
+                      <a:noAutofit/>
+                    </wps:bodyPr>
+                  </wps:wsp>
+                </a:graphicData>
+              </a:graphic>
+            </wp:anchor>
+          </w:drawing>
+        </mc:Choice>
+        <mc:Fallback>
+          <w:pict>
+            <v:shapetype w14:anchorId="30A654B0" id="_x0000_t202" coordsize="21600,21600" o:spt="202" path="m,l,21600r21600,l21600,xe">
+              <v:stroke joinstyle="miter"/>
+              <v:path gradientshapeok="t" o:connecttype="rect"/>
+            </v:shapetype>
+            <v:shape id="Textbox 19" o:spid="_x0000_s1038" type="#_x0000_t202" style="position:absolute;margin-left:416.7pt;margin-top:591.61pt;width:145pt;height:13.39pt;z-index:-16054784;visibility:visible;mso-wrap-style:square;mso-wrap-distance-left:0;mso-wrap-distance-top:0;mso-wrap-distance-right:0;mso-wrap-distance-bottom:0;mso-position-horizontal:absolute;mso-position-horizontal-relative:page;mso-position-vertical:absolute;mso-position-vertical-relative:page;v-text-anchor:top" o:gfxdata="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" filled="f" stroked="f">
+              <v:textbox inset="0,0,0,0">
+                <w:txbxContent>
+                  <w:p>
+                    <w:pPr>
+                      <w:spacing w:before="15"/>
+                      <w:ind w:left="20"/>
+                      <w:rPr>
+                        <w:rFonts w:ascii="Arial MT" w:hAnsi="Arial MT"/>
+                        <w:sz w:val="16"/>
+                      </w:rPr>
+                    </w:pPr>
+                    <w:r>
+                      <w:rPr>
+                        <w:rFonts w:ascii="Arial MT" w:hAnsi="Arial MT"/>
+                        <w:color w:val="404040"/>
+                        <w:sz w:val="16"/>
+                      </w:rPr>
+                      <w:t>Q.B.P.</w:t>
+                    </w:r>
+                    <w:r>
+                      <w:rPr>
+                        <w:rFonts w:ascii="Arial MT" w:hAnsi="Arial MT"/>
+                        <w:color w:val="404040"/>
+                        <w:spacing w:val="-9"/>
+                        <w:sz w:val="16"/>
+                      </w:rPr>
+                      <w:t xml:space="preserve"> </w:t>
+                    </w:r>
+                    <w:r>
+                      <w:rPr>
+                        <w:rFonts w:ascii="Arial MT" w:hAnsi="Arial MT"/>
+                        <w:color w:val="404040"/>
+                        <w:sz w:val="16"/>
+                      </w:rPr>
+                      <w:t>Josshiner</w:t>
+                    </w:r>
+                    <w:r>
+                      <w:rPr>
+                        <w:rFonts w:ascii="Arial MT" w:hAnsi="Arial MT"/>
+                        <w:color w:val="404040"/>
+                        <w:spacing w:val="-9"/>
+                        <w:sz w:val="16"/>
+                      </w:rPr>
+                      <w:t xml:space="preserve"> </w:t>
+                    </w:r>
+                    <w:r>
+                      <w:rPr>
+                        <w:rFonts w:ascii="Arial MT" w:hAnsi="Arial MT"/>
+                        <w:color w:val="404040"/>
+                        <w:sz w:val="16"/>
+                      </w:rPr>
+                      <w:t>Noé</w:t>
+                    </w:r>
+                    <w:r>
+                      <w:rPr>
+                        <w:rFonts w:ascii="Arial MT" w:hAnsi="Arial MT"/>
+                        <w:color w:val="404040"/>
+                        <w:spacing w:val="-8"/>
+                        <w:sz w:val="16"/>
+                      </w:rPr>
+                      <w:t xml:space="preserve"> </w:t>
+                    </w:r>
+                    <w:r>
+                      <w:rPr>
+                        <w:rFonts w:ascii="Arial MT" w:hAnsi="Arial MT"/>
+                        <w:color w:val="404040"/>
+                        <w:sz w:val="16"/>
+                      </w:rPr>
+                      <w:t>García</w:t>
+                    </w:r>
+                    <w:r>
+                      <w:rPr>
+                        <w:rFonts w:ascii="Arial MT" w:hAnsi="Arial MT"/>
+                        <w:color w:val="404040"/>
+                        <w:spacing w:val="-9"/>
+                        <w:sz w:val="16"/>
+                      </w:rPr>
+                      <w:t xml:space="preserve"> </w:t>
+                    </w:r>
+                    <w:r>
+                      <w:rPr>
+                        <w:rFonts w:ascii="Arial MT" w:hAnsi="Arial MT"/>
+                        <w:color w:val="404040"/>
+                        <w:spacing w:val="-2"/>
+                        <w:sz w:val="16"/>
+                      </w:rPr>
+                      <w:t>Hernández</w:t>
+                    </w:r>
+                  </w:p>
+                </w:txbxContent>
+              </v:textbox>
+              <w10:wrap anchorx="page" anchory="page"/>
+            </v:shape>
+          </w:pict>
+        </mc:Fallback>
+      </mc:AlternateContent>
+    </w:r>
+    <w:r>
+      <w:rPr>
+        <w:i w:val="0"/>
+        <w:noProof/>
+        <w:sz w:val="20"/>
+      </w:rPr>
+      <mc:AlternateContent>
+        <mc:Choice Requires="wps">
+          <w:drawing>
+            <wp:anchor distT="0" distB="0" distL="0" distR="0" simplePos="0" relativeHeight="487262208" behindDoc="1" locked="0" layoutInCell="1" allowOverlap="1" wp14:anchorId="739682D1" wp14:editId="702591AC">
+              <wp:simplePos x="0" y="0"/>
+              <wp:positionH relativeFrom="page">
+                <wp:posOffset>203708</wp:posOffset>
+              </wp:positionH>
+              <wp:positionV relativeFrom="page">
+                <wp:posOffset>7885090</wp:posOffset>
+              </wp:positionV>
+              <wp:extent cx="3552190" cy="109855"/>
+              <wp:effectExtent l="0" t="0" r="0" b="0"/>
+              <wp:wrapNone/>
+              <wp:docPr id="20" name="Textbox 20"/>
+              <wp:cNvGraphicFramePr>
+                <a:graphicFrameLocks xmlns:a="http://schemas.openxmlformats.org/drawingml/2006/main"/>
+              </wp:cNvGraphicFramePr>
+              <a:graphic xmlns:a="http://schemas.openxmlformats.org/drawingml/2006/main">
+                <a:graphicData uri="http://schemas.microsoft.com/office/word/2010/wordprocessingShape">
+                  <wps:wsp>
+                    <wps:cNvSpPr txBox="1">
+                      <a:spLocks/>
+                    </wps:cNvSpPr>
+                    <wps:spPr>
+                      <a:xfrm>
+                        <a:off x="0" y="0"/>
+                        <a:ext cx="3552190" cy="109855"/>
+                      </a:xfrm>
+                      <a:prstGeom prst="rect">
+                        <a:avLst/>
+                      </a:prstGeom>
+                    </wps:spPr>
+                    <wps:txbx>
+                      <w:txbxContent>
+                        <w:p>
+                          <w:pPr>
+                            <w:spacing w:before="15"/>
+                            <w:ind w:left="20"/>
+                            <w:rPr>
+                              <w:sz w:val="12"/>
+                            </w:rPr>
+                          </w:pPr>
+                          <w:r>
+                            <w:rPr>
+                              <w:spacing w:val="-2"/>
+                              <w:sz w:val="12"/>
+                            </w:rPr>
+                            <w:t>BLVD.</w:t>
+                          </w:r>
+                          <w:r>
+                            <w:rPr>
+                              <w:spacing w:val="-1"/>
+                              <w:sz w:val="12"/>
+                            </w:rPr>
+                            <w:t xml:space="preserve"> </w:t>
+                          </w:r>
+                          <w:r>
+                            <w:rPr>
+                              <w:spacing w:val="-2"/>
+                              <w:sz w:val="12"/>
+                            </w:rPr>
+                            <w:t>SOR</w:t>
+                          </w:r>
+                          <w:r>
+                            <w:rPr>
+                              <w:sz w:val="12"/>
+                            </w:rPr>
+                            <w:t xml:space="preserve"> </w:t>
+                          </w:r>
+                          <w:r>
+                            <w:rPr>
+                              <w:spacing w:val="-2"/>
+                              <w:sz w:val="12"/>
+                            </w:rPr>
+                            <w:t>JUANA</w:t>
+                          </w:r>
+                          <w:r>
+                            <w:rPr>
+                              <w:spacing w:val="-1"/>
+                              <w:sz w:val="12"/>
+                            </w:rPr>
+                            <w:t xml:space="preserve"> </w:t>
+                          </w:r>
+                          <w:r>
+                            <w:rPr>
+                              <w:spacing w:val="-2"/>
+                              <w:sz w:val="12"/>
+                            </w:rPr>
+                            <w:t>INÉS</w:t>
+                          </w:r>
+                          <w:r>
+                            <w:rPr>
+                              <w:spacing w:val="1"/>
+                              <w:sz w:val="12"/>
+                            </w:rPr>
+                            <w:t xml:space="preserve"> </w:t>
+                          </w:r>
+                          <w:r>
+                            <w:rPr>
+                              <w:spacing w:val="-2"/>
+                              <w:sz w:val="12"/>
+                            </w:rPr>
+                            <w:t>DE LA</w:t>
+                          </w:r>
+                          <w:r>
+                            <w:rPr>
+                              <w:spacing w:val="-1"/>
+                              <w:sz w:val="12"/>
+                            </w:rPr>
+                            <w:t xml:space="preserve"> </w:t>
+                          </w:r>
+                          <w:r>
+                            <w:rPr>
+                              <w:spacing w:val="-2"/>
+                              <w:sz w:val="12"/>
+                            </w:rPr>
+                            <w:t>CRUZ</w:t>
+                          </w:r>
+                          <w:r>
+                            <w:rPr>
+                              <w:spacing w:val="1"/>
+                              <w:sz w:val="12"/>
+                            </w:rPr>
+                            <w:t xml:space="preserve"> </w:t>
+                          </w:r>
+                          <w:r>
+                            <w:rPr>
+                              <w:spacing w:val="-2"/>
+                              <w:sz w:val="12"/>
+                            </w:rPr>
+                            <w:t>#1000</w:t>
+                          </w:r>
+                          <w:r>
+                            <w:rPr>
+                              <w:spacing w:val="3"/>
+                              <w:sz w:val="12"/>
+                            </w:rPr>
+                            <w:t xml:space="preserve"> </w:t>
+                          </w:r>
+                          <w:r>
+                            <w:rPr>
+                              <w:spacing w:val="-2"/>
+                              <w:sz w:val="12"/>
+                            </w:rPr>
+                            <w:t>COL.</w:t>
+                          </w:r>
+                          <w:r>
+                            <w:rPr>
+                              <w:spacing w:val="4"/>
+                              <w:sz w:val="12"/>
+                            </w:rPr>
+                            <w:t xml:space="preserve"> </w:t>
+                          </w:r>
+                          <w:r>
+                            <w:rPr>
+                              <w:spacing w:val="-2"/>
+                              <w:sz w:val="12"/>
+                            </w:rPr>
+                            <w:t>LAS</w:t>
+                          </w:r>
+                          <w:r>
+                            <w:rPr>
+                              <w:spacing w:val="1"/>
+                              <w:sz w:val="12"/>
+                            </w:rPr>
+                            <w:t xml:space="preserve"> </w:t>
+                          </w:r>
+                          <w:r>
+                            <w:rPr>
+                              <w:spacing w:val="-2"/>
+                              <w:sz w:val="12"/>
+                            </w:rPr>
+                            <w:t>ARBOLEDAS</w:t>
+                          </w:r>
+                          <w:r>
+                            <w:rPr>
+                              <w:spacing w:val="2"/>
+                              <w:sz w:val="12"/>
+                            </w:rPr>
+                            <w:t xml:space="preserve"> </w:t>
+                          </w:r>
+                          <w:r>
+                            <w:rPr>
+                              <w:spacing w:val="-2"/>
+                              <w:sz w:val="12"/>
+                            </w:rPr>
+                            <w:t>C.P.</w:t>
+                          </w:r>
+                          <w:r>
+                            <w:rPr>
+                              <w:spacing w:val="4"/>
+                              <w:sz w:val="12"/>
+                            </w:rPr>
+                            <w:t xml:space="preserve"> </w:t>
+                          </w:r>
+                          <w:r>
+                            <w:rPr>
+                              <w:spacing w:val="-2"/>
+                              <w:sz w:val="12"/>
+                            </w:rPr>
+                            <w:t>66004,</w:t>
+                          </w:r>
+                          <w:r>
+                            <w:rPr>
+                              <w:spacing w:val="2"/>
+                              <w:sz w:val="12"/>
+                            </w:rPr>
+                            <w:t xml:space="preserve"> </w:t>
+                          </w:r>
+                          <w:r>
+                            <w:rPr>
+                              <w:spacing w:val="-2"/>
+                              <w:sz w:val="12"/>
+                            </w:rPr>
+                            <w:t>GARCÍA,</w:t>
+                          </w:r>
+                          <w:r>
+                            <w:rPr>
+                              <w:spacing w:val="2"/>
+                              <w:sz w:val="12"/>
+                            </w:rPr>
+                            <w:t xml:space="preserve"> </w:t>
+                          </w:r>
+                          <w:r>
+                            <w:rPr>
+                              <w:spacing w:val="-2"/>
+                              <w:sz w:val="12"/>
+                            </w:rPr>
+                            <w:t>NUEVO</w:t>
+                          </w:r>
+                          <w:r>
+                            <w:rPr>
+                              <w:sz w:val="12"/>
+                            </w:rPr>
+                            <w:t xml:space="preserve"> </w:t>
+                          </w:r>
+                          <w:r>
+                            <w:rPr>
+                              <w:spacing w:val="-2"/>
+                              <w:sz w:val="12"/>
+                            </w:rPr>
+                            <w:t>LEÓN.</w:t>
+                          </w:r>
+                        </w:p>
+                      </w:txbxContent>
+                    </wps:txbx>
+                    <wps:bodyPr wrap="square" lIns="0" tIns="0" rIns="0" bIns="0" rtlCol="0">
+                      <a:noAutofit/>
+                    </wps:bodyPr>
+                  </wps:wsp>
+                </a:graphicData>
+              </a:graphic>
+            </wp:anchor>
+          </w:drawing>
+        </mc:Choice>
+        <mc:Fallback>
+          <w:pict>
+            <v:shape w14:anchorId="739682D1" id="Textbox 20" o:spid="_x0000_s1039" type="#_x0000_t202" style="position:absolute;margin-left:16.05pt;margin-top:620.85pt;width:279.7pt;height:8.65pt;z-index:-16054272;visibility:visible;mso-wrap-style:square;mso-wrap-distance-left:0;mso-wrap-distance-top:0;mso-wrap-distance-right:0;mso-wrap-distance-bottom:0;mso-position-horizontal:absolute;mso-position-horizontal-relative:page;mso-position-vertical:absolute;mso-position-vertical-relative:page;v-text-anchor:top" o:gfxdata="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" filled="f" stroked="f">
+              <v:textbox inset="0,0,0,0">
+                <w:txbxContent>
+                  <w:p>
+                    <w:pPr>
+                      <w:spacing w:before="15"/>
+                      <w:ind w:left="20"/>
+                      <w:rPr>
+                        <w:sz w:val="12"/>
+                      </w:rPr>
+                    </w:pPr>
+                    <w:r>
+                      <w:rPr>
+                        <w:spacing w:val="-2"/>
+                        <w:sz w:val="12"/>
+                      </w:rPr>
+                      <w:t>BLVD.</w:t>
+                    </w:r>
+                    <w:r>
+                      <w:rPr>
+                        <w:spacing w:val="-1"/>
+                        <w:sz w:val="12"/>
+                      </w:rPr>
+                      <w:t xml:space="preserve"> </w:t>
+                    </w:r>
+                    <w:r>
+                      <w:rPr>
+                        <w:spacing w:val="-2"/>
+                        <w:sz w:val="12"/>
+                      </w:rPr>
+                      <w:t>SOR</w:t>
+                    </w:r>
+                    <w:r>
+                      <w:rPr>
+                        <w:sz w:val="12"/>
+                      </w:rPr>
+                      <w:t xml:space="preserve"> </w:t>
+                    </w:r>
+                    <w:r>
+                      <w:rPr>
+                        <w:spacing w:val="-2"/>
+                        <w:sz w:val="12"/>
+                      </w:rPr>
+                      <w:t>JUANA</w:t>
+                    </w:r>
+                    <w:r>
+                      <w:rPr>
+                        <w:spacing w:val="-1"/>
+                        <w:sz w:val="12"/>
+                      </w:rPr>
+                      <w:t xml:space="preserve"> </w:t>
+                    </w:r>
+                    <w:r>
+                      <w:rPr>
+                        <w:spacing w:val="-2"/>
+                        <w:sz w:val="12"/>
+                      </w:rPr>
+                      <w:t>INÉS</w:t>
+                    </w:r>
+                    <w:r>
+                      <w:rPr>
+                        <w:spacing w:val="1"/>
+                        <w:sz w:val="12"/>
+                      </w:rPr>
+                      <w:t xml:space="preserve"> </w:t>
+                    </w:r>
+                    <w:r>
+                      <w:rPr>
+                        <w:spacing w:val="-2"/>
+                        <w:sz w:val="12"/>
+                      </w:rPr>
+                      <w:t>DE LA</w:t>
+                    </w:r>
+                    <w:r>
+                      <w:rPr>
+                        <w:spacing w:val="-1"/>
+                        <w:sz w:val="12"/>
+                      </w:rPr>
+                      <w:t xml:space="preserve"> </w:t>
+                    </w:r>
+                    <w:r>
+                      <w:rPr>
+                        <w:spacing w:val="-2"/>
+                        <w:sz w:val="12"/>
+                      </w:rPr>
+                      <w:t>CRUZ</w:t>
+                    </w:r>
+                    <w:r>
+                      <w:rPr>
+                        <w:spacing w:val="1"/>
+                        <w:sz w:val="12"/>
+                      </w:rPr>
+                      <w:t xml:space="preserve"> </w:t>
+                    </w:r>
+                    <w:r>
+                      <w:rPr>
+                        <w:spacing w:val="-2"/>
+                        <w:sz w:val="12"/>
+                      </w:rPr>
+                      <w:t>#1000</w:t>
+                    </w:r>
+                    <w:r>
+                      <w:rPr>
+                        <w:spacing w:val="3"/>
+                        <w:sz w:val="12"/>
+                      </w:rPr>
+                      <w:t xml:space="preserve"> </w:t>
+                    </w:r>
+                    <w:r>
+                      <w:rPr>
+                        <w:spacing w:val="-2"/>
+                        <w:sz w:val="12"/>
+                      </w:rPr>
+                      <w:t>COL.</w:t>
+                    </w:r>
+                    <w:r>
+                      <w:rPr>
+                        <w:spacing w:val="4"/>
+                        <w:sz w:val="12"/>
+                      </w:rPr>
+                      <w:t xml:space="preserve"> </w:t>
+                    </w:r>
+                    <w:r>
+                      <w:rPr>
+                        <w:spacing w:val="-2"/>
+                        <w:sz w:val="12"/>
+                      </w:rPr>
+                      <w:t>LAS</w:t>
+                    </w:r>
+                    <w:r>
+                      <w:rPr>
+                        <w:spacing w:val="1"/>
+                        <w:sz w:val="12"/>
+                      </w:rPr>
+                      <w:t xml:space="preserve"> </w:t>
+                    </w:r>
+                    <w:r>
+                      <w:rPr>
+                        <w:spacing w:val="-2"/>
+                        <w:sz w:val="12"/>
+                      </w:rPr>
+                      <w:t>ARBOLEDAS</w:t>
+                    </w:r>
+                    <w:r>
+                      <w:rPr>
+                        <w:spacing w:val="2"/>
+                        <w:sz w:val="12"/>
+                      </w:rPr>
+                      <w:t xml:space="preserve"> </w:t>
+                    </w:r>
+                    <w:r>
+                      <w:rPr>
+                        <w:spacing w:val="-2"/>
+                        <w:sz w:val="12"/>
+                      </w:rPr>
+                      <w:t>C.P.</w:t>
+                    </w:r>
+                    <w:r>
+                      <w:rPr>
+                        <w:spacing w:val="4"/>
+                        <w:sz w:val="12"/>
+                      </w:rPr>
+                      <w:t xml:space="preserve"> </w:t>
+                    </w:r>
+                    <w:r>
+                      <w:rPr>
+                        <w:spacing w:val="-2"/>
+                        <w:sz w:val="12"/>
+                      </w:rPr>
+                      <w:t>66004,</w:t>
+                    </w:r>
+                    <w:r>
+                      <w:rPr>
+                        <w:spacing w:val="2"/>
+                        <w:sz w:val="12"/>
+                      </w:rPr>
+                      <w:t xml:space="preserve"> </w:t>
+                    </w:r>
+                    <w:r>
+                      <w:rPr>
+                        <w:spacing w:val="-2"/>
+                        <w:sz w:val="12"/>
+                      </w:rPr>
+                      <w:t>GARCÍA,</w:t>
+                    </w:r>
+                    <w:r>
+                      <w:rPr>
+                        <w:spacing w:val="2"/>
+                        <w:sz w:val="12"/>
+                      </w:rPr>
+                      <w:t xml:space="preserve"> </w:t>
+                    </w:r>
+                    <w:r>
+                      <w:rPr>
+                        <w:spacing w:val="-2"/>
+                        <w:sz w:val="12"/>
+                      </w:rPr>
+                      <w:t>NUEVO</w:t>
+                    </w:r>
+                    <w:r>
+                      <w:rPr>
+                        <w:sz w:val="12"/>
+                      </w:rPr>
+                      <w:t xml:space="preserve"> </w:t>
+                    </w:r>
+                    <w:r>
+                      <w:rPr>
+                        <w:spacing w:val="-2"/>
+                        <w:sz w:val="12"/>
+                      </w:rPr>
+                      <w:t>LEÓN.</w:t>
+                    </w:r>
+                  </w:p>
+                </w:txbxContent>
+              </v:textbox>
+              <w10:wrap anchorx="page" anchory="page"/>
+            </v:shape>
+          </w:pict>
+        </mc:Fallback>
+      </mc:AlternateContent>
+    </w:r>
+    <w:r>
+      <w:rPr>
+        <w:i w:val="0"/>
+        <w:noProof/>
+        <w:sz w:val="20"/>
+      </w:rPr>
+      <mc:AlternateContent>
+        <mc:Choice Requires="wps">
+          <w:drawing>
+            <wp:anchor distT="0" distB="0" distL="0" distR="0" simplePos="0" relativeHeight="487262720" behindDoc="1" locked="0" layoutInCell="1" allowOverlap="1" wp14:anchorId="6C52562A" wp14:editId="2DC06BA4">
+              <wp:simplePos x="0" y="0"/>
+              <wp:positionH relativeFrom="page">
+                <wp:posOffset>5348478</wp:posOffset>
+              </wp:positionH>
+              <wp:positionV relativeFrom="page">
+                <wp:posOffset>7772582</wp:posOffset>
+              </wp:positionV>
+              <wp:extent cx="1751330" cy="590000"/>
+              <wp:effectExtent l="0" t="0" r="0" b="0"/>
+              <wp:wrapNone/>
+              <wp:docPr id="21" name="Textbox 21"/>
+              <wp:cNvGraphicFramePr>
+                <a:graphicFrameLocks xmlns:a="http://schemas.openxmlformats.org/drawingml/2006/main"/>
+              </wp:cNvGraphicFramePr>
+              <a:graphic xmlns:a="http://schemas.openxmlformats.org/drawingml/2006/main">
+                <a:graphicData uri="http://schemas.microsoft.com/office/word/2010/wordprocessingShape">
+                  <wps:wsp>
+                    <wps:cNvSpPr txBox="1">
+                      <a:spLocks/>
+                    </wps:cNvSpPr>
+                    <wps:spPr>
+                      <a:xfrm>
+                        <a:off x="0" y="0"/>
+                        <a:ext cx="1751330" cy="590000"/>
+                      </a:xfrm>
+                      <a:prstGeom prst="rect">
+                        <a:avLst/>
+                      </a:prstGeom>
+                    </wps:spPr>
+                    <wps:txbx>
+                      <w:txbxContent>
+                        <w:p>
+                          <w:pPr>
+                            <w:spacing w:before="15" w:line="256" w:lineRule="auto"/>
+                            <w:ind w:left="257" w:right="251"/>
+                            <w:jc w:val="center"/>
+                            <w:rPr>
+                              <w:rFonts w:ascii="Arial MT"/>
+                              <w:sz w:val="16"/>
+                            </w:rPr>
+                          </w:pPr>
+                          <w:r>
+                            <w:rPr>
+                              <w:rFonts w:ascii="Arial MT"/>
+                              <w:color w:val="404040"/>
+                              <w:spacing w:val="-4"/>
+                              <w:sz w:val="16"/>
+                            </w:rPr>
+                            <w:t xml:space="preserve">Responsable de Laboratorio </w:t>
+                          </w:r>
+                          <w:r>
+                            <w:rPr>
+                              <w:rFonts w:ascii="Arial MT"/>
+                              <w:color w:val="404040"/>
+                              <w:sz w:val="16"/>
+                            </w:rPr>
+                            <w:t>CED. PROF. 11846660</w:t>
+                          </w:r>
+                        </w:p>
+                        <w:p>
+                          <w:pPr>
+                            <w:jc w:val="center"/>
+                            <w:rPr>
+                              <w:rFonts w:ascii="Arial MT" w:hAnsi="Arial MT"/>
+                              <w:sz w:val="16"/>
+                            </w:rPr>
+                          </w:pPr>
+                          <w:r>
+                            <w:rPr>
+                              <w:rFonts w:ascii="Arial MT" w:hAnsi="Arial MT"/>
+                              <w:color w:val="404040"/>
+                              <w:sz w:val="16"/>
+                            </w:rPr>
+                            <w:t>Universidad</w:t>
+                          </w:r>
+                          <w:r>
+                            <w:rPr>
+                              <w:rFonts w:ascii="Arial MT" w:hAnsi="Arial MT"/>
+                              <w:color w:val="404040"/>
+                              <w:spacing w:val="-12"/>
+                              <w:sz w:val="16"/>
+                            </w:rPr>
+                            <w:t xml:space="preserve"> </w:t>
+                          </w:r>
+                          <w:r>
+                            <w:rPr>
+                              <w:rFonts w:ascii="Arial MT" w:hAnsi="Arial MT"/>
+                              <w:color w:val="404040"/>
+                              <w:sz w:val="16"/>
+                            </w:rPr>
+                            <w:t>Autónoma</w:t>
+                          </w:r>
+                          <w:r>
+                            <w:rPr>
+                              <w:rFonts w:ascii="Arial MT" w:hAnsi="Arial MT"/>
+                              <w:color w:val="404040"/>
+                              <w:spacing w:val="-10"/>
+                              <w:sz w:val="16"/>
+                            </w:rPr>
+                            <w:t xml:space="preserve"> </w:t>
+                          </w:r>
+                          <w:r>
+                            <w:rPr>
+                              <w:rFonts w:ascii="Arial MT" w:hAnsi="Arial MT"/>
+                              <w:color w:val="404040"/>
+                              <w:sz w:val="16"/>
+                            </w:rPr>
+                            <w:t>de</w:t>
+                          </w:r>
+                          <w:r>
+                            <w:rPr>
+                              <w:rFonts w:ascii="Arial MT" w:hAnsi="Arial MT"/>
+                              <w:color w:val="404040"/>
+                              <w:spacing w:val="-8"/>
+                              <w:sz w:val="16"/>
+                            </w:rPr>
+                            <w:t xml:space="preserve"> </w:t>
+                          </w:r>
+                          <w:r>
+                            <w:rPr>
+                              <w:rFonts w:ascii="Arial MT" w:hAnsi="Arial MT"/>
+                              <w:color w:val="404040"/>
+                              <w:sz w:val="16"/>
+                            </w:rPr>
+                            <w:t>Nuevo</w:t>
+                          </w:r>
+                          <w:r>
+                            <w:rPr>
+                              <w:rFonts w:ascii="Arial MT" w:hAnsi="Arial MT"/>
+                              <w:color w:val="404040"/>
+                              <w:spacing w:val="-11"/>
+                              <w:sz w:val="16"/>
+                            </w:rPr>
+                            <w:t xml:space="preserve"> </w:t>
+                          </w:r>
+                          <w:r>
+                            <w:rPr>
+                              <w:rFonts w:ascii="Arial MT" w:hAnsi="Arial MT"/>
+                              <w:color w:val="404040"/>
+                              <w:spacing w:val="-4"/>
+                              <w:sz w:val="16"/>
+                            </w:rPr>
+                            <w:t>León</w:t>
+                          </w:r>
+                        </w:p>
+                      </w:txbxContent>
+                    </wps:txbx>
+                    <wps:bodyPr wrap="square" lIns="0" tIns="0" rIns="0" bIns="0" rtlCol="0">
+                      <a:noAutofit/>
+                    </wps:bodyPr>
+                  </wps:wsp>
+                </a:graphicData>
+              </a:graphic>
+            </wp:anchor>
+          </w:drawing>
+        </mc:Choice>
+        <mc:Fallback>
+          <w:pict>
+            <v:shape w14:anchorId="6C52562A" id="Textbox 21" o:spid="_x0000_s1040" type="#_x0000_t202" style="position:absolute;margin-left:421.15pt;margin-top:612.01pt;width:137.9pt;height:46.46pt;z-index:-16053760;visibility:visible;mso-wrap-style:square;mso-wrap-distance-left:0;mso-wrap-distance-top:0;mso-wrap-distance-right:0;mso-wrap-distance-bottom:0;mso-position-horizontal:absolute;mso-position-horizontal-relative:page;mso-position-vertical:absolute;mso-position-vertical-relative:page;v-text-anchor:top" o:gfxdata="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" filled="f" stroked="f">
+              <v:textbox inset="0,0,0,0">
+                <w:txbxContent>
+                  <w:p>
+                    <w:pPr>
+                      <w:spacing w:before="15" w:line="256" w:lineRule="auto"/>
+                      <w:ind w:left="257" w:right="251"/>
+                      <w:jc w:val="center"/>
+                      <w:rPr>
+                        <w:rFonts w:ascii="Arial MT"/>
+                        <w:sz w:val="16"/>
+                      </w:rPr>
+                    </w:pPr>
+                    <w:r>
+                      <w:rPr>
+                        <w:rFonts w:ascii="Arial MT"/>
+                        <w:color w:val="404040"/>
+                        <w:spacing w:val="-4"/>
+                        <w:sz w:val="16"/>
+                      </w:rPr>
+                      <w:t xml:space="preserve">Responsable de Laboratorio </w:t>
+                    </w:r>
+                    <w:r>
+                      <w:rPr>
+                        <w:rFonts w:ascii="Arial MT"/>
+                        <w:color w:val="404040"/>
+                        <w:sz w:val="16"/>
+                      </w:rPr>
+                      <w:t>CED. PROF. 11846660</w:t>
+                    </w:r>
+                  </w:p>
+                  <w:p>
+                    <w:pPr>
+                      <w:jc w:val="center"/>
+                      <w:rPr>
+                        <w:rFonts w:ascii="Arial MT" w:hAnsi="Arial MT"/>
+                        <w:sz w:val="16"/>
+                      </w:rPr>
+                    </w:pPr>
+                    <w:r>
+                      <w:rPr>
+                        <w:rFonts w:ascii="Arial MT" w:hAnsi="Arial MT"/>
+                        <w:color w:val="404040"/>
+                        <w:sz w:val="16"/>
+                      </w:rPr>
+                      <w:t>Universidad</w:t>
+                    </w:r>
+                    <w:r>
+                      <w:rPr>
+                        <w:rFonts w:ascii="Arial MT" w:hAnsi="Arial MT"/>
+                        <w:color w:val="404040"/>
+                        <w:spacing w:val="-12"/>
+                        <w:sz w:val="16"/>
+                      </w:rPr>
+                      <w:t xml:space="preserve"> </w:t>
+                    </w:r>
+                    <w:r>
+                      <w:rPr>
+                        <w:rFonts w:ascii="Arial MT" w:hAnsi="Arial MT"/>
+                        <w:color w:val="404040"/>
+                        <w:sz w:val="16"/>
+                      </w:rPr>
+                      <w:t>Autónoma</w:t>
+                    </w:r>
+                    <w:r>
+                      <w:rPr>
+                        <w:rFonts w:ascii="Arial MT" w:hAnsi="Arial MT"/>
+                        <w:color w:val="404040"/>
+                        <w:spacing w:val="-10"/>
+                        <w:sz w:val="16"/>
+                      </w:rPr>
+                      <w:t xml:space="preserve"> </w:t>
+                    </w:r>
+                    <w:r>
+                      <w:rPr>
+                        <w:rFonts w:ascii="Arial MT" w:hAnsi="Arial MT"/>
+                        <w:color w:val="404040"/>
+                        <w:sz w:val="16"/>
+                      </w:rPr>
+                      <w:t>de</w:t>
+                    </w:r>
+                    <w:r>
+                      <w:rPr>
+                        <w:rFonts w:ascii="Arial MT" w:hAnsi="Arial MT"/>
+                        <w:color w:val="404040"/>
+                        <w:spacing w:val="-8"/>
+                        <w:sz w:val="16"/>
+                      </w:rPr>
+                      <w:t xml:space="preserve"> </w:t>
+                    </w:r>
+                    <w:r>
+                      <w:rPr>
+                        <w:rFonts w:ascii="Arial MT" w:hAnsi="Arial MT"/>
+                        <w:color w:val="404040"/>
+                        <w:sz w:val="16"/>
+                      </w:rPr>
+                      <w:t>Nuevo</w:t>
+                    </w:r>
+                    <w:r>
+                      <w:rPr>
+                        <w:rFonts w:ascii="Arial MT" w:hAnsi="Arial MT"/>
+                        <w:color w:val="404040"/>
+                        <w:spacing w:val="-11"/>
+                        <w:sz w:val="16"/>
+                      </w:rPr>
+                      <w:t xml:space="preserve"> </w:t>
+                    </w:r>
+                    <w:r>
+                      <w:rPr>
+                        <w:rFonts w:ascii="Arial MT" w:hAnsi="Arial MT"/>
+                        <w:color w:val="404040"/>
+                        <w:spacing w:val="-4"/>
+                        <w:sz w:val="16"/>
+                      </w:rPr>
+                      <w:t>León</w:t>
+                    </w:r>
+                  </w:p>
+                </w:txbxContent>
+              </v:textbox>
+              <w10:wrap anchorx="page" anchory="page"/>
+            </v:shape>
+          </w:pict>
+        </mc:Fallback>
+      </mc:AlternateContent>
+    </w:r>
+    <w:r>
+      <w:rPr>
+        <w:i w:val="0"/>
+        <w:noProof/>
+        <w:sz w:val="20"/>
+      </w:rPr>
+      <mc:AlternateContent>
+        <mc:Choice Requires="wps">
+          <w:drawing>
+            <wp:anchor distT="0" distB="0" distL="0" distR="0" simplePos="0" relativeHeight="487263232" behindDoc="1" locked="0" layoutInCell="1" allowOverlap="1" wp14:anchorId="49EE3916" wp14:editId="5310D7E8">
+              <wp:simplePos x="0" y="0"/>
+              <wp:positionH relativeFrom="page">
+                <wp:posOffset>432308</wp:posOffset>
+              </wp:positionH>
+              <wp:positionV relativeFrom="page">
+                <wp:posOffset>8138075</wp:posOffset>
+              </wp:positionV>
+              <wp:extent cx="465455" cy="201295"/>
+              <wp:effectExtent l="0" t="0" r="0" b="0"/>
+              <wp:wrapNone/>
+              <wp:docPr id="22" name="Textbox 22"/>
+              <wp:cNvGraphicFramePr>
+                <a:graphicFrameLocks xmlns:a="http://schemas.openxmlformats.org/drawingml/2006/main"/>
+              </wp:cNvGraphicFramePr>
+              <a:graphic xmlns:a="http://schemas.openxmlformats.org/drawingml/2006/main">
+                <a:graphicData uri="http://schemas.microsoft.com/office/word/2010/wordprocessingShape">
+                  <wps:wsp>
+                    <wps:cNvSpPr txBox="1">
+                      <a:spLocks/>
+                    </wps:cNvSpPr>
+                    <wps:spPr>
+                      <a:xfrm>
+                        <a:off x="0" y="0"/>
+                        <a:ext cx="465455" cy="201295"/>
+                      </a:xfrm>
+                      <a:prstGeom prst="rect">
+                        <a:avLst/>
+                      </a:prstGeom>
+                    </wps:spPr>
+                    <wps:txbx>
+                      <w:txbxContent>
+                        <w:p>
+                          <w:pPr>
+                            <w:spacing w:before="15" w:line="249" w:lineRule="auto"/>
+                            <w:ind w:left="51" w:hanging="32"/>
+                            <w:rPr>
+                              <w:sz w:val="12"/>
+                            </w:rPr>
+                          </w:pPr>
+                          <w:r>
+                            <w:rPr>
+                              <w:spacing w:val="-6"/>
+                              <w:sz w:val="12"/>
+                            </w:rPr>
+                            <w:t>Reimpresión</w:t>
+                          </w:r>
+                          <w:r>
+                            <w:rPr>
+                              <w:spacing w:val="-13"/>
+                              <w:sz w:val="12"/>
+                            </w:rPr>
+                            <w:t xml:space="preserve"> </w:t>
+                          </w:r>
+                          <w:r>
+                            <w:rPr>
+                              <w:spacing w:val="-6"/>
+                              <w:sz w:val="12"/>
+                            </w:rPr>
+                            <w:t>de</w:t>
+                          </w:r>
+                          <w:r>
+                            <w:rPr>
+                              <w:spacing w:val="40"/>
+                              <w:sz w:val="12"/>
+                            </w:rPr>
+                            <w:t xml:space="preserve"> </w:t>
+                          </w:r>
+                          <w:r>
+                            <w:rPr>
+                              <w:spacing w:val="-2"/>
+                              <w:sz w:val="12"/>
+                            </w:rPr>
+                            <w:t>resultados</w:t>
+                          </w:r>
+                        </w:p>
+                      </w:txbxContent>
+                    </wps:txbx>
+                    <wps:bodyPr wrap="square" lIns="0" tIns="0" rIns="0" bIns="0" rtlCol="0">
+                      <a:noAutofit/>
+                    </wps:bodyPr>
+                  </wps:wsp>
+                </a:graphicData>
+              </a:graphic>
+            </wp:anchor>
+          </w:drawing>
+        </mc:Choice>
+        <mc:Fallback>
+          <w:pict>
+            <v:shape w14:anchorId="49EE3916" id="Textbox 22" o:spid="_x0000_s1041" type="#_x0000_t202" style="position:absolute;margin-left:34.05pt;margin-top:640.8pt;width:36.65pt;height:15.85pt;z-index:-16053248;visibility:visible;mso-wrap-style:square;mso-wrap-distance-left:0;mso-wrap-distance-top:0;mso-wrap-distance-right:0;mso-wrap-distance-bottom:0;mso-position-horizontal:absolute;mso-position-horizontal-relative:page;mso-position-vertical:absolute;mso-position-vertical-relative:page;v-text-anchor:top" o:gfxdata="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" filled="f" stroked="f">
+              <v:textbox inset="0,0,0,0">
+                <w:txbxContent>
+                  <w:p>
+                    <w:pPr>
+                      <w:spacing w:before="15" w:line="249" w:lineRule="auto"/>
+                      <w:ind w:left="51" w:hanging="32"/>
+                      <w:rPr>
+                        <w:sz w:val="12"/>
+                      </w:rPr>
+                    </w:pPr>
+                    <w:r>
+                      <w:rPr>
+                        <w:spacing w:val="-6"/>
+                        <w:sz w:val="12"/>
+                      </w:rPr>
+                      <w:t>Reimpresión</w:t>
+                    </w:r>
+                    <w:r>
+                      <w:rPr>
+                        <w:spacing w:val="-13"/>
+                        <w:sz w:val="12"/>
+                      </w:rPr>
+                      <w:t xml:space="preserve"> </w:t>
+                    </w:r>
+                    <w:r>
+                      <w:rPr>
+                        <w:spacing w:val="-6"/>
+                        <w:sz w:val="12"/>
+                      </w:rPr>
+                      <w:t>de</w:t>
+                    </w:r>
+                    <w:r>
+                      <w:rPr>
+                        <w:spacing w:val="40"/>
+                        <w:sz w:val="12"/>
+                      </w:rPr>
+                      <w:t xml:space="preserve"> </w:t>
+                    </w:r>
+                    <w:r>
+                      <w:rPr>
+                        <w:spacing w:val="-2"/>
+                        <w:sz w:val="12"/>
+                      </w:rPr>
+                      <w:t>resultados</w:t>
+                    </w:r>
+                  </w:p>
+                </w:txbxContent>
+              </v:textbox>
+              <w10:wrap anchorx="page" anchory="page"/>
+            </v:shape>
+          </w:pict>
+        </mc:Fallback>
+      </mc:AlternateContent>
+    </w:r>
+    <w:r>
+      <w:rPr>
+        <w:i w:val="0"/>
+        <w:noProof/>
+        <w:sz w:val="20"/>
+      </w:rPr>
+      <mc:AlternateContent>
+        <mc:Choice Requires="wps">
+          <w:drawing>
+            <wp:anchor distT="0" distB="0" distL="0" distR="0" simplePos="0" relativeHeight="487263744" behindDoc="1" locked="0" layoutInCell="1" allowOverlap="1" wp14:anchorId="4837D418" wp14:editId="20D07D61">
+              <wp:simplePos x="0" y="0"/>
+              <wp:positionH relativeFrom="page">
+                <wp:posOffset>2551810</wp:posOffset>
+              </wp:positionH>
+              <wp:positionV relativeFrom="page">
+                <wp:posOffset>8354483</wp:posOffset>
+              </wp:positionV>
+              <wp:extent cx="430530" cy="109855"/>
+              <wp:effectExtent l="0" t="0" r="0" b="0"/>
+              <wp:wrapNone/>
+              <wp:docPr id="23" name="Textbox 23"/>
+              <wp:cNvGraphicFramePr>
+                <a:graphicFrameLocks xmlns:a="http://schemas.openxmlformats.org/drawingml/2006/main"/>
+              </wp:cNvGraphicFramePr>
+              <a:graphic xmlns:a="http://schemas.openxmlformats.org/drawingml/2006/main">
+                <a:graphicData uri="http://schemas.microsoft.com/office/word/2010/wordprocessingShape">
+                  <wps:wsp>
+                    <wps:cNvSpPr txBox="1">
+                      <a:spLocks/>
+                    </wps:cNvSpPr>
+                    <wps:spPr>
+                      <a:xfrm>
+                        <a:off x="0" y="0"/>
+                        <a:ext cx="430530" cy="109855"/>
+                      </a:xfrm>
+                      <a:prstGeom prst="rect">
+                        <a:avLst/>
+                      </a:prstGeom>
+                    </wps:spPr>
+                    <wps:txbx>
+                      <w:txbxContent>
+                        <w:p>
+                          <w:pPr>
+                            <w:tabs>
+                              <w:tab w:val="left" w:pos="321"/>
+                            </w:tabs>
+                            <w:spacing w:before="15"/>
+                            <w:ind w:left="60"/>
+                            <w:rPr>
+                              <w:sz w:val="12"/>
+                            </w:rPr>
+                          </w:pPr>
+                          <w:r>
+                            <w:rPr>
+                              <w:spacing w:val="-10"/>
+                              <w:sz w:val="12"/>
+                            </w:rPr>
+                            <w:fldChar w:fldCharType="begin"/>
+                          </w:r>
+                          <w:r>
+                            <w:rPr>
+                              <w:spacing w:val="-10"/>
+                              <w:sz w:val="12"/>
+                            </w:rPr>
+                            <w:instrText xml:space="preserve"> PAGE </w:instrText>
+                          </w:r>
+                          <w:r>
+                            <w:rPr>
+                              <w:spacing w:val="-10"/>
+                              <w:sz w:val="12"/>
+                            </w:rPr>
+                            <w:fldChar w:fldCharType="separate"/>
+                          </w:r>
+                          <w:r>
+                            <w:rPr>
+                              <w:spacing w:val="-10"/>
+                              <w:sz w:val="12"/>
+                            </w:rPr>
+                            <w:t>1</w:t>
+                          </w:r>
+                          <w:r>
+                            <w:rPr>
+                              <w:spacing w:val="-10"/>
+                              <w:sz w:val="12"/>
+                            </w:rPr>
+                            <w:fldChar w:fldCharType="end"/>
+                          </w:r>
+                          <w:r>
+                            <w:rPr>
+                              <w:sz w:val="12"/>
+                            </w:rPr>
+                            <w:tab/>
+                            <w:t>de</w:t>
+                          </w:r>
+                          <w:r>
+                            <w:rPr>
+                              <w:spacing w:val="49"/>
+                              <w:sz w:val="12"/>
+                            </w:rPr>
+                            <w:t xml:space="preserve">  </w:t>
+                          </w:r>
+                          <w:r>
+                            <w:rPr>
+                              <w:spacing w:val="-10"/>
+                              <w:sz w:val="12"/>
+                            </w:rPr>
+                            <w:fldChar w:fldCharType="begin"/>
+                          </w:r>
+                          <w:r>
+                            <w:rPr>
+                              <w:spacing w:val="-10"/>
+                              <w:sz w:val="12"/>
+                            </w:rPr>
+                            <w:instrText xml:space="preserve"> NUMPAGES </w:instrText>
+                          </w:r>
+                          <w:r>
+                            <w:rPr>
+                              <w:spacing w:val="-10"/>
+                              <w:sz w:val="12"/>
+                            </w:rPr>
+                            <w:fldChar w:fldCharType="separate"/>
+                          </w:r>
+                          <w:r>
+                            <w:rPr>
+                              <w:spacing w:val="-10"/>
+                              <w:sz w:val="12"/>
+                            </w:rPr>
+                            <w:t>3</w:t>
+                          </w:r>
+                          <w:r>
+                            <w:rPr>
+                              <w:spacing w:val="-10"/>
+                              <w:sz w:val="12"/>
+                            </w:rPr>
+                            <w:fldChar w:fldCharType="end"/>
+                          </w:r>
+                        </w:p>
+                      </w:txbxContent>
+                    </wps:txbx>
+                    <wps:bodyPr wrap="square" lIns="0" tIns="0" rIns="0" bIns="0" rtlCol="0">
+                      <a:noAutofit/>
+                    </wps:bodyPr>
+                  </wps:wsp>
+                </a:graphicData>
+              </a:graphic>
+            </wp:anchor>
+          </w:drawing>
+        </mc:Choice>
+        <mc:Fallback>
+          <w:pict>
+            <v:shape w14:anchorId="4837D418" id="Textbox 23" o:spid="_x0000_s1042" type="#_x0000_t202" style="position:absolute;margin-left:200.95pt;margin-top:657.85pt;width:33.9pt;height:8.65pt;z-index:-16052736;visibility:visible;mso-wrap-style:square;mso-wrap-distance-left:0;mso-wrap-distance-top:0;mso-wrap-distance-right:0;mso-wrap-distance-bottom:0;mso-position-horizontal:absolute;mso-position-horizontal-relative:page;mso-position-vertical:absolute;mso-position-vertical-relative:page;v-text-anchor:top" o:gfxdata="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" filled="f" stroked="f">
+              <v:textbox inset="0,0,0,0">
+                <w:txbxContent>
+                  <w:p>
+                    <w:pPr>
+                      <w:tabs>
+                        <w:tab w:val="left" w:pos="321"/>
+                      </w:tabs>
+                      <w:spacing w:before="15"/>
+                      <w:ind w:left="60"/>
+                      <w:rPr>
+                        <w:sz w:val="12"/>
+                      </w:rPr>
+                    </w:pPr>
+                    <w:r>
+                      <w:rPr>
+                        <w:spacing w:val="-10"/>
+                        <w:sz w:val="12"/>
+                      </w:rPr>
+                      <w:fldChar w:fldCharType="begin"/>
+                    </w:r>
+                    <w:r>
+                      <w:rPr>
+                        <w:spacing w:val="-10"/>
+                        <w:sz w:val="12"/>
+                      </w:rPr>
+                      <w:instrText xml:space="preserve"> PAGE </w:instrText>
+                    </w:r>
+                    <w:r>
+                      <w:rPr>
+                        <w:spacing w:val="-10"/>
+                        <w:sz w:val="12"/>
+                      </w:rPr>
+                      <w:fldChar w:fldCharType="separate"/>
+                    </w:r>
+                    <w:r>
+                      <w:rPr>
+                        <w:spacing w:val="-10"/>
+                        <w:sz w:val="12"/>
+                      </w:rPr>
+                      <w:t>1</w:t>
+                    </w:r>
+                    <w:r>
+                      <w:rPr>
+                        <w:spacing w:val="-10"/>
+                        <w:sz w:val="12"/>
+                      </w:rPr>
+                      <w:fldChar w:fldCharType="end"/>
+                    </w:r>
+                    <w:r>
+                      <w:rPr>
+                        <w:sz w:val="12"/>
+                      </w:rPr>
+                      <w:tab/>
+                      <w:t>de</w:t>
+                    </w:r>
+                    <w:r>
+                      <w:rPr>
+                        <w:spacing w:val="49"/>
+                        <w:sz w:val="12"/>
+                      </w:rPr>
+                      <w:t xml:space="preserve">  </w:t>
+                    </w:r>
+                    <w:r>
+                      <w:rPr>
+                        <w:spacing w:val="-10"/>
+                        <w:sz w:val="12"/>
+                      </w:rPr>
+                      <w:fldChar w:fldCharType="begin"/>
+                    </w:r>
+                    <w:r>
+                      <w:rPr>
+                        <w:spacing w:val="-10"/>
+                        <w:sz w:val="12"/>
+                      </w:rPr>
+                      <w:instrText xml:space="preserve"> NUMPAGES </w:instrText>
+                    </w:r>
+                    <w:r>
+                      <w:rPr>
+                        <w:spacing w:val="-10"/>
+                        <w:sz w:val="12"/>
+                      </w:rPr>
+                      <w:fldChar w:fldCharType="separate"/>
+                    </w:r>
+                    <w:r>
+                      <w:rPr>
+                        <w:spacing w:val="-10"/>
+                        <w:sz w:val="12"/>
+                      </w:rPr>
+                      <w:t>3</w:t>
+                    </w:r>
+                    <w:r>
+                      <w:rPr>
+                        <w:spacing w:val="-10"/>
+                        <w:sz w:val="12"/>
+                      </w:rPr>
+                      <w:fldChar w:fldCharType="end"/>
+                    </w:r>
+                  </w:p>
+                </w:txbxContent>
+              </v:textbox>
+              <w10:wrap anchorx="page" anchory="page"/>
+            </v:shape>
+          </w:pict>
+        </mc:Fallback>
+      </mc:AlternateContent>
+    </w:r>
   </w:p>
 </w:ftr>
 </file>
@@ -8875,8 +10442,1575 @@
 <w:ftr xmlns:wpc="http://schemas.microsoft.com/office/word/2010/wordprocessingCanvas" xmlns:cx="http://schemas.microsoft.com/office/drawing/2014/chartex" xmlns:cx1="http://schemas.microsoft.com/office/drawing/2015/9/8/chartex" xmlns:cx2="http://schemas.microsoft.com/office/drawing/2015/10/21/chartex" xmlns:cx3="http://schemas.microsoft.com/office/drawing/2016/5/9/chartex" xmlns:cx4="http://schemas.microsoft.com/office/drawing/2016/5/10/chartex" xmlns:cx5="http://schemas.microsoft.com/office/drawing/2016/5/11/chartex" xmlns:cx6="http://schemas.microsoft.com/office/drawing/2016/5/12/chartex" xmlns:cx7="http://schemas.microsoft.com/office/drawing/2016/5/13/chartex" xmlns:cx8="http://schemas.microsoft.com/office/drawing/2016/5/14/chartex" xmlns:mc="http://schemas.openxmlformats.org/markup-compatibility/2006" xmlns:aink="http://schemas.microsoft.com/office/drawing/2016/ink" xmlns:am3d="http://schemas.microsoft.com/office/drawing/2017/model3d" xmlns:o="urn:schemas-microsoft-com:office:office" xmlns:oel="http://schemas.microsoft.com/office/2019/extlst" xmlns:r="http://schemas.openxmlformats.org/officeDocument/2006/relationships" xmlns:m="http://schemas.openxmlformats.org/officeDocument/2006/math" xmlns:v="urn:schemas-microsoft-com:vml" xmlns:wp14="http://schemas.microsoft.com/office/word/2010/wordprocessingDrawing" xmlns:wp="http://schemas.openxmlformats.org/drawingml/2006/wordprocessingDrawing" xmlns:w10="urn:schemas-microsoft-com:office:word" xmlns:w="http://schemas.openxmlformats.org/wordprocessingml/2006/main" xmlns:w14="http://schemas.microsoft.com/office/word/2010/wordml" xmlns:w15="http://schemas.microsoft.com/office/word/2012/wordml" xmlns:w16cex="http://schemas.microsoft.com/office/word/2018/wordml/cex" xmlns:w16cid="http://schemas.microsoft.com/office/word/2016/wordml/cid" xmlns:w16="http://schemas.microsoft.com/office/word/2018/wordml" xmlns:w16du="http://schemas.microsoft.com/office/word/2023/wordml/word16du" xmlns:w16sdtdh="http://schemas.microsoft.com/office/word/2020/wordml/sdtdatahash" xmlns:w16sdtfl="http://schemas.microsoft.com/office/word/2024/wordml/sdtformatlock" xmlns:w16se="http://schemas.microsoft.com/office/word/2015/wordml/symex" xmlns:wpg="http://schemas.microsoft.com/office/word/2010/wordprocessingGroup" xmlns:wpi="http://schemas.microsoft.com/office/word/2010/wordprocessingInk" xmlns:wne="http://schemas.microsoft.com/office/word/2006/wordml" xmlns:wps="http://schemas.microsoft.com/office/word/2010/wordprocessingShape" mc:Ignorable="w14 w15 w16se w16cid w16 w16cex w16sdtdh w16sdtfl w16du wp14">
   <w:p>
     <w:pPr>
-      <w:pStyle w:val="Piedepgina"/>
+      <w:pStyle w:val="Textoindependiente"/>
+      <w:spacing w:line="14" w:lineRule="auto"/>
+      <w:rPr>
+        <w:i w:val="0"/>
+        <w:sz w:val="20"/>
+      </w:rPr>
     </w:pPr>
+    <w:r>
+      <w:rPr>
+        <w:i w:val="0"/>
+        <w:noProof/>
+        <w:sz w:val="20"/>
+      </w:rPr>
+      <w:drawing>
+        <wp:anchor distT="0" distB="0" distL="0" distR="0" simplePos="0" relativeHeight="487260672" behindDoc="1" locked="0" layoutInCell="1" allowOverlap="1" wp14:anchorId="6A974CF6" wp14:editId="49705F6B">
+          <wp:simplePos x="0" y="0"/>
+          <wp:positionH relativeFrom="page">
+            <wp:posOffset>137795</wp:posOffset>
+          </wp:positionH>
+          <wp:positionV relativeFrom="page">
+            <wp:posOffset>8538843</wp:posOffset>
+          </wp:positionV>
+          <wp:extent cx="7466583" cy="1490980"/>
+          <wp:effectExtent l="0" t="0" r="0" b="0"/>
+          <wp:wrapNone/>
+          <wp:docPr id="17" name="Image 17"/>
+          <wp:cNvGraphicFramePr>
+            <a:graphicFrameLocks xmlns:a="http://schemas.openxmlformats.org/drawingml/2006/main"/>
+          </wp:cNvGraphicFramePr>
+          <a:graphic xmlns:a="http://schemas.openxmlformats.org/drawingml/2006/main">
+            <a:graphicData uri="http://schemas.openxmlformats.org/drawingml/2006/picture">
+              <pic:pic xmlns:pic="http://schemas.openxmlformats.org/drawingml/2006/picture">
+                <pic:nvPicPr>
+                  <pic:cNvPr id="17" name="Image 17"/>
+                  <pic:cNvPicPr/>
+                </pic:nvPicPr>
+                <pic:blipFill>
+                  <a:blip r:embed="rId1" cstate="print"/>
+                  <a:stretch>
+                    <a:fillRect/>
+                  </a:stretch>
+                </pic:blipFill>
+                <pic:spPr>
+                  <a:xfrm>
+                    <a:off x="0" y="0"/>
+                    <a:ext cx="7466583" cy="1490980"/>
+                  </a:xfrm>
+                  <a:prstGeom prst="rect">
+                    <a:avLst/>
+                  </a:prstGeom>
+                </pic:spPr>
+              </pic:pic>
+            </a:graphicData>
+          </a:graphic>
+        </wp:anchor>
+      </w:drawing>
+    </w:r>
+    <w:r>
+      <w:rPr>
+        <w:i w:val="0"/>
+        <w:noProof/>
+        <w:sz w:val="20"/>
+      </w:rPr>
+      <mc:AlternateContent>
+        <mc:Choice Requires="wps">
+          <w:drawing>
+            <wp:anchor distT="0" distB="0" distL="0" distR="0" simplePos="0" relativeHeight="487261184" behindDoc="1" locked="0" layoutInCell="1" allowOverlap="1" wp14:anchorId="770974D8" wp14:editId="40D46EAA">
+              <wp:simplePos x="0" y="0"/>
+              <wp:positionH relativeFrom="page">
+                <wp:posOffset>5036184</wp:posOffset>
+              </wp:positionH>
+              <wp:positionV relativeFrom="page">
+                <wp:posOffset>7762275</wp:posOffset>
+              </wp:positionV>
+              <wp:extent cx="2373630" cy="1270"/>
+              <wp:effectExtent l="0" t="0" r="0" b="0"/>
+              <wp:wrapNone/>
+              <wp:docPr id="18" name="Graphic 18"/>
+              <wp:cNvGraphicFramePr>
+                <a:graphicFrameLocks xmlns:a="http://schemas.openxmlformats.org/drawingml/2006/main"/>
+              </wp:cNvGraphicFramePr>
+              <a:graphic xmlns:a="http://schemas.openxmlformats.org/drawingml/2006/main">
+                <a:graphicData uri="http://schemas.microsoft.com/office/word/2010/wordprocessingShape">
+                  <wps:wsp>
+                    <wps:cNvSpPr>
+                      <a:spLocks/>
+                    </wps:cNvSpPr>
+                    <wps:spPr>
+                      <a:xfrm>
+                        <a:off x="0" y="0"/>
+                        <a:ext cx="2373630" cy="1270"/>
+                      </a:xfrm>
+                      <a:custGeom>
+                        <a:avLst/>
+                        <a:gdLst/>
+                        <a:ahLst/>
+                        <a:cxnLst/>
+                        <a:rect l="l" t="t" r="r" b="b"/>
+                        <a:pathLst>
+                          <a:path w="2373630">
+                            <a:moveTo>
+                              <a:pt x="0" y="0"/>
+                            </a:moveTo>
+                            <a:lnTo>
+                              <a:pt x="2373248" y="0"/>
+                            </a:lnTo>
+                          </a:path>
+                        </a:pathLst>
+                      </a:custGeom>
+                      <a:ln w="6400">
+                        <a:solidFill>
+                          <a:srgbClr val="3E3E3E"/>
+                        </a:solidFill>
+                        <a:prstDash val="solid"/>
+                      </a:ln>
+                    </wps:spPr>
+                    <wps:bodyPr wrap="square" lIns="0" tIns="0" rIns="0" bIns="0" rtlCol="0">
+                      <a:prstTxWarp prst="textNoShape">
+                        <a:avLst/>
+                      </a:prstTxWarp>
+                      <a:noAutofit/>
+                    </wps:bodyPr>
+                  </wps:wsp>
+                </a:graphicData>
+              </a:graphic>
+            </wp:anchor>
+          </w:drawing>
+        </mc:Choice>
+        <mc:Fallback>
+          <w:pict>
+            <v:shape w14:anchorId="6C5DF57A" id="Graphic 18" o:spid="_x0000_s1026" style="position:absolute;margin-left:396.55pt;margin-top:611.20pt;width:186.9pt;height:.1pt;z-index:-16055296;visibility:visible;mso-wrap-style:square;mso-wrap-distance-left:0;mso-wrap-distance-top:0;mso-wrap-distance-right:0;mso-wrap-distance-bottom:0;mso-position-horizontal:absolute;mso-position-horizontal-relative:page;mso-position-vertical:absolute;mso-position-vertical-relative:page;v-text-anchor:top" coordsize="2373630,1270" o:gfxdata="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" path="m,l2373248,e" filled="f" strokecolor="#3e3e3e" strokeweight=".17778mm">
+              <v:path arrowok="t"/>
+              <w10:wrap anchorx="page" anchory="page"/>
+            </v:shape>
+          </w:pict>
+        </mc:Fallback>
+      </mc:AlternateContent>
+    </w:r>
+    <w:r>
+      <w:rPr>
+        <w:i w:val="0"/>
+        <w:noProof/>
+        <w:sz w:val="20"/>
+      </w:rPr>
+      <mc:AlternateContent>
+        <mc:Choice Requires="wps">
+          <w:drawing>
+            <wp:anchor distT="0" distB="0" distL="0" distR="0" simplePos="0" relativeHeight="487261696" behindDoc="1" locked="0" layoutInCell="1" allowOverlap="1" wp14:anchorId="30A654B0" wp14:editId="780BB11C">
+              <wp:simplePos x="0" y="0"/>
+              <wp:positionH relativeFrom="page">
+                <wp:posOffset>5292090</wp:posOffset>
+              </wp:positionH>
+              <wp:positionV relativeFrom="page">
+                <wp:posOffset>7513502</wp:posOffset>
+              </wp:positionV>
+              <wp:extent cx="1841500" cy="170000"/>
+              <wp:effectExtent l="0" t="0" r="0" b="0"/>
+              <wp:wrapNone/>
+              <wp:docPr id="19" name="Textbox 19"/>
+              <wp:cNvGraphicFramePr>
+                <a:graphicFrameLocks xmlns:a="http://schemas.openxmlformats.org/drawingml/2006/main"/>
+              </wp:cNvGraphicFramePr>
+              <a:graphic xmlns:a="http://schemas.openxmlformats.org/drawingml/2006/main">
+                <a:graphicData uri="http://schemas.microsoft.com/office/word/2010/wordprocessingShape">
+                  <wps:wsp>
+                    <wps:cNvSpPr txBox="1">
+                      <a:spLocks/>
+                    </wps:cNvSpPr>
+                    <wps:spPr>
+                      <a:xfrm>
+                        <a:off x="0" y="0"/>
+                        <a:ext cx="1841500" cy="170000"/>
+                      </a:xfrm>
+                      <a:prstGeom prst="rect">
+                        <a:avLst/>
+                      </a:prstGeom>
+                    </wps:spPr>
+                    <wps:txbx>
+                      <w:txbxContent>
+                        <w:p>
+                          <w:pPr>
+                            <w:spacing w:before="15"/>
+                            <w:ind w:left="20"/>
+                            <w:rPr>
+                              <w:rFonts w:ascii="Arial MT" w:hAnsi="Arial MT"/>
+                              <w:sz w:val="16"/>
+                            </w:rPr>
+                          </w:pPr>
+                          <w:r>
+                            <w:rPr>
+                              <w:rFonts w:ascii="Arial MT" w:hAnsi="Arial MT"/>
+                              <w:color w:val="404040"/>
+                              <w:sz w:val="16"/>
+                            </w:rPr>
+                            <w:t>Q.B.P.</w:t>
+                          </w:r>
+                          <w:r>
+                            <w:rPr>
+                              <w:rFonts w:ascii="Arial MT" w:hAnsi="Arial MT"/>
+                              <w:color w:val="404040"/>
+                              <w:spacing w:val="-9"/>
+                              <w:sz w:val="16"/>
+                            </w:rPr>
+                            <w:t xml:space="preserve"> </w:t>
+                          </w:r>
+                          <w:r>
+                            <w:rPr>
+                              <w:rFonts w:ascii="Arial MT" w:hAnsi="Arial MT"/>
+                              <w:color w:val="404040"/>
+                              <w:sz w:val="16"/>
+                            </w:rPr>
+                            <w:t>Josshiner</w:t>
+                          </w:r>
+                          <w:r>
+                            <w:rPr>
+                              <w:rFonts w:ascii="Arial MT" w:hAnsi="Arial MT"/>
+                              <w:color w:val="404040"/>
+                              <w:spacing w:val="-9"/>
+                              <w:sz w:val="16"/>
+                            </w:rPr>
+                            <w:t xml:space="preserve"> </w:t>
+                          </w:r>
+                          <w:r>
+                            <w:rPr>
+                              <w:rFonts w:ascii="Arial MT" w:hAnsi="Arial MT"/>
+                              <w:color w:val="404040"/>
+                              <w:sz w:val="16"/>
+                            </w:rPr>
+                            <w:t>Noé</w:t>
+                          </w:r>
+                          <w:r>
+                            <w:rPr>
+                              <w:rFonts w:ascii="Arial MT" w:hAnsi="Arial MT"/>
+                              <w:color w:val="404040"/>
+                              <w:spacing w:val="-8"/>
+                              <w:sz w:val="16"/>
+                            </w:rPr>
+                            <w:t xml:space="preserve"> </w:t>
+                          </w:r>
+                          <w:r>
+                            <w:rPr>
+                              <w:rFonts w:ascii="Arial MT" w:hAnsi="Arial MT"/>
+                              <w:color w:val="404040"/>
+                              <w:sz w:val="16"/>
+                            </w:rPr>
+                            <w:t>García</w:t>
+                          </w:r>
+                          <w:r>
+                            <w:rPr>
+                              <w:rFonts w:ascii="Arial MT" w:hAnsi="Arial MT"/>
+                              <w:color w:val="404040"/>
+                              <w:spacing w:val="-9"/>
+                              <w:sz w:val="16"/>
+                            </w:rPr>
+                            <w:t xml:space="preserve"> </w:t>
+                          </w:r>
+                          <w:r>
+                            <w:rPr>
+                              <w:rFonts w:ascii="Arial MT" w:hAnsi="Arial MT"/>
+                              <w:color w:val="404040"/>
+                              <w:spacing w:val="-2"/>
+                              <w:sz w:val="16"/>
+                            </w:rPr>
+                            <w:t>Hernández</w:t>
+                          </w:r>
+                        </w:p>
+                      </w:txbxContent>
+                    </wps:txbx>
+                    <wps:bodyPr wrap="square" lIns="0" tIns="0" rIns="0" bIns="0" rtlCol="0">
+                      <a:noAutofit/>
+                    </wps:bodyPr>
+                  </wps:wsp>
+                </a:graphicData>
+              </a:graphic>
+            </wp:anchor>
+          </w:drawing>
+        </mc:Choice>
+        <mc:Fallback>
+          <w:pict>
+            <v:shapetype w14:anchorId="30A654B0" id="_x0000_t202" coordsize="21600,21600" o:spt="202" path="m,l,21600r21600,l21600,xe">
+              <v:stroke joinstyle="miter"/>
+              <v:path gradientshapeok="t" o:connecttype="rect"/>
+            </v:shapetype>
+            <v:shape id="Textbox 19" o:spid="_x0000_s1038" type="#_x0000_t202" style="position:absolute;margin-left:416.7pt;margin-top:591.61pt;width:145pt;height:13.39pt;z-index:-16054784;visibility:visible;mso-wrap-style:square;mso-wrap-distance-left:0;mso-wrap-distance-top:0;mso-wrap-distance-right:0;mso-wrap-distance-bottom:0;mso-position-horizontal:absolute;mso-position-horizontal-relative:page;mso-position-vertical:absolute;mso-position-vertical-relative:page;v-text-anchor:top" o:gfxdata="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" filled="f" stroked="f">
+              <v:textbox inset="0,0,0,0">
+                <w:txbxContent>
+                  <w:p>
+                    <w:pPr>
+                      <w:spacing w:before="15"/>
+                      <w:ind w:left="20"/>
+                      <w:rPr>
+                        <w:rFonts w:ascii="Arial MT" w:hAnsi="Arial MT"/>
+                        <w:sz w:val="16"/>
+                      </w:rPr>
+                    </w:pPr>
+                    <w:r>
+                      <w:rPr>
+                        <w:rFonts w:ascii="Arial MT" w:hAnsi="Arial MT"/>
+                        <w:color w:val="404040"/>
+                        <w:sz w:val="16"/>
+                      </w:rPr>
+                      <w:t>Q.B.P.</w:t>
+                    </w:r>
+                    <w:r>
+                      <w:rPr>
+                        <w:rFonts w:ascii="Arial MT" w:hAnsi="Arial MT"/>
+                        <w:color w:val="404040"/>
+                        <w:spacing w:val="-9"/>
+                        <w:sz w:val="16"/>
+                      </w:rPr>
+                      <w:t xml:space="preserve"> </w:t>
+                    </w:r>
+                    <w:r>
+                      <w:rPr>
+                        <w:rFonts w:ascii="Arial MT" w:hAnsi="Arial MT"/>
+                        <w:color w:val="404040"/>
+                        <w:sz w:val="16"/>
+                      </w:rPr>
+                      <w:t>Josshiner</w:t>
+                    </w:r>
+                    <w:r>
+                      <w:rPr>
+                        <w:rFonts w:ascii="Arial MT" w:hAnsi="Arial MT"/>
+                        <w:color w:val="404040"/>
+                        <w:spacing w:val="-9"/>
+                        <w:sz w:val="16"/>
+                      </w:rPr>
+                      <w:t xml:space="preserve"> </w:t>
+                    </w:r>
+                    <w:r>
+                      <w:rPr>
+                        <w:rFonts w:ascii="Arial MT" w:hAnsi="Arial MT"/>
+                        <w:color w:val="404040"/>
+                        <w:sz w:val="16"/>
+                      </w:rPr>
+                      <w:t>Noé</w:t>
+                    </w:r>
+                    <w:r>
+                      <w:rPr>
+                        <w:rFonts w:ascii="Arial MT" w:hAnsi="Arial MT"/>
+                        <w:color w:val="404040"/>
+                        <w:spacing w:val="-8"/>
+                        <w:sz w:val="16"/>
+                      </w:rPr>
+                      <w:t xml:space="preserve"> </w:t>
+                    </w:r>
+                    <w:r>
+                      <w:rPr>
+                        <w:rFonts w:ascii="Arial MT" w:hAnsi="Arial MT"/>
+                        <w:color w:val="404040"/>
+                        <w:sz w:val="16"/>
+                      </w:rPr>
+                      <w:t>García</w:t>
+                    </w:r>
+                    <w:r>
+                      <w:rPr>
+                        <w:rFonts w:ascii="Arial MT" w:hAnsi="Arial MT"/>
+                        <w:color w:val="404040"/>
+                        <w:spacing w:val="-9"/>
+                        <w:sz w:val="16"/>
+                      </w:rPr>
+                      <w:t xml:space="preserve"> </w:t>
+                    </w:r>
+                    <w:r>
+                      <w:rPr>
+                        <w:rFonts w:ascii="Arial MT" w:hAnsi="Arial MT"/>
+                        <w:color w:val="404040"/>
+                        <w:spacing w:val="-2"/>
+                        <w:sz w:val="16"/>
+                      </w:rPr>
+                      <w:t>Hernández</w:t>
+                    </w:r>
+                  </w:p>
+                </w:txbxContent>
+              </v:textbox>
+              <w10:wrap anchorx="page" anchory="page"/>
+            </v:shape>
+          </w:pict>
+        </mc:Fallback>
+      </mc:AlternateContent>
+    </w:r>
+    <w:r>
+      <w:rPr>
+        <w:i w:val="0"/>
+        <w:noProof/>
+        <w:sz w:val="20"/>
+      </w:rPr>
+      <mc:AlternateContent>
+        <mc:Choice Requires="wps">
+          <w:drawing>
+            <wp:anchor distT="0" distB="0" distL="0" distR="0" simplePos="0" relativeHeight="487262208" behindDoc="1" locked="0" layoutInCell="1" allowOverlap="1" wp14:anchorId="739682D1" wp14:editId="702591AC">
+              <wp:simplePos x="0" y="0"/>
+              <wp:positionH relativeFrom="page">
+                <wp:posOffset>203708</wp:posOffset>
+              </wp:positionH>
+              <wp:positionV relativeFrom="page">
+                <wp:posOffset>7885090</wp:posOffset>
+              </wp:positionV>
+              <wp:extent cx="3552190" cy="109855"/>
+              <wp:effectExtent l="0" t="0" r="0" b="0"/>
+              <wp:wrapNone/>
+              <wp:docPr id="20" name="Textbox 20"/>
+              <wp:cNvGraphicFramePr>
+                <a:graphicFrameLocks xmlns:a="http://schemas.openxmlformats.org/drawingml/2006/main"/>
+              </wp:cNvGraphicFramePr>
+              <a:graphic xmlns:a="http://schemas.openxmlformats.org/drawingml/2006/main">
+                <a:graphicData uri="http://schemas.microsoft.com/office/word/2010/wordprocessingShape">
+                  <wps:wsp>
+                    <wps:cNvSpPr txBox="1">
+                      <a:spLocks/>
+                    </wps:cNvSpPr>
+                    <wps:spPr>
+                      <a:xfrm>
+                        <a:off x="0" y="0"/>
+                        <a:ext cx="3552190" cy="109855"/>
+                      </a:xfrm>
+                      <a:prstGeom prst="rect">
+                        <a:avLst/>
+                      </a:prstGeom>
+                    </wps:spPr>
+                    <wps:txbx>
+                      <w:txbxContent>
+                        <w:p>
+                          <w:pPr>
+                            <w:spacing w:before="15"/>
+                            <w:ind w:left="20"/>
+                            <w:rPr>
+                              <w:sz w:val="12"/>
+                            </w:rPr>
+                          </w:pPr>
+                          <w:r>
+                            <w:rPr>
+                              <w:spacing w:val="-2"/>
+                              <w:sz w:val="12"/>
+                            </w:rPr>
+                            <w:t>BLVD.</w:t>
+                          </w:r>
+                          <w:r>
+                            <w:rPr>
+                              <w:spacing w:val="-1"/>
+                              <w:sz w:val="12"/>
+                            </w:rPr>
+                            <w:t xml:space="preserve"> </w:t>
+                          </w:r>
+                          <w:r>
+                            <w:rPr>
+                              <w:spacing w:val="-2"/>
+                              <w:sz w:val="12"/>
+                            </w:rPr>
+                            <w:t>SOR</w:t>
+                          </w:r>
+                          <w:r>
+                            <w:rPr>
+                              <w:sz w:val="12"/>
+                            </w:rPr>
+                            <w:t xml:space="preserve"> </w:t>
+                          </w:r>
+                          <w:r>
+                            <w:rPr>
+                              <w:spacing w:val="-2"/>
+                              <w:sz w:val="12"/>
+                            </w:rPr>
+                            <w:t>JUANA</w:t>
+                          </w:r>
+                          <w:r>
+                            <w:rPr>
+                              <w:spacing w:val="-1"/>
+                              <w:sz w:val="12"/>
+                            </w:rPr>
+                            <w:t xml:space="preserve"> </w:t>
+                          </w:r>
+                          <w:r>
+                            <w:rPr>
+                              <w:spacing w:val="-2"/>
+                              <w:sz w:val="12"/>
+                            </w:rPr>
+                            <w:t>INÉS</w:t>
+                          </w:r>
+                          <w:r>
+                            <w:rPr>
+                              <w:spacing w:val="1"/>
+                              <w:sz w:val="12"/>
+                            </w:rPr>
+                            <w:t xml:space="preserve"> </w:t>
+                          </w:r>
+                          <w:r>
+                            <w:rPr>
+                              <w:spacing w:val="-2"/>
+                              <w:sz w:val="12"/>
+                            </w:rPr>
+                            <w:t>DE LA</w:t>
+                          </w:r>
+                          <w:r>
+                            <w:rPr>
+                              <w:spacing w:val="-1"/>
+                              <w:sz w:val="12"/>
+                            </w:rPr>
+                            <w:t xml:space="preserve"> </w:t>
+                          </w:r>
+                          <w:r>
+                            <w:rPr>
+                              <w:spacing w:val="-2"/>
+                              <w:sz w:val="12"/>
+                            </w:rPr>
+                            <w:t>CRUZ</w:t>
+                          </w:r>
+                          <w:r>
+                            <w:rPr>
+                              <w:spacing w:val="1"/>
+                              <w:sz w:val="12"/>
+                            </w:rPr>
+                            <w:t xml:space="preserve"> </w:t>
+                          </w:r>
+                          <w:r>
+                            <w:rPr>
+                              <w:spacing w:val="-2"/>
+                              <w:sz w:val="12"/>
+                            </w:rPr>
+                            <w:t>#1000</w:t>
+                          </w:r>
+                          <w:r>
+                            <w:rPr>
+                              <w:spacing w:val="3"/>
+                              <w:sz w:val="12"/>
+                            </w:rPr>
+                            <w:t xml:space="preserve"> </w:t>
+                          </w:r>
+                          <w:r>
+                            <w:rPr>
+                              <w:spacing w:val="-2"/>
+                              <w:sz w:val="12"/>
+                            </w:rPr>
+                            <w:t>COL.</w:t>
+                          </w:r>
+                          <w:r>
+                            <w:rPr>
+                              <w:spacing w:val="4"/>
+                              <w:sz w:val="12"/>
+                            </w:rPr>
+                            <w:t xml:space="preserve"> </w:t>
+                          </w:r>
+                          <w:r>
+                            <w:rPr>
+                              <w:spacing w:val="-2"/>
+                              <w:sz w:val="12"/>
+                            </w:rPr>
+                            <w:t>LAS</w:t>
+                          </w:r>
+                          <w:r>
+                            <w:rPr>
+                              <w:spacing w:val="1"/>
+                              <w:sz w:val="12"/>
+                            </w:rPr>
+                            <w:t xml:space="preserve"> </w:t>
+                          </w:r>
+                          <w:r>
+                            <w:rPr>
+                              <w:spacing w:val="-2"/>
+                              <w:sz w:val="12"/>
+                            </w:rPr>
+                            <w:t>ARBOLEDAS</w:t>
+                          </w:r>
+                          <w:r>
+                            <w:rPr>
+                              <w:spacing w:val="2"/>
+                              <w:sz w:val="12"/>
+                            </w:rPr>
+                            <w:t xml:space="preserve"> </w:t>
+                          </w:r>
+                          <w:r>
+                            <w:rPr>
+                              <w:spacing w:val="-2"/>
+                              <w:sz w:val="12"/>
+                            </w:rPr>
+                            <w:t>C.P.</w:t>
+                          </w:r>
+                          <w:r>
+                            <w:rPr>
+                              <w:spacing w:val="4"/>
+                              <w:sz w:val="12"/>
+                            </w:rPr>
+                            <w:t xml:space="preserve"> </w:t>
+                          </w:r>
+                          <w:r>
+                            <w:rPr>
+                              <w:spacing w:val="-2"/>
+                              <w:sz w:val="12"/>
+                            </w:rPr>
+                            <w:t>66004,</w:t>
+                          </w:r>
+                          <w:r>
+                            <w:rPr>
+                              <w:spacing w:val="2"/>
+                              <w:sz w:val="12"/>
+                            </w:rPr>
+                            <w:t xml:space="preserve"> </w:t>
+                          </w:r>
+                          <w:r>
+                            <w:rPr>
+                              <w:spacing w:val="-2"/>
+                              <w:sz w:val="12"/>
+                            </w:rPr>
+                            <w:t>GARCÍA,</w:t>
+                          </w:r>
+                          <w:r>
+                            <w:rPr>
+                              <w:spacing w:val="2"/>
+                              <w:sz w:val="12"/>
+                            </w:rPr>
+                            <w:t xml:space="preserve"> </w:t>
+                          </w:r>
+                          <w:r>
+                            <w:rPr>
+                              <w:spacing w:val="-2"/>
+                              <w:sz w:val="12"/>
+                            </w:rPr>
+                            <w:t>NUEVO</w:t>
+                          </w:r>
+                          <w:r>
+                            <w:rPr>
+                              <w:sz w:val="12"/>
+                            </w:rPr>
+                            <w:t xml:space="preserve"> </w:t>
+                          </w:r>
+                          <w:r>
+                            <w:rPr>
+                              <w:spacing w:val="-2"/>
+                              <w:sz w:val="12"/>
+                            </w:rPr>
+                            <w:t>LEÓN.</w:t>
+                          </w:r>
+                        </w:p>
+                      </w:txbxContent>
+                    </wps:txbx>
+                    <wps:bodyPr wrap="square" lIns="0" tIns="0" rIns="0" bIns="0" rtlCol="0">
+                      <a:noAutofit/>
+                    </wps:bodyPr>
+                  </wps:wsp>
+                </a:graphicData>
+              </a:graphic>
+            </wp:anchor>
+          </w:drawing>
+        </mc:Choice>
+        <mc:Fallback>
+          <w:pict>
+            <v:shape w14:anchorId="739682D1" id="Textbox 20" o:spid="_x0000_s1039" type="#_x0000_t202" style="position:absolute;margin-left:16.05pt;margin-top:620.85pt;width:279.7pt;height:8.65pt;z-index:-16054272;visibility:visible;mso-wrap-style:square;mso-wrap-distance-left:0;mso-wrap-distance-top:0;mso-wrap-distance-right:0;mso-wrap-distance-bottom:0;mso-position-horizontal:absolute;mso-position-horizontal-relative:page;mso-position-vertical:absolute;mso-position-vertical-relative:page;v-text-anchor:top" o:gfxdata="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" filled="f" stroked="f">
+              <v:textbox inset="0,0,0,0">
+                <w:txbxContent>
+                  <w:p>
+                    <w:pPr>
+                      <w:spacing w:before="15"/>
+                      <w:ind w:left="20"/>
+                      <w:rPr>
+                        <w:sz w:val="12"/>
+                      </w:rPr>
+                    </w:pPr>
+                    <w:r>
+                      <w:rPr>
+                        <w:spacing w:val="-2"/>
+                        <w:sz w:val="12"/>
+                      </w:rPr>
+                      <w:t>BLVD.</w:t>
+                    </w:r>
+                    <w:r>
+                      <w:rPr>
+                        <w:spacing w:val="-1"/>
+                        <w:sz w:val="12"/>
+                      </w:rPr>
+                      <w:t xml:space="preserve"> </w:t>
+                    </w:r>
+                    <w:r>
+                      <w:rPr>
+                        <w:spacing w:val="-2"/>
+                        <w:sz w:val="12"/>
+                      </w:rPr>
+                      <w:t>SOR</w:t>
+                    </w:r>
+                    <w:r>
+                      <w:rPr>
+                        <w:sz w:val="12"/>
+                      </w:rPr>
+                      <w:t xml:space="preserve"> </w:t>
+                    </w:r>
+                    <w:r>
+                      <w:rPr>
+                        <w:spacing w:val="-2"/>
+                        <w:sz w:val="12"/>
+                      </w:rPr>
+                      <w:t>JUANA</w:t>
+                    </w:r>
+                    <w:r>
+                      <w:rPr>
+                        <w:spacing w:val="-1"/>
+                        <w:sz w:val="12"/>
+                      </w:rPr>
+                      <w:t xml:space="preserve"> </w:t>
+                    </w:r>
+                    <w:r>
+                      <w:rPr>
+                        <w:spacing w:val="-2"/>
+                        <w:sz w:val="12"/>
+                      </w:rPr>
+                      <w:t>INÉS</w:t>
+                    </w:r>
+                    <w:r>
+                      <w:rPr>
+                        <w:spacing w:val="1"/>
+                        <w:sz w:val="12"/>
+                      </w:rPr>
+                      <w:t xml:space="preserve"> </w:t>
+                    </w:r>
+                    <w:r>
+                      <w:rPr>
+                        <w:spacing w:val="-2"/>
+                        <w:sz w:val="12"/>
+                      </w:rPr>
+                      <w:t>DE LA</w:t>
+                    </w:r>
+                    <w:r>
+                      <w:rPr>
+                        <w:spacing w:val="-1"/>
+                        <w:sz w:val="12"/>
+                      </w:rPr>
+                      <w:t xml:space="preserve"> </w:t>
+                    </w:r>
+                    <w:r>
+                      <w:rPr>
+                        <w:spacing w:val="-2"/>
+                        <w:sz w:val="12"/>
+                      </w:rPr>
+                      <w:t>CRUZ</w:t>
+                    </w:r>
+                    <w:r>
+                      <w:rPr>
+                        <w:spacing w:val="1"/>
+                        <w:sz w:val="12"/>
+                      </w:rPr>
+                      <w:t xml:space="preserve"> </w:t>
+                    </w:r>
+                    <w:r>
+                      <w:rPr>
+                        <w:spacing w:val="-2"/>
+                        <w:sz w:val="12"/>
+                      </w:rPr>
+                      <w:t>#1000</w:t>
+                    </w:r>
+                    <w:r>
+                      <w:rPr>
+                        <w:spacing w:val="3"/>
+                        <w:sz w:val="12"/>
+                      </w:rPr>
+                      <w:t xml:space="preserve"> </w:t>
+                    </w:r>
+                    <w:r>
+                      <w:rPr>
+                        <w:spacing w:val="-2"/>
+                        <w:sz w:val="12"/>
+                      </w:rPr>
+                      <w:t>COL.</w:t>
+                    </w:r>
+                    <w:r>
+                      <w:rPr>
+                        <w:spacing w:val="4"/>
+                        <w:sz w:val="12"/>
+                      </w:rPr>
+                      <w:t xml:space="preserve"> </w:t>
+                    </w:r>
+                    <w:r>
+                      <w:rPr>
+                        <w:spacing w:val="-2"/>
+                        <w:sz w:val="12"/>
+                      </w:rPr>
+                      <w:t>LAS</w:t>
+                    </w:r>
+                    <w:r>
+                      <w:rPr>
+                        <w:spacing w:val="1"/>
+                        <w:sz w:val="12"/>
+                      </w:rPr>
+                      <w:t xml:space="preserve"> </w:t>
+                    </w:r>
+                    <w:r>
+                      <w:rPr>
+                        <w:spacing w:val="-2"/>
+                        <w:sz w:val="12"/>
+                      </w:rPr>
+                      <w:t>ARBOLEDAS</w:t>
+                    </w:r>
+                    <w:r>
+                      <w:rPr>
+                        <w:spacing w:val="2"/>
+                        <w:sz w:val="12"/>
+                      </w:rPr>
+                      <w:t xml:space="preserve"> </w:t>
+                    </w:r>
+                    <w:r>
+                      <w:rPr>
+                        <w:spacing w:val="-2"/>
+                        <w:sz w:val="12"/>
+                      </w:rPr>
+                      <w:t>C.P.</w:t>
+                    </w:r>
+                    <w:r>
+                      <w:rPr>
+                        <w:spacing w:val="4"/>
+                        <w:sz w:val="12"/>
+                      </w:rPr>
+                      <w:t xml:space="preserve"> </w:t>
+                    </w:r>
+                    <w:r>
+                      <w:rPr>
+                        <w:spacing w:val="-2"/>
+                        <w:sz w:val="12"/>
+                      </w:rPr>
+                      <w:t>66004,</w:t>
+                    </w:r>
+                    <w:r>
+                      <w:rPr>
+                        <w:spacing w:val="2"/>
+                        <w:sz w:val="12"/>
+                      </w:rPr>
+                      <w:t xml:space="preserve"> </w:t>
+                    </w:r>
+                    <w:r>
+                      <w:rPr>
+                        <w:spacing w:val="-2"/>
+                        <w:sz w:val="12"/>
+                      </w:rPr>
+                      <w:t>GARCÍA,</w:t>
+                    </w:r>
+                    <w:r>
+                      <w:rPr>
+                        <w:spacing w:val="2"/>
+                        <w:sz w:val="12"/>
+                      </w:rPr>
+                      <w:t xml:space="preserve"> </w:t>
+                    </w:r>
+                    <w:r>
+                      <w:rPr>
+                        <w:spacing w:val="-2"/>
+                        <w:sz w:val="12"/>
+                      </w:rPr>
+                      <w:t>NUEVO</w:t>
+                    </w:r>
+                    <w:r>
+                      <w:rPr>
+                        <w:sz w:val="12"/>
+                      </w:rPr>
+                      <w:t xml:space="preserve"> </w:t>
+                    </w:r>
+                    <w:r>
+                      <w:rPr>
+                        <w:spacing w:val="-2"/>
+                        <w:sz w:val="12"/>
+                      </w:rPr>
+                      <w:t>LEÓN.</w:t>
+                    </w:r>
+                  </w:p>
+                </w:txbxContent>
+              </v:textbox>
+              <w10:wrap anchorx="page" anchory="page"/>
+            </v:shape>
+          </w:pict>
+        </mc:Fallback>
+      </mc:AlternateContent>
+    </w:r>
+    <w:r>
+      <w:rPr>
+        <w:i w:val="0"/>
+        <w:noProof/>
+        <w:sz w:val="20"/>
+      </w:rPr>
+      <mc:AlternateContent>
+        <mc:Choice Requires="wps">
+          <w:drawing>
+            <wp:anchor distT="0" distB="0" distL="0" distR="0" simplePos="0" relativeHeight="487262720" behindDoc="1" locked="0" layoutInCell="1" allowOverlap="1" wp14:anchorId="6C52562A" wp14:editId="2DC06BA4">
+              <wp:simplePos x="0" y="0"/>
+              <wp:positionH relativeFrom="page">
+                <wp:posOffset>5348478</wp:posOffset>
+              </wp:positionH>
+              <wp:positionV relativeFrom="page">
+                <wp:posOffset>7772582</wp:posOffset>
+              </wp:positionV>
+              <wp:extent cx="1751330" cy="590000"/>
+              <wp:effectExtent l="0" t="0" r="0" b="0"/>
+              <wp:wrapNone/>
+              <wp:docPr id="21" name="Textbox 21"/>
+              <wp:cNvGraphicFramePr>
+                <a:graphicFrameLocks xmlns:a="http://schemas.openxmlformats.org/drawingml/2006/main"/>
+              </wp:cNvGraphicFramePr>
+              <a:graphic xmlns:a="http://schemas.openxmlformats.org/drawingml/2006/main">
+                <a:graphicData uri="http://schemas.microsoft.com/office/word/2010/wordprocessingShape">
+                  <wps:wsp>
+                    <wps:cNvSpPr txBox="1">
+                      <a:spLocks/>
+                    </wps:cNvSpPr>
+                    <wps:spPr>
+                      <a:xfrm>
+                        <a:off x="0" y="0"/>
+                        <a:ext cx="1751330" cy="590000"/>
+                      </a:xfrm>
+                      <a:prstGeom prst="rect">
+                        <a:avLst/>
+                      </a:prstGeom>
+                    </wps:spPr>
+                    <wps:txbx>
+                      <w:txbxContent>
+                        <w:p>
+                          <w:pPr>
+                            <w:spacing w:before="15" w:line="256" w:lineRule="auto"/>
+                            <w:ind w:left="257" w:right="251"/>
+                            <w:jc w:val="center"/>
+                            <w:rPr>
+                              <w:rFonts w:ascii="Arial MT"/>
+                              <w:sz w:val="16"/>
+                            </w:rPr>
+                          </w:pPr>
+                          <w:r>
+                            <w:rPr>
+                              <w:rFonts w:ascii="Arial MT"/>
+                              <w:color w:val="404040"/>
+                              <w:spacing w:val="-4"/>
+                              <w:sz w:val="16"/>
+                            </w:rPr>
+                            <w:t xml:space="preserve">Responsable de Laboratorio </w:t>
+                          </w:r>
+                          <w:r>
+                            <w:rPr>
+                              <w:rFonts w:ascii="Arial MT"/>
+                              <w:color w:val="404040"/>
+                              <w:sz w:val="16"/>
+                            </w:rPr>
+                            <w:t>CED. PROF. 11846660</w:t>
+                          </w:r>
+                        </w:p>
+                        <w:p>
+                          <w:pPr>
+                            <w:jc w:val="center"/>
+                            <w:rPr>
+                              <w:rFonts w:ascii="Arial MT" w:hAnsi="Arial MT"/>
+                              <w:sz w:val="16"/>
+                            </w:rPr>
+                          </w:pPr>
+                          <w:r>
+                            <w:rPr>
+                              <w:rFonts w:ascii="Arial MT" w:hAnsi="Arial MT"/>
+                              <w:color w:val="404040"/>
+                              <w:sz w:val="16"/>
+                            </w:rPr>
+                            <w:t>Universidad</w:t>
+                          </w:r>
+                          <w:r>
+                            <w:rPr>
+                              <w:rFonts w:ascii="Arial MT" w:hAnsi="Arial MT"/>
+                              <w:color w:val="404040"/>
+                              <w:spacing w:val="-12"/>
+                              <w:sz w:val="16"/>
+                            </w:rPr>
+                            <w:t xml:space="preserve"> </w:t>
+                          </w:r>
+                          <w:r>
+                            <w:rPr>
+                              <w:rFonts w:ascii="Arial MT" w:hAnsi="Arial MT"/>
+                              <w:color w:val="404040"/>
+                              <w:sz w:val="16"/>
+                            </w:rPr>
+                            <w:t>Autónoma</w:t>
+                          </w:r>
+                          <w:r>
+                            <w:rPr>
+                              <w:rFonts w:ascii="Arial MT" w:hAnsi="Arial MT"/>
+                              <w:color w:val="404040"/>
+                              <w:spacing w:val="-10"/>
+                              <w:sz w:val="16"/>
+                            </w:rPr>
+                            <w:t xml:space="preserve"> </w:t>
+                          </w:r>
+                          <w:r>
+                            <w:rPr>
+                              <w:rFonts w:ascii="Arial MT" w:hAnsi="Arial MT"/>
+                              <w:color w:val="404040"/>
+                              <w:sz w:val="16"/>
+                            </w:rPr>
+                            <w:t>de</w:t>
+                          </w:r>
+                          <w:r>
+                            <w:rPr>
+                              <w:rFonts w:ascii="Arial MT" w:hAnsi="Arial MT"/>
+                              <w:color w:val="404040"/>
+                              <w:spacing w:val="-8"/>
+                              <w:sz w:val="16"/>
+                            </w:rPr>
+                            <w:t xml:space="preserve"> </w:t>
+                          </w:r>
+                          <w:r>
+                            <w:rPr>
+                              <w:rFonts w:ascii="Arial MT" w:hAnsi="Arial MT"/>
+                              <w:color w:val="404040"/>
+                              <w:sz w:val="16"/>
+                            </w:rPr>
+                            <w:t>Nuevo</w:t>
+                          </w:r>
+                          <w:r>
+                            <w:rPr>
+                              <w:rFonts w:ascii="Arial MT" w:hAnsi="Arial MT"/>
+                              <w:color w:val="404040"/>
+                              <w:spacing w:val="-11"/>
+                              <w:sz w:val="16"/>
+                            </w:rPr>
+                            <w:t xml:space="preserve"> </w:t>
+                          </w:r>
+                          <w:r>
+                            <w:rPr>
+                              <w:rFonts w:ascii="Arial MT" w:hAnsi="Arial MT"/>
+                              <w:color w:val="404040"/>
+                              <w:spacing w:val="-4"/>
+                              <w:sz w:val="16"/>
+                            </w:rPr>
+                            <w:t>León</w:t>
+                          </w:r>
+                        </w:p>
+                      </w:txbxContent>
+                    </wps:txbx>
+                    <wps:bodyPr wrap="square" lIns="0" tIns="0" rIns="0" bIns="0" rtlCol="0">
+                      <a:noAutofit/>
+                    </wps:bodyPr>
+                  </wps:wsp>
+                </a:graphicData>
+              </a:graphic>
+            </wp:anchor>
+          </w:drawing>
+        </mc:Choice>
+        <mc:Fallback>
+          <w:pict>
+            <v:shape w14:anchorId="6C52562A" id="Textbox 21" o:spid="_x0000_s1040" type="#_x0000_t202" style="position:absolute;margin-left:421.15pt;margin-top:612.01pt;width:137.9pt;height:46.46pt;z-index:-16053760;visibility:visible;mso-wrap-style:square;mso-wrap-distance-left:0;mso-wrap-distance-top:0;mso-wrap-distance-right:0;mso-wrap-distance-bottom:0;mso-position-horizontal:absolute;mso-position-horizontal-relative:page;mso-position-vertical:absolute;mso-position-vertical-relative:page;v-text-anchor:top" o:gfxdata="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" filled="f" stroked="f">
+              <v:textbox inset="0,0,0,0">
+                <w:txbxContent>
+                  <w:p>
+                    <w:pPr>
+                      <w:spacing w:before="15" w:line="256" w:lineRule="auto"/>
+                      <w:ind w:left="257" w:right="251"/>
+                      <w:jc w:val="center"/>
+                      <w:rPr>
+                        <w:rFonts w:ascii="Arial MT"/>
+                        <w:sz w:val="16"/>
+                      </w:rPr>
+                    </w:pPr>
+                    <w:r>
+                      <w:rPr>
+                        <w:rFonts w:ascii="Arial MT"/>
+                        <w:color w:val="404040"/>
+                        <w:spacing w:val="-4"/>
+                        <w:sz w:val="16"/>
+                      </w:rPr>
+                      <w:t xml:space="preserve">Responsable de Laboratorio </w:t>
+                    </w:r>
+                    <w:r>
+                      <w:rPr>
+                        <w:rFonts w:ascii="Arial MT"/>
+                        <w:color w:val="404040"/>
+                        <w:sz w:val="16"/>
+                      </w:rPr>
+                      <w:t>CED. PROF. 11846660</w:t>
+                    </w:r>
+                  </w:p>
+                  <w:p>
+                    <w:pPr>
+                      <w:jc w:val="center"/>
+                      <w:rPr>
+                        <w:rFonts w:ascii="Arial MT" w:hAnsi="Arial MT"/>
+                        <w:sz w:val="16"/>
+                      </w:rPr>
+                    </w:pPr>
+                    <w:r>
+                      <w:rPr>
+                        <w:rFonts w:ascii="Arial MT" w:hAnsi="Arial MT"/>
+                        <w:color w:val="404040"/>
+                        <w:sz w:val="16"/>
+                      </w:rPr>
+                      <w:t>Universidad</w:t>
+                    </w:r>
+                    <w:r>
+                      <w:rPr>
+                        <w:rFonts w:ascii="Arial MT" w:hAnsi="Arial MT"/>
+                        <w:color w:val="404040"/>
+                        <w:spacing w:val="-12"/>
+                        <w:sz w:val="16"/>
+                      </w:rPr>
+                      <w:t xml:space="preserve"> </w:t>
+                    </w:r>
+                    <w:r>
+                      <w:rPr>
+                        <w:rFonts w:ascii="Arial MT" w:hAnsi="Arial MT"/>
+                        <w:color w:val="404040"/>
+                        <w:sz w:val="16"/>
+                      </w:rPr>
+                      <w:t>Autónoma</w:t>
+                    </w:r>
+                    <w:r>
+                      <w:rPr>
+                        <w:rFonts w:ascii="Arial MT" w:hAnsi="Arial MT"/>
+                        <w:color w:val="404040"/>
+                        <w:spacing w:val="-10"/>
+                        <w:sz w:val="16"/>
+                      </w:rPr>
+                      <w:t xml:space="preserve"> </w:t>
+                    </w:r>
+                    <w:r>
+                      <w:rPr>
+                        <w:rFonts w:ascii="Arial MT" w:hAnsi="Arial MT"/>
+                        <w:color w:val="404040"/>
+                        <w:sz w:val="16"/>
+                      </w:rPr>
+                      <w:t>de</w:t>
+                    </w:r>
+                    <w:r>
+                      <w:rPr>
+                        <w:rFonts w:ascii="Arial MT" w:hAnsi="Arial MT"/>
+                        <w:color w:val="404040"/>
+                        <w:spacing w:val="-8"/>
+                        <w:sz w:val="16"/>
+                      </w:rPr>
+                      <w:t xml:space="preserve"> </w:t>
+                    </w:r>
+                    <w:r>
+                      <w:rPr>
+                        <w:rFonts w:ascii="Arial MT" w:hAnsi="Arial MT"/>
+                        <w:color w:val="404040"/>
+                        <w:sz w:val="16"/>
+                      </w:rPr>
+                      <w:t>Nuevo</w:t>
+                    </w:r>
+                    <w:r>
+                      <w:rPr>
+                        <w:rFonts w:ascii="Arial MT" w:hAnsi="Arial MT"/>
+                        <w:color w:val="404040"/>
+                        <w:spacing w:val="-11"/>
+                        <w:sz w:val="16"/>
+                      </w:rPr>
+                      <w:t xml:space="preserve"> </w:t>
+                    </w:r>
+                    <w:r>
+                      <w:rPr>
+                        <w:rFonts w:ascii="Arial MT" w:hAnsi="Arial MT"/>
+                        <w:color w:val="404040"/>
+                        <w:spacing w:val="-4"/>
+                        <w:sz w:val="16"/>
+                      </w:rPr>
+                      <w:t>León</w:t>
+                    </w:r>
+                  </w:p>
+                </w:txbxContent>
+              </v:textbox>
+              <w10:wrap anchorx="page" anchory="page"/>
+            </v:shape>
+          </w:pict>
+        </mc:Fallback>
+      </mc:AlternateContent>
+    </w:r>
+    <w:r>
+      <w:rPr>
+        <w:i w:val="0"/>
+        <w:noProof/>
+        <w:sz w:val="20"/>
+      </w:rPr>
+      <mc:AlternateContent>
+        <mc:Choice Requires="wps">
+          <w:drawing>
+            <wp:anchor distT="0" distB="0" distL="0" distR="0" simplePos="0" relativeHeight="487263232" behindDoc="1" locked="0" layoutInCell="1" allowOverlap="1" wp14:anchorId="49EE3916" wp14:editId="5310D7E8">
+              <wp:simplePos x="0" y="0"/>
+              <wp:positionH relativeFrom="page">
+                <wp:posOffset>432308</wp:posOffset>
+              </wp:positionH>
+              <wp:positionV relativeFrom="page">
+                <wp:posOffset>8138075</wp:posOffset>
+              </wp:positionV>
+              <wp:extent cx="465455" cy="201295"/>
+              <wp:effectExtent l="0" t="0" r="0" b="0"/>
+              <wp:wrapNone/>
+              <wp:docPr id="22" name="Textbox 22"/>
+              <wp:cNvGraphicFramePr>
+                <a:graphicFrameLocks xmlns:a="http://schemas.openxmlformats.org/drawingml/2006/main"/>
+              </wp:cNvGraphicFramePr>
+              <a:graphic xmlns:a="http://schemas.openxmlformats.org/drawingml/2006/main">
+                <a:graphicData uri="http://schemas.microsoft.com/office/word/2010/wordprocessingShape">
+                  <wps:wsp>
+                    <wps:cNvSpPr txBox="1">
+                      <a:spLocks/>
+                    </wps:cNvSpPr>
+                    <wps:spPr>
+                      <a:xfrm>
+                        <a:off x="0" y="0"/>
+                        <a:ext cx="465455" cy="201295"/>
+                      </a:xfrm>
+                      <a:prstGeom prst="rect">
+                        <a:avLst/>
+                      </a:prstGeom>
+                    </wps:spPr>
+                    <wps:txbx>
+                      <w:txbxContent>
+                        <w:p>
+                          <w:pPr>
+                            <w:spacing w:before="15" w:line="249" w:lineRule="auto"/>
+                            <w:ind w:left="51" w:hanging="32"/>
+                            <w:rPr>
+                              <w:sz w:val="12"/>
+                            </w:rPr>
+                          </w:pPr>
+                          <w:r>
+                            <w:rPr>
+                              <w:spacing w:val="-6"/>
+                              <w:sz w:val="12"/>
+                            </w:rPr>
+                            <w:t>Reimpresión</w:t>
+                          </w:r>
+                          <w:r>
+                            <w:rPr>
+                              <w:spacing w:val="-13"/>
+                              <w:sz w:val="12"/>
+                            </w:rPr>
+                            <w:t xml:space="preserve"> </w:t>
+                          </w:r>
+                          <w:r>
+                            <w:rPr>
+                              <w:spacing w:val="-6"/>
+                              <w:sz w:val="12"/>
+                            </w:rPr>
+                            <w:t>de</w:t>
+                          </w:r>
+                          <w:r>
+                            <w:rPr>
+                              <w:spacing w:val="40"/>
+                              <w:sz w:val="12"/>
+                            </w:rPr>
+                            <w:t xml:space="preserve"> </w:t>
+                          </w:r>
+                          <w:r>
+                            <w:rPr>
+                              <w:spacing w:val="-2"/>
+                              <w:sz w:val="12"/>
+                            </w:rPr>
+                            <w:t>resultados</w:t>
+                          </w:r>
+                        </w:p>
+                      </w:txbxContent>
+                    </wps:txbx>
+                    <wps:bodyPr wrap="square" lIns="0" tIns="0" rIns="0" bIns="0" rtlCol="0">
+                      <a:noAutofit/>
+                    </wps:bodyPr>
+                  </wps:wsp>
+                </a:graphicData>
+              </a:graphic>
+            </wp:anchor>
+          </w:drawing>
+        </mc:Choice>
+        <mc:Fallback>
+          <w:pict>
+            <v:shape w14:anchorId="49EE3916" id="Textbox 22" o:spid="_x0000_s1041" type="#_x0000_t202" style="position:absolute;margin-left:34.05pt;margin-top:640.8pt;width:36.65pt;height:15.85pt;z-index:-16053248;visibility:visible;mso-wrap-style:square;mso-wrap-distance-left:0;mso-wrap-distance-top:0;mso-wrap-distance-right:0;mso-wrap-distance-bottom:0;mso-position-horizontal:absolute;mso-position-horizontal-relative:page;mso-position-vertical:absolute;mso-position-vertical-relative:page;v-text-anchor:top" o:gfxdata="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" filled="f" stroked="f">
+              <v:textbox inset="0,0,0,0">
+                <w:txbxContent>
+                  <w:p>
+                    <w:pPr>
+                      <w:spacing w:before="15" w:line="249" w:lineRule="auto"/>
+                      <w:ind w:left="51" w:hanging="32"/>
+                      <w:rPr>
+                        <w:sz w:val="12"/>
+                      </w:rPr>
+                    </w:pPr>
+                    <w:r>
+                      <w:rPr>
+                        <w:spacing w:val="-6"/>
+                        <w:sz w:val="12"/>
+                      </w:rPr>
+                      <w:t>Reimpresión</w:t>
+                    </w:r>
+                    <w:r>
+                      <w:rPr>
+                        <w:spacing w:val="-13"/>
+                        <w:sz w:val="12"/>
+                      </w:rPr>
+                      <w:t xml:space="preserve"> </w:t>
+                    </w:r>
+                    <w:r>
+                      <w:rPr>
+                        <w:spacing w:val="-6"/>
+                        <w:sz w:val="12"/>
+                      </w:rPr>
+                      <w:t>de</w:t>
+                    </w:r>
+                    <w:r>
+                      <w:rPr>
+                        <w:spacing w:val="40"/>
+                        <w:sz w:val="12"/>
+                      </w:rPr>
+                      <w:t xml:space="preserve"> </w:t>
+                    </w:r>
+                    <w:r>
+                      <w:rPr>
+                        <w:spacing w:val="-2"/>
+                        <w:sz w:val="12"/>
+                      </w:rPr>
+                      <w:t>resultados</w:t>
+                    </w:r>
+                  </w:p>
+                </w:txbxContent>
+              </v:textbox>
+              <w10:wrap anchorx="page" anchory="page"/>
+            </v:shape>
+          </w:pict>
+        </mc:Fallback>
+      </mc:AlternateContent>
+    </w:r>
+    <w:r>
+      <w:rPr>
+        <w:i w:val="0"/>
+        <w:noProof/>
+        <w:sz w:val="20"/>
+      </w:rPr>
+      <mc:AlternateContent>
+        <mc:Choice Requires="wps">
+          <w:drawing>
+            <wp:anchor distT="0" distB="0" distL="0" distR="0" simplePos="0" relativeHeight="487263744" behindDoc="1" locked="0" layoutInCell="1" allowOverlap="1" wp14:anchorId="4837D418" wp14:editId="20D07D61">
+              <wp:simplePos x="0" y="0"/>
+              <wp:positionH relativeFrom="page">
+                <wp:posOffset>2551810</wp:posOffset>
+              </wp:positionH>
+              <wp:positionV relativeFrom="page">
+                <wp:posOffset>8354483</wp:posOffset>
+              </wp:positionV>
+              <wp:extent cx="430530" cy="109855"/>
+              <wp:effectExtent l="0" t="0" r="0" b="0"/>
+              <wp:wrapNone/>
+              <wp:docPr id="23" name="Textbox 23"/>
+              <wp:cNvGraphicFramePr>
+                <a:graphicFrameLocks xmlns:a="http://schemas.openxmlformats.org/drawingml/2006/main"/>
+              </wp:cNvGraphicFramePr>
+              <a:graphic xmlns:a="http://schemas.openxmlformats.org/drawingml/2006/main">
+                <a:graphicData uri="http://schemas.microsoft.com/office/word/2010/wordprocessingShape">
+                  <wps:wsp>
+                    <wps:cNvSpPr txBox="1">
+                      <a:spLocks/>
+                    </wps:cNvSpPr>
+                    <wps:spPr>
+                      <a:xfrm>
+                        <a:off x="0" y="0"/>
+                        <a:ext cx="430530" cy="109855"/>
+                      </a:xfrm>
+                      <a:prstGeom prst="rect">
+                        <a:avLst/>
+                      </a:prstGeom>
+                    </wps:spPr>
+                    <wps:txbx>
+                      <w:txbxContent>
+                        <w:p>
+                          <w:pPr>
+                            <w:tabs>
+                              <w:tab w:val="left" w:pos="321"/>
+                            </w:tabs>
+                            <w:spacing w:before="15"/>
+                            <w:ind w:left="60"/>
+                            <w:rPr>
+                              <w:sz w:val="12"/>
+                            </w:rPr>
+                          </w:pPr>
+                          <w:r>
+                            <w:rPr>
+                              <w:spacing w:val="-10"/>
+                              <w:sz w:val="12"/>
+                            </w:rPr>
+                            <w:fldChar w:fldCharType="begin"/>
+                          </w:r>
+                          <w:r>
+                            <w:rPr>
+                              <w:spacing w:val="-10"/>
+                              <w:sz w:val="12"/>
+                            </w:rPr>
+                            <w:instrText xml:space="preserve"> PAGE </w:instrText>
+                          </w:r>
+                          <w:r>
+                            <w:rPr>
+                              <w:spacing w:val="-10"/>
+                              <w:sz w:val="12"/>
+                            </w:rPr>
+                            <w:fldChar w:fldCharType="separate"/>
+                          </w:r>
+                          <w:r>
+                            <w:rPr>
+                              <w:spacing w:val="-10"/>
+                              <w:sz w:val="12"/>
+                            </w:rPr>
+                            <w:t>1</w:t>
+                          </w:r>
+                          <w:r>
+                            <w:rPr>
+                              <w:spacing w:val="-10"/>
+                              <w:sz w:val="12"/>
+                            </w:rPr>
+                            <w:fldChar w:fldCharType="end"/>
+                          </w:r>
+                          <w:r>
+                            <w:rPr>
+                              <w:sz w:val="12"/>
+                            </w:rPr>
+                            <w:tab/>
+                            <w:t>de</w:t>
+                          </w:r>
+                          <w:r>
+                            <w:rPr>
+                              <w:spacing w:val="49"/>
+                              <w:sz w:val="12"/>
+                            </w:rPr>
+                            <w:t xml:space="preserve">  </w:t>
+                          </w:r>
+                          <w:r>
+                            <w:rPr>
+                              <w:spacing w:val="-10"/>
+                              <w:sz w:val="12"/>
+                            </w:rPr>
+                            <w:fldChar w:fldCharType="begin"/>
+                          </w:r>
+                          <w:r>
+                            <w:rPr>
+                              <w:spacing w:val="-10"/>
+                              <w:sz w:val="12"/>
+                            </w:rPr>
+                            <w:instrText xml:space="preserve"> NUMPAGES </w:instrText>
+                          </w:r>
+                          <w:r>
+                            <w:rPr>
+                              <w:spacing w:val="-10"/>
+                              <w:sz w:val="12"/>
+                            </w:rPr>
+                            <w:fldChar w:fldCharType="separate"/>
+                          </w:r>
+                          <w:r>
+                            <w:rPr>
+                              <w:spacing w:val="-10"/>
+                              <w:sz w:val="12"/>
+                            </w:rPr>
+                            <w:t>3</w:t>
+                          </w:r>
+                          <w:r>
+                            <w:rPr>
+                              <w:spacing w:val="-10"/>
+                              <w:sz w:val="12"/>
+                            </w:rPr>
+                            <w:fldChar w:fldCharType="end"/>
+                          </w:r>
+                        </w:p>
+                      </w:txbxContent>
+                    </wps:txbx>
+                    <wps:bodyPr wrap="square" lIns="0" tIns="0" rIns="0" bIns="0" rtlCol="0">
+                      <a:noAutofit/>
+                    </wps:bodyPr>
+                  </wps:wsp>
+                </a:graphicData>
+              </a:graphic>
+            </wp:anchor>
+          </w:drawing>
+        </mc:Choice>
+        <mc:Fallback>
+          <w:pict>
+            <v:shape w14:anchorId="4837D418" id="Textbox 23" o:spid="_x0000_s1042" type="#_x0000_t202" style="position:absolute;margin-left:200.95pt;margin-top:657.85pt;width:33.9pt;height:8.65pt;z-index:-16052736;visibility:visible;mso-wrap-style:square;mso-wrap-distance-left:0;mso-wrap-distance-top:0;mso-wrap-distance-right:0;mso-wrap-distance-bottom:0;mso-position-horizontal:absolute;mso-position-horizontal-relative:page;mso-position-vertical:absolute;mso-position-vertical-relative:page;v-text-anchor:top" o:gfxdata="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" filled="f" stroked="f">
+              <v:textbox inset="0,0,0,0">
+                <w:txbxContent>
+                  <w:p>
+                    <w:pPr>
+                      <w:tabs>
+                        <w:tab w:val="left" w:pos="321"/>
+                      </w:tabs>
+                      <w:spacing w:before="15"/>
+                      <w:ind w:left="60"/>
+                      <w:rPr>
+                        <w:sz w:val="12"/>
+                      </w:rPr>
+                    </w:pPr>
+                    <w:r>
+                      <w:rPr>
+                        <w:spacing w:val="-10"/>
+                        <w:sz w:val="12"/>
+                      </w:rPr>
+                      <w:fldChar w:fldCharType="begin"/>
+                    </w:r>
+                    <w:r>
+                      <w:rPr>
+                        <w:spacing w:val="-10"/>
+                        <w:sz w:val="12"/>
+                      </w:rPr>
+                      <w:instrText xml:space="preserve"> PAGE </w:instrText>
+                    </w:r>
+                    <w:r>
+                      <w:rPr>
+                        <w:spacing w:val="-10"/>
+                        <w:sz w:val="12"/>
+                      </w:rPr>
+                      <w:fldChar w:fldCharType="separate"/>
+                    </w:r>
+                    <w:r>
+                      <w:rPr>
+                        <w:spacing w:val="-10"/>
+                        <w:sz w:val="12"/>
+                      </w:rPr>
+                      <w:t>1</w:t>
+                    </w:r>
+                    <w:r>
+                      <w:rPr>
+                        <w:spacing w:val="-10"/>
+                        <w:sz w:val="12"/>
+                      </w:rPr>
+                      <w:fldChar w:fldCharType="end"/>
+                    </w:r>
+                    <w:r>
+                      <w:rPr>
+                        <w:sz w:val="12"/>
+                      </w:rPr>
+                      <w:tab/>
+                      <w:t>de</w:t>
+                    </w:r>
+                    <w:r>
+                      <w:rPr>
+                        <w:spacing w:val="49"/>
+                        <w:sz w:val="12"/>
+                      </w:rPr>
+                      <w:t xml:space="preserve">  </w:t>
+                    </w:r>
+                    <w:r>
+                      <w:rPr>
+                        <w:spacing w:val="-10"/>
+                        <w:sz w:val="12"/>
+                      </w:rPr>
+                      <w:fldChar w:fldCharType="begin"/>
+                    </w:r>
+                    <w:r>
+                      <w:rPr>
+                        <w:spacing w:val="-10"/>
+                        <w:sz w:val="12"/>
+                      </w:rPr>
+                      <w:instrText xml:space="preserve"> NUMPAGES </w:instrText>
+                    </w:r>
+                    <w:r>
+                      <w:rPr>
+                        <w:spacing w:val="-10"/>
+                        <w:sz w:val="12"/>
+                      </w:rPr>
+                      <w:fldChar w:fldCharType="separate"/>
+                    </w:r>
+                    <w:r>
+                      <w:rPr>
+                        <w:spacing w:val="-10"/>
+                        <w:sz w:val="12"/>
+                      </w:rPr>
+                      <w:t>3</w:t>
+                    </w:r>
+                    <w:r>
+                      <w:rPr>
+                        <w:spacing w:val="-10"/>
+                        <w:sz w:val="12"/>
+                      </w:rPr>
+                      <w:fldChar w:fldCharType="end"/>
+                    </w:r>
+                  </w:p>
+                </w:txbxContent>
+              </v:textbox>
+              <w10:wrap anchorx="page" anchory="page"/>
+            </v:shape>
+          </w:pict>
+        </mc:Fallback>
+      </mc:AlternateContent>
+    </w:r>
   </w:p>
 </w:ftr>
 </file>

</xml_diff>

<commit_message>
fix(examenes): corregir de raíz paginación y bloque inferior de sangre
</commit_message>
<xml_diff>
--- a/examenes_medicos_templates/FORMATO EXAMEN DE SANGRE.docx
+++ b/examenes_medicos_templates/FORMATO EXAMEN DE SANGRE.docx
@@ -2418,21 +2418,6 @@
     </w:p>
     <w:p>
       <w:pPr>
-        <w:rPr>
-          <w:sz w:val="14"/>
-        </w:rPr>
-      </w:pPr>
-    </w:p>
-    <w:p>
-      <w:pPr>
-        <w:spacing w:before="33"/>
-        <w:rPr>
-          <w:sz w:val="14"/>
-        </w:rPr>
-      </w:pPr>
-    </w:p>
-    <w:p>
-      <w:pPr>
         <w:pStyle w:val="Textoindependiente"/>
         <w:ind w:left="340"/>
       </w:pPr>
@@ -2585,8 +2570,8 @@
     <w:p>
       <w:pPr>
         <w:pStyle w:val="Textoindependiente"/>
-        <w:spacing w:before="62" w:line="247" w:lineRule="auto"/>
-        <w:ind w:left="340" w:right="6731"/>
+        <w:spacing w:before="40" w:line="247" w:lineRule="auto"/>
+        <w:ind w:left="340" w:right="6200"/>
         <w:jc w:val="both"/>
       </w:pPr>
       <w:r>
@@ -4893,7 +4878,7 @@
       <w:pPr>
         <w:pStyle w:val="Textoindependiente"/>
         <w:spacing w:before="61" w:line="247" w:lineRule="auto"/>
-        <w:ind w:left="340" w:right="6731"/>
+        <w:ind w:left="340" w:right="6200"/>
         <w:jc w:val="both"/>
       </w:pPr>
       <w:r>
@@ -6994,8 +6979,8 @@
     <w:p>
       <w:pPr>
         <w:pStyle w:val="Textoindependiente"/>
-        <w:spacing w:before="62" w:line="247" w:lineRule="auto"/>
-        <w:ind w:left="340" w:right="6731"/>
+        <w:spacing w:before="40" w:line="247" w:lineRule="auto"/>
+        <w:ind w:left="340" w:right="6200"/>
         <w:jc w:val="both"/>
       </w:pPr>
       <w:r>
@@ -7360,7 +7345,7 @@
                 <wp:posOffset>5036184</wp:posOffset>
               </wp:positionH>
               <wp:positionV relativeFrom="page">
-                <wp:posOffset>7762275</wp:posOffset>
+                <wp:posOffset>8042275</wp:posOffset>
               </wp:positionV>
               <wp:extent cx="2373630" cy="1270"/>
               <wp:effectExtent l="0" t="0" r="0" b="0"/>
@@ -7418,7 +7403,7 @@
         </mc:Choice>
         <mc:Fallback>
           <w:pict>
-            <v:shape w14:anchorId="6C5DF57A" id="Graphic 18" o:spid="_x0000_s1026" style="position:absolute;margin-left:396.55pt;margin-top:611.20pt;width:186.9pt;height:.1pt;z-index:-16055296;visibility:visible;mso-wrap-style:square;mso-wrap-distance-left:0;mso-wrap-distance-top:0;mso-wrap-distance-right:0;mso-wrap-distance-bottom:0;mso-position-horizontal:absolute;mso-position-horizontal-relative:page;mso-position-vertical:absolute;mso-position-vertical-relative:page;v-text-anchor:top" coordsize="2373630,1270" o:gfxdata="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" path="m,l2373248,e" filled="f" strokecolor="#3e3e3e" strokeweight=".17778mm">
+            <v:shape w14:anchorId="6C5DF57A" id="Graphic 18" o:spid="_x0000_s1026" style="position:absolute;margin-left:396.55pt;margin-top:633.25pt;width:186.9pt;height:.1pt;z-index:-16055296;visibility:visible;mso-wrap-style:square;mso-wrap-distance-left:0;mso-wrap-distance-top:0;mso-wrap-distance-right:0;mso-wrap-distance-bottom:0;mso-position-horizontal:absolute;mso-position-horizontal-relative:page;mso-position-vertical:absolute;mso-position-vertical-relative:page;v-text-anchor:top" coordsize="2373630,1270" o:gfxdata="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" path="m,l2373248,e" filled="f" strokecolor="#3e3e3e" strokeweight=".17778mm">
               <v:path arrowok="t"/>
               <w10:wrap anchorx="page" anchory="page"/>
             </v:shape>
@@ -7441,9 +7426,9 @@
                 <wp:posOffset>5292090</wp:posOffset>
               </wp:positionH>
               <wp:positionV relativeFrom="page">
-                <wp:posOffset>7513502</wp:posOffset>
+                <wp:posOffset>7793502</wp:posOffset>
               </wp:positionV>
-              <wp:extent cx="1841500" cy="170000"/>
+              <wp:extent cx="2200000" cy="170000"/>
               <wp:effectExtent l="0" t="0" r="0" b="0"/>
               <wp:wrapNone/>
               <wp:docPr id="19" name="Textbox 19"/>
@@ -7459,7 +7444,7 @@
                     <wps:spPr>
                       <a:xfrm>
                         <a:off x="0" y="0"/>
-                        <a:ext cx="1841500" cy="170000"/>
+                        <a:ext cx="2200000" cy="170000"/>
                       </a:xfrm>
                       <a:prstGeom prst="rect">
                         <a:avLst/>
@@ -7571,7 +7556,7 @@
               <v:stroke joinstyle="miter"/>
               <v:path gradientshapeok="t" o:connecttype="rect"/>
             </v:shapetype>
-            <v:shape id="Textbox 19" o:spid="_x0000_s1038" type="#_x0000_t202" style="position:absolute;margin-left:416.7pt;margin-top:591.61pt;width:145pt;height:13.39pt;z-index:-16054784;visibility:visible;mso-wrap-style:square;mso-wrap-distance-left:0;mso-wrap-distance-top:0;mso-wrap-distance-right:0;mso-wrap-distance-bottom:0;mso-position-horizontal:absolute;mso-position-horizontal-relative:page;mso-position-vertical:absolute;mso-position-vertical-relative:page;v-text-anchor:top" o:gfxdata="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" filled="f" stroked="f">
+            <v:shape id="Textbox 19" o:spid="_x0000_s1038" type="#_x0000_t202" style="position:absolute;margin-left:416.7pt;margin-top:613.65pt;width:173pt;height:13.39pt;z-index:-16054784;visibility:visible;mso-wrap-style:square;mso-wrap-distance-left:0;mso-wrap-distance-top:0;mso-wrap-distance-right:0;mso-wrap-distance-bottom:0;mso-position-horizontal:absolute;mso-position-horizontal-relative:page;mso-position-vertical:absolute;mso-position-vertical-relative:page;v-text-anchor:top" o:gfxdata="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" filled="f" stroked="f">
               <v:textbox inset="0,0,0,0">
                 <w:txbxContent>
                   <w:p>
@@ -8169,9 +8154,9 @@
                 <wp:posOffset>5348478</wp:posOffset>
               </wp:positionH>
               <wp:positionV relativeFrom="page">
-                <wp:posOffset>7772582</wp:posOffset>
+                <wp:posOffset>8052582</wp:posOffset>
               </wp:positionV>
-              <wp:extent cx="1751330" cy="590000"/>
+              <wp:extent cx="2100000" cy="590000"/>
               <wp:effectExtent l="0" t="0" r="0" b="0"/>
               <wp:wrapNone/>
               <wp:docPr id="21" name="Textbox 21"/>
@@ -8187,7 +8172,7 @@
                     <wps:spPr>
                       <a:xfrm>
                         <a:off x="0" y="0"/>
-                        <a:ext cx="1751330" cy="590000"/>
+                        <a:ext cx="2100000" cy="590000"/>
                       </a:xfrm>
                       <a:prstGeom prst="rect">
                         <a:avLst/>
@@ -8198,7 +8183,7 @@
                         <w:p>
                           <w:pPr>
                             <w:spacing w:before="15" w:line="256" w:lineRule="auto"/>
-                            <w:ind w:left="257" w:right="251"/>
+                            <w:ind w:left="60" w:right="60"/>
                             <w:jc w:val="center"/>
                             <w:rPr>
                               <w:rFonts w:ascii="Arial MT"/>
@@ -8322,13 +8307,13 @@
         </mc:Choice>
         <mc:Fallback>
           <w:pict>
-            <v:shape w14:anchorId="6C52562A" id="Textbox 21" o:spid="_x0000_s1040" type="#_x0000_t202" style="position:absolute;margin-left:421.15pt;margin-top:612.01pt;width:137.9pt;height:46.46pt;z-index:-16053760;visibility:visible;mso-wrap-style:square;mso-wrap-distance-left:0;mso-wrap-distance-top:0;mso-wrap-distance-right:0;mso-wrap-distance-bottom:0;mso-position-horizontal:absolute;mso-position-horizontal-relative:page;mso-position-vertical:absolute;mso-position-vertical-relative:page;v-text-anchor:top" o:gfxdata="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" filled="f" stroked="f">
+            <v:shape w14:anchorId="6C52562A" id="Textbox 21" o:spid="_x0000_s1040" type="#_x0000_t202" style="position:absolute;margin-left:421.15pt;margin-top:634.05pt;width:165.35pt;height:46.46pt;z-index:-16053760;visibility:visible;mso-wrap-style:square;mso-wrap-distance-left:0;mso-wrap-distance-top:0;mso-wrap-distance-right:0;mso-wrap-distance-bottom:0;mso-position-horizontal:absolute;mso-position-horizontal-relative:page;mso-position-vertical:absolute;mso-position-vertical-relative:page;v-text-anchor:top" o:gfxdata="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" filled="f" stroked="f">
               <v:textbox inset="0,0,0,0">
                 <w:txbxContent>
                   <w:p>
                     <w:pPr>
                       <w:spacing w:before="15" w:line="256" w:lineRule="auto"/>
-                      <w:ind w:left="257" w:right="251"/>
+                      <w:ind w:left="60" w:right="60"/>
                       <w:jc w:val="center"/>
                       <w:rPr>
                         <w:rFonts w:ascii="Arial MT"/>
@@ -8937,7 +8922,7 @@
                 <wp:posOffset>5036184</wp:posOffset>
               </wp:positionH>
               <wp:positionV relativeFrom="page">
-                <wp:posOffset>7762275</wp:posOffset>
+                <wp:posOffset>8042275</wp:posOffset>
               </wp:positionV>
               <wp:extent cx="2373630" cy="1270"/>
               <wp:effectExtent l="0" t="0" r="0" b="0"/>
@@ -8995,7 +8980,7 @@
         </mc:Choice>
         <mc:Fallback>
           <w:pict>
-            <v:shape w14:anchorId="6C5DF57A" id="Graphic 18" o:spid="_x0000_s1026" style="position:absolute;margin-left:396.55pt;margin-top:611.20pt;width:186.9pt;height:.1pt;z-index:-16055296;visibility:visible;mso-wrap-style:square;mso-wrap-distance-left:0;mso-wrap-distance-top:0;mso-wrap-distance-right:0;mso-wrap-distance-bottom:0;mso-position-horizontal:absolute;mso-position-horizontal-relative:page;mso-position-vertical:absolute;mso-position-vertical-relative:page;v-text-anchor:top" coordsize="2373630,1270" o:gfxdata="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" path="m,l2373248,e" filled="f" strokecolor="#3e3e3e" strokeweight=".17778mm">
+            <v:shape w14:anchorId="6C5DF57A" id="Graphic 18" o:spid="_x0000_s1026" style="position:absolute;margin-left:396.55pt;margin-top:633.25pt;width:186.9pt;height:.1pt;z-index:-16055296;visibility:visible;mso-wrap-style:square;mso-wrap-distance-left:0;mso-wrap-distance-top:0;mso-wrap-distance-right:0;mso-wrap-distance-bottom:0;mso-position-horizontal:absolute;mso-position-horizontal-relative:page;mso-position-vertical:absolute;mso-position-vertical-relative:page;v-text-anchor:top" coordsize="2373630,1270" o:gfxdata="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" path="m,l2373248,e" filled="f" strokecolor="#3e3e3e" strokeweight=".17778mm">
               <v:path arrowok="t"/>
               <w10:wrap anchorx="page" anchory="page"/>
             </v:shape>
@@ -9018,9 +9003,9 @@
                 <wp:posOffset>5292090</wp:posOffset>
               </wp:positionH>
               <wp:positionV relativeFrom="page">
-                <wp:posOffset>7513502</wp:posOffset>
+                <wp:posOffset>7793502</wp:posOffset>
               </wp:positionV>
-              <wp:extent cx="1841500" cy="170000"/>
+              <wp:extent cx="2200000" cy="170000"/>
               <wp:effectExtent l="0" t="0" r="0" b="0"/>
               <wp:wrapNone/>
               <wp:docPr id="19" name="Textbox 19"/>
@@ -9036,7 +9021,7 @@
                     <wps:spPr>
                       <a:xfrm>
                         <a:off x="0" y="0"/>
-                        <a:ext cx="1841500" cy="170000"/>
+                        <a:ext cx="2200000" cy="170000"/>
                       </a:xfrm>
                       <a:prstGeom prst="rect">
                         <a:avLst/>
@@ -9148,7 +9133,7 @@
               <v:stroke joinstyle="miter"/>
               <v:path gradientshapeok="t" o:connecttype="rect"/>
             </v:shapetype>
-            <v:shape id="Textbox 19" o:spid="_x0000_s1038" type="#_x0000_t202" style="position:absolute;margin-left:416.7pt;margin-top:591.61pt;width:145pt;height:13.39pt;z-index:-16054784;visibility:visible;mso-wrap-style:square;mso-wrap-distance-left:0;mso-wrap-distance-top:0;mso-wrap-distance-right:0;mso-wrap-distance-bottom:0;mso-position-horizontal:absolute;mso-position-horizontal-relative:page;mso-position-vertical:absolute;mso-position-vertical-relative:page;v-text-anchor:top" o:gfxdata="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" filled="f" stroked="f">
+            <v:shape id="Textbox 19" o:spid="_x0000_s1038" type="#_x0000_t202" style="position:absolute;margin-left:416.7pt;margin-top:613.65pt;width:173pt;height:13.39pt;z-index:-16054784;visibility:visible;mso-wrap-style:square;mso-wrap-distance-left:0;mso-wrap-distance-top:0;mso-wrap-distance-right:0;mso-wrap-distance-bottom:0;mso-position-horizontal:absolute;mso-position-horizontal-relative:page;mso-position-vertical:absolute;mso-position-vertical-relative:page;v-text-anchor:top" o:gfxdata="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" filled="f" stroked="f">
               <v:textbox inset="0,0,0,0">
                 <w:txbxContent>
                   <w:p>
@@ -9746,9 +9731,9 @@
                 <wp:posOffset>5348478</wp:posOffset>
               </wp:positionH>
               <wp:positionV relativeFrom="page">
-                <wp:posOffset>7772582</wp:posOffset>
+                <wp:posOffset>8052582</wp:posOffset>
               </wp:positionV>
-              <wp:extent cx="1751330" cy="590000"/>
+              <wp:extent cx="2100000" cy="590000"/>
               <wp:effectExtent l="0" t="0" r="0" b="0"/>
               <wp:wrapNone/>
               <wp:docPr id="21" name="Textbox 21"/>
@@ -9764,7 +9749,7 @@
                     <wps:spPr>
                       <a:xfrm>
                         <a:off x="0" y="0"/>
-                        <a:ext cx="1751330" cy="590000"/>
+                        <a:ext cx="2100000" cy="590000"/>
                       </a:xfrm>
                       <a:prstGeom prst="rect">
                         <a:avLst/>
@@ -9775,7 +9760,7 @@
                         <w:p>
                           <w:pPr>
                             <w:spacing w:before="15" w:line="256" w:lineRule="auto"/>
-                            <w:ind w:left="257" w:right="251"/>
+                            <w:ind w:left="60" w:right="60"/>
                             <w:jc w:val="center"/>
                             <w:rPr>
                               <w:rFonts w:ascii="Arial MT"/>
@@ -9899,13 +9884,13 @@
         </mc:Choice>
         <mc:Fallback>
           <w:pict>
-            <v:shape w14:anchorId="6C52562A" id="Textbox 21" o:spid="_x0000_s1040" type="#_x0000_t202" style="position:absolute;margin-left:421.15pt;margin-top:612.01pt;width:137.9pt;height:46.46pt;z-index:-16053760;visibility:visible;mso-wrap-style:square;mso-wrap-distance-left:0;mso-wrap-distance-top:0;mso-wrap-distance-right:0;mso-wrap-distance-bottom:0;mso-position-horizontal:absolute;mso-position-horizontal-relative:page;mso-position-vertical:absolute;mso-position-vertical-relative:page;v-text-anchor:top" o:gfxdata="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" filled="f" stroked="f">
+            <v:shape w14:anchorId="6C52562A" id="Textbox 21" o:spid="_x0000_s1040" type="#_x0000_t202" style="position:absolute;margin-left:421.15pt;margin-top:634.05pt;width:165.35pt;height:46.46pt;z-index:-16053760;visibility:visible;mso-wrap-style:square;mso-wrap-distance-left:0;mso-wrap-distance-top:0;mso-wrap-distance-right:0;mso-wrap-distance-bottom:0;mso-position-horizontal:absolute;mso-position-horizontal-relative:page;mso-position-vertical:absolute;mso-position-vertical-relative:page;v-text-anchor:top" o:gfxdata="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" filled="f" stroked="f">
               <v:textbox inset="0,0,0,0">
                 <w:txbxContent>
                   <w:p>
                     <w:pPr>
                       <w:spacing w:before="15" w:line="256" w:lineRule="auto"/>
-                      <w:ind w:left="257" w:right="251"/>
+                      <w:ind w:left="60" w:right="60"/>
                       <w:jc w:val="center"/>
                       <w:rPr>
                         <w:rFonts w:ascii="Arial MT"/>
@@ -10514,7 +10499,7 @@
                 <wp:posOffset>5036184</wp:posOffset>
               </wp:positionH>
               <wp:positionV relativeFrom="page">
-                <wp:posOffset>7762275</wp:posOffset>
+                <wp:posOffset>8042275</wp:posOffset>
               </wp:positionV>
               <wp:extent cx="2373630" cy="1270"/>
               <wp:effectExtent l="0" t="0" r="0" b="0"/>
@@ -10572,7 +10557,7 @@
         </mc:Choice>
         <mc:Fallback>
           <w:pict>
-            <v:shape w14:anchorId="6C5DF57A" id="Graphic 18" o:spid="_x0000_s1026" style="position:absolute;margin-left:396.55pt;margin-top:611.20pt;width:186.9pt;height:.1pt;z-index:-16055296;visibility:visible;mso-wrap-style:square;mso-wrap-distance-left:0;mso-wrap-distance-top:0;mso-wrap-distance-right:0;mso-wrap-distance-bottom:0;mso-position-horizontal:absolute;mso-position-horizontal-relative:page;mso-position-vertical:absolute;mso-position-vertical-relative:page;v-text-anchor:top" coordsize="2373630,1270" o:gfxdata="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" path="m,l2373248,e" filled="f" strokecolor="#3e3e3e" strokeweight=".17778mm">
+            <v:shape w14:anchorId="6C5DF57A" id="Graphic 18" o:spid="_x0000_s1026" style="position:absolute;margin-left:396.55pt;margin-top:633.25pt;width:186.9pt;height:.1pt;z-index:-16055296;visibility:visible;mso-wrap-style:square;mso-wrap-distance-left:0;mso-wrap-distance-top:0;mso-wrap-distance-right:0;mso-wrap-distance-bottom:0;mso-position-horizontal:absolute;mso-position-horizontal-relative:page;mso-position-vertical:absolute;mso-position-vertical-relative:page;v-text-anchor:top" coordsize="2373630,1270" o:gfxdata="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" path="m,l2373248,e" filled="f" strokecolor="#3e3e3e" strokeweight=".17778mm">
               <v:path arrowok="t"/>
               <w10:wrap anchorx="page" anchory="page"/>
             </v:shape>
@@ -10595,9 +10580,9 @@
                 <wp:posOffset>5292090</wp:posOffset>
               </wp:positionH>
               <wp:positionV relativeFrom="page">
-                <wp:posOffset>7513502</wp:posOffset>
+                <wp:posOffset>7793502</wp:posOffset>
               </wp:positionV>
-              <wp:extent cx="1841500" cy="170000"/>
+              <wp:extent cx="2200000" cy="170000"/>
               <wp:effectExtent l="0" t="0" r="0" b="0"/>
               <wp:wrapNone/>
               <wp:docPr id="19" name="Textbox 19"/>
@@ -10613,7 +10598,7 @@
                     <wps:spPr>
                       <a:xfrm>
                         <a:off x="0" y="0"/>
-                        <a:ext cx="1841500" cy="170000"/>
+                        <a:ext cx="2200000" cy="170000"/>
                       </a:xfrm>
                       <a:prstGeom prst="rect">
                         <a:avLst/>
@@ -10725,7 +10710,7 @@
               <v:stroke joinstyle="miter"/>
               <v:path gradientshapeok="t" o:connecttype="rect"/>
             </v:shapetype>
-            <v:shape id="Textbox 19" o:spid="_x0000_s1038" type="#_x0000_t202" style="position:absolute;margin-left:416.7pt;margin-top:591.61pt;width:145pt;height:13.39pt;z-index:-16054784;visibility:visible;mso-wrap-style:square;mso-wrap-distance-left:0;mso-wrap-distance-top:0;mso-wrap-distance-right:0;mso-wrap-distance-bottom:0;mso-position-horizontal:absolute;mso-position-horizontal-relative:page;mso-position-vertical:absolute;mso-position-vertical-relative:page;v-text-anchor:top" o:gfxdata="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" filled="f" stroked="f">
+            <v:shape id="Textbox 19" o:spid="_x0000_s1038" type="#_x0000_t202" style="position:absolute;margin-left:416.7pt;margin-top:613.65pt;width:173pt;height:13.39pt;z-index:-16054784;visibility:visible;mso-wrap-style:square;mso-wrap-distance-left:0;mso-wrap-distance-top:0;mso-wrap-distance-right:0;mso-wrap-distance-bottom:0;mso-position-horizontal:absolute;mso-position-horizontal-relative:page;mso-position-vertical:absolute;mso-position-vertical-relative:page;v-text-anchor:top" o:gfxdata="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" filled="f" stroked="f">
               <v:textbox inset="0,0,0,0">
                 <w:txbxContent>
                   <w:p>
@@ -11323,9 +11308,9 @@
                 <wp:posOffset>5348478</wp:posOffset>
               </wp:positionH>
               <wp:positionV relativeFrom="page">
-                <wp:posOffset>7772582</wp:posOffset>
+                <wp:posOffset>8052582</wp:posOffset>
               </wp:positionV>
-              <wp:extent cx="1751330" cy="590000"/>
+              <wp:extent cx="2100000" cy="590000"/>
               <wp:effectExtent l="0" t="0" r="0" b="0"/>
               <wp:wrapNone/>
               <wp:docPr id="21" name="Textbox 21"/>
@@ -11341,7 +11326,7 @@
                     <wps:spPr>
                       <a:xfrm>
                         <a:off x="0" y="0"/>
-                        <a:ext cx="1751330" cy="590000"/>
+                        <a:ext cx="2100000" cy="590000"/>
                       </a:xfrm>
                       <a:prstGeom prst="rect">
                         <a:avLst/>
@@ -11352,7 +11337,7 @@
                         <w:p>
                           <w:pPr>
                             <w:spacing w:before="15" w:line="256" w:lineRule="auto"/>
-                            <w:ind w:left="257" w:right="251"/>
+                            <w:ind w:left="60" w:right="60"/>
                             <w:jc w:val="center"/>
                             <w:rPr>
                               <w:rFonts w:ascii="Arial MT"/>
@@ -11476,13 +11461,13 @@
         </mc:Choice>
         <mc:Fallback>
           <w:pict>
-            <v:shape w14:anchorId="6C52562A" id="Textbox 21" o:spid="_x0000_s1040" type="#_x0000_t202" style="position:absolute;margin-left:421.15pt;margin-top:612.01pt;width:137.9pt;height:46.46pt;z-index:-16053760;visibility:visible;mso-wrap-style:square;mso-wrap-distance-left:0;mso-wrap-distance-top:0;mso-wrap-distance-right:0;mso-wrap-distance-bottom:0;mso-position-horizontal:absolute;mso-position-horizontal-relative:page;mso-position-vertical:absolute;mso-position-vertical-relative:page;v-text-anchor:top" o:gfxdata="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" filled="f" stroked="f">
+            <v:shape w14:anchorId="6C52562A" id="Textbox 21" o:spid="_x0000_s1040" type="#_x0000_t202" style="position:absolute;margin-left:421.15pt;margin-top:634.05pt;width:165.35pt;height:46.46pt;z-index:-16053760;visibility:visible;mso-wrap-style:square;mso-wrap-distance-left:0;mso-wrap-distance-top:0;mso-wrap-distance-right:0;mso-wrap-distance-bottom:0;mso-position-horizontal:absolute;mso-position-horizontal-relative:page;mso-position-vertical:absolute;mso-position-vertical-relative:page;v-text-anchor:top" o:gfxdata="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" filled="f" stroked="f">
               <v:textbox inset="0,0,0,0">
                 <w:txbxContent>
                   <w:p>
                     <w:pPr>
                       <w:spacing w:before="15" w:line="256" w:lineRule="auto"/>
-                      <w:ind w:left="257" w:right="251"/>
+                      <w:ind w:left="60" w:right="60"/>
                       <w:jc w:val="center"/>
                       <w:rPr>
                         <w:rFonts w:ascii="Arial MT"/>
@@ -12033,7 +12018,7 @@
         <w:sz w:val="20"/>
       </w:rPr>
       <w:drawing>
-        <wp:anchor distT="0" distB="0" distL="0" distR="0" simplePos="0" relativeHeight="487273472" behindDoc="1" locked="0" layoutInCell="1" allowOverlap="1" wp14:anchorId="3D136515" wp14:editId="2C19B33E">
+        <wp:anchor distT="0" distB="0" distL="0" distR="0" simplePos="0" relativeHeight="487260672" behindDoc="1" locked="0" layoutInCell="1" allowOverlap="1" wp14:anchorId="6A974CF6" wp14:editId="49705F6B">
           <wp:simplePos x="0" y="0"/>
           <wp:positionH relativeFrom="page">
             <wp:posOffset>137795</wp:posOffset>
@@ -12044,7 +12029,7 @@
           <wp:extent cx="7466583" cy="1490980"/>
           <wp:effectExtent l="0" t="0" r="0" b="0"/>
           <wp:wrapNone/>
-          <wp:docPr id="44" name="Image 44"/>
+          <wp:docPr id="17" name="Image 17"/>
           <wp:cNvGraphicFramePr>
             <a:graphicFrameLocks xmlns:a="http://schemas.openxmlformats.org/drawingml/2006/main"/>
           </wp:cNvGraphicFramePr>
@@ -12052,7 +12037,7 @@
             <a:graphicData uri="http://schemas.openxmlformats.org/drawingml/2006/picture">
               <pic:pic xmlns:pic="http://schemas.openxmlformats.org/drawingml/2006/picture">
                 <pic:nvPicPr>
-                  <pic:cNvPr id="44" name="Image 44"/>
+                  <pic:cNvPr id="17" name="Image 17"/>
                   <pic:cNvPicPr/>
                 </pic:nvPicPr>
                 <pic:blipFill>
@@ -12085,18 +12070,18 @@
       <mc:AlternateContent>
         <mc:Choice Requires="wps">
           <w:drawing>
-            <wp:anchor distT="0" distB="0" distL="0" distR="0" simplePos="0" relativeHeight="487273984" behindDoc="1" locked="0" layoutInCell="1" allowOverlap="1" wp14:anchorId="70FE187A" wp14:editId="5EFE010C">
+            <wp:anchor distT="0" distB="0" distL="0" distR="0" simplePos="0" relativeHeight="487261184" behindDoc="1" locked="0" layoutInCell="1" allowOverlap="1" wp14:anchorId="770974D8" wp14:editId="40D46EAA">
               <wp:simplePos x="0" y="0"/>
               <wp:positionH relativeFrom="page">
                 <wp:posOffset>5036184</wp:posOffset>
               </wp:positionH>
               <wp:positionV relativeFrom="page">
-                <wp:posOffset>7762275</wp:posOffset>
+                <wp:posOffset>8042275</wp:posOffset>
               </wp:positionV>
               <wp:extent cx="2373630" cy="1270"/>
               <wp:effectExtent l="0" t="0" r="0" b="0"/>
               <wp:wrapNone/>
-              <wp:docPr id="45" name="Graphic 45"/>
+              <wp:docPr id="18" name="Graphic 18"/>
               <wp:cNvGraphicFramePr>
                 <a:graphicFrameLocks xmlns:a="http://schemas.openxmlformats.org/drawingml/2006/main"/>
               </wp:cNvGraphicFramePr>
@@ -12149,7 +12134,7 @@
         </mc:Choice>
         <mc:Fallback>
           <w:pict>
-            <v:shape w14:anchorId="71D2E424" id="Graphic 45" o:spid="_x0000_s1026" style="position:absolute;margin-left:396.55pt;margin-top:611.20pt;width:186.9pt;height:.1pt;z-index:-16042496;visibility:visible;mso-wrap-style:square;mso-wrap-distance-left:0;mso-wrap-distance-top:0;mso-wrap-distance-right:0;mso-wrap-distance-bottom:0;mso-position-horizontal:absolute;mso-position-horizontal-relative:page;mso-position-vertical:absolute;mso-position-vertical-relative:page;v-text-anchor:top" coordsize="2373630,1270" o:gfxdata="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" path="m,l2373248,e" filled="f" strokecolor="#3e3e3e" strokeweight=".17778mm">
+            <v:shape w14:anchorId="6C5DF57A" id="Graphic 18" o:spid="_x0000_s1026" style="position:absolute;margin-left:396.55pt;margin-top:633.25pt;width:186.9pt;height:.1pt;z-index:-16055296;visibility:visible;mso-wrap-style:square;mso-wrap-distance-left:0;mso-wrap-distance-top:0;mso-wrap-distance-right:0;mso-wrap-distance-bottom:0;mso-position-horizontal:absolute;mso-position-horizontal-relative:page;mso-position-vertical:absolute;mso-position-vertical-relative:page;v-text-anchor:top" coordsize="2373630,1270" o:gfxdata="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" path="m,l2373248,e" filled="f" strokecolor="#3e3e3e" strokeweight=".17778mm">
               <v:path arrowok="t"/>
               <w10:wrap anchorx="page" anchory="page"/>
             </v:shape>
@@ -12166,18 +12151,18 @@
       <mc:AlternateContent>
         <mc:Choice Requires="wps">
           <w:drawing>
-            <wp:anchor distT="0" distB="0" distL="0" distR="0" simplePos="0" relativeHeight="487274496" behindDoc="1" locked="0" layoutInCell="1" allowOverlap="1" wp14:anchorId="517B0598" wp14:editId="7792890F">
+            <wp:anchor distT="0" distB="0" distL="0" distR="0" simplePos="0" relativeHeight="487261696" behindDoc="1" locked="0" layoutInCell="1" allowOverlap="1" wp14:anchorId="30A654B0" wp14:editId="780BB11C">
               <wp:simplePos x="0" y="0"/>
               <wp:positionH relativeFrom="page">
                 <wp:posOffset>5292090</wp:posOffset>
               </wp:positionH>
               <wp:positionV relativeFrom="page">
-                <wp:posOffset>7513502</wp:posOffset>
+                <wp:posOffset>7793502</wp:posOffset>
               </wp:positionV>
-              <wp:extent cx="1841500" cy="170000"/>
+              <wp:extent cx="2200000" cy="170000"/>
               <wp:effectExtent l="0" t="0" r="0" b="0"/>
               <wp:wrapNone/>
-              <wp:docPr id="46" name="Textbox 46"/>
+              <wp:docPr id="19" name="Textbox 19"/>
               <wp:cNvGraphicFramePr>
                 <a:graphicFrameLocks xmlns:a="http://schemas.openxmlformats.org/drawingml/2006/main"/>
               </wp:cNvGraphicFramePr>
@@ -12190,7 +12175,7 @@
                     <wps:spPr>
                       <a:xfrm>
                         <a:off x="0" y="0"/>
-                        <a:ext cx="1841500" cy="170000"/>
+                        <a:ext cx="2200000" cy="170000"/>
                       </a:xfrm>
                       <a:prstGeom prst="rect">
                         <a:avLst/>
@@ -12298,11 +12283,11 @@
         </mc:Choice>
         <mc:Fallback>
           <w:pict>
-            <v:shapetype w14:anchorId="517B0598" id="_x0000_t202" coordsize="21600,21600" o:spt="202" path="m,l,21600r21600,l21600,xe">
+            <v:shapetype w14:anchorId="30A654B0" id="_x0000_t202" coordsize="21600,21600" o:spt="202" path="m,l,21600r21600,l21600,xe">
               <v:stroke joinstyle="miter"/>
               <v:path gradientshapeok="t" o:connecttype="rect"/>
             </v:shapetype>
-            <v:shape id="Textbox 46" o:spid="_x0000_s1057" type="#_x0000_t202" style="position:absolute;margin-left:416.7pt;margin-top:591.61pt;width:145pt;height:13.39pt;z-index:-16041984;visibility:visible;mso-wrap-style:square;mso-wrap-distance-left:0;mso-wrap-distance-top:0;mso-wrap-distance-right:0;mso-wrap-distance-bottom:0;mso-position-horizontal:absolute;mso-position-horizontal-relative:page;mso-position-vertical:absolute;mso-position-vertical-relative:page;v-text-anchor:top" o:gfxdata="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" filled="f" stroked="f">
+            <v:shape id="Textbox 19" o:spid="_x0000_s1038" type="#_x0000_t202" style="position:absolute;margin-left:416.7pt;margin-top:613.65pt;width:173pt;height:13.39pt;z-index:-16054784;visibility:visible;mso-wrap-style:square;mso-wrap-distance-left:0;mso-wrap-distance-top:0;mso-wrap-distance-right:0;mso-wrap-distance-bottom:0;mso-position-horizontal:absolute;mso-position-horizontal-relative:page;mso-position-vertical:absolute;mso-position-vertical-relative:page;v-text-anchor:top" o:gfxdata="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" filled="f" stroked="f">
               <v:textbox inset="0,0,0,0">
                 <w:txbxContent>
                   <w:p>
@@ -12409,7 +12394,7 @@
       <mc:AlternateContent>
         <mc:Choice Requires="wps">
           <w:drawing>
-            <wp:anchor distT="0" distB="0" distL="0" distR="0" simplePos="0" relativeHeight="487275008" behindDoc="1" locked="0" layoutInCell="1" allowOverlap="1" wp14:anchorId="4BA0F36B" wp14:editId="78A72A28">
+            <wp:anchor distT="0" distB="0" distL="0" distR="0" simplePos="0" relativeHeight="487262208" behindDoc="1" locked="0" layoutInCell="1" allowOverlap="1" wp14:anchorId="739682D1" wp14:editId="702591AC">
               <wp:simplePos x="0" y="0"/>
               <wp:positionH relativeFrom="page">
                 <wp:posOffset>203708</wp:posOffset>
@@ -12420,7 +12405,7 @@
               <wp:extent cx="3552190" cy="109855"/>
               <wp:effectExtent l="0" t="0" r="0" b="0"/>
               <wp:wrapNone/>
-              <wp:docPr id="47" name="Textbox 47"/>
+              <wp:docPr id="20" name="Textbox 20"/>
               <wp:cNvGraphicFramePr>
                 <a:graphicFrameLocks xmlns:a="http://schemas.openxmlformats.org/drawingml/2006/main"/>
               </wp:cNvGraphicFramePr>
@@ -12664,7 +12649,7 @@
         </mc:Choice>
         <mc:Fallback>
           <w:pict>
-            <v:shape w14:anchorId="4BA0F36B" id="Textbox 47" o:spid="_x0000_s1058" type="#_x0000_t202" style="position:absolute;margin-left:16.05pt;margin-top:620.85pt;width:279.7pt;height:8.65pt;z-index:-16041472;visibility:visible;mso-wrap-style:square;mso-wrap-distance-left:0;mso-wrap-distance-top:0;mso-wrap-distance-right:0;mso-wrap-distance-bottom:0;mso-position-horizontal:absolute;mso-position-horizontal-relative:page;mso-position-vertical:absolute;mso-position-vertical-relative:page;v-text-anchor:top" o:gfxdata="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" filled="f" stroked="f">
+            <v:shape w14:anchorId="739682D1" id="Textbox 20" o:spid="_x0000_s1039" type="#_x0000_t202" style="position:absolute;margin-left:16.05pt;margin-top:620.85pt;width:279.7pt;height:8.65pt;z-index:-16054272;visibility:visible;mso-wrap-style:square;mso-wrap-distance-left:0;mso-wrap-distance-top:0;mso-wrap-distance-right:0;mso-wrap-distance-bottom:0;mso-position-horizontal:absolute;mso-position-horizontal-relative:page;mso-position-vertical:absolute;mso-position-vertical-relative:page;v-text-anchor:top" o:gfxdata="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" filled="f" stroked="f">
               <v:textbox inset="0,0,0,0">
                 <w:txbxContent>
                   <w:p>
@@ -12894,18 +12879,18 @@
       <mc:AlternateContent>
         <mc:Choice Requires="wps">
           <w:drawing>
-            <wp:anchor distT="0" distB="0" distL="0" distR="0" simplePos="0" relativeHeight="487275520" behindDoc="1" locked="0" layoutInCell="1" allowOverlap="1" wp14:anchorId="40093C03" wp14:editId="3D50261E">
+            <wp:anchor distT="0" distB="0" distL="0" distR="0" simplePos="0" relativeHeight="487262720" behindDoc="1" locked="0" layoutInCell="1" allowOverlap="1" wp14:anchorId="6C52562A" wp14:editId="2DC06BA4">
               <wp:simplePos x="0" y="0"/>
               <wp:positionH relativeFrom="page">
                 <wp:posOffset>5348478</wp:posOffset>
               </wp:positionH>
               <wp:positionV relativeFrom="page">
-                <wp:posOffset>7772582</wp:posOffset>
+                <wp:posOffset>8052582</wp:posOffset>
               </wp:positionV>
-              <wp:extent cx="1751330" cy="590000"/>
+              <wp:extent cx="2100000" cy="590000"/>
               <wp:effectExtent l="0" t="0" r="0" b="0"/>
               <wp:wrapNone/>
-              <wp:docPr id="48" name="Textbox 48"/>
+              <wp:docPr id="21" name="Textbox 21"/>
               <wp:cNvGraphicFramePr>
                 <a:graphicFrameLocks xmlns:a="http://schemas.openxmlformats.org/drawingml/2006/main"/>
               </wp:cNvGraphicFramePr>
@@ -12918,7 +12903,7 @@
                     <wps:spPr>
                       <a:xfrm>
                         <a:off x="0" y="0"/>
-                        <a:ext cx="1751330" cy="590000"/>
+                        <a:ext cx="2100000" cy="590000"/>
                       </a:xfrm>
                       <a:prstGeom prst="rect">
                         <a:avLst/>
@@ -12929,7 +12914,7 @@
                         <w:p>
                           <w:pPr>
                             <w:spacing w:before="15" w:line="256" w:lineRule="auto"/>
-                            <w:ind w:left="257" w:right="251"/>
+                            <w:ind w:left="60" w:right="60"/>
                             <w:jc w:val="center"/>
                             <w:rPr>
                               <w:rFonts w:ascii="Arial MT"/>
@@ -13053,13 +13038,13 @@
         </mc:Choice>
         <mc:Fallback>
           <w:pict>
-            <v:shape w14:anchorId="40093C03" id="Textbox 48" o:spid="_x0000_s1059" type="#_x0000_t202" style="position:absolute;margin-left:421.15pt;margin-top:612.01pt;width:137.9pt;height:46.46pt;z-index:-16040960;visibility:visible;mso-wrap-style:square;mso-wrap-distance-left:0;mso-wrap-distance-top:0;mso-wrap-distance-right:0;mso-wrap-distance-bottom:0;mso-position-horizontal:absolute;mso-position-horizontal-relative:page;mso-position-vertical:absolute;mso-position-vertical-relative:page;v-text-anchor:top" o:gfxdata="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" filled="f" stroked="f">
+            <v:shape w14:anchorId="6C52562A" id="Textbox 21" o:spid="_x0000_s1040" type="#_x0000_t202" style="position:absolute;margin-left:421.15pt;margin-top:634.05pt;width:165.35pt;height:46.46pt;z-index:-16053760;visibility:visible;mso-wrap-style:square;mso-wrap-distance-left:0;mso-wrap-distance-top:0;mso-wrap-distance-right:0;mso-wrap-distance-bottom:0;mso-position-horizontal:absolute;mso-position-horizontal-relative:page;mso-position-vertical:absolute;mso-position-vertical-relative:page;v-text-anchor:top" o:gfxdata="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" filled="f" stroked="f">
               <v:textbox inset="0,0,0,0">
                 <w:txbxContent>
                   <w:p>
                     <w:pPr>
                       <w:spacing w:before="15" w:line="256" w:lineRule="auto"/>
-                      <w:ind w:left="257" w:right="251"/>
+                      <w:ind w:left="60" w:right="60"/>
                       <w:jc w:val="center"/>
                       <w:rPr>
                         <w:rFonts w:ascii="Arial MT"/>
@@ -13187,7 +13172,7 @@
       <mc:AlternateContent>
         <mc:Choice Requires="wps">
           <w:drawing>
-            <wp:anchor distT="0" distB="0" distL="0" distR="0" simplePos="0" relativeHeight="487276032" behindDoc="1" locked="0" layoutInCell="1" allowOverlap="1" wp14:anchorId="46D31D5F" wp14:editId="2C1AA280">
+            <wp:anchor distT="0" distB="0" distL="0" distR="0" simplePos="0" relativeHeight="487263232" behindDoc="1" locked="0" layoutInCell="1" allowOverlap="1" wp14:anchorId="49EE3916" wp14:editId="5310D7E8">
               <wp:simplePos x="0" y="0"/>
               <wp:positionH relativeFrom="page">
                 <wp:posOffset>432308</wp:posOffset>
@@ -13198,7 +13183,7 @@
               <wp:extent cx="465455" cy="201295"/>
               <wp:effectExtent l="0" t="0" r="0" b="0"/>
               <wp:wrapNone/>
-              <wp:docPr id="49" name="Textbox 49"/>
+              <wp:docPr id="22" name="Textbox 22"/>
               <wp:cNvGraphicFramePr>
                 <a:graphicFrameLocks xmlns:a="http://schemas.openxmlformats.org/drawingml/2006/main"/>
               </wp:cNvGraphicFramePr>
@@ -13276,7 +13261,7 @@
         </mc:Choice>
         <mc:Fallback>
           <w:pict>
-            <v:shape w14:anchorId="46D31D5F" id="Textbox 49" o:spid="_x0000_s1060" type="#_x0000_t202" style="position:absolute;margin-left:34.05pt;margin-top:640.8pt;width:36.65pt;height:15.85pt;z-index:-16040448;visibility:visible;mso-wrap-style:square;mso-wrap-distance-left:0;mso-wrap-distance-top:0;mso-wrap-distance-right:0;mso-wrap-distance-bottom:0;mso-position-horizontal:absolute;mso-position-horizontal-relative:page;mso-position-vertical:absolute;mso-position-vertical-relative:page;v-text-anchor:top" o:gfxdata="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" filled="f" stroked="f">
+            <v:shape w14:anchorId="49EE3916" id="Textbox 22" o:spid="_x0000_s1041" type="#_x0000_t202" style="position:absolute;margin-left:34.05pt;margin-top:640.8pt;width:36.65pt;height:15.85pt;z-index:-16053248;visibility:visible;mso-wrap-style:square;mso-wrap-distance-left:0;mso-wrap-distance-top:0;mso-wrap-distance-right:0;mso-wrap-distance-bottom:0;mso-position-horizontal:absolute;mso-position-horizontal-relative:page;mso-position-vertical:absolute;mso-position-vertical-relative:page;v-text-anchor:top" o:gfxdata="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" filled="f" stroked="f">
               <v:textbox inset="0,0,0,0">
                 <w:txbxContent>
                   <w:p>
@@ -13340,7 +13325,7 @@
       <mc:AlternateContent>
         <mc:Choice Requires="wps">
           <w:drawing>
-            <wp:anchor distT="0" distB="0" distL="0" distR="0" simplePos="0" relativeHeight="487276544" behindDoc="1" locked="0" layoutInCell="1" allowOverlap="1" wp14:anchorId="14D8CBF0" wp14:editId="5C147BF2">
+            <wp:anchor distT="0" distB="0" distL="0" distR="0" simplePos="0" relativeHeight="487263744" behindDoc="1" locked="0" layoutInCell="1" allowOverlap="1" wp14:anchorId="4837D418" wp14:editId="20D07D61">
               <wp:simplePos x="0" y="0"/>
               <wp:positionH relativeFrom="page">
                 <wp:posOffset>2551810</wp:posOffset>
@@ -13351,7 +13336,7 @@
               <wp:extent cx="430530" cy="109855"/>
               <wp:effectExtent l="0" t="0" r="0" b="0"/>
               <wp:wrapNone/>
-              <wp:docPr id="50" name="Textbox 50"/>
+              <wp:docPr id="23" name="Textbox 23"/>
               <wp:cNvGraphicFramePr>
                 <a:graphicFrameLocks xmlns:a="http://schemas.openxmlformats.org/drawingml/2006/main"/>
               </wp:cNvGraphicFramePr>
@@ -13409,7 +13394,7 @@
                               <w:spacing w:val="-10"/>
                               <w:sz w:val="12"/>
                             </w:rPr>
-                            <w:t>2</w:t>
+                            <w:t>1</w:t>
                           </w:r>
                           <w:r>
                             <w:rPr>
@@ -13481,7 +13466,7 @@
         </mc:Choice>
         <mc:Fallback>
           <w:pict>
-            <v:shape w14:anchorId="14D8CBF0" id="Textbox 50" o:spid="_x0000_s1061" type="#_x0000_t202" style="position:absolute;margin-left:200.95pt;margin-top:657.85pt;width:33.9pt;height:8.65pt;z-index:-16039936;visibility:visible;mso-wrap-style:square;mso-wrap-distance-left:0;mso-wrap-distance-top:0;mso-wrap-distance-right:0;mso-wrap-distance-bottom:0;mso-position-horizontal:absolute;mso-position-horizontal-relative:page;mso-position-vertical:absolute;mso-position-vertical-relative:page;v-text-anchor:top" o:gfxdata="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" filled="f" stroked="f">
+            <v:shape w14:anchorId="4837D418" id="Textbox 23" o:spid="_x0000_s1042" type="#_x0000_t202" style="position:absolute;margin-left:200.95pt;margin-top:657.85pt;width:33.9pt;height:8.65pt;z-index:-16052736;visibility:visible;mso-wrap-style:square;mso-wrap-distance-left:0;mso-wrap-distance-top:0;mso-wrap-distance-right:0;mso-wrap-distance-bottom:0;mso-position-horizontal:absolute;mso-position-horizontal-relative:page;mso-position-vertical:absolute;mso-position-vertical-relative:page;v-text-anchor:top" o:gfxdata="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" filled="f" stroked="f">
               <v:textbox inset="0,0,0,0">
                 <w:txbxContent>
                   <w:p>
@@ -13521,7 +13506,7 @@
                         <w:spacing w:val="-10"/>
                         <w:sz w:val="12"/>
                       </w:rPr>
-                      <w:t>2</w:t>
+                      <w:t>1</w:t>
                     </w:r>
                     <w:r>
                       <w:rPr>

</xml_diff>

<commit_message>
fix(examenes): corregir composición de líneas en bloque de firma de sangre
</commit_message>
<xml_diff>
--- a/examenes_medicos_templates/FORMATO EXAMEN DE SANGRE.docx
+++ b/examenes_medicos_templates/FORMATO EXAMEN DE SANGRE.docx
@@ -8156,7 +8156,7 @@
               <wp:positionV relativeFrom="page">
                 <wp:posOffset>8052582</wp:posOffset>
               </wp:positionV>
-              <wp:extent cx="2100000" cy="590000"/>
+              <wp:extent cx="2100000" cy="680000"/>
               <wp:effectExtent l="0" t="0" r="0" b="0"/>
               <wp:wrapNone/>
               <wp:docPr id="21" name="Textbox 21"/>
@@ -8172,7 +8172,7 @@
                     <wps:spPr>
                       <a:xfrm>
                         <a:off x="0" y="0"/>
-                        <a:ext cx="2100000" cy="590000"/>
+                        <a:ext cx="2100000" cy="680000"/>
                       </a:xfrm>
                       <a:prstGeom prst="rect">
                         <a:avLst/>
@@ -8197,8 +8197,19 @@
                               <w:spacing w:val="-4"/>
                               <w:sz w:val="16"/>
                             </w:rPr>
-                            <w:t xml:space="preserve">Responsable de Laboratorio </w:t>
-                          </w:r>
+                            <w:t>Responsable de Laboratorio</w:t>
+                          </w:r>
+                        </w:p>
+                        <w:p>
+                          <w:pPr>
+                            <w:spacing w:before="0" w:line="256" w:lineRule="auto"/>
+                            <w:ind w:left="60" w:right="60"/>
+                            <w:jc w:val="center"/>
+                            <w:rPr>
+                              <w:rFonts w:ascii="Arial MT"/>
+                              <w:sz w:val="16"/>
+                            </w:rPr>
+                          </w:pPr>
                           <w:r>
                             <w:rPr>
                               <w:rFonts w:ascii="Arial MT"/>
@@ -8307,7 +8318,7 @@
         </mc:Choice>
         <mc:Fallback>
           <w:pict>
-            <v:shape w14:anchorId="6C52562A" id="Textbox 21" o:spid="_x0000_s1040" type="#_x0000_t202" style="position:absolute;margin-left:421.15pt;margin-top:634.05pt;width:165.35pt;height:46.46pt;z-index:-16053760;visibility:visible;mso-wrap-style:square;mso-wrap-distance-left:0;mso-wrap-distance-top:0;mso-wrap-distance-right:0;mso-wrap-distance-bottom:0;mso-position-horizontal:absolute;mso-position-horizontal-relative:page;mso-position-vertical:absolute;mso-position-vertical-relative:page;v-text-anchor:top" o:gfxdata="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" filled="f" stroked="f">
+            <v:shape w14:anchorId="6C52562A" id="Textbox 21" o:spid="_x0000_s1040" type="#_x0000_t202" style="position:absolute;margin-left:421.15pt;margin-top:634.05pt;width:165.35pt;height:53.54pt;z-index:-16053760;visibility:visible;mso-wrap-style:square;mso-wrap-distance-left:0;mso-wrap-distance-top:0;mso-wrap-distance-right:0;mso-wrap-distance-bottom:0;mso-position-horizontal:absolute;mso-position-horizontal-relative:page;mso-position-vertical:absolute;mso-position-vertical-relative:page;v-text-anchor:top" o:gfxdata="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" filled="f" stroked="f">
               <v:textbox inset="0,0,0,0">
                 <w:txbxContent>
                   <w:p>
@@ -8327,8 +8338,19 @@
                         <w:spacing w:val="-4"/>
                         <w:sz w:val="16"/>
                       </w:rPr>
-                      <w:t xml:space="preserve">Responsable de Laboratorio </w:t>
-                    </w:r>
+                      <w:t>Responsable de Laboratorio</w:t>
+                    </w:r>
+                  </w:p>
+                  <w:p>
+                    <w:pPr>
+                      <w:spacing w:before="0" w:line="256" w:lineRule="auto"/>
+                      <w:ind w:left="60" w:right="60"/>
+                      <w:jc w:val="center"/>
+                      <w:rPr>
+                        <w:rFonts w:ascii="Arial MT"/>
+                        <w:sz w:val="16"/>
+                      </w:rPr>
+                    </w:pPr>
                     <w:r>
                       <w:rPr>
                         <w:rFonts w:ascii="Arial MT"/>
@@ -9733,7 +9755,7 @@
               <wp:positionV relativeFrom="page">
                 <wp:posOffset>8052582</wp:posOffset>
               </wp:positionV>
-              <wp:extent cx="2100000" cy="590000"/>
+              <wp:extent cx="2100000" cy="680000"/>
               <wp:effectExtent l="0" t="0" r="0" b="0"/>
               <wp:wrapNone/>
               <wp:docPr id="21" name="Textbox 21"/>
@@ -9749,7 +9771,7 @@
                     <wps:spPr>
                       <a:xfrm>
                         <a:off x="0" y="0"/>
-                        <a:ext cx="2100000" cy="590000"/>
+                        <a:ext cx="2100000" cy="680000"/>
                       </a:xfrm>
                       <a:prstGeom prst="rect">
                         <a:avLst/>
@@ -9774,8 +9796,19 @@
                               <w:spacing w:val="-4"/>
                               <w:sz w:val="16"/>
                             </w:rPr>
-                            <w:t xml:space="preserve">Responsable de Laboratorio </w:t>
-                          </w:r>
+                            <w:t>Responsable de Laboratorio</w:t>
+                          </w:r>
+                        </w:p>
+                        <w:p>
+                          <w:pPr>
+                            <w:spacing w:before="0" w:line="256" w:lineRule="auto"/>
+                            <w:ind w:left="60" w:right="60"/>
+                            <w:jc w:val="center"/>
+                            <w:rPr>
+                              <w:rFonts w:ascii="Arial MT"/>
+                              <w:sz w:val="16"/>
+                            </w:rPr>
+                          </w:pPr>
                           <w:r>
                             <w:rPr>
                               <w:rFonts w:ascii="Arial MT"/>
@@ -9884,7 +9917,7 @@
         </mc:Choice>
         <mc:Fallback>
           <w:pict>
-            <v:shape w14:anchorId="6C52562A" id="Textbox 21" o:spid="_x0000_s1040" type="#_x0000_t202" style="position:absolute;margin-left:421.15pt;margin-top:634.05pt;width:165.35pt;height:46.46pt;z-index:-16053760;visibility:visible;mso-wrap-style:square;mso-wrap-distance-left:0;mso-wrap-distance-top:0;mso-wrap-distance-right:0;mso-wrap-distance-bottom:0;mso-position-horizontal:absolute;mso-position-horizontal-relative:page;mso-position-vertical:absolute;mso-position-vertical-relative:page;v-text-anchor:top" o:gfxdata="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" filled="f" stroked="f">
+            <v:shape w14:anchorId="6C52562A" id="Textbox 21" o:spid="_x0000_s1040" type="#_x0000_t202" style="position:absolute;margin-left:421.15pt;margin-top:634.05pt;width:165.35pt;height:53.54pt;z-index:-16053760;visibility:visible;mso-wrap-style:square;mso-wrap-distance-left:0;mso-wrap-distance-top:0;mso-wrap-distance-right:0;mso-wrap-distance-bottom:0;mso-position-horizontal:absolute;mso-position-horizontal-relative:page;mso-position-vertical:absolute;mso-position-vertical-relative:page;v-text-anchor:top" o:gfxdata="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" filled="f" stroked="f">
               <v:textbox inset="0,0,0,0">
                 <w:txbxContent>
                   <w:p>
@@ -9904,8 +9937,19 @@
                         <w:spacing w:val="-4"/>
                         <w:sz w:val="16"/>
                       </w:rPr>
-                      <w:t xml:space="preserve">Responsable de Laboratorio </w:t>
-                    </w:r>
+                      <w:t>Responsable de Laboratorio</w:t>
+                    </w:r>
+                  </w:p>
+                  <w:p>
+                    <w:pPr>
+                      <w:spacing w:before="0" w:line="256" w:lineRule="auto"/>
+                      <w:ind w:left="60" w:right="60"/>
+                      <w:jc w:val="center"/>
+                      <w:rPr>
+                        <w:rFonts w:ascii="Arial MT"/>
+                        <w:sz w:val="16"/>
+                      </w:rPr>
+                    </w:pPr>
                     <w:r>
                       <w:rPr>
                         <w:rFonts w:ascii="Arial MT"/>
@@ -11310,7 +11354,7 @@
               <wp:positionV relativeFrom="page">
                 <wp:posOffset>8052582</wp:posOffset>
               </wp:positionV>
-              <wp:extent cx="2100000" cy="590000"/>
+              <wp:extent cx="2100000" cy="680000"/>
               <wp:effectExtent l="0" t="0" r="0" b="0"/>
               <wp:wrapNone/>
               <wp:docPr id="21" name="Textbox 21"/>
@@ -11326,7 +11370,7 @@
                     <wps:spPr>
                       <a:xfrm>
                         <a:off x="0" y="0"/>
-                        <a:ext cx="2100000" cy="590000"/>
+                        <a:ext cx="2100000" cy="680000"/>
                       </a:xfrm>
                       <a:prstGeom prst="rect">
                         <a:avLst/>
@@ -11351,8 +11395,19 @@
                               <w:spacing w:val="-4"/>
                               <w:sz w:val="16"/>
                             </w:rPr>
-                            <w:t xml:space="preserve">Responsable de Laboratorio </w:t>
-                          </w:r>
+                            <w:t>Responsable de Laboratorio</w:t>
+                          </w:r>
+                        </w:p>
+                        <w:p>
+                          <w:pPr>
+                            <w:spacing w:before="0" w:line="256" w:lineRule="auto"/>
+                            <w:ind w:left="60" w:right="60"/>
+                            <w:jc w:val="center"/>
+                            <w:rPr>
+                              <w:rFonts w:ascii="Arial MT"/>
+                              <w:sz w:val="16"/>
+                            </w:rPr>
+                          </w:pPr>
                           <w:r>
                             <w:rPr>
                               <w:rFonts w:ascii="Arial MT"/>
@@ -11461,7 +11516,7 @@
         </mc:Choice>
         <mc:Fallback>
           <w:pict>
-            <v:shape w14:anchorId="6C52562A" id="Textbox 21" o:spid="_x0000_s1040" type="#_x0000_t202" style="position:absolute;margin-left:421.15pt;margin-top:634.05pt;width:165.35pt;height:46.46pt;z-index:-16053760;visibility:visible;mso-wrap-style:square;mso-wrap-distance-left:0;mso-wrap-distance-top:0;mso-wrap-distance-right:0;mso-wrap-distance-bottom:0;mso-position-horizontal:absolute;mso-position-horizontal-relative:page;mso-position-vertical:absolute;mso-position-vertical-relative:page;v-text-anchor:top" o:gfxdata="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" filled="f" stroked="f">
+            <v:shape w14:anchorId="6C52562A" id="Textbox 21" o:spid="_x0000_s1040" type="#_x0000_t202" style="position:absolute;margin-left:421.15pt;margin-top:634.05pt;width:165.35pt;height:53.54pt;z-index:-16053760;visibility:visible;mso-wrap-style:square;mso-wrap-distance-left:0;mso-wrap-distance-top:0;mso-wrap-distance-right:0;mso-wrap-distance-bottom:0;mso-position-horizontal:absolute;mso-position-horizontal-relative:page;mso-position-vertical:absolute;mso-position-vertical-relative:page;v-text-anchor:top" o:gfxdata="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" filled="f" stroked="f">
               <v:textbox inset="0,0,0,0">
                 <w:txbxContent>
                   <w:p>
@@ -11481,8 +11536,19 @@
                         <w:spacing w:val="-4"/>
                         <w:sz w:val="16"/>
                       </w:rPr>
-                      <w:t xml:space="preserve">Responsable de Laboratorio </w:t>
-                    </w:r>
+                      <w:t>Responsable de Laboratorio</w:t>
+                    </w:r>
+                  </w:p>
+                  <w:p>
+                    <w:pPr>
+                      <w:spacing w:before="0" w:line="256" w:lineRule="auto"/>
+                      <w:ind w:left="60" w:right="60"/>
+                      <w:jc w:val="center"/>
+                      <w:rPr>
+                        <w:rFonts w:ascii="Arial MT"/>
+                        <w:sz w:val="16"/>
+                      </w:rPr>
+                    </w:pPr>
                     <w:r>
                       <w:rPr>
                         <w:rFonts w:ascii="Arial MT"/>
@@ -12887,7 +12953,7 @@
               <wp:positionV relativeFrom="page">
                 <wp:posOffset>8052582</wp:posOffset>
               </wp:positionV>
-              <wp:extent cx="2100000" cy="590000"/>
+              <wp:extent cx="2100000" cy="680000"/>
               <wp:effectExtent l="0" t="0" r="0" b="0"/>
               <wp:wrapNone/>
               <wp:docPr id="21" name="Textbox 21"/>
@@ -12903,7 +12969,7 @@
                     <wps:spPr>
                       <a:xfrm>
                         <a:off x="0" y="0"/>
-                        <a:ext cx="2100000" cy="590000"/>
+                        <a:ext cx="2100000" cy="680000"/>
                       </a:xfrm>
                       <a:prstGeom prst="rect">
                         <a:avLst/>
@@ -12928,8 +12994,19 @@
                               <w:spacing w:val="-4"/>
                               <w:sz w:val="16"/>
                             </w:rPr>
-                            <w:t xml:space="preserve">Responsable de Laboratorio </w:t>
-                          </w:r>
+                            <w:t>Responsable de Laboratorio</w:t>
+                          </w:r>
+                        </w:p>
+                        <w:p>
+                          <w:pPr>
+                            <w:spacing w:before="0" w:line="256" w:lineRule="auto"/>
+                            <w:ind w:left="60" w:right="60"/>
+                            <w:jc w:val="center"/>
+                            <w:rPr>
+                              <w:rFonts w:ascii="Arial MT"/>
+                              <w:sz w:val="16"/>
+                            </w:rPr>
+                          </w:pPr>
                           <w:r>
                             <w:rPr>
                               <w:rFonts w:ascii="Arial MT"/>
@@ -13038,7 +13115,7 @@
         </mc:Choice>
         <mc:Fallback>
           <w:pict>
-            <v:shape w14:anchorId="6C52562A" id="Textbox 21" o:spid="_x0000_s1040" type="#_x0000_t202" style="position:absolute;margin-left:421.15pt;margin-top:634.05pt;width:165.35pt;height:46.46pt;z-index:-16053760;visibility:visible;mso-wrap-style:square;mso-wrap-distance-left:0;mso-wrap-distance-top:0;mso-wrap-distance-right:0;mso-wrap-distance-bottom:0;mso-position-horizontal:absolute;mso-position-horizontal-relative:page;mso-position-vertical:absolute;mso-position-vertical-relative:page;v-text-anchor:top" o:gfxdata="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" filled="f" stroked="f">
+            <v:shape w14:anchorId="6C52562A" id="Textbox 21" o:spid="_x0000_s1040" type="#_x0000_t202" style="position:absolute;margin-left:421.15pt;margin-top:634.05pt;width:165.35pt;height:53.54pt;z-index:-16053760;visibility:visible;mso-wrap-style:square;mso-wrap-distance-left:0;mso-wrap-distance-top:0;mso-wrap-distance-right:0;mso-wrap-distance-bottom:0;mso-position-horizontal:absolute;mso-position-horizontal-relative:page;mso-position-vertical:absolute;mso-position-vertical-relative:page;v-text-anchor:top" o:gfxdata="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" filled="f" stroked="f">
               <v:textbox inset="0,0,0,0">
                 <w:txbxContent>
                   <w:p>
@@ -13058,8 +13135,19 @@
                         <w:spacing w:val="-4"/>
                         <w:sz w:val="16"/>
                       </w:rPr>
-                      <w:t xml:space="preserve">Responsable de Laboratorio </w:t>
-                    </w:r>
+                      <w:t>Responsable de Laboratorio</w:t>
+                    </w:r>
+                  </w:p>
+                  <w:p>
+                    <w:pPr>
+                      <w:spacing w:before="0" w:line="256" w:lineRule="auto"/>
+                      <w:ind w:left="60" w:right="60"/>
+                      <w:jc w:val="center"/>
+                      <w:rPr>
+                        <w:rFonts w:ascii="Arial MT"/>
+                        <w:sz w:val="16"/>
+                      </w:rPr>
+                    </w:pPr>
                     <w:r>
                       <w:rPr>
                         <w:rFonts w:ascii="Arial MT"/>

</xml_diff>

<commit_message>
fix(sangre): prevent sexo line break and standardize PDF filename by QR folio
- Fixed text wrapping issue in 'Sexo' field to display full value in one line
- Set PDF filename to match QR folio value (e.g., XMY379637722.pdf)
- Ensured no changes to document layout, typography, or structure
- Limited scope strictly to rendering and export behavior
</commit_message>
<xml_diff>
--- a/examenes_medicos_templates/FORMATO EXAMEN DE SANGRE.docx
+++ b/examenes_medicos_templates/FORMATO EXAMEN DE SANGRE.docx
@@ -2838,12 +2838,10 @@
         <w:spacing w:line="247" w:lineRule="auto"/>
         <w:jc w:val="both"/>
         <w:sectPr>
-          <w:headerReference w:type="even" r:id="rId8"/>
-          <w:headerReference w:type="default" r:id="rId9"/>
-          <w:footerReference w:type="even" r:id="rId10"/>
-          <w:footerReference w:type="default" r:id="rId11"/>
-          <w:headerReference w:type="first" r:id="rId12"/>
-          <w:footerReference w:type="first" r:id="rId13"/>
+          <w:headerReference w:type="default" r:id="rId8"/>
+          <w:footerReference w:type="even" r:id="rId9"/>
+          <w:footerReference w:type="default" r:id="rId10"/>
+          <w:footerReference w:type="first" r:id="rId11"/>
           <w:type w:val="continuous"/>
           <w:pgSz w:w="12240" w:h="15840"/>
           <w:pgMar w:top="3600" w:right="360" w:bottom="3440" w:left="0" w:header="287" w:footer="3256" w:gutter="0"/>
@@ -5145,8 +5143,8 @@
         <w:spacing w:line="247" w:lineRule="auto"/>
         <w:jc w:val="both"/>
         <w:sectPr>
-          <w:headerReference w:type="default" r:id="rId14"/>
-          <w:footerReference w:type="default" r:id="rId15"/>
+          <w:headerReference w:type="default" r:id="rId12"/>
+          <w:footerReference w:type="default" r:id="rId13"/>
           <w:pgSz w:w="12240" w:h="15840"/>
           <w:pgMar w:top="3600" w:right="360" w:bottom="3500" w:left="0" w:header="287" w:footer="3306" w:gutter="0"/>
           <w:cols w:space="720"/>
@@ -7287,7 +7285,7 @@
         <w:sz w:val="20"/>
       </w:rPr>
       <w:drawing>
-        <wp:anchor distT="0" distB="0" distL="0" distR="0" simplePos="0" relativeHeight="487260672" behindDoc="1" locked="0" layoutInCell="1" allowOverlap="1" wp14:anchorId="6A974CF6" wp14:editId="49705F6B">
+        <wp:anchor distT="0" distB="0" distL="0" distR="0" simplePos="0" relativeHeight="251656192" behindDoc="1" locked="0" layoutInCell="1" allowOverlap="1" wp14:anchorId="6A974CF6" wp14:editId="430CD916">
           <wp:simplePos x="0" y="0"/>
           <wp:positionH relativeFrom="page">
             <wp:posOffset>137795</wp:posOffset>
@@ -7339,7 +7337,7 @@
       <mc:AlternateContent>
         <mc:Choice Requires="wps">
           <w:drawing>
-            <wp:anchor distT="0" distB="0" distL="0" distR="0" simplePos="0" relativeHeight="487261184" behindDoc="1" locked="0" layoutInCell="1" allowOverlap="1" wp14:anchorId="770974D8" wp14:editId="40D46EAA">
+            <wp:anchor distT="0" distB="0" distL="0" distR="0" simplePos="0" relativeHeight="251662336" behindDoc="1" locked="0" layoutInCell="1" allowOverlap="1" wp14:anchorId="770974D8" wp14:editId="40D46EAA">
               <wp:simplePos x="0" y="0"/>
               <wp:positionH relativeFrom="page">
                 <wp:posOffset>5036184</wp:posOffset>
@@ -7403,7 +7401,7 @@
         </mc:Choice>
         <mc:Fallback>
           <w:pict>
-            <v:shape w14:anchorId="6C5DF57A" id="Graphic 18" o:spid="_x0000_s1026" style="position:absolute;margin-left:396.55pt;margin-top:633.25pt;width:186.9pt;height:.1pt;z-index:-16055296;visibility:visible;mso-wrap-style:square;mso-wrap-distance-left:0;mso-wrap-distance-top:0;mso-wrap-distance-right:0;mso-wrap-distance-bottom:0;mso-position-horizontal:absolute;mso-position-horizontal-relative:page;mso-position-vertical:absolute;mso-position-vertical-relative:page;v-text-anchor:top" coordsize="2373630,1270" o:gfxdata="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" path="m,l2373248,e" filled="f" strokecolor="#3e3e3e" strokeweight=".17778mm">
+            <v:shape w14:anchorId="52ED694D" id="Graphic 18" o:spid="_x0000_s1026" style="position:absolute;margin-left:396.55pt;margin-top:633.25pt;width:186.9pt;height:.1pt;z-index:-251654144;visibility:visible;mso-wrap-style:square;mso-wrap-distance-left:0;mso-wrap-distance-top:0;mso-wrap-distance-right:0;mso-wrap-distance-bottom:0;mso-position-horizontal:absolute;mso-position-horizontal-relative:page;mso-position-vertical:absolute;mso-position-vertical-relative:page;v-text-anchor:top" coordsize="2373630,1270" o:gfxdata="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" path="m,l2373248,e" filled="f" strokecolor="#3e3e3e" strokeweight=".17778mm">
               <v:path arrowok="t"/>
               <w10:wrap anchorx="page" anchory="page"/>
             </v:shape>
@@ -7420,7 +7418,7 @@
       <mc:AlternateContent>
         <mc:Choice Requires="wps">
           <w:drawing>
-            <wp:anchor distT="0" distB="0" distL="0" distR="0" simplePos="0" relativeHeight="487261696" behindDoc="1" locked="0" layoutInCell="1" allowOverlap="1" wp14:anchorId="30A654B0" wp14:editId="780BB11C">
+            <wp:anchor distT="0" distB="0" distL="0" distR="0" simplePos="0" relativeHeight="251666432" behindDoc="1" locked="0" layoutInCell="1" allowOverlap="1" wp14:anchorId="30A654B0" wp14:editId="780BB11C">
               <wp:simplePos x="0" y="0"/>
               <wp:positionH relativeFrom="page">
                 <wp:posOffset>5292090</wp:posOffset>
@@ -7556,7 +7554,7 @@
               <v:stroke joinstyle="miter"/>
               <v:path gradientshapeok="t" o:connecttype="rect"/>
             </v:shapetype>
-            <v:shape id="Textbox 19" o:spid="_x0000_s1038" type="#_x0000_t202" style="position:absolute;margin-left:416.7pt;margin-top:613.65pt;width:173pt;height:13.39pt;z-index:-16054784;visibility:visible;mso-wrap-style:square;mso-wrap-distance-left:0;mso-wrap-distance-top:0;mso-wrap-distance-right:0;mso-wrap-distance-bottom:0;mso-position-horizontal:absolute;mso-position-horizontal-relative:page;mso-position-vertical:absolute;mso-position-vertical-relative:page;v-text-anchor:top" o:gfxdata="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" filled="f" stroked="f">
+            <v:shape id="Textbox 19" o:spid="_x0000_s1038" type="#_x0000_t202" style="position:absolute;margin-left:416.7pt;margin-top:613.65pt;width:173.25pt;height:13.4pt;z-index:-251650048;visibility:visible;mso-wrap-style:square;mso-wrap-distance-left:0;mso-wrap-distance-top:0;mso-wrap-distance-right:0;mso-wrap-distance-bottom:0;mso-position-horizontal:absolute;mso-position-horizontal-relative:page;mso-position-vertical:absolute;mso-position-vertical-relative:page;v-text-anchor:top" o:gfxdata="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" filled="f" stroked="f">
               <v:textbox inset="0,0,0,0">
                 <w:txbxContent>
                   <w:p>
@@ -7663,7 +7661,7 @@
       <mc:AlternateContent>
         <mc:Choice Requires="wps">
           <w:drawing>
-            <wp:anchor distT="0" distB="0" distL="0" distR="0" simplePos="0" relativeHeight="487262208" behindDoc="1" locked="0" layoutInCell="1" allowOverlap="1" wp14:anchorId="739682D1" wp14:editId="702591AC">
+            <wp:anchor distT="0" distB="0" distL="0" distR="0" simplePos="0" relativeHeight="251670528" behindDoc="1" locked="0" layoutInCell="1" allowOverlap="1" wp14:anchorId="739682D1" wp14:editId="702591AC">
               <wp:simplePos x="0" y="0"/>
               <wp:positionH relativeFrom="page">
                 <wp:posOffset>203708</wp:posOffset>
@@ -7918,7 +7916,7 @@
         </mc:Choice>
         <mc:Fallback>
           <w:pict>
-            <v:shape w14:anchorId="739682D1" id="Textbox 20" o:spid="_x0000_s1039" type="#_x0000_t202" style="position:absolute;margin-left:16.05pt;margin-top:620.85pt;width:279.7pt;height:8.65pt;z-index:-16054272;visibility:visible;mso-wrap-style:square;mso-wrap-distance-left:0;mso-wrap-distance-top:0;mso-wrap-distance-right:0;mso-wrap-distance-bottom:0;mso-position-horizontal:absolute;mso-position-horizontal-relative:page;mso-position-vertical:absolute;mso-position-vertical-relative:page;v-text-anchor:top" o:gfxdata="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" filled="f" stroked="f">
+            <v:shape w14:anchorId="739682D1" id="Textbox 20" o:spid="_x0000_s1039" type="#_x0000_t202" style="position:absolute;margin-left:16.05pt;margin-top:620.85pt;width:279.7pt;height:8.65pt;z-index:-251645952;visibility:visible;mso-wrap-style:square;mso-wrap-distance-left:0;mso-wrap-distance-top:0;mso-wrap-distance-right:0;mso-wrap-distance-bottom:0;mso-position-horizontal:absolute;mso-position-horizontal-relative:page;mso-position-vertical:absolute;mso-position-vertical-relative:page;v-text-anchor:top" o:gfxdata="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" filled="f" stroked="f">
               <v:textbox inset="0,0,0,0">
                 <w:txbxContent>
                   <w:p>
@@ -8148,7 +8146,7 @@
       <mc:AlternateContent>
         <mc:Choice Requires="wps">
           <w:drawing>
-            <wp:anchor distT="0" distB="0" distL="0" distR="0" simplePos="0" relativeHeight="487262720" behindDoc="1" locked="0" layoutInCell="1" allowOverlap="1" wp14:anchorId="6C52562A" wp14:editId="2DC06BA4">
+            <wp:anchor distT="0" distB="0" distL="0" distR="0" simplePos="0" relativeHeight="251674624" behindDoc="1" locked="0" layoutInCell="1" allowOverlap="1" wp14:anchorId="6C52562A" wp14:editId="2DC06BA4">
               <wp:simplePos x="0" y="0"/>
               <wp:positionH relativeFrom="page">
                 <wp:posOffset>5348478</wp:posOffset>
@@ -8202,7 +8200,7 @@
                         </w:p>
                         <w:p>
                           <w:pPr>
-                            <w:spacing w:before="0" w:line="256" w:lineRule="auto"/>
+                            <w:spacing w:line="256" w:lineRule="auto"/>
                             <w:ind w:left="60" w:right="60"/>
                             <w:jc w:val="center"/>
                             <w:rPr>
@@ -8318,7 +8316,7 @@
         </mc:Choice>
         <mc:Fallback>
           <w:pict>
-            <v:shape w14:anchorId="6C52562A" id="Textbox 21" o:spid="_x0000_s1040" type="#_x0000_t202" style="position:absolute;margin-left:421.15pt;margin-top:634.05pt;width:165.35pt;height:53.54pt;z-index:-16053760;visibility:visible;mso-wrap-style:square;mso-wrap-distance-left:0;mso-wrap-distance-top:0;mso-wrap-distance-right:0;mso-wrap-distance-bottom:0;mso-position-horizontal:absolute;mso-position-horizontal-relative:page;mso-position-vertical:absolute;mso-position-vertical-relative:page;v-text-anchor:top" o:gfxdata="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" filled="f" stroked="f">
+            <v:shape w14:anchorId="6C52562A" id="Textbox 21" o:spid="_x0000_s1040" type="#_x0000_t202" style="position:absolute;margin-left:421.15pt;margin-top:634.05pt;width:165.35pt;height:53.55pt;z-index:-251641856;visibility:visible;mso-wrap-style:square;mso-wrap-distance-left:0;mso-wrap-distance-top:0;mso-wrap-distance-right:0;mso-wrap-distance-bottom:0;mso-position-horizontal:absolute;mso-position-horizontal-relative:page;mso-position-vertical:absolute;mso-position-vertical-relative:page;v-text-anchor:top" o:gfxdata="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" filled="f" stroked="f">
               <v:textbox inset="0,0,0,0">
                 <w:txbxContent>
                   <w:p>
@@ -8343,7 +8341,7 @@
                   </w:p>
                   <w:p>
                     <w:pPr>
-                      <w:spacing w:before="0" w:line="256" w:lineRule="auto"/>
+                      <w:spacing w:line="256" w:lineRule="auto"/>
                       <w:ind w:left="60" w:right="60"/>
                       <w:jc w:val="center"/>
                       <w:rPr>
@@ -8463,7 +8461,7 @@
       <mc:AlternateContent>
         <mc:Choice Requires="wps">
           <w:drawing>
-            <wp:anchor distT="0" distB="0" distL="0" distR="0" simplePos="0" relativeHeight="487263232" behindDoc="1" locked="0" layoutInCell="1" allowOverlap="1" wp14:anchorId="49EE3916" wp14:editId="5310D7E8">
+            <wp:anchor distT="0" distB="0" distL="0" distR="0" simplePos="0" relativeHeight="251678720" behindDoc="1" locked="0" layoutInCell="1" allowOverlap="1" wp14:anchorId="49EE3916" wp14:editId="5310D7E8">
               <wp:simplePos x="0" y="0"/>
               <wp:positionH relativeFrom="page">
                 <wp:posOffset>432308</wp:posOffset>
@@ -8552,7 +8550,7 @@
         </mc:Choice>
         <mc:Fallback>
           <w:pict>
-            <v:shape w14:anchorId="49EE3916" id="Textbox 22" o:spid="_x0000_s1041" type="#_x0000_t202" style="position:absolute;margin-left:34.05pt;margin-top:640.8pt;width:36.65pt;height:15.85pt;z-index:-16053248;visibility:visible;mso-wrap-style:square;mso-wrap-distance-left:0;mso-wrap-distance-top:0;mso-wrap-distance-right:0;mso-wrap-distance-bottom:0;mso-position-horizontal:absolute;mso-position-horizontal-relative:page;mso-position-vertical:absolute;mso-position-vertical-relative:page;v-text-anchor:top" o:gfxdata="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" filled="f" stroked="f">
+            <v:shape w14:anchorId="49EE3916" id="Textbox 22" o:spid="_x0000_s1041" type="#_x0000_t202" style="position:absolute;margin-left:34.05pt;margin-top:640.8pt;width:36.65pt;height:15.85pt;z-index:-251637760;visibility:visible;mso-wrap-style:square;mso-wrap-distance-left:0;mso-wrap-distance-top:0;mso-wrap-distance-right:0;mso-wrap-distance-bottom:0;mso-position-horizontal:absolute;mso-position-horizontal-relative:page;mso-position-vertical:absolute;mso-position-vertical-relative:page;v-text-anchor:top" o:gfxdata="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" filled="f" stroked="f">
               <v:textbox inset="0,0,0,0">
                 <w:txbxContent>
                   <w:p>
@@ -8616,7 +8614,7 @@
       <mc:AlternateContent>
         <mc:Choice Requires="wps">
           <w:drawing>
-            <wp:anchor distT="0" distB="0" distL="0" distR="0" simplePos="0" relativeHeight="487263744" behindDoc="1" locked="0" layoutInCell="1" allowOverlap="1" wp14:anchorId="4837D418" wp14:editId="20D07D61">
+            <wp:anchor distT="0" distB="0" distL="0" distR="0" simplePos="0" relativeHeight="251682816" behindDoc="1" locked="0" layoutInCell="1" allowOverlap="1" wp14:anchorId="4837D418" wp14:editId="20D07D61">
               <wp:simplePos x="0" y="0"/>
               <wp:positionH relativeFrom="page">
                 <wp:posOffset>2551810</wp:posOffset>
@@ -8757,7 +8755,7 @@
         </mc:Choice>
         <mc:Fallback>
           <w:pict>
-            <v:shape w14:anchorId="4837D418" id="Textbox 23" o:spid="_x0000_s1042" type="#_x0000_t202" style="position:absolute;margin-left:200.95pt;margin-top:657.85pt;width:33.9pt;height:8.65pt;z-index:-16052736;visibility:visible;mso-wrap-style:square;mso-wrap-distance-left:0;mso-wrap-distance-top:0;mso-wrap-distance-right:0;mso-wrap-distance-bottom:0;mso-position-horizontal:absolute;mso-position-horizontal-relative:page;mso-position-vertical:absolute;mso-position-vertical-relative:page;v-text-anchor:top" o:gfxdata="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" filled="f" stroked="f">
+            <v:shape w14:anchorId="4837D418" id="Textbox 23" o:spid="_x0000_s1042" type="#_x0000_t202" style="position:absolute;margin-left:200.95pt;margin-top:657.85pt;width:33.9pt;height:8.65pt;z-index:-251633664;visibility:visible;mso-wrap-style:square;mso-wrap-distance-left:0;mso-wrap-distance-top:0;mso-wrap-distance-right:0;mso-wrap-distance-bottom:0;mso-position-horizontal:absolute;mso-position-horizontal-relative:page;mso-position-vertical:absolute;mso-position-vertical-relative:page;v-text-anchor:top" o:gfxdata="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" filled="f" stroked="f">
               <v:textbox inset="0,0,0,0">
                 <w:txbxContent>
                   <w:p>
@@ -8886,7 +8884,7 @@
         <w:sz w:val="20"/>
       </w:rPr>
       <w:drawing>
-        <wp:anchor distT="0" distB="0" distL="0" distR="0" simplePos="0" relativeHeight="487260672" behindDoc="1" locked="0" layoutInCell="1" allowOverlap="1" wp14:anchorId="6A974CF6" wp14:editId="49705F6B">
+        <wp:anchor distT="0" distB="0" distL="0" distR="0" simplePos="0" relativeHeight="251659264" behindDoc="1" locked="0" layoutInCell="1" allowOverlap="1" wp14:anchorId="6A974CF6" wp14:editId="5B7A89A2">
           <wp:simplePos x="0" y="0"/>
           <wp:positionH relativeFrom="page">
             <wp:posOffset>137795</wp:posOffset>
@@ -8897,7 +8895,7 @@
           <wp:extent cx="7466583" cy="1490980"/>
           <wp:effectExtent l="0" t="0" r="0" b="0"/>
           <wp:wrapNone/>
-          <wp:docPr id="17" name="Image 17"/>
+          <wp:docPr id="864895243" name="Image 17"/>
           <wp:cNvGraphicFramePr>
             <a:graphicFrameLocks xmlns:a="http://schemas.openxmlformats.org/drawingml/2006/main"/>
           </wp:cNvGraphicFramePr>
@@ -8938,7 +8936,7 @@
       <mc:AlternateContent>
         <mc:Choice Requires="wps">
           <w:drawing>
-            <wp:anchor distT="0" distB="0" distL="0" distR="0" simplePos="0" relativeHeight="487261184" behindDoc="1" locked="0" layoutInCell="1" allowOverlap="1" wp14:anchorId="770974D8" wp14:editId="40D46EAA">
+            <wp:anchor distT="0" distB="0" distL="0" distR="0" simplePos="0" relativeHeight="251664384" behindDoc="1" locked="0" layoutInCell="1" allowOverlap="1" wp14:anchorId="770974D8" wp14:editId="40D46EAA">
               <wp:simplePos x="0" y="0"/>
               <wp:positionH relativeFrom="page">
                 <wp:posOffset>5036184</wp:posOffset>
@@ -8949,7 +8947,7 @@
               <wp:extent cx="2373630" cy="1270"/>
               <wp:effectExtent l="0" t="0" r="0" b="0"/>
               <wp:wrapNone/>
-              <wp:docPr id="18" name="Graphic 18"/>
+              <wp:docPr id="877270441" name="Graphic 18"/>
               <wp:cNvGraphicFramePr>
                 <a:graphicFrameLocks xmlns:a="http://schemas.openxmlformats.org/drawingml/2006/main"/>
               </wp:cNvGraphicFramePr>
@@ -9002,7 +9000,7 @@
         </mc:Choice>
         <mc:Fallback>
           <w:pict>
-            <v:shape w14:anchorId="6C5DF57A" id="Graphic 18" o:spid="_x0000_s1026" style="position:absolute;margin-left:396.55pt;margin-top:633.25pt;width:186.9pt;height:.1pt;z-index:-16055296;visibility:visible;mso-wrap-style:square;mso-wrap-distance-left:0;mso-wrap-distance-top:0;mso-wrap-distance-right:0;mso-wrap-distance-bottom:0;mso-position-horizontal:absolute;mso-position-horizontal-relative:page;mso-position-vertical:absolute;mso-position-vertical-relative:page;v-text-anchor:top" coordsize="2373630,1270" o:gfxdata="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" path="m,l2373248,e" filled="f" strokecolor="#3e3e3e" strokeweight=".17778mm">
+            <v:shape w14:anchorId="06E6148B" id="Graphic 18" o:spid="_x0000_s1026" style="position:absolute;margin-left:396.55pt;margin-top:633.25pt;width:186.9pt;height:.1pt;z-index:-251652096;visibility:visible;mso-wrap-style:square;mso-wrap-distance-left:0;mso-wrap-distance-top:0;mso-wrap-distance-right:0;mso-wrap-distance-bottom:0;mso-position-horizontal:absolute;mso-position-horizontal-relative:page;mso-position-vertical:absolute;mso-position-vertical-relative:page;v-text-anchor:top" coordsize="2373630,1270" o:gfxdata="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" path="m,l2373248,e" filled="f" strokecolor="#3e3e3e" strokeweight=".17778mm">
               <v:path arrowok="t"/>
               <w10:wrap anchorx="page" anchory="page"/>
             </v:shape>
@@ -9019,7 +9017,7 @@
       <mc:AlternateContent>
         <mc:Choice Requires="wps">
           <w:drawing>
-            <wp:anchor distT="0" distB="0" distL="0" distR="0" simplePos="0" relativeHeight="487261696" behindDoc="1" locked="0" layoutInCell="1" allowOverlap="1" wp14:anchorId="30A654B0" wp14:editId="780BB11C">
+            <wp:anchor distT="0" distB="0" distL="0" distR="0" simplePos="0" relativeHeight="251669504" behindDoc="1" locked="0" layoutInCell="1" allowOverlap="1" wp14:anchorId="30A654B0" wp14:editId="780BB11C">
               <wp:simplePos x="0" y="0"/>
               <wp:positionH relativeFrom="page">
                 <wp:posOffset>5292090</wp:posOffset>
@@ -9030,7 +9028,7 @@
               <wp:extent cx="2200000" cy="170000"/>
               <wp:effectExtent l="0" t="0" r="0" b="0"/>
               <wp:wrapNone/>
-              <wp:docPr id="19" name="Textbox 19"/>
+              <wp:docPr id="1597732799" name="Textbox 19"/>
               <wp:cNvGraphicFramePr>
                 <a:graphicFrameLocks xmlns:a="http://schemas.openxmlformats.org/drawingml/2006/main"/>
               </wp:cNvGraphicFramePr>
@@ -9155,7 +9153,7 @@
               <v:stroke joinstyle="miter"/>
               <v:path gradientshapeok="t" o:connecttype="rect"/>
             </v:shapetype>
-            <v:shape id="Textbox 19" o:spid="_x0000_s1038" type="#_x0000_t202" style="position:absolute;margin-left:416.7pt;margin-top:613.65pt;width:173pt;height:13.39pt;z-index:-16054784;visibility:visible;mso-wrap-style:square;mso-wrap-distance-left:0;mso-wrap-distance-top:0;mso-wrap-distance-right:0;mso-wrap-distance-bottom:0;mso-position-horizontal:absolute;mso-position-horizontal-relative:page;mso-position-vertical:absolute;mso-position-vertical-relative:page;v-text-anchor:top" o:gfxdata="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" filled="f" stroked="f">
+            <v:shape id="_x0000_s1043" type="#_x0000_t202" style="position:absolute;margin-left:416.7pt;margin-top:613.65pt;width:173.25pt;height:13.4pt;z-index:-251646976;visibility:visible;mso-wrap-style:square;mso-wrap-distance-left:0;mso-wrap-distance-top:0;mso-wrap-distance-right:0;mso-wrap-distance-bottom:0;mso-position-horizontal:absolute;mso-position-horizontal-relative:page;mso-position-vertical:absolute;mso-position-vertical-relative:page;v-text-anchor:top" o:gfxdata="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" filled="f" stroked="f">
               <v:textbox inset="0,0,0,0">
                 <w:txbxContent>
                   <w:p>
@@ -9262,7 +9260,7 @@
       <mc:AlternateContent>
         <mc:Choice Requires="wps">
           <w:drawing>
-            <wp:anchor distT="0" distB="0" distL="0" distR="0" simplePos="0" relativeHeight="487262208" behindDoc="1" locked="0" layoutInCell="1" allowOverlap="1" wp14:anchorId="739682D1" wp14:editId="702591AC">
+            <wp:anchor distT="0" distB="0" distL="0" distR="0" simplePos="0" relativeHeight="251671552" behindDoc="1" locked="0" layoutInCell="1" allowOverlap="1" wp14:anchorId="739682D1" wp14:editId="702591AC">
               <wp:simplePos x="0" y="0"/>
               <wp:positionH relativeFrom="page">
                 <wp:posOffset>203708</wp:posOffset>
@@ -9273,7 +9271,7 @@
               <wp:extent cx="3552190" cy="109855"/>
               <wp:effectExtent l="0" t="0" r="0" b="0"/>
               <wp:wrapNone/>
-              <wp:docPr id="20" name="Textbox 20"/>
+              <wp:docPr id="591786788" name="Textbox 20"/>
               <wp:cNvGraphicFramePr>
                 <a:graphicFrameLocks xmlns:a="http://schemas.openxmlformats.org/drawingml/2006/main"/>
               </wp:cNvGraphicFramePr>
@@ -9517,7 +9515,7 @@
         </mc:Choice>
         <mc:Fallback>
           <w:pict>
-            <v:shape w14:anchorId="739682D1" id="Textbox 20" o:spid="_x0000_s1039" type="#_x0000_t202" style="position:absolute;margin-left:16.05pt;margin-top:620.85pt;width:279.7pt;height:8.65pt;z-index:-16054272;visibility:visible;mso-wrap-style:square;mso-wrap-distance-left:0;mso-wrap-distance-top:0;mso-wrap-distance-right:0;mso-wrap-distance-bottom:0;mso-position-horizontal:absolute;mso-position-horizontal-relative:page;mso-position-vertical:absolute;mso-position-vertical-relative:page;v-text-anchor:top" o:gfxdata="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" filled="f" stroked="f">
+            <v:shape w14:anchorId="739682D1" id="_x0000_s1044" type="#_x0000_t202" style="position:absolute;margin-left:16.05pt;margin-top:620.85pt;width:279.7pt;height:8.65pt;z-index:-251644928;visibility:visible;mso-wrap-style:square;mso-wrap-distance-left:0;mso-wrap-distance-top:0;mso-wrap-distance-right:0;mso-wrap-distance-bottom:0;mso-position-horizontal:absolute;mso-position-horizontal-relative:page;mso-position-vertical:absolute;mso-position-vertical-relative:page;v-text-anchor:top" o:gfxdata="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" filled="f" stroked="f">
               <v:textbox inset="0,0,0,0">
                 <w:txbxContent>
                   <w:p>
@@ -9747,7 +9745,7 @@
       <mc:AlternateContent>
         <mc:Choice Requires="wps">
           <w:drawing>
-            <wp:anchor distT="0" distB="0" distL="0" distR="0" simplePos="0" relativeHeight="487262720" behindDoc="1" locked="0" layoutInCell="1" allowOverlap="1" wp14:anchorId="6C52562A" wp14:editId="2DC06BA4">
+            <wp:anchor distT="0" distB="0" distL="0" distR="0" simplePos="0" relativeHeight="251675648" behindDoc="1" locked="0" layoutInCell="1" allowOverlap="1" wp14:anchorId="6C52562A" wp14:editId="2DC06BA4">
               <wp:simplePos x="0" y="0"/>
               <wp:positionH relativeFrom="page">
                 <wp:posOffset>5348478</wp:posOffset>
@@ -9758,7 +9756,7 @@
               <wp:extent cx="2100000" cy="680000"/>
               <wp:effectExtent l="0" t="0" r="0" b="0"/>
               <wp:wrapNone/>
-              <wp:docPr id="21" name="Textbox 21"/>
+              <wp:docPr id="837044843" name="Textbox 21"/>
               <wp:cNvGraphicFramePr>
                 <a:graphicFrameLocks xmlns:a="http://schemas.openxmlformats.org/drawingml/2006/main"/>
               </wp:cNvGraphicFramePr>
@@ -9801,7 +9799,7 @@
                         </w:p>
                         <w:p>
                           <w:pPr>
-                            <w:spacing w:before="0" w:line="256" w:lineRule="auto"/>
+                            <w:spacing w:line="256" w:lineRule="auto"/>
                             <w:ind w:left="60" w:right="60"/>
                             <w:jc w:val="center"/>
                             <w:rPr>
@@ -9917,7 +9915,7 @@
         </mc:Choice>
         <mc:Fallback>
           <w:pict>
-            <v:shape w14:anchorId="6C52562A" id="Textbox 21" o:spid="_x0000_s1040" type="#_x0000_t202" style="position:absolute;margin-left:421.15pt;margin-top:634.05pt;width:165.35pt;height:53.54pt;z-index:-16053760;visibility:visible;mso-wrap-style:square;mso-wrap-distance-left:0;mso-wrap-distance-top:0;mso-wrap-distance-right:0;mso-wrap-distance-bottom:0;mso-position-horizontal:absolute;mso-position-horizontal-relative:page;mso-position-vertical:absolute;mso-position-vertical-relative:page;v-text-anchor:top" o:gfxdata="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" filled="f" stroked="f">
+            <v:shape w14:anchorId="6C52562A" id="_x0000_s1045" type="#_x0000_t202" style="position:absolute;margin-left:421.15pt;margin-top:634.05pt;width:165.35pt;height:53.55pt;z-index:-251640832;visibility:visible;mso-wrap-style:square;mso-wrap-distance-left:0;mso-wrap-distance-top:0;mso-wrap-distance-right:0;mso-wrap-distance-bottom:0;mso-position-horizontal:absolute;mso-position-horizontal-relative:page;mso-position-vertical:absolute;mso-position-vertical-relative:page;v-text-anchor:top" o:gfxdata="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" filled="f" stroked="f">
               <v:textbox inset="0,0,0,0">
                 <w:txbxContent>
                   <w:p>
@@ -9942,7 +9940,7 @@
                   </w:p>
                   <w:p>
                     <w:pPr>
-                      <w:spacing w:before="0" w:line="256" w:lineRule="auto"/>
+                      <w:spacing w:line="256" w:lineRule="auto"/>
                       <w:ind w:left="60" w:right="60"/>
                       <w:jc w:val="center"/>
                       <w:rPr>
@@ -10062,7 +10060,7 @@
       <mc:AlternateContent>
         <mc:Choice Requires="wps">
           <w:drawing>
-            <wp:anchor distT="0" distB="0" distL="0" distR="0" simplePos="0" relativeHeight="487263232" behindDoc="1" locked="0" layoutInCell="1" allowOverlap="1" wp14:anchorId="49EE3916" wp14:editId="5310D7E8">
+            <wp:anchor distT="0" distB="0" distL="0" distR="0" simplePos="0" relativeHeight="251681792" behindDoc="1" locked="0" layoutInCell="1" allowOverlap="1" wp14:anchorId="49EE3916" wp14:editId="5310D7E8">
               <wp:simplePos x="0" y="0"/>
               <wp:positionH relativeFrom="page">
                 <wp:posOffset>432308</wp:posOffset>
@@ -10073,7 +10071,7 @@
               <wp:extent cx="465455" cy="201295"/>
               <wp:effectExtent l="0" t="0" r="0" b="0"/>
               <wp:wrapNone/>
-              <wp:docPr id="22" name="Textbox 22"/>
+              <wp:docPr id="1967402150" name="Textbox 22"/>
               <wp:cNvGraphicFramePr>
                 <a:graphicFrameLocks xmlns:a="http://schemas.openxmlformats.org/drawingml/2006/main"/>
               </wp:cNvGraphicFramePr>
@@ -10151,7 +10149,7 @@
         </mc:Choice>
         <mc:Fallback>
           <w:pict>
-            <v:shape w14:anchorId="49EE3916" id="Textbox 22" o:spid="_x0000_s1041" type="#_x0000_t202" style="position:absolute;margin-left:34.05pt;margin-top:640.8pt;width:36.65pt;height:15.85pt;z-index:-16053248;visibility:visible;mso-wrap-style:square;mso-wrap-distance-left:0;mso-wrap-distance-top:0;mso-wrap-distance-right:0;mso-wrap-distance-bottom:0;mso-position-horizontal:absolute;mso-position-horizontal-relative:page;mso-position-vertical:absolute;mso-position-vertical-relative:page;v-text-anchor:top" o:gfxdata="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" filled="f" stroked="f">
+            <v:shape w14:anchorId="49EE3916" id="_x0000_s1046" type="#_x0000_t202" style="position:absolute;margin-left:34.05pt;margin-top:640.8pt;width:36.65pt;height:15.85pt;z-index:-251634688;visibility:visible;mso-wrap-style:square;mso-wrap-distance-left:0;mso-wrap-distance-top:0;mso-wrap-distance-right:0;mso-wrap-distance-bottom:0;mso-position-horizontal:absolute;mso-position-horizontal-relative:page;mso-position-vertical:absolute;mso-position-vertical-relative:page;v-text-anchor:top" o:gfxdata="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" filled="f" stroked="f">
               <v:textbox inset="0,0,0,0">
                 <w:txbxContent>
                   <w:p>
@@ -10215,7 +10213,7 @@
       <mc:AlternateContent>
         <mc:Choice Requires="wps">
           <w:drawing>
-            <wp:anchor distT="0" distB="0" distL="0" distR="0" simplePos="0" relativeHeight="487263744" behindDoc="1" locked="0" layoutInCell="1" allowOverlap="1" wp14:anchorId="4837D418" wp14:editId="20D07D61">
+            <wp:anchor distT="0" distB="0" distL="0" distR="0" simplePos="0" relativeHeight="251684864" behindDoc="1" locked="0" layoutInCell="1" allowOverlap="1" wp14:anchorId="4837D418" wp14:editId="20D07D61">
               <wp:simplePos x="0" y="0"/>
               <wp:positionH relativeFrom="page">
                 <wp:posOffset>2551810</wp:posOffset>
@@ -10226,7 +10224,7 @@
               <wp:extent cx="430530" cy="109855"/>
               <wp:effectExtent l="0" t="0" r="0" b="0"/>
               <wp:wrapNone/>
-              <wp:docPr id="23" name="Textbox 23"/>
+              <wp:docPr id="1590742244" name="Textbox 23"/>
               <wp:cNvGraphicFramePr>
                 <a:graphicFrameLocks xmlns:a="http://schemas.openxmlformats.org/drawingml/2006/main"/>
               </wp:cNvGraphicFramePr>
@@ -10356,7 +10354,7 @@
         </mc:Choice>
         <mc:Fallback>
           <w:pict>
-            <v:shape w14:anchorId="4837D418" id="Textbox 23" o:spid="_x0000_s1042" type="#_x0000_t202" style="position:absolute;margin-left:200.95pt;margin-top:657.85pt;width:33.9pt;height:8.65pt;z-index:-16052736;visibility:visible;mso-wrap-style:square;mso-wrap-distance-left:0;mso-wrap-distance-top:0;mso-wrap-distance-right:0;mso-wrap-distance-bottom:0;mso-position-horizontal:absolute;mso-position-horizontal-relative:page;mso-position-vertical:absolute;mso-position-vertical-relative:page;v-text-anchor:top" o:gfxdata="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" filled="f" stroked="f">
+            <v:shape w14:anchorId="4837D418" id="_x0000_s1047" type="#_x0000_t202" style="position:absolute;margin-left:200.95pt;margin-top:657.85pt;width:33.9pt;height:8.65pt;z-index:-251631616;visibility:visible;mso-wrap-style:square;mso-wrap-distance-left:0;mso-wrap-distance-top:0;mso-wrap-distance-right:0;mso-wrap-distance-bottom:0;mso-position-horizontal:absolute;mso-position-horizontal-relative:page;mso-position-vertical:absolute;mso-position-vertical-relative:page;v-text-anchor:top" o:gfxdata="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" filled="f" stroked="f">
               <v:textbox inset="0,0,0,0">
                 <w:txbxContent>
                   <w:p>
@@ -10485,7 +10483,7 @@
         <w:sz w:val="20"/>
       </w:rPr>
       <w:drawing>
-        <wp:anchor distT="0" distB="0" distL="0" distR="0" simplePos="0" relativeHeight="487260672" behindDoc="1" locked="0" layoutInCell="1" allowOverlap="1" wp14:anchorId="6A974CF6" wp14:editId="49705F6B">
+        <wp:anchor distT="0" distB="0" distL="0" distR="0" simplePos="0" relativeHeight="251658240" behindDoc="1" locked="0" layoutInCell="1" allowOverlap="1" wp14:anchorId="6A974CF6" wp14:editId="5B8369B1">
           <wp:simplePos x="0" y="0"/>
           <wp:positionH relativeFrom="page">
             <wp:posOffset>137795</wp:posOffset>
@@ -10496,7 +10494,7 @@
           <wp:extent cx="7466583" cy="1490980"/>
           <wp:effectExtent l="0" t="0" r="0" b="0"/>
           <wp:wrapNone/>
-          <wp:docPr id="17" name="Image 17"/>
+          <wp:docPr id="149676384" name="Image 17"/>
           <wp:cNvGraphicFramePr>
             <a:graphicFrameLocks xmlns:a="http://schemas.openxmlformats.org/drawingml/2006/main"/>
           </wp:cNvGraphicFramePr>
@@ -10537,7 +10535,7 @@
       <mc:AlternateContent>
         <mc:Choice Requires="wps">
           <w:drawing>
-            <wp:anchor distT="0" distB="0" distL="0" distR="0" simplePos="0" relativeHeight="487261184" behindDoc="1" locked="0" layoutInCell="1" allowOverlap="1" wp14:anchorId="770974D8" wp14:editId="40D46EAA">
+            <wp:anchor distT="0" distB="0" distL="0" distR="0" simplePos="0" relativeHeight="251665408" behindDoc="1" locked="0" layoutInCell="1" allowOverlap="1" wp14:anchorId="770974D8" wp14:editId="40D46EAA">
               <wp:simplePos x="0" y="0"/>
               <wp:positionH relativeFrom="page">
                 <wp:posOffset>5036184</wp:posOffset>
@@ -10548,7 +10546,7 @@
               <wp:extent cx="2373630" cy="1270"/>
               <wp:effectExtent l="0" t="0" r="0" b="0"/>
               <wp:wrapNone/>
-              <wp:docPr id="18" name="Graphic 18"/>
+              <wp:docPr id="1157842987" name="Graphic 18"/>
               <wp:cNvGraphicFramePr>
                 <a:graphicFrameLocks xmlns:a="http://schemas.openxmlformats.org/drawingml/2006/main"/>
               </wp:cNvGraphicFramePr>
@@ -10601,7 +10599,7 @@
         </mc:Choice>
         <mc:Fallback>
           <w:pict>
-            <v:shape w14:anchorId="6C5DF57A" id="Graphic 18" o:spid="_x0000_s1026" style="position:absolute;margin-left:396.55pt;margin-top:633.25pt;width:186.9pt;height:.1pt;z-index:-16055296;visibility:visible;mso-wrap-style:square;mso-wrap-distance-left:0;mso-wrap-distance-top:0;mso-wrap-distance-right:0;mso-wrap-distance-bottom:0;mso-position-horizontal:absolute;mso-position-horizontal-relative:page;mso-position-vertical:absolute;mso-position-vertical-relative:page;v-text-anchor:top" coordsize="2373630,1270" o:gfxdata="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" path="m,l2373248,e" filled="f" strokecolor="#3e3e3e" strokeweight=".17778mm">
+            <v:shape w14:anchorId="26523D7B" id="Graphic 18" o:spid="_x0000_s1026" style="position:absolute;margin-left:396.55pt;margin-top:633.25pt;width:186.9pt;height:.1pt;z-index:-251651072;visibility:visible;mso-wrap-style:square;mso-wrap-distance-left:0;mso-wrap-distance-top:0;mso-wrap-distance-right:0;mso-wrap-distance-bottom:0;mso-position-horizontal:absolute;mso-position-horizontal-relative:page;mso-position-vertical:absolute;mso-position-vertical-relative:page;v-text-anchor:top" coordsize="2373630,1270" o:gfxdata="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" path="m,l2373248,e" filled="f" strokecolor="#3e3e3e" strokeweight=".17778mm">
               <v:path arrowok="t"/>
               <w10:wrap anchorx="page" anchory="page"/>
             </v:shape>
@@ -10618,7 +10616,7 @@
       <mc:AlternateContent>
         <mc:Choice Requires="wps">
           <w:drawing>
-            <wp:anchor distT="0" distB="0" distL="0" distR="0" simplePos="0" relativeHeight="487261696" behindDoc="1" locked="0" layoutInCell="1" allowOverlap="1" wp14:anchorId="30A654B0" wp14:editId="780BB11C">
+            <wp:anchor distT="0" distB="0" distL="0" distR="0" simplePos="0" relativeHeight="251668480" behindDoc="1" locked="0" layoutInCell="1" allowOverlap="1" wp14:anchorId="30A654B0" wp14:editId="780BB11C">
               <wp:simplePos x="0" y="0"/>
               <wp:positionH relativeFrom="page">
                 <wp:posOffset>5292090</wp:posOffset>
@@ -10629,7 +10627,7 @@
               <wp:extent cx="2200000" cy="170000"/>
               <wp:effectExtent l="0" t="0" r="0" b="0"/>
               <wp:wrapNone/>
-              <wp:docPr id="19" name="Textbox 19"/>
+              <wp:docPr id="1081421127" name="Textbox 19"/>
               <wp:cNvGraphicFramePr>
                 <a:graphicFrameLocks xmlns:a="http://schemas.openxmlformats.org/drawingml/2006/main"/>
               </wp:cNvGraphicFramePr>
@@ -10754,7 +10752,7 @@
               <v:stroke joinstyle="miter"/>
               <v:path gradientshapeok="t" o:connecttype="rect"/>
             </v:shapetype>
-            <v:shape id="Textbox 19" o:spid="_x0000_s1038" type="#_x0000_t202" style="position:absolute;margin-left:416.7pt;margin-top:613.65pt;width:173pt;height:13.39pt;z-index:-16054784;visibility:visible;mso-wrap-style:square;mso-wrap-distance-left:0;mso-wrap-distance-top:0;mso-wrap-distance-right:0;mso-wrap-distance-bottom:0;mso-position-horizontal:absolute;mso-position-horizontal-relative:page;mso-position-vertical:absolute;mso-position-vertical-relative:page;v-text-anchor:top" o:gfxdata="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" filled="f" stroked="f">
+            <v:shape id="_x0000_s1048" type="#_x0000_t202" style="position:absolute;margin-left:416.7pt;margin-top:613.65pt;width:173.25pt;height:13.4pt;z-index:-251648000;visibility:visible;mso-wrap-style:square;mso-wrap-distance-left:0;mso-wrap-distance-top:0;mso-wrap-distance-right:0;mso-wrap-distance-bottom:0;mso-position-horizontal:absolute;mso-position-horizontal-relative:page;mso-position-vertical:absolute;mso-position-vertical-relative:page;v-text-anchor:top" o:gfxdata="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" filled="f" stroked="f">
               <v:textbox inset="0,0,0,0">
                 <w:txbxContent>
                   <w:p>
@@ -10861,7 +10859,7 @@
       <mc:AlternateContent>
         <mc:Choice Requires="wps">
           <w:drawing>
-            <wp:anchor distT="0" distB="0" distL="0" distR="0" simplePos="0" relativeHeight="487262208" behindDoc="1" locked="0" layoutInCell="1" allowOverlap="1" wp14:anchorId="739682D1" wp14:editId="702591AC">
+            <wp:anchor distT="0" distB="0" distL="0" distR="0" simplePos="0" relativeHeight="251673600" behindDoc="1" locked="0" layoutInCell="1" allowOverlap="1" wp14:anchorId="739682D1" wp14:editId="702591AC">
               <wp:simplePos x="0" y="0"/>
               <wp:positionH relativeFrom="page">
                 <wp:posOffset>203708</wp:posOffset>
@@ -10872,7 +10870,7 @@
               <wp:extent cx="3552190" cy="109855"/>
               <wp:effectExtent l="0" t="0" r="0" b="0"/>
               <wp:wrapNone/>
-              <wp:docPr id="20" name="Textbox 20"/>
+              <wp:docPr id="1841965971" name="Textbox 20"/>
               <wp:cNvGraphicFramePr>
                 <a:graphicFrameLocks xmlns:a="http://schemas.openxmlformats.org/drawingml/2006/main"/>
               </wp:cNvGraphicFramePr>
@@ -11116,7 +11114,7 @@
         </mc:Choice>
         <mc:Fallback>
           <w:pict>
-            <v:shape w14:anchorId="739682D1" id="Textbox 20" o:spid="_x0000_s1039" type="#_x0000_t202" style="position:absolute;margin-left:16.05pt;margin-top:620.85pt;width:279.7pt;height:8.65pt;z-index:-16054272;visibility:visible;mso-wrap-style:square;mso-wrap-distance-left:0;mso-wrap-distance-top:0;mso-wrap-distance-right:0;mso-wrap-distance-bottom:0;mso-position-horizontal:absolute;mso-position-horizontal-relative:page;mso-position-vertical:absolute;mso-position-vertical-relative:page;v-text-anchor:top" o:gfxdata="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" filled="f" stroked="f">
+            <v:shape w14:anchorId="739682D1" id="_x0000_s1049" type="#_x0000_t202" style="position:absolute;margin-left:16.05pt;margin-top:620.85pt;width:279.7pt;height:8.65pt;z-index:-251642880;visibility:visible;mso-wrap-style:square;mso-wrap-distance-left:0;mso-wrap-distance-top:0;mso-wrap-distance-right:0;mso-wrap-distance-bottom:0;mso-position-horizontal:absolute;mso-position-horizontal-relative:page;mso-position-vertical:absolute;mso-position-vertical-relative:page;v-text-anchor:top" o:gfxdata="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" filled="f" stroked="f">
               <v:textbox inset="0,0,0,0">
                 <w:txbxContent>
                   <w:p>
@@ -11346,7 +11344,7 @@
       <mc:AlternateContent>
         <mc:Choice Requires="wps">
           <w:drawing>
-            <wp:anchor distT="0" distB="0" distL="0" distR="0" simplePos="0" relativeHeight="487262720" behindDoc="1" locked="0" layoutInCell="1" allowOverlap="1" wp14:anchorId="6C52562A" wp14:editId="2DC06BA4">
+            <wp:anchor distT="0" distB="0" distL="0" distR="0" simplePos="0" relativeHeight="251676672" behindDoc="1" locked="0" layoutInCell="1" allowOverlap="1" wp14:anchorId="6C52562A" wp14:editId="2DC06BA4">
               <wp:simplePos x="0" y="0"/>
               <wp:positionH relativeFrom="page">
                 <wp:posOffset>5348478</wp:posOffset>
@@ -11357,7 +11355,7 @@
               <wp:extent cx="2100000" cy="680000"/>
               <wp:effectExtent l="0" t="0" r="0" b="0"/>
               <wp:wrapNone/>
-              <wp:docPr id="21" name="Textbox 21"/>
+              <wp:docPr id="939222362" name="Textbox 21"/>
               <wp:cNvGraphicFramePr>
                 <a:graphicFrameLocks xmlns:a="http://schemas.openxmlformats.org/drawingml/2006/main"/>
               </wp:cNvGraphicFramePr>
@@ -11400,7 +11398,7 @@
                         </w:p>
                         <w:p>
                           <w:pPr>
-                            <w:spacing w:before="0" w:line="256" w:lineRule="auto"/>
+                            <w:spacing w:line="256" w:lineRule="auto"/>
                             <w:ind w:left="60" w:right="60"/>
                             <w:jc w:val="center"/>
                             <w:rPr>
@@ -11516,7 +11514,7 @@
         </mc:Choice>
         <mc:Fallback>
           <w:pict>
-            <v:shape w14:anchorId="6C52562A" id="Textbox 21" o:spid="_x0000_s1040" type="#_x0000_t202" style="position:absolute;margin-left:421.15pt;margin-top:634.05pt;width:165.35pt;height:53.54pt;z-index:-16053760;visibility:visible;mso-wrap-style:square;mso-wrap-distance-left:0;mso-wrap-distance-top:0;mso-wrap-distance-right:0;mso-wrap-distance-bottom:0;mso-position-horizontal:absolute;mso-position-horizontal-relative:page;mso-position-vertical:absolute;mso-position-vertical-relative:page;v-text-anchor:top" o:gfxdata="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" filled="f" stroked="f">
+            <v:shape w14:anchorId="6C52562A" id="_x0000_s1050" type="#_x0000_t202" style="position:absolute;margin-left:421.15pt;margin-top:634.05pt;width:165.35pt;height:53.55pt;z-index:-251639808;visibility:visible;mso-wrap-style:square;mso-wrap-distance-left:0;mso-wrap-distance-top:0;mso-wrap-distance-right:0;mso-wrap-distance-bottom:0;mso-position-horizontal:absolute;mso-position-horizontal-relative:page;mso-position-vertical:absolute;mso-position-vertical-relative:page;v-text-anchor:top" o:gfxdata="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" filled="f" stroked="f">
               <v:textbox inset="0,0,0,0">
                 <w:txbxContent>
                   <w:p>
@@ -11541,7 +11539,7 @@
                   </w:p>
                   <w:p>
                     <w:pPr>
-                      <w:spacing w:before="0" w:line="256" w:lineRule="auto"/>
+                      <w:spacing w:line="256" w:lineRule="auto"/>
                       <w:ind w:left="60" w:right="60"/>
                       <w:jc w:val="center"/>
                       <w:rPr>
@@ -11661,7 +11659,7 @@
       <mc:AlternateContent>
         <mc:Choice Requires="wps">
           <w:drawing>
-            <wp:anchor distT="0" distB="0" distL="0" distR="0" simplePos="0" relativeHeight="487263232" behindDoc="1" locked="0" layoutInCell="1" allowOverlap="1" wp14:anchorId="49EE3916" wp14:editId="5310D7E8">
+            <wp:anchor distT="0" distB="0" distL="0" distR="0" simplePos="0" relativeHeight="251680768" behindDoc="1" locked="0" layoutInCell="1" allowOverlap="1" wp14:anchorId="49EE3916" wp14:editId="5310D7E8">
               <wp:simplePos x="0" y="0"/>
               <wp:positionH relativeFrom="page">
                 <wp:posOffset>432308</wp:posOffset>
@@ -11672,7 +11670,7 @@
               <wp:extent cx="465455" cy="201295"/>
               <wp:effectExtent l="0" t="0" r="0" b="0"/>
               <wp:wrapNone/>
-              <wp:docPr id="22" name="Textbox 22"/>
+              <wp:docPr id="765954287" name="Textbox 22"/>
               <wp:cNvGraphicFramePr>
                 <a:graphicFrameLocks xmlns:a="http://schemas.openxmlformats.org/drawingml/2006/main"/>
               </wp:cNvGraphicFramePr>
@@ -11750,7 +11748,7 @@
         </mc:Choice>
         <mc:Fallback>
           <w:pict>
-            <v:shape w14:anchorId="49EE3916" id="Textbox 22" o:spid="_x0000_s1041" type="#_x0000_t202" style="position:absolute;margin-left:34.05pt;margin-top:640.8pt;width:36.65pt;height:15.85pt;z-index:-16053248;visibility:visible;mso-wrap-style:square;mso-wrap-distance-left:0;mso-wrap-distance-top:0;mso-wrap-distance-right:0;mso-wrap-distance-bottom:0;mso-position-horizontal:absolute;mso-position-horizontal-relative:page;mso-position-vertical:absolute;mso-position-vertical-relative:page;v-text-anchor:top" o:gfxdata="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" filled="f" stroked="f">
+            <v:shape w14:anchorId="49EE3916" id="_x0000_s1051" type="#_x0000_t202" style="position:absolute;margin-left:34.05pt;margin-top:640.8pt;width:36.65pt;height:15.85pt;z-index:-251635712;visibility:visible;mso-wrap-style:square;mso-wrap-distance-left:0;mso-wrap-distance-top:0;mso-wrap-distance-right:0;mso-wrap-distance-bottom:0;mso-position-horizontal:absolute;mso-position-horizontal-relative:page;mso-position-vertical:absolute;mso-position-vertical-relative:page;v-text-anchor:top" o:gfxdata="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" filled="f" stroked="f">
               <v:textbox inset="0,0,0,0">
                 <w:txbxContent>
                   <w:p>
@@ -11814,7 +11812,7 @@
       <mc:AlternateContent>
         <mc:Choice Requires="wps">
           <w:drawing>
-            <wp:anchor distT="0" distB="0" distL="0" distR="0" simplePos="0" relativeHeight="487263744" behindDoc="1" locked="0" layoutInCell="1" allowOverlap="1" wp14:anchorId="4837D418" wp14:editId="20D07D61">
+            <wp:anchor distT="0" distB="0" distL="0" distR="0" simplePos="0" relativeHeight="251685888" behindDoc="1" locked="0" layoutInCell="1" allowOverlap="1" wp14:anchorId="4837D418" wp14:editId="20D07D61">
               <wp:simplePos x="0" y="0"/>
               <wp:positionH relativeFrom="page">
                 <wp:posOffset>2551810</wp:posOffset>
@@ -11825,7 +11823,7 @@
               <wp:extent cx="430530" cy="109855"/>
               <wp:effectExtent l="0" t="0" r="0" b="0"/>
               <wp:wrapNone/>
-              <wp:docPr id="23" name="Textbox 23"/>
+              <wp:docPr id="2064209686" name="Textbox 23"/>
               <wp:cNvGraphicFramePr>
                 <a:graphicFrameLocks xmlns:a="http://schemas.openxmlformats.org/drawingml/2006/main"/>
               </wp:cNvGraphicFramePr>
@@ -11955,7 +11953,7 @@
         </mc:Choice>
         <mc:Fallback>
           <w:pict>
-            <v:shape w14:anchorId="4837D418" id="Textbox 23" o:spid="_x0000_s1042" type="#_x0000_t202" style="position:absolute;margin-left:200.95pt;margin-top:657.85pt;width:33.9pt;height:8.65pt;z-index:-16052736;visibility:visible;mso-wrap-style:square;mso-wrap-distance-left:0;mso-wrap-distance-top:0;mso-wrap-distance-right:0;mso-wrap-distance-bottom:0;mso-position-horizontal:absolute;mso-position-horizontal-relative:page;mso-position-vertical:absolute;mso-position-vertical-relative:page;v-text-anchor:top" o:gfxdata="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" filled="f" stroked="f">
+            <v:shape w14:anchorId="4837D418" id="_x0000_s1052" type="#_x0000_t202" style="position:absolute;margin-left:200.95pt;margin-top:657.85pt;width:33.9pt;height:8.65pt;z-index:-251630592;visibility:visible;mso-wrap-style:square;mso-wrap-distance-left:0;mso-wrap-distance-top:0;mso-wrap-distance-right:0;mso-wrap-distance-bottom:0;mso-position-horizontal:absolute;mso-position-horizontal-relative:page;mso-position-vertical:absolute;mso-position-vertical-relative:page;v-text-anchor:top" o:gfxdata="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" filled="f" stroked="f">
               <v:textbox inset="0,0,0,0">
                 <w:txbxContent>
                   <w:p>
@@ -12084,7 +12082,7 @@
         <w:sz w:val="20"/>
       </w:rPr>
       <w:drawing>
-        <wp:anchor distT="0" distB="0" distL="0" distR="0" simplePos="0" relativeHeight="487260672" behindDoc="1" locked="0" layoutInCell="1" allowOverlap="1" wp14:anchorId="6A974CF6" wp14:editId="49705F6B">
+        <wp:anchor distT="0" distB="0" distL="0" distR="0" simplePos="0" relativeHeight="251661312" behindDoc="1" locked="0" layoutInCell="1" allowOverlap="1" wp14:anchorId="6A974CF6" wp14:editId="49705F6B">
           <wp:simplePos x="0" y="0"/>
           <wp:positionH relativeFrom="page">
             <wp:posOffset>137795</wp:posOffset>
@@ -12095,7 +12093,7 @@
           <wp:extent cx="7466583" cy="1490980"/>
           <wp:effectExtent l="0" t="0" r="0" b="0"/>
           <wp:wrapNone/>
-          <wp:docPr id="17" name="Image 17"/>
+          <wp:docPr id="975044682" name="Image 17"/>
           <wp:cNvGraphicFramePr>
             <a:graphicFrameLocks xmlns:a="http://schemas.openxmlformats.org/drawingml/2006/main"/>
           </wp:cNvGraphicFramePr>
@@ -12136,7 +12134,7 @@
       <mc:AlternateContent>
         <mc:Choice Requires="wps">
           <w:drawing>
-            <wp:anchor distT="0" distB="0" distL="0" distR="0" simplePos="0" relativeHeight="487261184" behindDoc="1" locked="0" layoutInCell="1" allowOverlap="1" wp14:anchorId="770974D8" wp14:editId="40D46EAA">
+            <wp:anchor distT="0" distB="0" distL="0" distR="0" simplePos="0" relativeHeight="251663360" behindDoc="1" locked="0" layoutInCell="1" allowOverlap="1" wp14:anchorId="770974D8" wp14:editId="40D46EAA">
               <wp:simplePos x="0" y="0"/>
               <wp:positionH relativeFrom="page">
                 <wp:posOffset>5036184</wp:posOffset>
@@ -12147,7 +12145,7 @@
               <wp:extent cx="2373630" cy="1270"/>
               <wp:effectExtent l="0" t="0" r="0" b="0"/>
               <wp:wrapNone/>
-              <wp:docPr id="18" name="Graphic 18"/>
+              <wp:docPr id="592851348" name="Graphic 18"/>
               <wp:cNvGraphicFramePr>
                 <a:graphicFrameLocks xmlns:a="http://schemas.openxmlformats.org/drawingml/2006/main"/>
               </wp:cNvGraphicFramePr>
@@ -12200,7 +12198,7 @@
         </mc:Choice>
         <mc:Fallback>
           <w:pict>
-            <v:shape w14:anchorId="6C5DF57A" id="Graphic 18" o:spid="_x0000_s1026" style="position:absolute;margin-left:396.55pt;margin-top:633.25pt;width:186.9pt;height:.1pt;z-index:-16055296;visibility:visible;mso-wrap-style:square;mso-wrap-distance-left:0;mso-wrap-distance-top:0;mso-wrap-distance-right:0;mso-wrap-distance-bottom:0;mso-position-horizontal:absolute;mso-position-horizontal-relative:page;mso-position-vertical:absolute;mso-position-vertical-relative:page;v-text-anchor:top" coordsize="2373630,1270" o:gfxdata="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" path="m,l2373248,e" filled="f" strokecolor="#3e3e3e" strokeweight=".17778mm">
+            <v:shape w14:anchorId="0426067B" id="Graphic 18" o:spid="_x0000_s1026" style="position:absolute;margin-left:396.55pt;margin-top:633.25pt;width:186.9pt;height:.1pt;z-index:-251653120;visibility:visible;mso-wrap-style:square;mso-wrap-distance-left:0;mso-wrap-distance-top:0;mso-wrap-distance-right:0;mso-wrap-distance-bottom:0;mso-position-horizontal:absolute;mso-position-horizontal-relative:page;mso-position-vertical:absolute;mso-position-vertical-relative:page;v-text-anchor:top" coordsize="2373630,1270" o:gfxdata="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" path="m,l2373248,e" filled="f" strokecolor="#3e3e3e" strokeweight=".17778mm">
               <v:path arrowok="t"/>
               <w10:wrap anchorx="page" anchory="page"/>
             </v:shape>
@@ -12217,7 +12215,7 @@
       <mc:AlternateContent>
         <mc:Choice Requires="wps">
           <w:drawing>
-            <wp:anchor distT="0" distB="0" distL="0" distR="0" simplePos="0" relativeHeight="487261696" behindDoc="1" locked="0" layoutInCell="1" allowOverlap="1" wp14:anchorId="30A654B0" wp14:editId="780BB11C">
+            <wp:anchor distT="0" distB="0" distL="0" distR="0" simplePos="0" relativeHeight="251667456" behindDoc="1" locked="0" layoutInCell="1" allowOverlap="1" wp14:anchorId="30A654B0" wp14:editId="780BB11C">
               <wp:simplePos x="0" y="0"/>
               <wp:positionH relativeFrom="page">
                 <wp:posOffset>5292090</wp:posOffset>
@@ -12228,7 +12226,7 @@
               <wp:extent cx="2200000" cy="170000"/>
               <wp:effectExtent l="0" t="0" r="0" b="0"/>
               <wp:wrapNone/>
-              <wp:docPr id="19" name="Textbox 19"/>
+              <wp:docPr id="758013839" name="Textbox 19"/>
               <wp:cNvGraphicFramePr>
                 <a:graphicFrameLocks xmlns:a="http://schemas.openxmlformats.org/drawingml/2006/main"/>
               </wp:cNvGraphicFramePr>
@@ -12353,7 +12351,7 @@
               <v:stroke joinstyle="miter"/>
               <v:path gradientshapeok="t" o:connecttype="rect"/>
             </v:shapetype>
-            <v:shape id="Textbox 19" o:spid="_x0000_s1038" type="#_x0000_t202" style="position:absolute;margin-left:416.7pt;margin-top:613.65pt;width:173pt;height:13.39pt;z-index:-16054784;visibility:visible;mso-wrap-style:square;mso-wrap-distance-left:0;mso-wrap-distance-top:0;mso-wrap-distance-right:0;mso-wrap-distance-bottom:0;mso-position-horizontal:absolute;mso-position-horizontal-relative:page;mso-position-vertical:absolute;mso-position-vertical-relative:page;v-text-anchor:top" o:gfxdata="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" filled="f" stroked="f">
+            <v:shape id="_x0000_s1065" type="#_x0000_t202" style="position:absolute;margin-left:416.7pt;margin-top:613.65pt;width:173.25pt;height:13.4pt;z-index:-251649024;visibility:visible;mso-wrap-style:square;mso-wrap-distance-left:0;mso-wrap-distance-top:0;mso-wrap-distance-right:0;mso-wrap-distance-bottom:0;mso-position-horizontal:absolute;mso-position-horizontal-relative:page;mso-position-vertical:absolute;mso-position-vertical-relative:page;v-text-anchor:top" o:gfxdata="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" filled="f" stroked="f">
               <v:textbox inset="0,0,0,0">
                 <w:txbxContent>
                   <w:p>
@@ -12460,7 +12458,7 @@
       <mc:AlternateContent>
         <mc:Choice Requires="wps">
           <w:drawing>
-            <wp:anchor distT="0" distB="0" distL="0" distR="0" simplePos="0" relativeHeight="487262208" behindDoc="1" locked="0" layoutInCell="1" allowOverlap="1" wp14:anchorId="739682D1" wp14:editId="702591AC">
+            <wp:anchor distT="0" distB="0" distL="0" distR="0" simplePos="0" relativeHeight="251672576" behindDoc="1" locked="0" layoutInCell="1" allowOverlap="1" wp14:anchorId="739682D1" wp14:editId="702591AC">
               <wp:simplePos x="0" y="0"/>
               <wp:positionH relativeFrom="page">
                 <wp:posOffset>203708</wp:posOffset>
@@ -12471,7 +12469,7 @@
               <wp:extent cx="3552190" cy="109855"/>
               <wp:effectExtent l="0" t="0" r="0" b="0"/>
               <wp:wrapNone/>
-              <wp:docPr id="20" name="Textbox 20"/>
+              <wp:docPr id="1515471101" name="Textbox 20"/>
               <wp:cNvGraphicFramePr>
                 <a:graphicFrameLocks xmlns:a="http://schemas.openxmlformats.org/drawingml/2006/main"/>
               </wp:cNvGraphicFramePr>
@@ -12715,7 +12713,7 @@
         </mc:Choice>
         <mc:Fallback>
           <w:pict>
-            <v:shape w14:anchorId="739682D1" id="Textbox 20" o:spid="_x0000_s1039" type="#_x0000_t202" style="position:absolute;margin-left:16.05pt;margin-top:620.85pt;width:279.7pt;height:8.65pt;z-index:-16054272;visibility:visible;mso-wrap-style:square;mso-wrap-distance-left:0;mso-wrap-distance-top:0;mso-wrap-distance-right:0;mso-wrap-distance-bottom:0;mso-position-horizontal:absolute;mso-position-horizontal-relative:page;mso-position-vertical:absolute;mso-position-vertical-relative:page;v-text-anchor:top" o:gfxdata="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" filled="f" stroked="f">
+            <v:shape w14:anchorId="739682D1" id="_x0000_s1066" type="#_x0000_t202" style="position:absolute;margin-left:16.05pt;margin-top:620.85pt;width:279.7pt;height:8.65pt;z-index:-251643904;visibility:visible;mso-wrap-style:square;mso-wrap-distance-left:0;mso-wrap-distance-top:0;mso-wrap-distance-right:0;mso-wrap-distance-bottom:0;mso-position-horizontal:absolute;mso-position-horizontal-relative:page;mso-position-vertical:absolute;mso-position-vertical-relative:page;v-text-anchor:top" o:gfxdata="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" filled="f" stroked="f">
               <v:textbox inset="0,0,0,0">
                 <w:txbxContent>
                   <w:p>
@@ -12945,7 +12943,7 @@
       <mc:AlternateContent>
         <mc:Choice Requires="wps">
           <w:drawing>
-            <wp:anchor distT="0" distB="0" distL="0" distR="0" simplePos="0" relativeHeight="487262720" behindDoc="1" locked="0" layoutInCell="1" allowOverlap="1" wp14:anchorId="6C52562A" wp14:editId="2DC06BA4">
+            <wp:anchor distT="0" distB="0" distL="0" distR="0" simplePos="0" relativeHeight="251677696" behindDoc="1" locked="0" layoutInCell="1" allowOverlap="1" wp14:anchorId="6C52562A" wp14:editId="2DC06BA4">
               <wp:simplePos x="0" y="0"/>
               <wp:positionH relativeFrom="page">
                 <wp:posOffset>5348478</wp:posOffset>
@@ -12956,7 +12954,7 @@
               <wp:extent cx="2100000" cy="680000"/>
               <wp:effectExtent l="0" t="0" r="0" b="0"/>
               <wp:wrapNone/>
-              <wp:docPr id="21" name="Textbox 21"/>
+              <wp:docPr id="1541745657" name="Textbox 21"/>
               <wp:cNvGraphicFramePr>
                 <a:graphicFrameLocks xmlns:a="http://schemas.openxmlformats.org/drawingml/2006/main"/>
               </wp:cNvGraphicFramePr>
@@ -12999,7 +12997,7 @@
                         </w:p>
                         <w:p>
                           <w:pPr>
-                            <w:spacing w:before="0" w:line="256" w:lineRule="auto"/>
+                            <w:spacing w:line="256" w:lineRule="auto"/>
                             <w:ind w:left="60" w:right="60"/>
                             <w:jc w:val="center"/>
                             <w:rPr>
@@ -13115,7 +13113,7 @@
         </mc:Choice>
         <mc:Fallback>
           <w:pict>
-            <v:shape w14:anchorId="6C52562A" id="Textbox 21" o:spid="_x0000_s1040" type="#_x0000_t202" style="position:absolute;margin-left:421.15pt;margin-top:634.05pt;width:165.35pt;height:53.54pt;z-index:-16053760;visibility:visible;mso-wrap-style:square;mso-wrap-distance-left:0;mso-wrap-distance-top:0;mso-wrap-distance-right:0;mso-wrap-distance-bottom:0;mso-position-horizontal:absolute;mso-position-horizontal-relative:page;mso-position-vertical:absolute;mso-position-vertical-relative:page;v-text-anchor:top" o:gfxdata="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" filled="f" stroked="f">
+            <v:shape w14:anchorId="6C52562A" id="_x0000_s1067" type="#_x0000_t202" style="position:absolute;margin-left:421.15pt;margin-top:634.05pt;width:165.35pt;height:53.55pt;z-index:-251638784;visibility:visible;mso-wrap-style:square;mso-wrap-distance-left:0;mso-wrap-distance-top:0;mso-wrap-distance-right:0;mso-wrap-distance-bottom:0;mso-position-horizontal:absolute;mso-position-horizontal-relative:page;mso-position-vertical:absolute;mso-position-vertical-relative:page;v-text-anchor:top" o:gfxdata="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" filled="f" stroked="f">
               <v:textbox inset="0,0,0,0">
                 <w:txbxContent>
                   <w:p>
@@ -13140,7 +13138,7 @@
                   </w:p>
                   <w:p>
                     <w:pPr>
-                      <w:spacing w:before="0" w:line="256" w:lineRule="auto"/>
+                      <w:spacing w:line="256" w:lineRule="auto"/>
                       <w:ind w:left="60" w:right="60"/>
                       <w:jc w:val="center"/>
                       <w:rPr>
@@ -13260,7 +13258,7 @@
       <mc:AlternateContent>
         <mc:Choice Requires="wps">
           <w:drawing>
-            <wp:anchor distT="0" distB="0" distL="0" distR="0" simplePos="0" relativeHeight="487263232" behindDoc="1" locked="0" layoutInCell="1" allowOverlap="1" wp14:anchorId="49EE3916" wp14:editId="5310D7E8">
+            <wp:anchor distT="0" distB="0" distL="0" distR="0" simplePos="0" relativeHeight="251679744" behindDoc="1" locked="0" layoutInCell="1" allowOverlap="1" wp14:anchorId="49EE3916" wp14:editId="5310D7E8">
               <wp:simplePos x="0" y="0"/>
               <wp:positionH relativeFrom="page">
                 <wp:posOffset>432308</wp:posOffset>
@@ -13271,7 +13269,7 @@
               <wp:extent cx="465455" cy="201295"/>
               <wp:effectExtent l="0" t="0" r="0" b="0"/>
               <wp:wrapNone/>
-              <wp:docPr id="22" name="Textbox 22"/>
+              <wp:docPr id="18650990" name="Textbox 22"/>
               <wp:cNvGraphicFramePr>
                 <a:graphicFrameLocks xmlns:a="http://schemas.openxmlformats.org/drawingml/2006/main"/>
               </wp:cNvGraphicFramePr>
@@ -13349,7 +13347,7 @@
         </mc:Choice>
         <mc:Fallback>
           <w:pict>
-            <v:shape w14:anchorId="49EE3916" id="Textbox 22" o:spid="_x0000_s1041" type="#_x0000_t202" style="position:absolute;margin-left:34.05pt;margin-top:640.8pt;width:36.65pt;height:15.85pt;z-index:-16053248;visibility:visible;mso-wrap-style:square;mso-wrap-distance-left:0;mso-wrap-distance-top:0;mso-wrap-distance-right:0;mso-wrap-distance-bottom:0;mso-position-horizontal:absolute;mso-position-horizontal-relative:page;mso-position-vertical:absolute;mso-position-vertical-relative:page;v-text-anchor:top" o:gfxdata="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" filled="f" stroked="f">
+            <v:shape w14:anchorId="49EE3916" id="_x0000_s1068" type="#_x0000_t202" style="position:absolute;margin-left:34.05pt;margin-top:640.8pt;width:36.65pt;height:15.85pt;z-index:-251636736;visibility:visible;mso-wrap-style:square;mso-wrap-distance-left:0;mso-wrap-distance-top:0;mso-wrap-distance-right:0;mso-wrap-distance-bottom:0;mso-position-horizontal:absolute;mso-position-horizontal-relative:page;mso-position-vertical:absolute;mso-position-vertical-relative:page;v-text-anchor:top" o:gfxdata="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" filled="f" stroked="f">
               <v:textbox inset="0,0,0,0">
                 <w:txbxContent>
                   <w:p>
@@ -13413,7 +13411,7 @@
       <mc:AlternateContent>
         <mc:Choice Requires="wps">
           <w:drawing>
-            <wp:anchor distT="0" distB="0" distL="0" distR="0" simplePos="0" relativeHeight="487263744" behindDoc="1" locked="0" layoutInCell="1" allowOverlap="1" wp14:anchorId="4837D418" wp14:editId="20D07D61">
+            <wp:anchor distT="0" distB="0" distL="0" distR="0" simplePos="0" relativeHeight="251683840" behindDoc="1" locked="0" layoutInCell="1" allowOverlap="1" wp14:anchorId="4837D418" wp14:editId="20D07D61">
               <wp:simplePos x="0" y="0"/>
               <wp:positionH relativeFrom="page">
                 <wp:posOffset>2551810</wp:posOffset>
@@ -13424,7 +13422,7 @@
               <wp:extent cx="430530" cy="109855"/>
               <wp:effectExtent l="0" t="0" r="0" b="0"/>
               <wp:wrapNone/>
-              <wp:docPr id="23" name="Textbox 23"/>
+              <wp:docPr id="1436480631" name="Textbox 23"/>
               <wp:cNvGraphicFramePr>
                 <a:graphicFrameLocks xmlns:a="http://schemas.openxmlformats.org/drawingml/2006/main"/>
               </wp:cNvGraphicFramePr>
@@ -13554,7 +13552,7 @@
         </mc:Choice>
         <mc:Fallback>
           <w:pict>
-            <v:shape w14:anchorId="4837D418" id="Textbox 23" o:spid="_x0000_s1042" type="#_x0000_t202" style="position:absolute;margin-left:200.95pt;margin-top:657.85pt;width:33.9pt;height:8.65pt;z-index:-16052736;visibility:visible;mso-wrap-style:square;mso-wrap-distance-left:0;mso-wrap-distance-top:0;mso-wrap-distance-right:0;mso-wrap-distance-bottom:0;mso-position-horizontal:absolute;mso-position-horizontal-relative:page;mso-position-vertical:absolute;mso-position-vertical-relative:page;v-text-anchor:top" o:gfxdata="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" filled="f" stroked="f">
+            <v:shape w14:anchorId="4837D418" id="_x0000_s1069" type="#_x0000_t202" style="position:absolute;margin-left:200.95pt;margin-top:657.85pt;width:33.9pt;height:8.65pt;z-index:-251632640;visibility:visible;mso-wrap-style:square;mso-wrap-distance-left:0;mso-wrap-distance-top:0;mso-wrap-distance-right:0;mso-wrap-distance-bottom:0;mso-position-horizontal:absolute;mso-position-horizontal-relative:page;mso-position-vertical:absolute;mso-position-vertical-relative:page;v-text-anchor:top" o:gfxdata="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" filled="f" stroked="f">
               <v:textbox inset="0,0,0,0">
                 <w:txbxContent>
                   <w:p>
@@ -13685,16 +13683,6 @@
 </file>
 
 <file path=word/header1.xml><?xml version="1.0" encoding="utf-8"?>
-<w:hdr xmlns:wpc="http://schemas.microsoft.com/office/word/2010/wordprocessingCanvas" xmlns:cx="http://schemas.microsoft.com/office/drawing/2014/chartex" xmlns:cx1="http://schemas.microsoft.com/office/drawing/2015/9/8/chartex" xmlns:cx2="http://schemas.microsoft.com/office/drawing/2015/10/21/chartex" xmlns:cx3="http://schemas.microsoft.com/office/drawing/2016/5/9/chartex" xmlns:cx4="http://schemas.microsoft.com/office/drawing/2016/5/10/chartex" xmlns:cx5="http://schemas.microsoft.com/office/drawing/2016/5/11/chartex" xmlns:cx6="http://schemas.microsoft.com/office/drawing/2016/5/12/chartex" xmlns:cx7="http://schemas.microsoft.com/office/drawing/2016/5/13/chartex" xmlns:cx8="http://schemas.microsoft.com/office/drawing/2016/5/14/chartex" xmlns:mc="http://schemas.openxmlformats.org/markup-compatibility/2006" xmlns:aink="http://schemas.microsoft.com/office/drawing/2016/ink" xmlns:am3d="http://schemas.microsoft.com/office/drawing/2017/model3d" xmlns:o="urn:schemas-microsoft-com:office:office" xmlns:oel="http://schemas.microsoft.com/office/2019/extlst" xmlns:r="http://schemas.openxmlformats.org/officeDocument/2006/relationships" xmlns:m="http://schemas.openxmlformats.org/officeDocument/2006/math" xmlns:v="urn:schemas-microsoft-com:vml" xmlns:wp14="http://schemas.microsoft.com/office/word/2010/wordprocessingDrawing" xmlns:wp="http://schemas.openxmlformats.org/drawingml/2006/wordprocessingDrawing" xmlns:w10="urn:schemas-microsoft-com:office:word" xmlns:w="http://schemas.openxmlformats.org/wordprocessingml/2006/main" xmlns:w14="http://schemas.microsoft.com/office/word/2010/wordml" xmlns:w15="http://schemas.microsoft.com/office/word/2012/wordml" xmlns:w16cex="http://schemas.microsoft.com/office/word/2018/wordml/cex" xmlns:w16cid="http://schemas.microsoft.com/office/word/2016/wordml/cid" xmlns:w16="http://schemas.microsoft.com/office/word/2018/wordml" xmlns:w16du="http://schemas.microsoft.com/office/word/2023/wordml/word16du" xmlns:w16sdtdh="http://schemas.microsoft.com/office/word/2020/wordml/sdtdatahash" xmlns:w16sdtfl="http://schemas.microsoft.com/office/word/2024/wordml/sdtformatlock" xmlns:w16se="http://schemas.microsoft.com/office/word/2015/wordml/symex" xmlns:wpg="http://schemas.microsoft.com/office/word/2010/wordprocessingGroup" xmlns:wpi="http://schemas.microsoft.com/office/word/2010/wordprocessingInk" xmlns:wne="http://schemas.microsoft.com/office/word/2006/wordml" xmlns:wps="http://schemas.microsoft.com/office/word/2010/wordprocessingShape" mc:Ignorable="w14 w15 w16se w16cid w16 w16cex w16sdtdh w16sdtfl w16du wp14">
-  <w:p>
-    <w:pPr>
-      <w:pStyle w:val="Encabezado"/>
-    </w:pPr>
-  </w:p>
-</w:hdr>
-</file>
-
-<file path=word/header2.xml><?xml version="1.0" encoding="utf-8"?>
 <w:hdr xmlns:wpc="http://schemas.microsoft.com/office/word/2010/wordprocessingCanvas" xmlns:cx="http://schemas.microsoft.com/office/drawing/2014/chartex" xmlns:cx1="http://schemas.microsoft.com/office/drawing/2015/9/8/chartex" xmlns:cx2="http://schemas.microsoft.com/office/drawing/2015/10/21/chartex" xmlns:cx3="http://schemas.microsoft.com/office/drawing/2016/5/9/chartex" xmlns:cx4="http://schemas.microsoft.com/office/drawing/2016/5/10/chartex" xmlns:cx5="http://schemas.microsoft.com/office/drawing/2016/5/11/chartex" xmlns:cx6="http://schemas.microsoft.com/office/drawing/2016/5/12/chartex" xmlns:cx7="http://schemas.microsoft.com/office/drawing/2016/5/13/chartex" xmlns:cx8="http://schemas.microsoft.com/office/drawing/2016/5/14/chartex" xmlns:mc="http://schemas.openxmlformats.org/markup-compatibility/2006" xmlns:aink="http://schemas.microsoft.com/office/drawing/2016/ink" xmlns:am3d="http://schemas.microsoft.com/office/drawing/2017/model3d" xmlns:o="urn:schemas-microsoft-com:office:office" xmlns:oel="http://schemas.microsoft.com/office/2019/extlst" xmlns:r="http://schemas.openxmlformats.org/officeDocument/2006/relationships" xmlns:m="http://schemas.openxmlformats.org/officeDocument/2006/math" xmlns:v="urn:schemas-microsoft-com:vml" xmlns:wp14="http://schemas.microsoft.com/office/word/2010/wordprocessingDrawing" xmlns:wp="http://schemas.openxmlformats.org/drawingml/2006/wordprocessingDrawing" xmlns:w10="urn:schemas-microsoft-com:office:word" xmlns:w="http://schemas.openxmlformats.org/wordprocessingml/2006/main" xmlns:w14="http://schemas.microsoft.com/office/word/2010/wordml" xmlns:w15="http://schemas.microsoft.com/office/word/2012/wordml" xmlns:w16cex="http://schemas.microsoft.com/office/word/2018/wordml/cex" xmlns:w16cid="http://schemas.microsoft.com/office/word/2016/wordml/cid" xmlns:w16="http://schemas.microsoft.com/office/word/2018/wordml" xmlns:w16du="http://schemas.microsoft.com/office/word/2023/wordml/word16du" xmlns:w16sdtdh="http://schemas.microsoft.com/office/word/2020/wordml/sdtdatahash" xmlns:w16sdtfl="http://schemas.microsoft.com/office/word/2024/wordml/sdtformatlock" xmlns:w16se="http://schemas.microsoft.com/office/word/2015/wordml/symex" xmlns:wpg="http://schemas.microsoft.com/office/word/2010/wordprocessingGroup" xmlns:wpi="http://schemas.microsoft.com/office/word/2010/wordprocessingInk" xmlns:wne="http://schemas.microsoft.com/office/word/2006/wordml" xmlns:wps="http://schemas.microsoft.com/office/word/2010/wordprocessingShape" mc:Ignorable="w14 w15 w16se w16cid w16 w16cex w16sdtdh w16sdtfl w16du wp14">
   <w:p>
     <w:pPr>
@@ -13714,7 +13702,116 @@
       <mc:AlternateContent>
         <mc:Choice Requires="wps">
           <w:drawing>
-            <wp:anchor distT="0" distB="0" distL="0" distR="0" simplePos="0" relativeHeight="251711488" behindDoc="1" locked="0" layoutInCell="1" allowOverlap="1" wp14:anchorId="0898095E" wp14:editId="46718BDD">
+            <wp:anchor distT="0" distB="0" distL="0" distR="0" simplePos="0" relativeHeight="251651072" behindDoc="1" locked="0" layoutInCell="1" allowOverlap="1" wp14:anchorId="69BD5EE8" wp14:editId="71214753">
+              <wp:simplePos x="0" y="0"/>
+              <wp:positionH relativeFrom="page">
+                <wp:posOffset>5530215</wp:posOffset>
+              </wp:positionH>
+              <wp:positionV relativeFrom="page">
+                <wp:posOffset>2076780</wp:posOffset>
+              </wp:positionV>
+              <wp:extent cx="797357" cy="168249"/>
+              <wp:effectExtent l="0" t="0" r="0" b="0"/>
+              <wp:wrapNone/>
+              <wp:docPr id="13" name="Textbox 13"/>
+              <wp:cNvGraphicFramePr>
+                <a:graphicFrameLocks xmlns:a="http://schemas.openxmlformats.org/drawingml/2006/main"/>
+              </wp:cNvGraphicFramePr>
+              <a:graphic xmlns:a="http://schemas.openxmlformats.org/drawingml/2006/main">
+                <a:graphicData uri="http://schemas.microsoft.com/office/word/2010/wordprocessingShape">
+                  <wps:wsp>
+                    <wps:cNvSpPr txBox="1">
+                      <a:spLocks/>
+                    </wps:cNvSpPr>
+                    <wps:spPr>
+                      <a:xfrm>
+                        <a:off x="0" y="0"/>
+                        <a:ext cx="797357" cy="168249"/>
+                      </a:xfrm>
+                      <a:prstGeom prst="rect">
+                        <a:avLst/>
+                      </a:prstGeom>
+                    </wps:spPr>
+                    <wps:txbx>
+                      <w:txbxContent>
+                        <w:p>
+                          <w:pPr>
+                            <w:spacing w:before="12"/>
+                            <w:ind w:left="20"/>
+                            <w:jc w:val="center"/>
+                            <w:rPr>
+                              <w:sz w:val="18"/>
+                            </w:rPr>
+                          </w:pPr>
+                          <w:r>
+                            <w:rPr>
+                              <w:spacing w:val="-2"/>
+                              <w:sz w:val="18"/>
+                            </w:rPr>
+                            <w:t>{sexo}</w:t>
+                          </w:r>
+                        </w:p>
+                      </w:txbxContent>
+                    </wps:txbx>
+                    <wps:bodyPr wrap="square" lIns="0" tIns="0" rIns="0" bIns="0" rtlCol="0">
+                      <a:noAutofit/>
+                    </wps:bodyPr>
+                  </wps:wsp>
+                </a:graphicData>
+              </a:graphic>
+              <wp14:sizeRelH relativeFrom="margin">
+                <wp14:pctWidth>0</wp14:pctWidth>
+              </wp14:sizeRelH>
+              <wp14:sizeRelV relativeFrom="margin">
+                <wp14:pctHeight>0</wp14:pctHeight>
+              </wp14:sizeRelV>
+            </wp:anchor>
+          </w:drawing>
+        </mc:Choice>
+        <mc:Fallback>
+          <w:pict>
+            <v:shapetype w14:anchorId="69BD5EE8" id="_x0000_t202" coordsize="21600,21600" o:spt="202" path="m,l,21600r21600,l21600,xe">
+              <v:stroke joinstyle="miter"/>
+              <v:path gradientshapeok="t" o:connecttype="rect"/>
+            </v:shapetype>
+            <v:shape id="Textbox 13" o:spid="_x0000_s1026" type="#_x0000_t202" style="position:absolute;margin-left:435.45pt;margin-top:163.55pt;width:92pt;height:13.25pt;z-index:-251665408;visibility:visible;mso-wrap-style:square;mso-width-percent:0;mso-height-percent:0;mso-wrap-distance-left:0;mso-wrap-distance-top:0;mso-wrap-distance-right:0;mso-wrap-distance-bottom:0;mso-position-horizontal:absolute;mso-position-horizontal-relative:page;mso-position-vertical:absolute;mso-position-vertical-relative:page;mso-width-percent:0;mso-height-percent:0;mso-width-relative:margin;mso-height-relative:margin;v-text-anchor:top" o:gfxdata="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" filled="f" stroked="f">
+              <v:textbox inset="0,0,0,0">
+                <w:txbxContent>
+                  <w:p>
+                    <w:pPr>
+                      <w:spacing w:before="12"/>
+                      <w:ind w:left="20"/>
+                      <w:jc w:val="center"/>
+                      <w:rPr>
+                        <w:sz w:val="18"/>
+                      </w:rPr>
+                    </w:pPr>
+                    <w:r>
+                      <w:rPr>
+                        <w:spacing w:val="-2"/>
+                        <w:sz w:val="18"/>
+                      </w:rPr>
+                      <w:t>{sexo}</w:t>
+                    </w:r>
+                  </w:p>
+                </w:txbxContent>
+              </v:textbox>
+              <w10:wrap anchorx="page" anchory="page"/>
+            </v:shape>
+          </w:pict>
+        </mc:Fallback>
+      </mc:AlternateContent>
+    </w:r>
+    <w:r>
+      <w:rPr>
+        <w:i w:val="0"/>
+        <w:noProof/>
+        <w:sz w:val="20"/>
+      </w:rPr>
+      <mc:AlternateContent>
+        <mc:Choice Requires="wps">
+          <w:drawing>
+            <wp:anchor distT="0" distB="0" distL="0" distR="0" simplePos="0" relativeHeight="251657216" behindDoc="1" locked="0" layoutInCell="1" allowOverlap="1" wp14:anchorId="0898095E" wp14:editId="5EF0EB65">
               <wp:simplePos x="0" y="0"/>
               <wp:positionH relativeFrom="page">
                 <wp:posOffset>6353175</wp:posOffset>
@@ -13797,11 +13894,7 @@
         </mc:Choice>
         <mc:Fallback>
           <w:pict>
-            <v:shapetype w14:anchorId="0898095E" id="_x0000_t202" coordsize="21600,21600" o:spt="202" path="m,l,21600r21600,l21600,xe">
-              <v:stroke joinstyle="miter"/>
-              <v:path gradientshapeok="t" o:connecttype="rect"/>
-            </v:shapetype>
-            <v:shape id="Textbox 14" o:spid="_x0000_s1026" type="#_x0000_t202" style="position:absolute;margin-left:500.25pt;margin-top:162.75pt;width:51.25pt;height:15pt;z-index:-251604992;visibility:visible;mso-wrap-style:square;mso-width-percent:0;mso-height-percent:0;mso-wrap-distance-left:0;mso-wrap-distance-top:0;mso-wrap-distance-right:0;mso-wrap-distance-bottom:0;mso-position-horizontal:absolute;mso-position-horizontal-relative:page;mso-position-vertical:absolute;mso-position-vertical-relative:page;mso-width-percent:0;mso-height-percent:0;mso-width-relative:margin;mso-height-relative:margin;v-text-anchor:top" o:gfxdata="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" filled="f" stroked="f">
+            <v:shape w14:anchorId="0898095E" id="Textbox 14" o:spid="_x0000_s1027" type="#_x0000_t202" style="position:absolute;margin-left:500.25pt;margin-top:162.75pt;width:51.25pt;height:15pt;z-index:-251659264;visibility:visible;mso-wrap-style:square;mso-width-percent:0;mso-height-percent:0;mso-wrap-distance-left:0;mso-wrap-distance-top:0;mso-wrap-distance-right:0;mso-wrap-distance-bottom:0;mso-position-horizontal:absolute;mso-position-horizontal-relative:page;mso-position-vertical:absolute;mso-position-vertical-relative:page;mso-width-percent:0;mso-height-percent:0;mso-width-relative:margin;mso-height-relative:margin;v-text-anchor:top" o:gfxdata="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" filled="f" stroked="f">
               <v:textbox inset="0,0,0,0">
                 <w:txbxContent>
                   <w:p>
@@ -13853,107 +13946,7 @@
       <mc:AlternateContent>
         <mc:Choice Requires="wps">
           <w:drawing>
-            <wp:anchor distT="0" distB="0" distL="0" distR="0" simplePos="0" relativeHeight="251707392" behindDoc="1" locked="0" layoutInCell="1" allowOverlap="1" wp14:anchorId="69BD5EE8" wp14:editId="2D8E03C0">
-              <wp:simplePos x="0" y="0"/>
-              <wp:positionH relativeFrom="page">
-                <wp:posOffset>5778109</wp:posOffset>
-              </wp:positionH>
-              <wp:positionV relativeFrom="page">
-                <wp:posOffset>2075632</wp:posOffset>
-              </wp:positionV>
-              <wp:extent cx="342199" cy="152400"/>
-              <wp:effectExtent l="0" t="0" r="0" b="0"/>
-              <wp:wrapNone/>
-              <wp:docPr id="13" name="Textbox 13"/>
-              <wp:cNvGraphicFramePr>
-                <a:graphicFrameLocks xmlns:a="http://schemas.openxmlformats.org/drawingml/2006/main"/>
-              </wp:cNvGraphicFramePr>
-              <a:graphic xmlns:a="http://schemas.openxmlformats.org/drawingml/2006/main">
-                <a:graphicData uri="http://schemas.microsoft.com/office/word/2010/wordprocessingShape">
-                  <wps:wsp>
-                    <wps:cNvSpPr txBox="1">
-                      <a:spLocks/>
-                    </wps:cNvSpPr>
-                    <wps:spPr>
-                      <a:xfrm>
-                        <a:off x="0" y="0"/>
-                        <a:ext cx="342199" cy="152400"/>
-                      </a:xfrm>
-                      <a:prstGeom prst="rect">
-                        <a:avLst/>
-                      </a:prstGeom>
-                    </wps:spPr>
-                    <wps:txbx>
-                      <w:txbxContent>
-                        <w:p>
-                          <w:pPr>
-                            <w:spacing w:before="12"/>
-                            <w:ind w:left="20"/>
-                            <w:rPr>
-                              <w:sz w:val="18"/>
-                            </w:rPr>
-                          </w:pPr>
-                          <w:r>
-                            <w:rPr>
-                              <w:spacing w:val="-2"/>
-                              <w:sz w:val="18"/>
-                            </w:rPr>
-                            <w:t>{sexo}</w:t>
-                          </w:r>
-                        </w:p>
-                      </w:txbxContent>
-                    </wps:txbx>
-                    <wps:bodyPr wrap="square" lIns="0" tIns="0" rIns="0" bIns="0" rtlCol="0">
-                      <a:noAutofit/>
-                    </wps:bodyPr>
-                  </wps:wsp>
-                </a:graphicData>
-              </a:graphic>
-              <wp14:sizeRelH relativeFrom="margin">
-                <wp14:pctWidth>0</wp14:pctWidth>
-              </wp14:sizeRelH>
-            </wp:anchor>
-          </w:drawing>
-        </mc:Choice>
-        <mc:Fallback>
-          <w:pict>
-            <v:shape w14:anchorId="69BD5EE8" id="Textbox 13" o:spid="_x0000_s1027" type="#_x0000_t202" style="position:absolute;margin-left:454.95pt;margin-top:163.45pt;width:26.95pt;height:12pt;z-index:-251609088;visibility:visible;mso-wrap-style:square;mso-width-percent:0;mso-wrap-distance-left:0;mso-wrap-distance-top:0;mso-wrap-distance-right:0;mso-wrap-distance-bottom:0;mso-position-horizontal:absolute;mso-position-horizontal-relative:page;mso-position-vertical:absolute;mso-position-vertical-relative:page;mso-width-percent:0;mso-width-relative:margin;v-text-anchor:top" o:gfxdata="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" filled="f" stroked="f">
-              <v:textbox inset="0,0,0,0">
-                <w:txbxContent>
-                  <w:p>
-                    <w:pPr>
-                      <w:spacing w:before="12"/>
-                      <w:ind w:left="20"/>
-                      <w:rPr>
-                        <w:sz w:val="18"/>
-                      </w:rPr>
-                    </w:pPr>
-                    <w:r>
-                      <w:rPr>
-                        <w:spacing w:val="-2"/>
-                        <w:sz w:val="18"/>
-                      </w:rPr>
-                      <w:t>{sexo}</w:t>
-                    </w:r>
-                  </w:p>
-                </w:txbxContent>
-              </v:textbox>
-              <w10:wrap anchorx="page" anchory="page"/>
-            </v:shape>
-          </w:pict>
-        </mc:Fallback>
-      </mc:AlternateContent>
-    </w:r>
-    <w:r>
-      <w:rPr>
-        <w:i w:val="0"/>
-        <w:noProof/>
-        <w:sz w:val="20"/>
-      </w:rPr>
-      <mc:AlternateContent>
-        <mc:Choice Requires="wps">
-          <w:drawing>
-            <wp:anchor distT="0" distB="0" distL="0" distR="0" simplePos="0" relativeHeight="251688960" behindDoc="1" locked="0" layoutInCell="1" allowOverlap="1" wp14:anchorId="6997D6B6" wp14:editId="72983E13">
+            <wp:anchor distT="0" distB="0" distL="0" distR="0" simplePos="0" relativeHeight="251643904" behindDoc="1" locked="0" layoutInCell="1" allowOverlap="1" wp14:anchorId="6997D6B6" wp14:editId="72983E13">
               <wp:simplePos x="0" y="0"/>
               <wp:positionH relativeFrom="page">
                 <wp:posOffset>6900074</wp:posOffset>
@@ -14044,7 +14037,7 @@
         </mc:Choice>
         <mc:Fallback>
           <w:pict>
-            <v:shape w14:anchorId="6997D6B6" id="Textbox 10" o:spid="_x0000_s1028" type="#_x0000_t202" style="position:absolute;margin-left:543.3pt;margin-top:140.9pt;width:41.5pt;height:12pt;z-index:-251627520;visibility:visible;mso-wrap-style:square;mso-width-percent:0;mso-wrap-distance-left:0;mso-wrap-distance-top:0;mso-wrap-distance-right:0;mso-wrap-distance-bottom:0;mso-position-horizontal:absolute;mso-position-horizontal-relative:page;mso-position-vertical:absolute;mso-position-vertical-relative:page;mso-width-percent:0;mso-width-relative:margin;v-text-anchor:top" o:gfxdata="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" filled="f" stroked="f">
+            <v:shape w14:anchorId="6997D6B6" id="Textbox 10" o:spid="_x0000_s1028" type="#_x0000_t202" style="position:absolute;margin-left:543.3pt;margin-top:140.9pt;width:41.5pt;height:12pt;z-index:-251672576;visibility:visible;mso-wrap-style:square;mso-width-percent:0;mso-wrap-distance-left:0;mso-wrap-distance-top:0;mso-wrap-distance-right:0;mso-wrap-distance-bottom:0;mso-position-horizontal:absolute;mso-position-horizontal-relative:page;mso-position-vertical:absolute;mso-position-vertical-relative:page;mso-width-percent:0;mso-width-relative:margin;v-text-anchor:top" o:gfxdata="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" filled="f" stroked="f">
               <v:textbox inset="0,0,0,0">
                 <w:txbxContent>
                   <w:p>
@@ -14107,7 +14100,7 @@
       <mc:AlternateContent>
         <mc:Choice Requires="wps">
           <w:drawing>
-            <wp:anchor distT="0" distB="0" distL="0" distR="0" simplePos="0" relativeHeight="251680768" behindDoc="1" locked="0" layoutInCell="1" allowOverlap="1" wp14:anchorId="748918DC" wp14:editId="42CA9B3A">
+            <wp:anchor distT="0" distB="0" distL="0" distR="0" simplePos="0" relativeHeight="251641856" behindDoc="1" locked="0" layoutInCell="1" allowOverlap="1" wp14:anchorId="748918DC" wp14:editId="42CA9B3A">
               <wp:simplePos x="0" y="0"/>
               <wp:positionH relativeFrom="page">
                 <wp:posOffset>5222739</wp:posOffset>
@@ -14245,7 +14238,7 @@
         </mc:Choice>
         <mc:Fallback>
           <w:pict>
-            <v:shape w14:anchorId="748918DC" id="Textbox 9" o:spid="_x0000_s1029" type="#_x0000_t202" style="position:absolute;margin-left:411.25pt;margin-top:140.9pt;width:128.1pt;height:12.45pt;z-index:-251635712;visibility:visible;mso-wrap-style:square;mso-width-percent:0;mso-wrap-distance-left:0;mso-wrap-distance-top:0;mso-wrap-distance-right:0;mso-wrap-distance-bottom:0;mso-position-horizontal:absolute;mso-position-horizontal-relative:page;mso-position-vertical:absolute;mso-position-vertical-relative:page;mso-width-percent:0;mso-width-relative:margin;v-text-anchor:top" o:gfxdata="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" filled="f" stroked="f">
+            <v:shape w14:anchorId="748918DC" id="Textbox 9" o:spid="_x0000_s1029" type="#_x0000_t202" style="position:absolute;margin-left:411.25pt;margin-top:140.9pt;width:128.1pt;height:12.45pt;z-index:-251674624;visibility:visible;mso-wrap-style:square;mso-width-percent:0;mso-wrap-distance-left:0;mso-wrap-distance-top:0;mso-wrap-distance-right:0;mso-wrap-distance-bottom:0;mso-position-horizontal:absolute;mso-position-horizontal-relative:page;mso-position-vertical:absolute;mso-position-vertical-relative:page;mso-width-percent:0;mso-width-relative:margin;v-text-anchor:top" o:gfxdata="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" filled="f" stroked="f">
               <v:textbox inset="0,0,0,0">
                 <w:txbxContent>
                   <w:p>
@@ -14355,7 +14348,7 @@
       <mc:AlternateContent>
         <mc:Choice Requires="wps">
           <w:drawing>
-            <wp:anchor distT="0" distB="0" distL="0" distR="0" simplePos="0" relativeHeight="251670528" behindDoc="1" locked="0" layoutInCell="1" allowOverlap="1" wp14:anchorId="6BC1ADC5" wp14:editId="1E075418">
+            <wp:anchor distT="0" distB="0" distL="0" distR="0" simplePos="0" relativeHeight="251639808" behindDoc="1" locked="0" layoutInCell="1" allowOverlap="1" wp14:anchorId="6BC1ADC5" wp14:editId="1E075418">
               <wp:simplePos x="0" y="0"/>
               <wp:positionH relativeFrom="page">
                 <wp:posOffset>6748609</wp:posOffset>
@@ -14435,7 +14428,7 @@
         </mc:Choice>
         <mc:Fallback>
           <w:pict>
-            <v:shape w14:anchorId="6BC1ADC5" id="Textbox 8" o:spid="_x0000_s1030" type="#_x0000_t202" style="position:absolute;margin-left:531.4pt;margin-top:117.95pt;width:47.7pt;height:12pt;z-index:-251645952;visibility:visible;mso-wrap-style:square;mso-width-percent:0;mso-wrap-distance-left:0;mso-wrap-distance-top:0;mso-wrap-distance-right:0;mso-wrap-distance-bottom:0;mso-position-horizontal:absolute;mso-position-horizontal-relative:page;mso-position-vertical:absolute;mso-position-vertical-relative:page;mso-width-percent:0;mso-width-relative:margin;v-text-anchor:top" o:gfxdata="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" filled="f" stroked="f">
+            <v:shape w14:anchorId="6BC1ADC5" id="Textbox 8" o:spid="_x0000_s1030" type="#_x0000_t202" style="position:absolute;margin-left:531.4pt;margin-top:117.95pt;width:47.7pt;height:12pt;z-index:-251676672;visibility:visible;mso-wrap-style:square;mso-width-percent:0;mso-wrap-distance-left:0;mso-wrap-distance-top:0;mso-wrap-distance-right:0;mso-wrap-distance-bottom:0;mso-position-horizontal:absolute;mso-position-horizontal-relative:page;mso-position-vertical:absolute;mso-position-vertical-relative:page;mso-width-percent:0;mso-width-relative:margin;v-text-anchor:top" o:gfxdata="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" filled="f" stroked="f">
               <v:textbox inset="0,0,0,0">
                 <w:txbxContent>
                   <w:p>
@@ -14487,7 +14480,7 @@
       <mc:AlternateContent>
         <mc:Choice Requires="wps">
           <w:drawing>
-            <wp:anchor distT="0" distB="0" distL="0" distR="0" simplePos="0" relativeHeight="251658240" behindDoc="1" locked="0" layoutInCell="1" allowOverlap="1" wp14:anchorId="6C53B098" wp14:editId="0AC9F008">
+            <wp:anchor distT="0" distB="0" distL="0" distR="0" simplePos="0" relativeHeight="251637760" behindDoc="1" locked="0" layoutInCell="1" allowOverlap="1" wp14:anchorId="6C53B098" wp14:editId="0AC9F008">
               <wp:simplePos x="0" y="0"/>
               <wp:positionH relativeFrom="page">
                 <wp:posOffset>5222739</wp:posOffset>
@@ -14612,7 +14605,7 @@
         </mc:Choice>
         <mc:Fallback>
           <w:pict>
-            <v:shape w14:anchorId="6C53B098" id="Textbox 7" o:spid="_x0000_s1031" type="#_x0000_t202" style="position:absolute;margin-left:411.25pt;margin-top:117.95pt;width:113.95pt;height:12pt;z-index:-251658240;visibility:visible;mso-wrap-style:square;mso-width-percent:0;mso-wrap-distance-left:0;mso-wrap-distance-top:0;mso-wrap-distance-right:0;mso-wrap-distance-bottom:0;mso-position-horizontal:absolute;mso-position-horizontal-relative:page;mso-position-vertical:absolute;mso-position-vertical-relative:page;mso-width-percent:0;mso-width-relative:margin;v-text-anchor:top" o:gfxdata="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" filled="f" stroked="f">
+            <v:shape w14:anchorId="6C53B098" id="Textbox 7" o:spid="_x0000_s1031" type="#_x0000_t202" style="position:absolute;margin-left:411.25pt;margin-top:117.95pt;width:113.95pt;height:12pt;z-index:-251678720;visibility:visible;mso-wrap-style:square;mso-width-percent:0;mso-wrap-distance-left:0;mso-wrap-distance-top:0;mso-wrap-distance-right:0;mso-wrap-distance-bottom:0;mso-position-horizontal:absolute;mso-position-horizontal-relative:page;mso-position-vertical:absolute;mso-position-vertical-relative:page;mso-width-percent:0;mso-width-relative:margin;v-text-anchor:top" o:gfxdata="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" filled="f" stroked="f">
               <v:textbox inset="0,0,0,0">
                 <w:txbxContent>
                   <w:p>
@@ -14709,7 +14702,7 @@
       <mc:AlternateContent>
         <mc:Choice Requires="wps">
           <w:drawing>
-            <wp:anchor distT="0" distB="0" distL="0" distR="0" simplePos="0" relativeHeight="251727872" behindDoc="1" locked="0" layoutInCell="1" allowOverlap="1" wp14:anchorId="4106CB45" wp14:editId="14450084">
+            <wp:anchor distT="0" distB="0" distL="0" distR="0" simplePos="0" relativeHeight="251653120" behindDoc="1" locked="0" layoutInCell="1" allowOverlap="1" wp14:anchorId="4106CB45" wp14:editId="1561BC61">
               <wp:simplePos x="0" y="0"/>
               <wp:positionH relativeFrom="page">
                 <wp:posOffset>201952</wp:posOffset>
@@ -14801,7 +14794,7 @@
         </mc:Choice>
         <mc:Fallback>
           <w:pict>
-            <v:shape w14:anchorId="4106CB45" id="Textbox 16" o:spid="_x0000_s1032" type="#_x0000_t202" style="position:absolute;margin-left:15.9pt;margin-top:165.65pt;width:354.25pt;height:12pt;z-index:-251588608;visibility:visible;mso-wrap-style:square;mso-width-percent:0;mso-wrap-distance-left:0;mso-wrap-distance-top:0;mso-wrap-distance-right:0;mso-wrap-distance-bottom:0;mso-position-horizontal:absolute;mso-position-horizontal-relative:page;mso-position-vertical:absolute;mso-position-vertical-relative:page;mso-width-percent:0;mso-width-relative:margin;v-text-anchor:top" o:gfxdata="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" filled="f" stroked="f">
+            <v:shape w14:anchorId="4106CB45" id="Textbox 16" o:spid="_x0000_s1032" type="#_x0000_t202" style="position:absolute;margin-left:15.9pt;margin-top:165.65pt;width:354.25pt;height:12pt;z-index:-251663360;visibility:visible;mso-wrap-style:square;mso-width-percent:0;mso-wrap-distance-left:0;mso-wrap-distance-top:0;mso-wrap-distance-right:0;mso-wrap-distance-bottom:0;mso-position-horizontal:absolute;mso-position-horizontal-relative:page;mso-position-vertical:absolute;mso-position-vertical-relative:page;mso-width-percent:0;mso-width-relative:margin;v-text-anchor:top" o:gfxdata="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" filled="f" stroked="f">
               <v:textbox inset="0,0,0,0">
                 <w:txbxContent>
                   <w:p>
@@ -14863,7 +14856,7 @@
         <w:sz w:val="20"/>
       </w:rPr>
       <w:drawing>
-        <wp:anchor distT="0" distB="0" distL="0" distR="0" simplePos="0" relativeHeight="251600896" behindDoc="1" locked="0" layoutInCell="1" allowOverlap="1" wp14:anchorId="750A143C" wp14:editId="1EB72933">
+        <wp:anchor distT="0" distB="0" distL="0" distR="0" simplePos="0" relativeHeight="251629568" behindDoc="1" locked="0" layoutInCell="1" allowOverlap="1" wp14:anchorId="750A143C" wp14:editId="1EB72933">
           <wp:simplePos x="0" y="0"/>
           <wp:positionH relativeFrom="page">
             <wp:posOffset>108586</wp:posOffset>
@@ -14915,7 +14908,7 @@
       <mc:AlternateContent>
         <mc:Choice Requires="wpg">
           <w:drawing>
-            <wp:anchor distT="0" distB="0" distL="0" distR="0" simplePos="0" relativeHeight="251615232" behindDoc="1" locked="0" layoutInCell="1" allowOverlap="1" wp14:anchorId="73B4567A" wp14:editId="68667510">
+            <wp:anchor distT="0" distB="0" distL="0" distR="0" simplePos="0" relativeHeight="251631616" behindDoc="1" locked="0" layoutInCell="1" allowOverlap="1" wp14:anchorId="73B4567A" wp14:editId="68667510">
               <wp:simplePos x="0" y="0"/>
               <wp:positionH relativeFrom="page">
                 <wp:posOffset>214617</wp:posOffset>
@@ -15809,7 +15802,7 @@
         </mc:Choice>
         <mc:Fallback>
           <w:pict>
-            <v:group w14:anchorId="005CF779" id="Group 2" o:spid="_x0000_s1026" style="position:absolute;margin-left:16.9pt;margin-top:112.8pt;width:564.05pt;height:67.6pt;z-index:-251701248;mso-wrap-distance-left:0;mso-wrap-distance-right:0;mso-position-horizontal-relative:page;mso-position-vertical-relative:page" coordsize="71634,8585" o:gfxdata="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">
+            <v:group w14:anchorId="1B329507" id="Group 2" o:spid="_x0000_s1026" style="position:absolute;margin-left:16.9pt;margin-top:112.8pt;width:564.05pt;height:67.6pt;z-index:-251684864;mso-wrap-distance-left:0;mso-wrap-distance-right:0;mso-position-horizontal-relative:page;mso-position-vertical-relative:page" coordsize="71634,8585" o:gfxdata="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">
               <v:shape id="Graphic 3" o:spid="_x0000_s1027" style="position:absolute;width:71634;height:8585;visibility:visible;mso-wrap-style:square;v-text-anchor:top" coordsize="7163434,858519" o:gfxdata="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" path="m5004066,l3024136,r,7620l3024136,160020r-1524,l3022612,177800r,7620l3022612,655320r-25400,l2997212,185420r12700,l3009912,177800r,-17780l3009912,7620r-1219200,l1790712,160020r,17780l1790712,185420r,469900l660400,655320r,40640l,695960,,858520r4991112,l4991112,695960r,-40640l4991112,185420r,-7620l5004066,177800r,-17780l5004066,7620r,-7620xem7162813,7620r-1333501,l5829312,7239r-812800,l5016512,858139r355600,l5372112,858520r787400,l6159512,858139r1003301,l7162813,7620xe" fillcolor="#eae4e4" stroked="f">
                 <v:path arrowok="t"/>
               </v:shape>
@@ -15831,7 +15824,7 @@
       <mc:AlternateContent>
         <mc:Choice Requires="wps">
           <w:drawing>
-            <wp:anchor distT="0" distB="0" distL="0" distR="0" simplePos="0" relativeHeight="251629568" behindDoc="1" locked="0" layoutInCell="1" allowOverlap="1" wp14:anchorId="3DA5D2A3" wp14:editId="1D8E794E">
+            <wp:anchor distT="0" distB="0" distL="0" distR="0" simplePos="0" relativeHeight="251633664" behindDoc="1" locked="0" layoutInCell="1" allowOverlap="1" wp14:anchorId="3DA5D2A3" wp14:editId="1D8E794E">
               <wp:simplePos x="0" y="0"/>
               <wp:positionH relativeFrom="page">
                 <wp:posOffset>3224910</wp:posOffset>
@@ -15999,7 +15992,7 @@
         </mc:Choice>
         <mc:Fallback>
           <w:pict>
-            <v:shape w14:anchorId="3DA5D2A3" id="Textbox 5" o:spid="_x0000_s1033" type="#_x0000_t202" style="position:absolute;margin-left:253.95pt;margin-top:113.15pt;width:104.45pt;height:50.85pt;z-index:-251686912;visibility:visible;mso-wrap-style:square;mso-wrap-distance-left:0;mso-wrap-distance-top:0;mso-wrap-distance-right:0;mso-wrap-distance-bottom:0;mso-position-horizontal:absolute;mso-position-horizontal-relative:page;mso-position-vertical:absolute;mso-position-vertical-relative:page;v-text-anchor:top" o:gfxdata="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" filled="f" stroked="f">
+            <v:shape w14:anchorId="3DA5D2A3" id="Textbox 5" o:spid="_x0000_s1033" type="#_x0000_t202" style="position:absolute;margin-left:253.95pt;margin-top:113.15pt;width:104.45pt;height:50.85pt;z-index:-251682816;visibility:visible;mso-wrap-style:square;mso-wrap-distance-left:0;mso-wrap-distance-top:0;mso-wrap-distance-right:0;mso-wrap-distance-bottom:0;mso-position-horizontal:absolute;mso-position-horizontal-relative:page;mso-position-vertical:absolute;mso-position-vertical-relative:page;v-text-anchor:top" o:gfxdata="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" filled="f" stroked="f">
               <v:textbox inset="0,0,0,0">
                 <w:txbxContent>
                   <w:p>
@@ -16142,7 +16135,7 @@
       <mc:AlternateContent>
         <mc:Choice Requires="wps">
           <w:drawing>
-            <wp:anchor distT="0" distB="0" distL="0" distR="0" simplePos="0" relativeHeight="251643904" behindDoc="1" locked="0" layoutInCell="1" allowOverlap="1" wp14:anchorId="7DD060C0" wp14:editId="6F7C9F14">
+            <wp:anchor distT="0" distB="0" distL="0" distR="0" simplePos="0" relativeHeight="251635712" behindDoc="1" locked="0" layoutInCell="1" allowOverlap="1" wp14:anchorId="7DD060C0" wp14:editId="6F7C9F14">
               <wp:simplePos x="0" y="0"/>
               <wp:positionH relativeFrom="page">
                 <wp:posOffset>1993138</wp:posOffset>
@@ -16308,7 +16301,7 @@
         </mc:Choice>
         <mc:Fallback>
           <w:pict>
-            <v:shape w14:anchorId="7DD060C0" id="Textbox 6" o:spid="_x0000_s1034" type="#_x0000_t202" style="position:absolute;margin-left:156.95pt;margin-top:113.5pt;width:82.85pt;height:48.95pt;z-index:-251672576;visibility:visible;mso-wrap-style:square;mso-wrap-distance-left:0;mso-wrap-distance-top:0;mso-wrap-distance-right:0;mso-wrap-distance-bottom:0;mso-position-horizontal:absolute;mso-position-horizontal-relative:page;mso-position-vertical:absolute;mso-position-vertical-relative:page;v-text-anchor:top" o:gfxdata="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" filled="f" stroked="f">
+            <v:shape w14:anchorId="7DD060C0" id="Textbox 6" o:spid="_x0000_s1034" type="#_x0000_t202" style="position:absolute;margin-left:156.95pt;margin-top:113.5pt;width:82.85pt;height:48.95pt;z-index:-251680768;visibility:visible;mso-wrap-style:square;mso-wrap-distance-left:0;mso-wrap-distance-top:0;mso-wrap-distance-right:0;mso-wrap-distance-bottom:0;mso-position-horizontal:absolute;mso-position-horizontal-relative:page;mso-position-vertical:absolute;mso-position-vertical-relative:page;v-text-anchor:top" o:gfxdata="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" filled="f" stroked="f">
               <v:textbox inset="0,0,0,0">
                 <w:txbxContent>
                   <w:p>
@@ -16449,7 +16442,7 @@
       <mc:AlternateContent>
         <mc:Choice Requires="wps">
           <w:drawing>
-            <wp:anchor distT="0" distB="0" distL="0" distR="0" simplePos="0" relativeHeight="251695104" behindDoc="1" locked="0" layoutInCell="1" allowOverlap="1" wp14:anchorId="1A629CDB" wp14:editId="54284BA2">
+            <wp:anchor distT="0" distB="0" distL="0" distR="0" simplePos="0" relativeHeight="251645952" behindDoc="1" locked="0" layoutInCell="1" allowOverlap="1" wp14:anchorId="1A629CDB" wp14:editId="54284BA2">
               <wp:simplePos x="0" y="0"/>
               <wp:positionH relativeFrom="page">
                 <wp:posOffset>691692</wp:posOffset>
@@ -16527,7 +16520,7 @@
         </mc:Choice>
         <mc:Fallback>
           <w:pict>
-            <v:shape w14:anchorId="1A629CDB" id="Textbox 11" o:spid="_x0000_s1035" type="#_x0000_t202" style="position:absolute;margin-left:54.45pt;margin-top:150.6pt;width:63.65pt;height:12pt;z-index:-251621376;visibility:visible;mso-wrap-style:square;mso-wrap-distance-left:0;mso-wrap-distance-top:0;mso-wrap-distance-right:0;mso-wrap-distance-bottom:0;mso-position-horizontal:absolute;mso-position-horizontal-relative:page;mso-position-vertical:absolute;mso-position-vertical-relative:page;v-text-anchor:top" o:gfxdata="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" filled="f" stroked="f">
+            <v:shape w14:anchorId="1A629CDB" id="Textbox 11" o:spid="_x0000_s1035" type="#_x0000_t202" style="position:absolute;margin-left:54.45pt;margin-top:150.6pt;width:63.65pt;height:12pt;z-index:-251670528;visibility:visible;mso-wrap-style:square;mso-wrap-distance-left:0;mso-wrap-distance-top:0;mso-wrap-distance-right:0;mso-wrap-distance-bottom:0;mso-position-horizontal:absolute;mso-position-horizontal-relative:page;mso-position-vertical:absolute;mso-position-vertical-relative:page;v-text-anchor:top" o:gfxdata="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" filled="f" stroked="f">
               <v:textbox inset="0,0,0,0">
                 <w:txbxContent>
                   <w:p>
@@ -16580,7 +16573,7 @@
       <mc:AlternateContent>
         <mc:Choice Requires="wps">
           <w:drawing>
-            <wp:anchor distT="0" distB="0" distL="0" distR="0" simplePos="0" relativeHeight="251701248" behindDoc="1" locked="0" layoutInCell="1" allowOverlap="1" wp14:anchorId="28EA7589" wp14:editId="1EB763C2">
+            <wp:anchor distT="0" distB="0" distL="0" distR="0" simplePos="0" relativeHeight="251648000" behindDoc="1" locked="0" layoutInCell="1" allowOverlap="1" wp14:anchorId="28EA7589" wp14:editId="1EB763C2">
               <wp:simplePos x="0" y="0"/>
               <wp:positionH relativeFrom="page">
                 <wp:posOffset>5221985</wp:posOffset>
@@ -16643,7 +16636,7 @@
         </mc:Choice>
         <mc:Fallback>
           <w:pict>
-            <v:shape w14:anchorId="28EA7589" id="Textbox 12" o:spid="_x0000_s1036" type="#_x0000_t202" style="position:absolute;margin-left:411.2pt;margin-top:163.45pt;width:22.65pt;height:12pt;z-index:-251615232;visibility:visible;mso-wrap-style:square;mso-wrap-distance-left:0;mso-wrap-distance-top:0;mso-wrap-distance-right:0;mso-wrap-distance-bottom:0;mso-position-horizontal:absolute;mso-position-horizontal-relative:page;mso-position-vertical:absolute;mso-position-vertical-relative:page;v-text-anchor:top" o:gfxdata="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" filled="f" stroked="f">
+            <v:shape w14:anchorId="28EA7589" id="Textbox 12" o:spid="_x0000_s1036" type="#_x0000_t202" style="position:absolute;margin-left:411.2pt;margin-top:163.45pt;width:22.65pt;height:12pt;z-index:-251668480;visibility:visible;mso-wrap-style:square;mso-wrap-distance-left:0;mso-wrap-distance-top:0;mso-wrap-distance-right:0;mso-wrap-distance-bottom:0;mso-position-horizontal:absolute;mso-position-horizontal-relative:page;mso-position-vertical:absolute;mso-position-vertical-relative:page;v-text-anchor:top" o:gfxdata="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" filled="f" stroked="f">
               <v:textbox inset="0,0,0,0">
                 <w:txbxContent>
                   <w:p>
@@ -16681,7 +16674,7 @@
       <mc:AlternateContent>
         <mc:Choice Requires="wps">
           <w:drawing>
-            <wp:anchor distT="0" distB="0" distL="0" distR="0" simplePos="0" relativeHeight="251713536" behindDoc="1" locked="0" layoutInCell="1" allowOverlap="1" wp14:anchorId="25BF1F03" wp14:editId="7C525E9B">
+            <wp:anchor distT="0" distB="0" distL="0" distR="0" simplePos="0" relativeHeight="251650048" behindDoc="1" locked="0" layoutInCell="1" allowOverlap="1" wp14:anchorId="25BF1F03" wp14:editId="25A97604">
               <wp:simplePos x="0" y="0"/>
               <wp:positionH relativeFrom="page">
                 <wp:posOffset>7035800</wp:posOffset>
@@ -16744,7 +16737,7 @@
         </mc:Choice>
         <mc:Fallback>
           <w:pict>
-            <v:shape w14:anchorId="25BF1F03" id="Textbox 15" o:spid="_x0000_s1037" type="#_x0000_t202" style="position:absolute;margin-left:554pt;margin-top:162.95pt;width:20.9pt;height:12pt;z-index:-251602944;visibility:visible;mso-wrap-style:square;mso-wrap-distance-left:0;mso-wrap-distance-top:0;mso-wrap-distance-right:0;mso-wrap-distance-bottom:0;mso-position-horizontal:absolute;mso-position-horizontal-relative:page;mso-position-vertical:absolute;mso-position-vertical-relative:page;v-text-anchor:top" o:gfxdata="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" filled="f" stroked="f">
+            <v:shape w14:anchorId="25BF1F03" id="Textbox 15" o:spid="_x0000_s1037" type="#_x0000_t202" style="position:absolute;margin-left:554pt;margin-top:162.95pt;width:20.9pt;height:12pt;z-index:-251666432;visibility:visible;mso-wrap-style:square;mso-wrap-distance-left:0;mso-wrap-distance-top:0;mso-wrap-distance-right:0;mso-wrap-distance-bottom:0;mso-position-horizontal:absolute;mso-position-horizontal-relative:page;mso-position-vertical:absolute;mso-position-vertical-relative:page;v-text-anchor:top" o:gfxdata="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" filled="f" stroked="f">
               <v:textbox inset="0,0,0,0">
                 <w:txbxContent>
                   <w:p>
@@ -16777,17 +16770,7 @@
 </w:hdr>
 </file>
 
-<file path=word/header3.xml><?xml version="1.0" encoding="utf-8"?>
-<w:hdr xmlns:wpc="http://schemas.microsoft.com/office/word/2010/wordprocessingCanvas" xmlns:cx="http://schemas.microsoft.com/office/drawing/2014/chartex" xmlns:cx1="http://schemas.microsoft.com/office/drawing/2015/9/8/chartex" xmlns:cx2="http://schemas.microsoft.com/office/drawing/2015/10/21/chartex" xmlns:cx3="http://schemas.microsoft.com/office/drawing/2016/5/9/chartex" xmlns:cx4="http://schemas.microsoft.com/office/drawing/2016/5/10/chartex" xmlns:cx5="http://schemas.microsoft.com/office/drawing/2016/5/11/chartex" xmlns:cx6="http://schemas.microsoft.com/office/drawing/2016/5/12/chartex" xmlns:cx7="http://schemas.microsoft.com/office/drawing/2016/5/13/chartex" xmlns:cx8="http://schemas.microsoft.com/office/drawing/2016/5/14/chartex" xmlns:mc="http://schemas.openxmlformats.org/markup-compatibility/2006" xmlns:aink="http://schemas.microsoft.com/office/drawing/2016/ink" xmlns:am3d="http://schemas.microsoft.com/office/drawing/2017/model3d" xmlns:o="urn:schemas-microsoft-com:office:office" xmlns:oel="http://schemas.microsoft.com/office/2019/extlst" xmlns:r="http://schemas.openxmlformats.org/officeDocument/2006/relationships" xmlns:m="http://schemas.openxmlformats.org/officeDocument/2006/math" xmlns:v="urn:schemas-microsoft-com:vml" xmlns:wp14="http://schemas.microsoft.com/office/word/2010/wordprocessingDrawing" xmlns:wp="http://schemas.openxmlformats.org/drawingml/2006/wordprocessingDrawing" xmlns:w10="urn:schemas-microsoft-com:office:word" xmlns:w="http://schemas.openxmlformats.org/wordprocessingml/2006/main" xmlns:w14="http://schemas.microsoft.com/office/word/2010/wordml" xmlns:w15="http://schemas.microsoft.com/office/word/2012/wordml" xmlns:w16cex="http://schemas.microsoft.com/office/word/2018/wordml/cex" xmlns:w16cid="http://schemas.microsoft.com/office/word/2016/wordml/cid" xmlns:w16="http://schemas.microsoft.com/office/word/2018/wordml" xmlns:w16du="http://schemas.microsoft.com/office/word/2023/wordml/word16du" xmlns:w16sdtdh="http://schemas.microsoft.com/office/word/2020/wordml/sdtdatahash" xmlns:w16sdtfl="http://schemas.microsoft.com/office/word/2024/wordml/sdtformatlock" xmlns:w16se="http://schemas.microsoft.com/office/word/2015/wordml/symex" xmlns:wpg="http://schemas.microsoft.com/office/word/2010/wordprocessingGroup" xmlns:wpi="http://schemas.microsoft.com/office/word/2010/wordprocessingInk" xmlns:wne="http://schemas.microsoft.com/office/word/2006/wordml" xmlns:wps="http://schemas.microsoft.com/office/word/2010/wordprocessingShape" mc:Ignorable="w14 w15 w16se w16cid w16 w16cex w16sdtdh w16sdtfl w16du wp14">
-  <w:p>
-    <w:pPr>
-      <w:pStyle w:val="Encabezado"/>
-    </w:pPr>
-  </w:p>
-</w:hdr>
-</file>
-
-<file path=word/header4.xml><?xml version="1.0" encoding="utf-8"?>
+<file path=word/header2.xml><?xml version="1.0" encoding="utf-8"?>
 <w:hdr xmlns:wpc="http://schemas.microsoft.com/office/word/2010/wordprocessingCanvas" xmlns:cx="http://schemas.microsoft.com/office/drawing/2014/chartex" xmlns:cx1="http://schemas.microsoft.com/office/drawing/2015/9/8/chartex" xmlns:cx2="http://schemas.microsoft.com/office/drawing/2015/10/21/chartex" xmlns:cx3="http://schemas.microsoft.com/office/drawing/2016/5/9/chartex" xmlns:cx4="http://schemas.microsoft.com/office/drawing/2016/5/10/chartex" xmlns:cx5="http://schemas.microsoft.com/office/drawing/2016/5/11/chartex" xmlns:cx6="http://schemas.microsoft.com/office/drawing/2016/5/12/chartex" xmlns:cx7="http://schemas.microsoft.com/office/drawing/2016/5/13/chartex" xmlns:cx8="http://schemas.microsoft.com/office/drawing/2016/5/14/chartex" xmlns:mc="http://schemas.openxmlformats.org/markup-compatibility/2006" xmlns:aink="http://schemas.microsoft.com/office/drawing/2016/ink" xmlns:am3d="http://schemas.microsoft.com/office/drawing/2017/model3d" xmlns:o="urn:schemas-microsoft-com:office:office" xmlns:oel="http://schemas.microsoft.com/office/2019/extlst" xmlns:r="http://schemas.openxmlformats.org/officeDocument/2006/relationships" xmlns:m="http://schemas.openxmlformats.org/officeDocument/2006/math" xmlns:v="urn:schemas-microsoft-com:vml" xmlns:wp14="http://schemas.microsoft.com/office/word/2010/wordprocessingDrawing" xmlns:wp="http://schemas.openxmlformats.org/drawingml/2006/wordprocessingDrawing" xmlns:w10="urn:schemas-microsoft-com:office:word" xmlns:w="http://schemas.openxmlformats.org/wordprocessingml/2006/main" xmlns:w14="http://schemas.microsoft.com/office/word/2010/wordml" xmlns:w15="http://schemas.microsoft.com/office/word/2012/wordml" xmlns:w16cex="http://schemas.microsoft.com/office/word/2018/wordml/cex" xmlns:w16cid="http://schemas.microsoft.com/office/word/2016/wordml/cid" xmlns:w16="http://schemas.microsoft.com/office/word/2018/wordml" xmlns:w16du="http://schemas.microsoft.com/office/word/2023/wordml/word16du" xmlns:w16sdtdh="http://schemas.microsoft.com/office/word/2020/wordml/sdtdatahash" xmlns:w16sdtfl="http://schemas.microsoft.com/office/word/2024/wordml/sdtformatlock" xmlns:w16se="http://schemas.microsoft.com/office/word/2015/wordml/symex" xmlns:wpg="http://schemas.microsoft.com/office/word/2010/wordprocessingGroup" xmlns:wpi="http://schemas.microsoft.com/office/word/2010/wordprocessingInk" xmlns:wne="http://schemas.microsoft.com/office/word/2006/wordml" xmlns:wps="http://schemas.microsoft.com/office/word/2010/wordprocessingShape" mc:Ignorable="w14 w15 w16se w16cid w16 w16cex w16sdtdh w16sdtfl w16du wp14">
   <w:p>
     <w:pPr>
@@ -16807,7 +16790,116 @@
       <mc:AlternateContent>
         <mc:Choice Requires="wps">
           <w:drawing>
-            <wp:anchor distT="0" distB="0" distL="0" distR="0" simplePos="0" relativeHeight="251711488" behindDoc="1" locked="0" layoutInCell="1" allowOverlap="1" wp14:anchorId="0898095E" wp14:editId="46718BDD">
+            <wp:anchor distT="0" distB="0" distL="0" distR="0" simplePos="0" relativeHeight="251655168" behindDoc="1" locked="0" layoutInCell="1" allowOverlap="1" wp14:anchorId="69BD5EE8" wp14:editId="37D35FBE">
+              <wp:simplePos x="0" y="0"/>
+              <wp:positionH relativeFrom="page">
+                <wp:posOffset>5530291</wp:posOffset>
+              </wp:positionH>
+              <wp:positionV relativeFrom="page">
+                <wp:posOffset>2077517</wp:posOffset>
+              </wp:positionV>
+              <wp:extent cx="826618" cy="145085"/>
+              <wp:effectExtent l="0" t="0" r="0" b="0"/>
+              <wp:wrapNone/>
+              <wp:docPr id="2028466852" name="Textbox 13"/>
+              <wp:cNvGraphicFramePr>
+                <a:graphicFrameLocks xmlns:a="http://schemas.openxmlformats.org/drawingml/2006/main"/>
+              </wp:cNvGraphicFramePr>
+              <a:graphic xmlns:a="http://schemas.openxmlformats.org/drawingml/2006/main">
+                <a:graphicData uri="http://schemas.microsoft.com/office/word/2010/wordprocessingShape">
+                  <wps:wsp>
+                    <wps:cNvSpPr txBox="1">
+                      <a:spLocks/>
+                    </wps:cNvSpPr>
+                    <wps:spPr>
+                      <a:xfrm>
+                        <a:off x="0" y="0"/>
+                        <a:ext cx="826618" cy="145085"/>
+                      </a:xfrm>
+                      <a:prstGeom prst="rect">
+                        <a:avLst/>
+                      </a:prstGeom>
+                    </wps:spPr>
+                    <wps:txbx>
+                      <w:txbxContent>
+                        <w:p>
+                          <w:pPr>
+                            <w:spacing w:before="12"/>
+                            <w:ind w:left="20"/>
+                            <w:jc w:val="center"/>
+                            <w:rPr>
+                              <w:sz w:val="18"/>
+                            </w:rPr>
+                          </w:pPr>
+                          <w:r>
+                            <w:rPr>
+                              <w:spacing w:val="-2"/>
+                              <w:sz w:val="18"/>
+                            </w:rPr>
+                            <w:t>{sexo}</w:t>
+                          </w:r>
+                        </w:p>
+                      </w:txbxContent>
+                    </wps:txbx>
+                    <wps:bodyPr wrap="square" lIns="0" tIns="0" rIns="0" bIns="0" rtlCol="0">
+                      <a:noAutofit/>
+                    </wps:bodyPr>
+                  </wps:wsp>
+                </a:graphicData>
+              </a:graphic>
+              <wp14:sizeRelH relativeFrom="margin">
+                <wp14:pctWidth>0</wp14:pctWidth>
+              </wp14:sizeRelH>
+              <wp14:sizeRelV relativeFrom="margin">
+                <wp14:pctHeight>0</wp14:pctHeight>
+              </wp14:sizeRelV>
+            </wp:anchor>
+          </w:drawing>
+        </mc:Choice>
+        <mc:Fallback>
+          <w:pict>
+            <v:shapetype w14:anchorId="69BD5EE8" id="_x0000_t202" coordsize="21600,21600" o:spt="202" path="m,l,21600r21600,l21600,xe">
+              <v:stroke joinstyle="miter"/>
+              <v:path gradientshapeok="t" o:connecttype="rect"/>
+            </v:shapetype>
+            <v:shape id="_x0000_s1053" type="#_x0000_t202" style="position:absolute;margin-left:435.45pt;margin-top:163.6pt;width:92pt;height:11.4pt;z-index:-251661312;visibility:visible;mso-wrap-style:square;mso-width-percent:0;mso-height-percent:0;mso-wrap-distance-left:0;mso-wrap-distance-top:0;mso-wrap-distance-right:0;mso-wrap-distance-bottom:0;mso-position-horizontal:absolute;mso-position-horizontal-relative:page;mso-position-vertical:absolute;mso-position-vertical-relative:page;mso-width-percent:0;mso-height-percent:0;mso-width-relative:margin;mso-height-relative:margin;v-text-anchor:top" o:gfxdata="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" filled="f" stroked="f">
+              <v:textbox inset="0,0,0,0">
+                <w:txbxContent>
+                  <w:p>
+                    <w:pPr>
+                      <w:spacing w:before="12"/>
+                      <w:ind w:left="20"/>
+                      <w:jc w:val="center"/>
+                      <w:rPr>
+                        <w:sz w:val="18"/>
+                      </w:rPr>
+                    </w:pPr>
+                    <w:r>
+                      <w:rPr>
+                        <w:spacing w:val="-2"/>
+                        <w:sz w:val="18"/>
+                      </w:rPr>
+                      <w:t>{sexo}</w:t>
+                    </w:r>
+                  </w:p>
+                </w:txbxContent>
+              </v:textbox>
+              <w10:wrap anchorx="page" anchory="page"/>
+            </v:shape>
+          </w:pict>
+        </mc:Fallback>
+      </mc:AlternateContent>
+    </w:r>
+    <w:r>
+      <w:rPr>
+        <w:i w:val="0"/>
+        <w:noProof/>
+        <w:sz w:val="20"/>
+      </w:rPr>
+      <mc:AlternateContent>
+        <mc:Choice Requires="wps">
+          <w:drawing>
+            <wp:anchor distT="0" distB="0" distL="0" distR="0" simplePos="0" relativeHeight="251660288" behindDoc="1" locked="0" layoutInCell="1" allowOverlap="1" wp14:anchorId="0898095E" wp14:editId="06FEFFFF">
               <wp:simplePos x="0" y="0"/>
               <wp:positionH relativeFrom="page">
                 <wp:posOffset>6353175</wp:posOffset>
@@ -16818,7 +16910,7 @@
               <wp:extent cx="650738" cy="190500"/>
               <wp:effectExtent l="0" t="0" r="0" b="0"/>
               <wp:wrapNone/>
-              <wp:docPr id="14" name="Textbox 14"/>
+              <wp:docPr id="45814318" name="Textbox 14"/>
               <wp:cNvGraphicFramePr>
                 <a:graphicFrameLocks xmlns:a="http://schemas.openxmlformats.org/drawingml/2006/main"/>
               </wp:cNvGraphicFramePr>
@@ -16890,11 +16982,7 @@
         </mc:Choice>
         <mc:Fallback>
           <w:pict>
-            <v:shapetype w14:anchorId="0898095E" id="_x0000_t202" coordsize="21600,21600" o:spt="202" path="m,l,21600r21600,l21600,xe">
-              <v:stroke joinstyle="miter"/>
-              <v:path gradientshapeok="t" o:connecttype="rect"/>
-            </v:shapetype>
-            <v:shape id="Textbox 14" o:spid="_x0000_s1026" type="#_x0000_t202" style="position:absolute;margin-left:500.25pt;margin-top:162.75pt;width:51.25pt;height:15pt;z-index:-251604992;visibility:visible;mso-wrap-style:square;mso-width-percent:0;mso-height-percent:0;mso-wrap-distance-left:0;mso-wrap-distance-top:0;mso-wrap-distance-right:0;mso-wrap-distance-bottom:0;mso-position-horizontal:absolute;mso-position-horizontal-relative:page;mso-position-vertical:absolute;mso-position-vertical-relative:page;mso-width-percent:0;mso-height-percent:0;mso-width-relative:margin;mso-height-relative:margin;v-text-anchor:top" o:gfxdata="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" filled="f" stroked="f">
+            <v:shape w14:anchorId="0898095E" id="_x0000_s1054" type="#_x0000_t202" style="position:absolute;margin-left:500.25pt;margin-top:162.75pt;width:51.25pt;height:15pt;z-index:-251656192;visibility:visible;mso-wrap-style:square;mso-width-percent:0;mso-height-percent:0;mso-wrap-distance-left:0;mso-wrap-distance-top:0;mso-wrap-distance-right:0;mso-wrap-distance-bottom:0;mso-position-horizontal:absolute;mso-position-horizontal-relative:page;mso-position-vertical:absolute;mso-position-vertical-relative:page;mso-width-percent:0;mso-height-percent:0;mso-width-relative:margin;mso-height-relative:margin;v-text-anchor:top" o:gfxdata="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" filled="f" stroked="f">
               <v:textbox inset="0,0,0,0">
                 <w:txbxContent>
                   <w:p>
@@ -16946,107 +17034,7 @@
       <mc:AlternateContent>
         <mc:Choice Requires="wps">
           <w:drawing>
-            <wp:anchor distT="0" distB="0" distL="0" distR="0" simplePos="0" relativeHeight="251707392" behindDoc="1" locked="0" layoutInCell="1" allowOverlap="1" wp14:anchorId="69BD5EE8" wp14:editId="2D8E03C0">
-              <wp:simplePos x="0" y="0"/>
-              <wp:positionH relativeFrom="page">
-                <wp:posOffset>5778109</wp:posOffset>
-              </wp:positionH>
-              <wp:positionV relativeFrom="page">
-                <wp:posOffset>2075632</wp:posOffset>
-              </wp:positionV>
-              <wp:extent cx="342199" cy="152400"/>
-              <wp:effectExtent l="0" t="0" r="0" b="0"/>
-              <wp:wrapNone/>
-              <wp:docPr id="13" name="Textbox 13"/>
-              <wp:cNvGraphicFramePr>
-                <a:graphicFrameLocks xmlns:a="http://schemas.openxmlformats.org/drawingml/2006/main"/>
-              </wp:cNvGraphicFramePr>
-              <a:graphic xmlns:a="http://schemas.openxmlformats.org/drawingml/2006/main">
-                <a:graphicData uri="http://schemas.microsoft.com/office/word/2010/wordprocessingShape">
-                  <wps:wsp>
-                    <wps:cNvSpPr txBox="1">
-                      <a:spLocks/>
-                    </wps:cNvSpPr>
-                    <wps:spPr>
-                      <a:xfrm>
-                        <a:off x="0" y="0"/>
-                        <a:ext cx="342199" cy="152400"/>
-                      </a:xfrm>
-                      <a:prstGeom prst="rect">
-                        <a:avLst/>
-                      </a:prstGeom>
-                    </wps:spPr>
-                    <wps:txbx>
-                      <w:txbxContent>
-                        <w:p>
-                          <w:pPr>
-                            <w:spacing w:before="12"/>
-                            <w:ind w:left="20"/>
-                            <w:rPr>
-                              <w:sz w:val="18"/>
-                            </w:rPr>
-                          </w:pPr>
-                          <w:r>
-                            <w:rPr>
-                              <w:spacing w:val="-2"/>
-                              <w:sz w:val="18"/>
-                            </w:rPr>
-                            <w:t>{sexo}</w:t>
-                          </w:r>
-                        </w:p>
-                      </w:txbxContent>
-                    </wps:txbx>
-                    <wps:bodyPr wrap="square" lIns="0" tIns="0" rIns="0" bIns="0" rtlCol="0">
-                      <a:noAutofit/>
-                    </wps:bodyPr>
-                  </wps:wsp>
-                </a:graphicData>
-              </a:graphic>
-              <wp14:sizeRelH relativeFrom="margin">
-                <wp14:pctWidth>0</wp14:pctWidth>
-              </wp14:sizeRelH>
-            </wp:anchor>
-          </w:drawing>
-        </mc:Choice>
-        <mc:Fallback>
-          <w:pict>
-            <v:shape w14:anchorId="69BD5EE8" id="Textbox 13" o:spid="_x0000_s1027" type="#_x0000_t202" style="position:absolute;margin-left:454.95pt;margin-top:163.45pt;width:26.95pt;height:12pt;z-index:-251609088;visibility:visible;mso-wrap-style:square;mso-width-percent:0;mso-wrap-distance-left:0;mso-wrap-distance-top:0;mso-wrap-distance-right:0;mso-wrap-distance-bottom:0;mso-position-horizontal:absolute;mso-position-horizontal-relative:page;mso-position-vertical:absolute;mso-position-vertical-relative:page;mso-width-percent:0;mso-width-relative:margin;v-text-anchor:top" o:gfxdata="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" filled="f" stroked="f">
-              <v:textbox inset="0,0,0,0">
-                <w:txbxContent>
-                  <w:p>
-                    <w:pPr>
-                      <w:spacing w:before="12"/>
-                      <w:ind w:left="20"/>
-                      <w:rPr>
-                        <w:sz w:val="18"/>
-                      </w:rPr>
-                    </w:pPr>
-                    <w:r>
-                      <w:rPr>
-                        <w:spacing w:val="-2"/>
-                        <w:sz w:val="18"/>
-                      </w:rPr>
-                      <w:t>{sexo}</w:t>
-                    </w:r>
-                  </w:p>
-                </w:txbxContent>
-              </v:textbox>
-              <w10:wrap anchorx="page" anchory="page"/>
-            </v:shape>
-          </w:pict>
-        </mc:Fallback>
-      </mc:AlternateContent>
-    </w:r>
-    <w:r>
-      <w:rPr>
-        <w:i w:val="0"/>
-        <w:noProof/>
-        <w:sz w:val="20"/>
-      </w:rPr>
-      <mc:AlternateContent>
-        <mc:Choice Requires="wps">
-          <w:drawing>
-            <wp:anchor distT="0" distB="0" distL="0" distR="0" simplePos="0" relativeHeight="251688960" behindDoc="1" locked="0" layoutInCell="1" allowOverlap="1" wp14:anchorId="6997D6B6" wp14:editId="72983E13">
+            <wp:anchor distT="0" distB="0" distL="0" distR="0" simplePos="0" relativeHeight="251644928" behindDoc="1" locked="0" layoutInCell="1" allowOverlap="1" wp14:anchorId="6997D6B6" wp14:editId="72983E13">
               <wp:simplePos x="0" y="0"/>
               <wp:positionH relativeFrom="page">
                 <wp:posOffset>6900074</wp:posOffset>
@@ -17057,7 +17045,7 @@
               <wp:extent cx="527322" cy="152400"/>
               <wp:effectExtent l="0" t="0" r="0" b="0"/>
               <wp:wrapNone/>
-              <wp:docPr id="10" name="Textbox 10"/>
+              <wp:docPr id="2005139550" name="Textbox 10"/>
               <wp:cNvGraphicFramePr>
                 <a:graphicFrameLocks xmlns:a="http://schemas.openxmlformats.org/drawingml/2006/main"/>
               </wp:cNvGraphicFramePr>
@@ -17137,7 +17125,7 @@
         </mc:Choice>
         <mc:Fallback>
           <w:pict>
-            <v:shape w14:anchorId="6997D6B6" id="Textbox 10" o:spid="_x0000_s1028" type="#_x0000_t202" style="position:absolute;margin-left:543.3pt;margin-top:140.9pt;width:41.5pt;height:12pt;z-index:-251627520;visibility:visible;mso-wrap-style:square;mso-width-percent:0;mso-wrap-distance-left:0;mso-wrap-distance-top:0;mso-wrap-distance-right:0;mso-wrap-distance-bottom:0;mso-position-horizontal:absolute;mso-position-horizontal-relative:page;mso-position-vertical:absolute;mso-position-vertical-relative:page;mso-width-percent:0;mso-width-relative:margin;v-text-anchor:top" o:gfxdata="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" filled="f" stroked="f">
+            <v:shape w14:anchorId="6997D6B6" id="_x0000_s1055" type="#_x0000_t202" style="position:absolute;margin-left:543.3pt;margin-top:140.9pt;width:41.5pt;height:12pt;z-index:-251671552;visibility:visible;mso-wrap-style:square;mso-width-percent:0;mso-wrap-distance-left:0;mso-wrap-distance-top:0;mso-wrap-distance-right:0;mso-wrap-distance-bottom:0;mso-position-horizontal:absolute;mso-position-horizontal-relative:page;mso-position-vertical:absolute;mso-position-vertical-relative:page;mso-width-percent:0;mso-width-relative:margin;v-text-anchor:top" o:gfxdata="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" filled="f" stroked="f">
               <v:textbox inset="0,0,0,0">
                 <w:txbxContent>
                   <w:p>
@@ -17200,7 +17188,7 @@
       <mc:AlternateContent>
         <mc:Choice Requires="wps">
           <w:drawing>
-            <wp:anchor distT="0" distB="0" distL="0" distR="0" simplePos="0" relativeHeight="251680768" behindDoc="1" locked="0" layoutInCell="1" allowOverlap="1" wp14:anchorId="748918DC" wp14:editId="42CA9B3A">
+            <wp:anchor distT="0" distB="0" distL="0" distR="0" simplePos="0" relativeHeight="251642880" behindDoc="1" locked="0" layoutInCell="1" allowOverlap="1" wp14:anchorId="748918DC" wp14:editId="42CA9B3A">
               <wp:simplePos x="0" y="0"/>
               <wp:positionH relativeFrom="page">
                 <wp:posOffset>5222739</wp:posOffset>
@@ -17211,7 +17199,7 @@
               <wp:extent cx="1626846" cy="158115"/>
               <wp:effectExtent l="0" t="0" r="0" b="0"/>
               <wp:wrapNone/>
-              <wp:docPr id="9" name="Textbox 9"/>
+              <wp:docPr id="2043162573" name="Textbox 9"/>
               <wp:cNvGraphicFramePr>
                 <a:graphicFrameLocks xmlns:a="http://schemas.openxmlformats.org/drawingml/2006/main"/>
               </wp:cNvGraphicFramePr>
@@ -17338,7 +17326,7 @@
         </mc:Choice>
         <mc:Fallback>
           <w:pict>
-            <v:shape w14:anchorId="748918DC" id="Textbox 9" o:spid="_x0000_s1029" type="#_x0000_t202" style="position:absolute;margin-left:411.25pt;margin-top:140.9pt;width:128.1pt;height:12.45pt;z-index:-251635712;visibility:visible;mso-wrap-style:square;mso-width-percent:0;mso-wrap-distance-left:0;mso-wrap-distance-top:0;mso-wrap-distance-right:0;mso-wrap-distance-bottom:0;mso-position-horizontal:absolute;mso-position-horizontal-relative:page;mso-position-vertical:absolute;mso-position-vertical-relative:page;mso-width-percent:0;mso-width-relative:margin;v-text-anchor:top" o:gfxdata="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" filled="f" stroked="f">
+            <v:shape w14:anchorId="748918DC" id="_x0000_s1056" type="#_x0000_t202" style="position:absolute;margin-left:411.25pt;margin-top:140.9pt;width:128.1pt;height:12.45pt;z-index:-251673600;visibility:visible;mso-wrap-style:square;mso-width-percent:0;mso-wrap-distance-left:0;mso-wrap-distance-top:0;mso-wrap-distance-right:0;mso-wrap-distance-bottom:0;mso-position-horizontal:absolute;mso-position-horizontal-relative:page;mso-position-vertical:absolute;mso-position-vertical-relative:page;mso-width-percent:0;mso-width-relative:margin;v-text-anchor:top" o:gfxdata="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" filled="f" stroked="f">
               <v:textbox inset="0,0,0,0">
                 <w:txbxContent>
                   <w:p>
@@ -17448,7 +17436,7 @@
       <mc:AlternateContent>
         <mc:Choice Requires="wps">
           <w:drawing>
-            <wp:anchor distT="0" distB="0" distL="0" distR="0" simplePos="0" relativeHeight="251670528" behindDoc="1" locked="0" layoutInCell="1" allowOverlap="1" wp14:anchorId="6BC1ADC5" wp14:editId="1E075418">
+            <wp:anchor distT="0" distB="0" distL="0" distR="0" simplePos="0" relativeHeight="251640832" behindDoc="1" locked="0" layoutInCell="1" allowOverlap="1" wp14:anchorId="6BC1ADC5" wp14:editId="1E075418">
               <wp:simplePos x="0" y="0"/>
               <wp:positionH relativeFrom="page">
                 <wp:posOffset>6748609</wp:posOffset>
@@ -17459,7 +17447,7 @@
               <wp:extent cx="605860" cy="152400"/>
               <wp:effectExtent l="0" t="0" r="0" b="0"/>
               <wp:wrapNone/>
-              <wp:docPr id="8" name="Textbox 8"/>
+              <wp:docPr id="13964915" name="Textbox 8"/>
               <wp:cNvGraphicFramePr>
                 <a:graphicFrameLocks xmlns:a="http://schemas.openxmlformats.org/drawingml/2006/main"/>
               </wp:cNvGraphicFramePr>
@@ -17528,7 +17516,7 @@
         </mc:Choice>
         <mc:Fallback>
           <w:pict>
-            <v:shape w14:anchorId="6BC1ADC5" id="Textbox 8" o:spid="_x0000_s1030" type="#_x0000_t202" style="position:absolute;margin-left:531.4pt;margin-top:117.95pt;width:47.7pt;height:12pt;z-index:-251645952;visibility:visible;mso-wrap-style:square;mso-width-percent:0;mso-wrap-distance-left:0;mso-wrap-distance-top:0;mso-wrap-distance-right:0;mso-wrap-distance-bottom:0;mso-position-horizontal:absolute;mso-position-horizontal-relative:page;mso-position-vertical:absolute;mso-position-vertical-relative:page;mso-width-percent:0;mso-width-relative:margin;v-text-anchor:top" o:gfxdata="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" filled="f" stroked="f">
+            <v:shape w14:anchorId="6BC1ADC5" id="_x0000_s1057" type="#_x0000_t202" style="position:absolute;margin-left:531.4pt;margin-top:117.95pt;width:47.7pt;height:12pt;z-index:-251675648;visibility:visible;mso-wrap-style:square;mso-width-percent:0;mso-wrap-distance-left:0;mso-wrap-distance-top:0;mso-wrap-distance-right:0;mso-wrap-distance-bottom:0;mso-position-horizontal:absolute;mso-position-horizontal-relative:page;mso-position-vertical:absolute;mso-position-vertical-relative:page;mso-width-percent:0;mso-width-relative:margin;v-text-anchor:top" o:gfxdata="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" filled="f" stroked="f">
               <v:textbox inset="0,0,0,0">
                 <w:txbxContent>
                   <w:p>
@@ -17580,7 +17568,7 @@
       <mc:AlternateContent>
         <mc:Choice Requires="wps">
           <w:drawing>
-            <wp:anchor distT="0" distB="0" distL="0" distR="0" simplePos="0" relativeHeight="251658240" behindDoc="1" locked="0" layoutInCell="1" allowOverlap="1" wp14:anchorId="6C53B098" wp14:editId="0AC9F008">
+            <wp:anchor distT="0" distB="0" distL="0" distR="0" simplePos="0" relativeHeight="251638784" behindDoc="1" locked="0" layoutInCell="1" allowOverlap="1" wp14:anchorId="6C53B098" wp14:editId="0AC9F008">
               <wp:simplePos x="0" y="0"/>
               <wp:positionH relativeFrom="page">
                 <wp:posOffset>5222739</wp:posOffset>
@@ -17591,7 +17579,7 @@
               <wp:extent cx="1447332" cy="152400"/>
               <wp:effectExtent l="0" t="0" r="0" b="0"/>
               <wp:wrapNone/>
-              <wp:docPr id="7" name="Textbox 7"/>
+              <wp:docPr id="234347827" name="Textbox 7"/>
               <wp:cNvGraphicFramePr>
                 <a:graphicFrameLocks xmlns:a="http://schemas.openxmlformats.org/drawingml/2006/main"/>
               </wp:cNvGraphicFramePr>
@@ -17705,7 +17693,7 @@
         </mc:Choice>
         <mc:Fallback>
           <w:pict>
-            <v:shape w14:anchorId="6C53B098" id="Textbox 7" o:spid="_x0000_s1031" type="#_x0000_t202" style="position:absolute;margin-left:411.25pt;margin-top:117.95pt;width:113.95pt;height:12pt;z-index:-251658240;visibility:visible;mso-wrap-style:square;mso-width-percent:0;mso-wrap-distance-left:0;mso-wrap-distance-top:0;mso-wrap-distance-right:0;mso-wrap-distance-bottom:0;mso-position-horizontal:absolute;mso-position-horizontal-relative:page;mso-position-vertical:absolute;mso-position-vertical-relative:page;mso-width-percent:0;mso-width-relative:margin;v-text-anchor:top" o:gfxdata="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" filled="f" stroked="f">
+            <v:shape w14:anchorId="6C53B098" id="_x0000_s1058" type="#_x0000_t202" style="position:absolute;margin-left:411.25pt;margin-top:117.95pt;width:113.95pt;height:12pt;z-index:-251677696;visibility:visible;mso-wrap-style:square;mso-width-percent:0;mso-wrap-distance-left:0;mso-wrap-distance-top:0;mso-wrap-distance-right:0;mso-wrap-distance-bottom:0;mso-position-horizontal:absolute;mso-position-horizontal-relative:page;mso-position-vertical:absolute;mso-position-vertical-relative:page;mso-width-percent:0;mso-width-relative:margin;v-text-anchor:top" o:gfxdata="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" filled="f" stroked="f">
               <v:textbox inset="0,0,0,0">
                 <w:txbxContent>
                   <w:p>
@@ -17802,7 +17790,7 @@
       <mc:AlternateContent>
         <mc:Choice Requires="wps">
           <w:drawing>
-            <wp:anchor distT="0" distB="0" distL="0" distR="0" simplePos="0" relativeHeight="251727872" behindDoc="1" locked="0" layoutInCell="1" allowOverlap="1" wp14:anchorId="4106CB45" wp14:editId="14450084">
+            <wp:anchor distT="0" distB="0" distL="0" distR="0" simplePos="0" relativeHeight="251654144" behindDoc="1" locked="0" layoutInCell="1" allowOverlap="1" wp14:anchorId="4106CB45" wp14:editId="61849EF7">
               <wp:simplePos x="0" y="0"/>
               <wp:positionH relativeFrom="page">
                 <wp:posOffset>201952</wp:posOffset>
@@ -17813,7 +17801,7 @@
               <wp:extent cx="4499073" cy="152400"/>
               <wp:effectExtent l="0" t="0" r="0" b="0"/>
               <wp:wrapNone/>
-              <wp:docPr id="16" name="Textbox 16"/>
+              <wp:docPr id="1311801200" name="Textbox 16"/>
               <wp:cNvGraphicFramePr>
                 <a:graphicFrameLocks xmlns:a="http://schemas.openxmlformats.org/drawingml/2006/main"/>
               </wp:cNvGraphicFramePr>
@@ -17894,7 +17882,7 @@
         </mc:Choice>
         <mc:Fallback>
           <w:pict>
-            <v:shape w14:anchorId="4106CB45" id="Textbox 16" o:spid="_x0000_s1032" type="#_x0000_t202" style="position:absolute;margin-left:15.9pt;margin-top:165.65pt;width:354.25pt;height:12pt;z-index:-251588608;visibility:visible;mso-wrap-style:square;mso-width-percent:0;mso-wrap-distance-left:0;mso-wrap-distance-top:0;mso-wrap-distance-right:0;mso-wrap-distance-bottom:0;mso-position-horizontal:absolute;mso-position-horizontal-relative:page;mso-position-vertical:absolute;mso-position-vertical-relative:page;mso-width-percent:0;mso-width-relative:margin;v-text-anchor:top" o:gfxdata="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" filled="f" stroked="f">
+            <v:shape w14:anchorId="4106CB45" id="_x0000_s1059" type="#_x0000_t202" style="position:absolute;margin-left:15.9pt;margin-top:165.65pt;width:354.25pt;height:12pt;z-index:-251662336;visibility:visible;mso-wrap-style:square;mso-width-percent:0;mso-wrap-distance-left:0;mso-wrap-distance-top:0;mso-wrap-distance-right:0;mso-wrap-distance-bottom:0;mso-position-horizontal:absolute;mso-position-horizontal-relative:page;mso-position-vertical:absolute;mso-position-vertical-relative:page;mso-width-percent:0;mso-width-relative:margin;v-text-anchor:top" o:gfxdata="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" filled="f" stroked="f">
               <v:textbox inset="0,0,0,0">
                 <w:txbxContent>
                   <w:p>
@@ -17956,7 +17944,7 @@
         <w:sz w:val="20"/>
       </w:rPr>
       <w:drawing>
-        <wp:anchor distT="0" distB="0" distL="0" distR="0" simplePos="0" relativeHeight="251600896" behindDoc="1" locked="0" layoutInCell="1" allowOverlap="1" wp14:anchorId="750A143C" wp14:editId="1EB72933">
+        <wp:anchor distT="0" distB="0" distL="0" distR="0" simplePos="0" relativeHeight="251630592" behindDoc="1" locked="0" layoutInCell="1" allowOverlap="1" wp14:anchorId="750A143C" wp14:editId="1EB72933">
           <wp:simplePos x="0" y="0"/>
           <wp:positionH relativeFrom="page">
             <wp:posOffset>108586</wp:posOffset>
@@ -17967,7 +17955,7 @@
           <wp:extent cx="7415530" cy="951865"/>
           <wp:effectExtent l="0" t="0" r="0" b="0"/>
           <wp:wrapNone/>
-          <wp:docPr id="1" name="Image 1"/>
+          <wp:docPr id="731179523" name="Image 1"/>
           <wp:cNvGraphicFramePr>
             <a:graphicFrameLocks xmlns:a="http://schemas.openxmlformats.org/drawingml/2006/main"/>
           </wp:cNvGraphicFramePr>
@@ -18008,7 +17996,7 @@
       <mc:AlternateContent>
         <mc:Choice Requires="wpg">
           <w:drawing>
-            <wp:anchor distT="0" distB="0" distL="0" distR="0" simplePos="0" relativeHeight="251615232" behindDoc="1" locked="0" layoutInCell="1" allowOverlap="1" wp14:anchorId="73B4567A" wp14:editId="68667510">
+            <wp:anchor distT="0" distB="0" distL="0" distR="0" simplePos="0" relativeHeight="251632640" behindDoc="1" locked="0" layoutInCell="1" allowOverlap="1" wp14:anchorId="73B4567A" wp14:editId="68667510">
               <wp:simplePos x="0" y="0"/>
               <wp:positionH relativeFrom="page">
                 <wp:posOffset>214617</wp:posOffset>
@@ -18019,7 +18007,7 @@
               <wp:extent cx="7163434" cy="858519"/>
               <wp:effectExtent l="0" t="0" r="0" b="0"/>
               <wp:wrapNone/>
-              <wp:docPr id="2" name="Group 2"/>
+              <wp:docPr id="526496778" name="Group 2"/>
               <wp:cNvGraphicFramePr>
                 <a:graphicFrameLocks xmlns:a="http://schemas.openxmlformats.org/drawingml/2006/main"/>
               </wp:cNvGraphicFramePr>
@@ -18038,7 +18026,7 @@
                       </a:xfrm>
                     </wpg:grpSpPr>
                     <wps:wsp>
-                      <wps:cNvPr id="3" name="Graphic 3"/>
+                      <wps:cNvPr id="311262559" name="Graphic 3"/>
                       <wps:cNvSpPr/>
                       <wps:spPr>
                         <a:xfrm>
@@ -18201,7 +18189,7 @@
                       </wps:bodyPr>
                     </wps:wsp>
                     <wps:wsp>
-                      <wps:cNvPr id="4" name="Graphic 4"/>
+                      <wps:cNvPr id="646014184" name="Graphic 4"/>
                       <wps:cNvSpPr/>
                       <wps:spPr>
                         <a:xfrm>
@@ -18902,11 +18890,11 @@
         </mc:Choice>
         <mc:Fallback>
           <w:pict>
-            <v:group w14:anchorId="005CF779" id="Group 2" o:spid="_x0000_s1026" style="position:absolute;margin-left:16.9pt;margin-top:112.8pt;width:564.05pt;height:67.6pt;z-index:-251701248;mso-wrap-distance-left:0;mso-wrap-distance-right:0;mso-position-horizontal-relative:page;mso-position-vertical-relative:page" coordsize="71634,8585" o:gfxdata="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">
-              <v:shape id="Graphic 3" o:spid="_x0000_s1027" style="position:absolute;width:71634;height:8585;visibility:visible;mso-wrap-style:square;v-text-anchor:top" coordsize="7163434,858519" o:gfxdata="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" path="m5004066,l3024136,r,7620l3024136,160020r-1524,l3022612,177800r,7620l3022612,655320r-25400,l2997212,185420r12700,l3009912,177800r,-17780l3009912,7620r-1219200,l1790712,160020r,17780l1790712,185420r,469900l660400,655320r,40640l,695960,,858520r4991112,l4991112,695960r,-40640l4991112,185420r,-7620l5004066,177800r,-17780l5004066,7620r,-7620xem7162813,7620r-1333501,l5829312,7239r-812800,l5016512,858139r355600,l5372112,858520r787400,l6159512,858139r1003301,l7162813,7620xe" fillcolor="#eae4e4" stroked="f">
+            <v:group w14:anchorId="52FC77FC" id="Group 2" o:spid="_x0000_s1026" style="position:absolute;margin-left:16.9pt;margin-top:112.8pt;width:564.05pt;height:67.6pt;z-index:-251683840;mso-wrap-distance-left:0;mso-wrap-distance-right:0;mso-position-horizontal-relative:page;mso-position-vertical-relative:page" coordsize="71634,8585" o:gfxdata="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">
+              <v:shape id="Graphic 3" o:spid="_x0000_s1027" style="position:absolute;width:71634;height:8585;visibility:visible;mso-wrap-style:square;v-text-anchor:top" coordsize="7163434,858519" o:gfxdata="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" path="m5004066,l3024136,r,7620l3024136,160020r-1524,l3022612,177800r,7620l3022612,655320r-25400,l2997212,185420r12700,l3009912,177800r,-17780l3009912,7620r-1219200,l1790712,160020r,17780l1790712,185420r,469900l660400,655320r,40640l,695960,,858520r4991112,l4991112,695960r,-40640l4991112,185420r,-7620l5004066,177800r,-17780l5004066,7620r,-7620xem7162813,7620r-1333501,l5829312,7239r-812800,l5016512,858139r355600,l5372112,858520r787400,l6159512,858139r1003301,l7162813,7620xe" fillcolor="#eae4e4" stroked="f">
                 <v:path arrowok="t"/>
               </v:shape>
-              <v:shape id="Graphic 4" o:spid="_x0000_s1028" style="position:absolute;left:2635;top:492;width:12503;height:4381;visibility:visible;mso-wrap-style:square;v-text-anchor:top" coordsize="1250315,438150" o:gfxdata="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" path="m18656,l,,,437553r18656,l18656,xem37299,l27978,r,437553l37299,437553,37299,xem65278,l55956,r,437553l65278,437553,65278,xem121246,l102590,r,437553l121246,437553,121246,xem158534,r-9309,l149225,437553r9309,l158534,xem195859,l167881,r,437553l195859,437553,195859,xem223824,l205181,r,437553l223824,437553,223824,xem261137,l233159,r,437553l261137,437553,261137,xem279781,r-9322,l270459,437553r9322,l279781,xem335749,l307771,r,437553l335749,437553,335749,xem354406,r-9335,l345071,437553r9335,l354406,xem382384,l363728,r,437553l382384,437553,382384,xem419684,r-9322,l410362,437553r9322,l419684,xem456984,l429006,r,437553l456984,437553,456984,xem503605,l466318,r,437553l503605,437553,503605,xem531583,l512953,r,437553l531583,437553,531583,xem559587,r-9335,l550252,437553r9335,l559587,xem596887,r-9335,l587552,437553r9335,l596887,xem624865,r-9335,l615530,437553r9335,l624865,xem662165,l634187,r,437553l662165,437553,662165,xem699465,l680821,r,437553l699465,437553,699465,xem727456,r-9335,l718121,437553r9335,l727456,xem783412,l746099,r,437553l783412,437553,783412,xem802055,r-9321,l792734,437553r9321,l802055,xem848639,l820674,r,437553l848639,437553,848639,xem895299,l858012,r,437553l895299,437553,895299,xem913917,r-9296,l904621,437553r9296,l913917,xem932624,r-9334,l923290,437553r9334,l932624,xem979208,l951230,r,437553l979208,437553,979208,xem1007198,l988568,r,437553l1007198,437553,1007198,xem1035215,r-9309,l1025906,437553r9309,l1035215,xem1063155,r-9309,l1053846,437553r9309,l1063155,xem1100556,r-18643,l1081913,437553r18643,l1100556,xem1147165,r-18643,l1128522,437553r18643,l1147165,xem1203096,r-27965,l1175131,437553r27965,l1203096,xem1221790,r-9321,l1212469,437553r9321,l1221790,xem1249781,r-18643,l1231138,437553r18643,l1249781,xe" fillcolor="black" stroked="f">
+              <v:shape id="Graphic 4" o:spid="_x0000_s1028" style="position:absolute;left:2635;top:492;width:12503;height:4381;visibility:visible;mso-wrap-style:square;v-text-anchor:top" coordsize="1250315,438150" o:gfxdata="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" path="m18656,l,,,437553r18656,l18656,xem37299,l27978,r,437553l37299,437553,37299,xem65278,l55956,r,437553l65278,437553,65278,xem121246,l102590,r,437553l121246,437553,121246,xem158534,r-9309,l149225,437553r9309,l158534,xem195859,l167881,r,437553l195859,437553,195859,xem223824,l205181,r,437553l223824,437553,223824,xem261137,l233159,r,437553l261137,437553,261137,xem279781,r-9322,l270459,437553r9322,l279781,xem335749,l307771,r,437553l335749,437553,335749,xem354406,r-9335,l345071,437553r9335,l354406,xem382384,l363728,r,437553l382384,437553,382384,xem419684,r-9322,l410362,437553r9322,l419684,xem456984,l429006,r,437553l456984,437553,456984,xem503605,l466318,r,437553l503605,437553,503605,xem531583,l512953,r,437553l531583,437553,531583,xem559587,r-9335,l550252,437553r9335,l559587,xem596887,r-9335,l587552,437553r9335,l596887,xem624865,r-9335,l615530,437553r9335,l624865,xem662165,l634187,r,437553l662165,437553,662165,xem699465,l680821,r,437553l699465,437553,699465,xem727456,r-9335,l718121,437553r9335,l727456,xem783412,l746099,r,437553l783412,437553,783412,xem802055,r-9321,l792734,437553r9321,l802055,xem848639,l820674,r,437553l848639,437553,848639,xem895299,l858012,r,437553l895299,437553,895299,xem913917,r-9296,l904621,437553r9296,l913917,xem932624,r-9334,l923290,437553r9334,l932624,xem979208,l951230,r,437553l979208,437553,979208,xem1007198,l988568,r,437553l1007198,437553,1007198,xem1035215,r-9309,l1025906,437553r9309,l1035215,xem1063155,r-9309,l1053846,437553r9309,l1063155,xem1100556,r-18643,l1081913,437553r18643,l1100556,xem1147165,r-18643,l1128522,437553r18643,l1147165,xem1203096,r-27965,l1175131,437553r27965,l1203096,xem1221790,r-9321,l1212469,437553r9321,l1221790,xem1249781,r-18643,l1231138,437553r18643,l1249781,xe" fillcolor="black" stroked="f">
                 <v:path arrowok="t"/>
               </v:shape>
               <w10:wrap anchorx="page" anchory="page"/>
@@ -18924,7 +18912,7 @@
       <mc:AlternateContent>
         <mc:Choice Requires="wps">
           <w:drawing>
-            <wp:anchor distT="0" distB="0" distL="0" distR="0" simplePos="0" relativeHeight="251629568" behindDoc="1" locked="0" layoutInCell="1" allowOverlap="1" wp14:anchorId="3DA5D2A3" wp14:editId="1D8E794E">
+            <wp:anchor distT="0" distB="0" distL="0" distR="0" simplePos="0" relativeHeight="251634688" behindDoc="1" locked="0" layoutInCell="1" allowOverlap="1" wp14:anchorId="3DA5D2A3" wp14:editId="1D8E794E">
               <wp:simplePos x="0" y="0"/>
               <wp:positionH relativeFrom="page">
                 <wp:posOffset>3224910</wp:posOffset>
@@ -18935,7 +18923,7 @@
               <wp:extent cx="1326515" cy="645795"/>
               <wp:effectExtent l="0" t="0" r="0" b="0"/>
               <wp:wrapNone/>
-              <wp:docPr id="5" name="Textbox 5"/>
+              <wp:docPr id="810502813" name="Textbox 5"/>
               <wp:cNvGraphicFramePr>
                 <a:graphicFrameLocks xmlns:a="http://schemas.openxmlformats.org/drawingml/2006/main"/>
               </wp:cNvGraphicFramePr>
@@ -19092,7 +19080,7 @@
         </mc:Choice>
         <mc:Fallback>
           <w:pict>
-            <v:shape w14:anchorId="3DA5D2A3" id="Textbox 5" o:spid="_x0000_s1033" type="#_x0000_t202" style="position:absolute;margin-left:253.95pt;margin-top:113.15pt;width:104.45pt;height:50.85pt;z-index:-251686912;visibility:visible;mso-wrap-style:square;mso-wrap-distance-left:0;mso-wrap-distance-top:0;mso-wrap-distance-right:0;mso-wrap-distance-bottom:0;mso-position-horizontal:absolute;mso-position-horizontal-relative:page;mso-position-vertical:absolute;mso-position-vertical-relative:page;v-text-anchor:top" o:gfxdata="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" filled="f" stroked="f">
+            <v:shape w14:anchorId="3DA5D2A3" id="_x0000_s1060" type="#_x0000_t202" style="position:absolute;margin-left:253.95pt;margin-top:113.15pt;width:104.45pt;height:50.85pt;z-index:-251681792;visibility:visible;mso-wrap-style:square;mso-wrap-distance-left:0;mso-wrap-distance-top:0;mso-wrap-distance-right:0;mso-wrap-distance-bottom:0;mso-position-horizontal:absolute;mso-position-horizontal-relative:page;mso-position-vertical:absolute;mso-position-vertical-relative:page;v-text-anchor:top" o:gfxdata="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" filled="f" stroked="f">
               <v:textbox inset="0,0,0,0">
                 <w:txbxContent>
                   <w:p>
@@ -19235,7 +19223,7 @@
       <mc:AlternateContent>
         <mc:Choice Requires="wps">
           <w:drawing>
-            <wp:anchor distT="0" distB="0" distL="0" distR="0" simplePos="0" relativeHeight="251643904" behindDoc="1" locked="0" layoutInCell="1" allowOverlap="1" wp14:anchorId="7DD060C0" wp14:editId="6F7C9F14">
+            <wp:anchor distT="0" distB="0" distL="0" distR="0" simplePos="0" relativeHeight="251636736" behindDoc="1" locked="0" layoutInCell="1" allowOverlap="1" wp14:anchorId="7DD060C0" wp14:editId="6F7C9F14">
               <wp:simplePos x="0" y="0"/>
               <wp:positionH relativeFrom="page">
                 <wp:posOffset>1993138</wp:posOffset>
@@ -19246,7 +19234,7 @@
               <wp:extent cx="1052195" cy="621665"/>
               <wp:effectExtent l="0" t="0" r="0" b="0"/>
               <wp:wrapNone/>
-              <wp:docPr id="6" name="Textbox 6"/>
+              <wp:docPr id="54463957" name="Textbox 6"/>
               <wp:cNvGraphicFramePr>
                 <a:graphicFrameLocks xmlns:a="http://schemas.openxmlformats.org/drawingml/2006/main"/>
               </wp:cNvGraphicFramePr>
@@ -19401,7 +19389,7 @@
         </mc:Choice>
         <mc:Fallback>
           <w:pict>
-            <v:shape w14:anchorId="7DD060C0" id="Textbox 6" o:spid="_x0000_s1034" type="#_x0000_t202" style="position:absolute;margin-left:156.95pt;margin-top:113.5pt;width:82.85pt;height:48.95pt;z-index:-251672576;visibility:visible;mso-wrap-style:square;mso-wrap-distance-left:0;mso-wrap-distance-top:0;mso-wrap-distance-right:0;mso-wrap-distance-bottom:0;mso-position-horizontal:absolute;mso-position-horizontal-relative:page;mso-position-vertical:absolute;mso-position-vertical-relative:page;v-text-anchor:top" o:gfxdata="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" filled="f" stroked="f">
+            <v:shape w14:anchorId="7DD060C0" id="_x0000_s1061" type="#_x0000_t202" style="position:absolute;margin-left:156.95pt;margin-top:113.5pt;width:82.85pt;height:48.95pt;z-index:-251679744;visibility:visible;mso-wrap-style:square;mso-wrap-distance-left:0;mso-wrap-distance-top:0;mso-wrap-distance-right:0;mso-wrap-distance-bottom:0;mso-position-horizontal:absolute;mso-position-horizontal-relative:page;mso-position-vertical:absolute;mso-position-vertical-relative:page;v-text-anchor:top" o:gfxdata="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" filled="f" stroked="f">
               <v:textbox inset="0,0,0,0">
                 <w:txbxContent>
                   <w:p>
@@ -19542,7 +19530,7 @@
       <mc:AlternateContent>
         <mc:Choice Requires="wps">
           <w:drawing>
-            <wp:anchor distT="0" distB="0" distL="0" distR="0" simplePos="0" relativeHeight="251695104" behindDoc="1" locked="0" layoutInCell="1" allowOverlap="1" wp14:anchorId="1A629CDB" wp14:editId="54284BA2">
+            <wp:anchor distT="0" distB="0" distL="0" distR="0" simplePos="0" relativeHeight="251646976" behindDoc="1" locked="0" layoutInCell="1" allowOverlap="1" wp14:anchorId="1A629CDB" wp14:editId="54284BA2">
               <wp:simplePos x="0" y="0"/>
               <wp:positionH relativeFrom="page">
                 <wp:posOffset>691692</wp:posOffset>
@@ -19553,7 +19541,7 @@
               <wp:extent cx="808355" cy="152400"/>
               <wp:effectExtent l="0" t="0" r="0" b="0"/>
               <wp:wrapNone/>
-              <wp:docPr id="11" name="Textbox 11"/>
+              <wp:docPr id="970698087" name="Textbox 11"/>
               <wp:cNvGraphicFramePr>
                 <a:graphicFrameLocks xmlns:a="http://schemas.openxmlformats.org/drawingml/2006/main"/>
               </wp:cNvGraphicFramePr>
@@ -19620,7 +19608,7 @@
         </mc:Choice>
         <mc:Fallback>
           <w:pict>
-            <v:shape w14:anchorId="1A629CDB" id="Textbox 11" o:spid="_x0000_s1035" type="#_x0000_t202" style="position:absolute;margin-left:54.45pt;margin-top:150.6pt;width:63.65pt;height:12pt;z-index:-251621376;visibility:visible;mso-wrap-style:square;mso-wrap-distance-left:0;mso-wrap-distance-top:0;mso-wrap-distance-right:0;mso-wrap-distance-bottom:0;mso-position-horizontal:absolute;mso-position-horizontal-relative:page;mso-position-vertical:absolute;mso-position-vertical-relative:page;v-text-anchor:top" o:gfxdata="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" filled="f" stroked="f">
+            <v:shape w14:anchorId="1A629CDB" id="_x0000_s1062" type="#_x0000_t202" style="position:absolute;margin-left:54.45pt;margin-top:150.6pt;width:63.65pt;height:12pt;z-index:-251669504;visibility:visible;mso-wrap-style:square;mso-wrap-distance-left:0;mso-wrap-distance-top:0;mso-wrap-distance-right:0;mso-wrap-distance-bottom:0;mso-position-horizontal:absolute;mso-position-horizontal-relative:page;mso-position-vertical:absolute;mso-position-vertical-relative:page;v-text-anchor:top" o:gfxdata="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" filled="f" stroked="f">
               <v:textbox inset="0,0,0,0">
                 <w:txbxContent>
                   <w:p>
@@ -19673,7 +19661,7 @@
       <mc:AlternateContent>
         <mc:Choice Requires="wps">
           <w:drawing>
-            <wp:anchor distT="0" distB="0" distL="0" distR="0" simplePos="0" relativeHeight="251701248" behindDoc="1" locked="0" layoutInCell="1" allowOverlap="1" wp14:anchorId="28EA7589" wp14:editId="1EB763C2">
+            <wp:anchor distT="0" distB="0" distL="0" distR="0" simplePos="0" relativeHeight="251649024" behindDoc="1" locked="0" layoutInCell="1" allowOverlap="1" wp14:anchorId="28EA7589" wp14:editId="1EB763C2">
               <wp:simplePos x="0" y="0"/>
               <wp:positionH relativeFrom="page">
                 <wp:posOffset>5221985</wp:posOffset>
@@ -19684,7 +19672,7 @@
               <wp:extent cx="287655" cy="152400"/>
               <wp:effectExtent l="0" t="0" r="0" b="0"/>
               <wp:wrapNone/>
-              <wp:docPr id="12" name="Textbox 12"/>
+              <wp:docPr id="1833481975" name="Textbox 12"/>
               <wp:cNvGraphicFramePr>
                 <a:graphicFrameLocks xmlns:a="http://schemas.openxmlformats.org/drawingml/2006/main"/>
               </wp:cNvGraphicFramePr>
@@ -19736,7 +19724,7 @@
         </mc:Choice>
         <mc:Fallback>
           <w:pict>
-            <v:shape w14:anchorId="28EA7589" id="Textbox 12" o:spid="_x0000_s1036" type="#_x0000_t202" style="position:absolute;margin-left:411.2pt;margin-top:163.45pt;width:22.65pt;height:12pt;z-index:-251615232;visibility:visible;mso-wrap-style:square;mso-wrap-distance-left:0;mso-wrap-distance-top:0;mso-wrap-distance-right:0;mso-wrap-distance-bottom:0;mso-position-horizontal:absolute;mso-position-horizontal-relative:page;mso-position-vertical:absolute;mso-position-vertical-relative:page;v-text-anchor:top" o:gfxdata="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" filled="f" stroked="f">
+            <v:shape w14:anchorId="28EA7589" id="_x0000_s1063" type="#_x0000_t202" style="position:absolute;margin-left:411.2pt;margin-top:163.45pt;width:22.65pt;height:12pt;z-index:-251667456;visibility:visible;mso-wrap-style:square;mso-wrap-distance-left:0;mso-wrap-distance-top:0;mso-wrap-distance-right:0;mso-wrap-distance-bottom:0;mso-position-horizontal:absolute;mso-position-horizontal-relative:page;mso-position-vertical:absolute;mso-position-vertical-relative:page;v-text-anchor:top" o:gfxdata="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" filled="f" stroked="f">
               <v:textbox inset="0,0,0,0">
                 <w:txbxContent>
                   <w:p>
@@ -19774,7 +19762,7 @@
       <mc:AlternateContent>
         <mc:Choice Requires="wps">
           <w:drawing>
-            <wp:anchor distT="0" distB="0" distL="0" distR="0" simplePos="0" relativeHeight="251713536" behindDoc="1" locked="0" layoutInCell="1" allowOverlap="1" wp14:anchorId="25BF1F03" wp14:editId="7C525E9B">
+            <wp:anchor distT="0" distB="0" distL="0" distR="0" simplePos="0" relativeHeight="251652096" behindDoc="1" locked="0" layoutInCell="1" allowOverlap="1" wp14:anchorId="25BF1F03" wp14:editId="24BA2D1F">
               <wp:simplePos x="0" y="0"/>
               <wp:positionH relativeFrom="page">
                 <wp:posOffset>7035800</wp:posOffset>
@@ -19785,7 +19773,7 @@
               <wp:extent cx="265430" cy="152400"/>
               <wp:effectExtent l="0" t="0" r="0" b="0"/>
               <wp:wrapNone/>
-              <wp:docPr id="15" name="Textbox 15"/>
+              <wp:docPr id="2027284801" name="Textbox 15"/>
               <wp:cNvGraphicFramePr>
                 <a:graphicFrameLocks xmlns:a="http://schemas.openxmlformats.org/drawingml/2006/main"/>
               </wp:cNvGraphicFramePr>
@@ -19837,7 +19825,7 @@
         </mc:Choice>
         <mc:Fallback>
           <w:pict>
-            <v:shape w14:anchorId="25BF1F03" id="Textbox 15" o:spid="_x0000_s1037" type="#_x0000_t202" style="position:absolute;margin-left:554pt;margin-top:162.95pt;width:20.9pt;height:12pt;z-index:-251602944;visibility:visible;mso-wrap-style:square;mso-wrap-distance-left:0;mso-wrap-distance-top:0;mso-wrap-distance-right:0;mso-wrap-distance-bottom:0;mso-position-horizontal:absolute;mso-position-horizontal-relative:page;mso-position-vertical:absolute;mso-position-vertical-relative:page;v-text-anchor:top" o:gfxdata="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" filled="f" stroked="f">
+            <v:shape w14:anchorId="25BF1F03" id="_x0000_s1064" type="#_x0000_t202" style="position:absolute;margin-left:554pt;margin-top:162.95pt;width:20.9pt;height:12pt;z-index:-251664384;visibility:visible;mso-wrap-style:square;mso-wrap-distance-left:0;mso-wrap-distance-top:0;mso-wrap-distance-right:0;mso-wrap-distance-bottom:0;mso-position-horizontal:absolute;mso-position-horizontal-relative:page;mso-position-vertical:absolute;mso-position-vertical-relative:page;v-text-anchor:top" o:gfxdata="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" filled="f" stroked="f">
               <v:textbox inset="0,0,0,0">
                 <w:txbxContent>
                   <w:p>

</xml_diff>